<commit_message>
Insérer les photos du Havana Resort dans le plan d'affaires
Ajoute un dossier photos avec les images fournies et une correspondance
photos.json entre chaque emplacement du document et une photo. Le
générateur remplace les espaces réservés par les photos associées et
construit une galerie en annexe F. Couverture : vue aérienne de la
piscine.

Co-Authored-By: Claude Fable 5.1 <noreply@anthropic.com>
Claude-Session: https://claude.ai/code/session_01SZvZuYXZ3BuNTXPMcsdahV
</commit_message>
<xml_diff>
--- a/plan-affaires/Plan_affaires_Complexe_Havana.docx
+++ b/plan-affaires/Plan_affaires_Complexe_Havana.docx
@@ -85,48 +85,79 @@
       <w:tblPr>
         <w:tblW w:type="dxa" w:w="9648"/>
         <w:tblBorders>
-          <w:top w:val="single" w:color="auto" w:sz="4"/>
-          <w:left w:val="single" w:color="auto" w:sz="4"/>
-          <w:bottom w:val="single" w:color="auto" w:sz="4"/>
-          <w:right w:val="single" w:color="auto" w:sz="4"/>
-          <w:insideH w:val="single" w:color="auto" w:sz="4"/>
-          <w:insideV w:val="single" w:color="auto" w:sz="4"/>
+          <w:top w:val="none" w:color="FFFFFF" w:sz="0"/>
+          <w:left w:val="none" w:color="FFFFFF" w:sz="0"/>
+          <w:bottom w:val="none" w:color="FFFFFF" w:sz="0"/>
+          <w:right w:val="none" w:color="FFFFFF" w:sz="0"/>
+          <w:insideH w:val="none" w:color="FFFFFF" w:sz="0"/>
+          <w:insideV w:val="none" w:color="FFFFFF" w:sz="0"/>
         </w:tblBorders>
       </w:tblPr>
       <w:tblGrid>
         <w:gridCol w:w="9648"/>
       </w:tblGrid>
       <w:tr>
-        <w:trPr>
-          <w:trHeight w:val="4200" w:hRule="atLeast"/>
-        </w:trPr>
         <w:tc>
           <w:tcPr>
             <w:tcW w:type="dxa" w:w="9648"/>
             <w:tcBorders>
-              <w:top w:val="dashed" w:color="8A94A6" w:sz="8"/>
-              <w:left w:val="dashed" w:color="8A94A6" w:sz="8"/>
-              <w:bottom w:val="dashed" w:color="8A94A6" w:sz="8"/>
-              <w:right w:val="dashed" w:color="8A94A6" w:sz="8"/>
+              <w:top w:val="none" w:color="FFFFFF" w:sz="0"/>
+              <w:left w:val="none" w:color="FFFFFF" w:sz="0"/>
+              <w:bottom w:val="none" w:color="FFFFFF" w:sz="0"/>
+              <w:right w:val="none" w:color="FFFFFF" w:sz="0"/>
             </w:tcBorders>
-            <w:shd w:fill="F7F8FA" w:color="auto" w:val="clear"/>
-            <w:vAlign w:val="center"/>
-          </w:tcPr>
-          <w:p>
-            <w:pPr>
-              <w:spacing w:after="60"/>
+            <w:tcMar>
+              <w:top w:type="dxa" w:w="0"/>
+              <w:left w:type="dxa" w:w="0"/>
+              <w:bottom w:type="dxa" w:w="0"/>
+              <w:right w:type="dxa" w:w="0"/>
+            </w:tcMar>
+            <w:vAlign w:val="center"/>
+          </w:tcPr>
+          <w:p>
+            <w:pPr>
+              <w:spacing w:after="40"/>
               <w:jc w:val="center"/>
             </w:pPr>
             <w:r>
-              <w:rPr>
-                <w:rFonts w:ascii="Calibri" w:cs="Calibri" w:eastAsia="Calibri" w:hAnsi="Calibri"/>
-                <w:b/>
-                <w:bCs/>
-                <w:color w:val="8A94A6"/>
-                <w:sz w:val="18"/>
-                <w:szCs w:val="18"/>
-              </w:rPr>
-              <w:t xml:space="preserve">IMAGE À INSÉRER</w:t>
+              <w:drawing>
+                <wp:inline distT="0" distB="0" distL="0" distR="0">
+                  <wp:extent cx="5867400" cy="4191000"/>
+                  <wp:effectExtent t="0" r="0" b="0" l="0"/>
+                  <wp:docPr id="1" name="" descr="" title=""/>
+                  <wp:cNvGraphicFramePr>
+                    <a:graphicFrameLocks xmlns:a="http://schemas.openxmlformats.org/drawingml/2006/main" noChangeAspect="1"/>
+                  </wp:cNvGraphicFramePr>
+                  <a:graphic xmlns:a="http://schemas.openxmlformats.org/drawingml/2006/main">
+                    <a:graphicData uri="http://schemas.openxmlformats.org/drawingml/2006/picture">
+                      <pic:pic xmlns:pic="http://schemas.openxmlformats.org/drawingml/2006/picture">
+                        <pic:nvPicPr>
+                          <pic:cNvPr id="0" name="" descr=""/>
+                          <pic:cNvPicPr>
+                            <a:picLocks noChangeAspect="1" noChangeArrowheads="1"/>
+                          </pic:cNvPicPr>
+                        </pic:nvPicPr>
+                        <pic:blipFill>
+                          <a:blip r:embed="rId9" cstate="none"/>
+                          <a:srcRect/>
+                          <a:stretch>
+                            <a:fillRect/>
+                          </a:stretch>
+                        </pic:blipFill>
+                        <pic:spPr bwMode="auto">
+                          <a:xfrm>
+                            <a:off x="0" y="0"/>
+                            <a:ext cx="5867400" cy="4191000"/>
+                          </a:xfrm>
+                          <a:prstGeom prst="rect">
+                            <a:avLst/>
+                          </a:prstGeom>
+                        </pic:spPr>
+                      </pic:pic>
+                    </a:graphicData>
+                  </a:graphic>
+                </wp:inline>
+              </w:drawing>
             </w:r>
           </w:p>
           <w:p>
@@ -140,10 +171,10 @@
                 <w:i/>
                 <w:iCs/>
                 <w:color w:val="8A94A6"/>
-                <w:sz w:val="19"/>
-                <w:szCs w:val="19"/>
-              </w:rPr>
-              <w:t xml:space="preserve">Photo de couverture : vue aérienne du site ou piscine centrale avec le café-bar (haute résolution)</w:t>
+                <w:sz w:val="17"/>
+                <w:szCs w:val="17"/>
+              </w:rPr>
+              <w:t xml:space="preserve"/>
             </w:r>
           </w:p>
         </w:tc>
@@ -4529,40 +4560,72 @@
         <w:gridCol w:w="4724"/>
       </w:tblGrid>
       <w:tr>
-        <w:trPr>
-          <w:trHeight w:val="2200" w:hRule="atLeast"/>
-        </w:trPr>
         <w:tc>
           <w:tcPr>
             <w:tcW w:type="dxa" w:w="4724"/>
             <w:tcBorders>
-              <w:top w:val="dashed" w:color="8A94A6" w:sz="8"/>
-              <w:left w:val="dashed" w:color="8A94A6" w:sz="8"/>
-              <w:bottom w:val="dashed" w:color="8A94A6" w:sz="8"/>
-              <w:right w:val="dashed" w:color="8A94A6" w:sz="8"/>
+              <w:top w:val="none" w:color="FFFFFF" w:sz="0"/>
+              <w:left w:val="none" w:color="FFFFFF" w:sz="0"/>
+              <w:bottom w:val="none" w:color="FFFFFF" w:sz="0"/>
+              <w:right w:val="none" w:color="FFFFFF" w:sz="0"/>
             </w:tcBorders>
-            <w:shd w:fill="F7F8FA" w:color="auto" w:val="clear"/>
-            <w:vAlign w:val="center"/>
-          </w:tcPr>
-          <w:p>
-            <w:pPr>
-              <w:spacing w:after="60"/>
+            <w:tcMar>
+              <w:top w:type="dxa" w:w="0"/>
+              <w:left w:type="dxa" w:w="0"/>
+              <w:bottom w:type="dxa" w:w="0"/>
+              <w:right w:type="dxa" w:w="0"/>
+            </w:tcMar>
+            <w:vAlign w:val="center"/>
+          </w:tcPr>
+          <w:p>
+            <w:pPr>
+              <w:spacing w:after="40"/>
               <w:jc w:val="center"/>
             </w:pPr>
             <w:r>
-              <w:rPr>
-                <w:rFonts w:ascii="Calibri" w:cs="Calibri" w:eastAsia="Calibri" w:hAnsi="Calibri"/>
-                <w:b/>
-                <w:bCs/>
-                <w:color w:val="8A94A6"/>
-                <w:sz w:val="18"/>
-                <w:szCs w:val="18"/>
-              </w:rPr>
-              <w:t xml:space="preserve">IMAGE À INSÉRER</w:t>
-            </w:r>
-          </w:p>
-          <w:p>
-            <w:pPr>
+              <w:drawing>
+                <wp:inline distT="0" distB="0" distL="0" distR="0">
+                  <wp:extent cx="3000375" cy="1809750"/>
+                  <wp:effectExtent t="0" r="0" b="0" l="0"/>
+                  <wp:docPr id="1" name="" descr="" title=""/>
+                  <wp:cNvGraphicFramePr>
+                    <a:graphicFrameLocks xmlns:a="http://schemas.openxmlformats.org/drawingml/2006/main" noChangeAspect="1"/>
+                  </wp:cNvGraphicFramePr>
+                  <a:graphic xmlns:a="http://schemas.openxmlformats.org/drawingml/2006/main">
+                    <a:graphicData uri="http://schemas.openxmlformats.org/drawingml/2006/picture">
+                      <pic:pic xmlns:pic="http://schemas.openxmlformats.org/drawingml/2006/picture">
+                        <pic:nvPicPr>
+                          <pic:cNvPr id="0" name="" descr=""/>
+                          <pic:cNvPicPr>
+                            <a:picLocks noChangeAspect="1" noChangeArrowheads="1"/>
+                          </pic:cNvPicPr>
+                        </pic:nvPicPr>
+                        <pic:blipFill>
+                          <a:blip r:embed="rId10" cstate="none"/>
+                          <a:srcRect/>
+                          <a:stretch>
+                            <a:fillRect/>
+                          </a:stretch>
+                        </pic:blipFill>
+                        <pic:spPr bwMode="auto">
+                          <a:xfrm>
+                            <a:off x="0" y="0"/>
+                            <a:ext cx="3000375" cy="1809750"/>
+                          </a:xfrm>
+                          <a:prstGeom prst="rect">
+                            <a:avLst/>
+                          </a:prstGeom>
+                        </pic:spPr>
+                      </pic:pic>
+                    </a:graphicData>
+                  </a:graphic>
+                </wp:inline>
+              </w:drawing>
+            </w:r>
+          </w:p>
+          <w:p>
+            <w:pPr>
+              <w:spacing w:after="0"/>
               <w:jc w:val="center"/>
             </w:pPr>
             <w:r>
@@ -4571,10 +4634,10 @@
                 <w:i/>
                 <w:iCs/>
                 <w:color w:val="8A94A6"/>
-                <w:sz w:val="19"/>
-                <w:szCs w:val="19"/>
-              </w:rPr>
-              <w:t xml:space="preserve">Vue aérienne du site (263 acres)</w:t>
+                <w:sz w:val="17"/>
+                <w:szCs w:val="17"/>
+              </w:rPr>
+              <w:t xml:space="preserve">Le pavillon d'accueil, au toit de chaume</w:t>
             </w:r>
           </w:p>
         </w:tc>
@@ -4598,33 +4661,68 @@
           <w:tcPr>
             <w:tcW w:type="dxa" w:w="4724"/>
             <w:tcBorders>
-              <w:top w:val="dashed" w:color="8A94A6" w:sz="8"/>
-              <w:left w:val="dashed" w:color="8A94A6" w:sz="8"/>
-              <w:bottom w:val="dashed" w:color="8A94A6" w:sz="8"/>
-              <w:right w:val="dashed" w:color="8A94A6" w:sz="8"/>
+              <w:top w:val="none" w:color="FFFFFF" w:sz="0"/>
+              <w:left w:val="none" w:color="FFFFFF" w:sz="0"/>
+              <w:bottom w:val="none" w:color="FFFFFF" w:sz="0"/>
+              <w:right w:val="none" w:color="FFFFFF" w:sz="0"/>
             </w:tcBorders>
-            <w:shd w:fill="F7F8FA" w:color="auto" w:val="clear"/>
-            <w:vAlign w:val="center"/>
-          </w:tcPr>
-          <w:p>
-            <w:pPr>
-              <w:spacing w:after="60"/>
+            <w:tcMar>
+              <w:top w:type="dxa" w:w="0"/>
+              <w:left w:type="dxa" w:w="0"/>
+              <w:bottom w:type="dxa" w:w="0"/>
+              <w:right w:type="dxa" w:w="0"/>
+            </w:tcMar>
+            <w:vAlign w:val="center"/>
+          </w:tcPr>
+          <w:p>
+            <w:pPr>
+              <w:spacing w:after="40"/>
               <w:jc w:val="center"/>
             </w:pPr>
             <w:r>
-              <w:rPr>
-                <w:rFonts w:ascii="Calibri" w:cs="Calibri" w:eastAsia="Calibri" w:hAnsi="Calibri"/>
-                <w:b/>
-                <w:bCs/>
-                <w:color w:val="8A94A6"/>
-                <w:sz w:val="18"/>
-                <w:szCs w:val="18"/>
-              </w:rPr>
-              <w:t xml:space="preserve">IMAGE À INSÉRER</w:t>
-            </w:r>
-          </w:p>
-          <w:p>
-            <w:pPr>
+              <w:drawing>
+                <wp:inline distT="0" distB="0" distL="0" distR="0">
+                  <wp:extent cx="2876550" cy="2095500"/>
+                  <wp:effectExtent t="0" r="0" b="0" l="0"/>
+                  <wp:docPr id="1" name="" descr="" title=""/>
+                  <wp:cNvGraphicFramePr>
+                    <a:graphicFrameLocks xmlns:a="http://schemas.openxmlformats.org/drawingml/2006/main" noChangeAspect="1"/>
+                  </wp:cNvGraphicFramePr>
+                  <a:graphic xmlns:a="http://schemas.openxmlformats.org/drawingml/2006/main">
+                    <a:graphicData uri="http://schemas.openxmlformats.org/drawingml/2006/picture">
+                      <pic:pic xmlns:pic="http://schemas.openxmlformats.org/drawingml/2006/picture">
+                        <pic:nvPicPr>
+                          <pic:cNvPr id="0" name="" descr=""/>
+                          <pic:cNvPicPr>
+                            <a:picLocks noChangeAspect="1" noChangeArrowheads="1"/>
+                          </pic:cNvPicPr>
+                        </pic:nvPicPr>
+                        <pic:blipFill>
+                          <a:blip r:embed="rId11" cstate="none"/>
+                          <a:srcRect/>
+                          <a:stretch>
+                            <a:fillRect/>
+                          </a:stretch>
+                        </pic:blipFill>
+                        <pic:spPr bwMode="auto">
+                          <a:xfrm>
+                            <a:off x="0" y="0"/>
+                            <a:ext cx="2876550" cy="2095500"/>
+                          </a:xfrm>
+                          <a:prstGeom prst="rect">
+                            <a:avLst/>
+                          </a:prstGeom>
+                        </pic:spPr>
+                      </pic:pic>
+                    </a:graphicData>
+                  </a:graphic>
+                </wp:inline>
+              </w:drawing>
+            </w:r>
+          </w:p>
+          <w:p>
+            <w:pPr>
+              <w:spacing w:after="0"/>
               <w:jc w:val="center"/>
             </w:pPr>
             <w:r>
@@ -4633,10 +4731,10 @@
                 <w:i/>
                 <w:iCs/>
                 <w:color w:val="8A94A6"/>
-                <w:sz w:val="19"/>
-                <w:szCs w:val="19"/>
-              </w:rPr>
-              <w:t xml:space="preserve">Piscine centrale et café-bar en saison</w:t>
+                <w:sz w:val="17"/>
+                <w:szCs w:val="17"/>
+              </w:rPr>
+              <w:t xml:space="preserve">La piscine centrale un jour de fête de la mousse</w:t>
             </w:r>
           </w:p>
         </w:tc>
@@ -7568,40 +7666,72 @@
         <w:gridCol w:w="4724"/>
       </w:tblGrid>
       <w:tr>
-        <w:trPr>
-          <w:trHeight w:val="2200" w:hRule="atLeast"/>
-        </w:trPr>
         <w:tc>
           <w:tcPr>
             <w:tcW w:type="dxa" w:w="4724"/>
             <w:tcBorders>
-              <w:top w:val="dashed" w:color="8A94A6" w:sz="8"/>
-              <w:left w:val="dashed" w:color="8A94A6" w:sz="8"/>
-              <w:bottom w:val="dashed" w:color="8A94A6" w:sz="8"/>
-              <w:right w:val="dashed" w:color="8A94A6" w:sz="8"/>
+              <w:top w:val="none" w:color="FFFFFF" w:sz="0"/>
+              <w:left w:val="none" w:color="FFFFFF" w:sz="0"/>
+              <w:bottom w:val="none" w:color="FFFFFF" w:sz="0"/>
+              <w:right w:val="none" w:color="FFFFFF" w:sz="0"/>
             </w:tcBorders>
-            <w:shd w:fill="F7F8FA" w:color="auto" w:val="clear"/>
-            <w:vAlign w:val="center"/>
-          </w:tcPr>
-          <w:p>
-            <w:pPr>
-              <w:spacing w:after="60"/>
+            <w:tcMar>
+              <w:top w:type="dxa" w:w="0"/>
+              <w:left w:type="dxa" w:w="0"/>
+              <w:bottom w:type="dxa" w:w="0"/>
+              <w:right w:type="dxa" w:w="0"/>
+            </w:tcMar>
+            <w:vAlign w:val="center"/>
+          </w:tcPr>
+          <w:p>
+            <w:pPr>
+              <w:spacing w:after="40"/>
               <w:jc w:val="center"/>
             </w:pPr>
             <w:r>
-              <w:rPr>
-                <w:rFonts w:ascii="Calibri" w:cs="Calibri" w:eastAsia="Calibri" w:hAnsi="Calibri"/>
-                <w:b/>
-                <w:bCs/>
-                <w:color w:val="8A94A6"/>
-                <w:sz w:val="18"/>
-                <w:szCs w:val="18"/>
-              </w:rPr>
-              <w:t xml:space="preserve">IMAGE À INSÉRER</w:t>
-            </w:r>
-          </w:p>
-          <w:p>
-            <w:pPr>
+              <w:drawing>
+                <wp:inline distT="0" distB="0" distL="0" distR="0">
+                  <wp:extent cx="2790825" cy="2095500"/>
+                  <wp:effectExtent t="0" r="0" b="0" l="0"/>
+                  <wp:docPr id="1" name="" descr="" title=""/>
+                  <wp:cNvGraphicFramePr>
+                    <a:graphicFrameLocks xmlns:a="http://schemas.openxmlformats.org/drawingml/2006/main" noChangeAspect="1"/>
+                  </wp:cNvGraphicFramePr>
+                  <a:graphic xmlns:a="http://schemas.openxmlformats.org/drawingml/2006/main">
+                    <a:graphicData uri="http://schemas.openxmlformats.org/drawingml/2006/picture">
+                      <pic:pic xmlns:pic="http://schemas.openxmlformats.org/drawingml/2006/picture">
+                        <pic:nvPicPr>
+                          <pic:cNvPr id="0" name="" descr=""/>
+                          <pic:cNvPicPr>
+                            <a:picLocks noChangeAspect="1" noChangeArrowheads="1"/>
+                          </pic:cNvPicPr>
+                        </pic:nvPicPr>
+                        <pic:blipFill>
+                          <a:blip r:embed="rId12" cstate="none"/>
+                          <a:srcRect/>
+                          <a:stretch>
+                            <a:fillRect/>
+                          </a:stretch>
+                        </pic:blipFill>
+                        <pic:spPr bwMode="auto">
+                          <a:xfrm>
+                            <a:off x="0" y="0"/>
+                            <a:ext cx="2790825" cy="2095500"/>
+                          </a:xfrm>
+                          <a:prstGeom prst="rect">
+                            <a:avLst/>
+                          </a:prstGeom>
+                        </pic:spPr>
+                      </pic:pic>
+                    </a:graphicData>
+                  </a:graphic>
+                </wp:inline>
+              </w:drawing>
+            </w:r>
+          </w:p>
+          <w:p>
+            <w:pPr>
+              <w:spacing w:after="0"/>
               <w:jc w:val="center"/>
             </w:pPr>
             <w:r>
@@ -7610,10 +7740,10 @@
                 <w:i/>
                 <w:iCs/>
                 <w:color w:val="8A94A6"/>
-                <w:sz w:val="19"/>
-                <w:szCs w:val="19"/>
-              </w:rPr>
-              <w:t xml:space="preserve">Rendu ou esquisse : hôtel 17 chambres et restaurant Madera</w:t>
+                <w:sz w:val="17"/>
+                <w:szCs w:val="17"/>
+              </w:rPr>
+              <w:t xml:space="preserve">Le bâtiment hôtelier actuel, à agrandir à 17 chambres</w:t>
             </w:r>
           </w:p>
         </w:tc>
@@ -7637,33 +7767,68 @@
           <w:tcPr>
             <w:tcW w:type="dxa" w:w="4724"/>
             <w:tcBorders>
-              <w:top w:val="dashed" w:color="8A94A6" w:sz="8"/>
-              <w:left w:val="dashed" w:color="8A94A6" w:sz="8"/>
-              <w:bottom w:val="dashed" w:color="8A94A6" w:sz="8"/>
-              <w:right w:val="dashed" w:color="8A94A6" w:sz="8"/>
+              <w:top w:val="none" w:color="FFFFFF" w:sz="0"/>
+              <w:left w:val="none" w:color="FFFFFF" w:sz="0"/>
+              <w:bottom w:val="none" w:color="FFFFFF" w:sz="0"/>
+              <w:right w:val="none" w:color="FFFFFF" w:sz="0"/>
             </w:tcBorders>
-            <w:shd w:fill="F7F8FA" w:color="auto" w:val="clear"/>
-            <w:vAlign w:val="center"/>
-          </w:tcPr>
-          <w:p>
-            <w:pPr>
-              <w:spacing w:after="60"/>
+            <w:tcMar>
+              <w:top w:type="dxa" w:w="0"/>
+              <w:left w:type="dxa" w:w="0"/>
+              <w:bottom w:type="dxa" w:w="0"/>
+              <w:right w:type="dxa" w:w="0"/>
+            </w:tcMar>
+            <w:vAlign w:val="center"/>
+          </w:tcPr>
+          <w:p>
+            <w:pPr>
+              <w:spacing w:after="40"/>
               <w:jc w:val="center"/>
             </w:pPr>
             <w:r>
-              <w:rPr>
-                <w:rFonts w:ascii="Calibri" w:cs="Calibri" w:eastAsia="Calibri" w:hAnsi="Calibri"/>
-                <w:b/>
-                <w:bCs/>
-                <w:color w:val="8A94A6"/>
-                <w:sz w:val="18"/>
-                <w:szCs w:val="18"/>
-              </w:rPr>
-              <w:t xml:space="preserve">IMAGE À INSÉRER</w:t>
-            </w:r>
-          </w:p>
-          <w:p>
-            <w:pPr>
+              <w:drawing>
+                <wp:inline distT="0" distB="0" distL="0" distR="0">
+                  <wp:extent cx="3000375" cy="1809750"/>
+                  <wp:effectExtent t="0" r="0" b="0" l="0"/>
+                  <wp:docPr id="1" name="" descr="" title=""/>
+                  <wp:cNvGraphicFramePr>
+                    <a:graphicFrameLocks xmlns:a="http://schemas.openxmlformats.org/drawingml/2006/main" noChangeAspect="1"/>
+                  </wp:cNvGraphicFramePr>
+                  <a:graphic xmlns:a="http://schemas.openxmlformats.org/drawingml/2006/main">
+                    <a:graphicData uri="http://schemas.openxmlformats.org/drawingml/2006/picture">
+                      <pic:pic xmlns:pic="http://schemas.openxmlformats.org/drawingml/2006/picture">
+                        <pic:nvPicPr>
+                          <pic:cNvPr id="0" name="" descr=""/>
+                          <pic:cNvPicPr>
+                            <a:picLocks noChangeAspect="1" noChangeArrowheads="1"/>
+                          </pic:cNvPicPr>
+                        </pic:nvPicPr>
+                        <pic:blipFill>
+                          <a:blip r:embed="rId13" cstate="none"/>
+                          <a:srcRect/>
+                          <a:stretch>
+                            <a:fillRect/>
+                          </a:stretch>
+                        </pic:blipFill>
+                        <pic:spPr bwMode="auto">
+                          <a:xfrm>
+                            <a:off x="0" y="0"/>
+                            <a:ext cx="3000375" cy="1809750"/>
+                          </a:xfrm>
+                          <a:prstGeom prst="rect">
+                            <a:avLst/>
+                          </a:prstGeom>
+                        </pic:spPr>
+                      </pic:pic>
+                    </a:graphicData>
+                  </a:graphic>
+                </wp:inline>
+              </w:drawing>
+            </w:r>
+          </w:p>
+          <w:p>
+            <w:pPr>
+              <w:spacing w:after="0"/>
               <w:jc w:val="center"/>
             </w:pPr>
             <w:r>
@@ -7672,10 +7837,10 @@
                 <w:i/>
                 <w:iCs/>
                 <w:color w:val="8A94A6"/>
-                <w:sz w:val="19"/>
-                <w:szCs w:val="19"/>
-              </w:rPr>
-              <w:t xml:space="preserve">Rendu ou esquisse : piscine et spa quatre saisons</w:t>
+                <w:sz w:val="17"/>
+                <w:szCs w:val="17"/>
+              </w:rPr>
+              <w:t xml:space="preserve">Les chalets existants, à mettre à niveau pour l'exploitation quatre saisons</w:t>
             </w:r>
           </w:p>
         </w:tc>
@@ -7690,48 +7855,79 @@
       <w:tblPr>
         <w:tblW w:type="dxa" w:w="9648"/>
         <w:tblBorders>
-          <w:top w:val="single" w:color="auto" w:sz="4"/>
-          <w:left w:val="single" w:color="auto" w:sz="4"/>
-          <w:bottom w:val="single" w:color="auto" w:sz="4"/>
-          <w:right w:val="single" w:color="auto" w:sz="4"/>
-          <w:insideH w:val="single" w:color="auto" w:sz="4"/>
-          <w:insideV w:val="single" w:color="auto" w:sz="4"/>
+          <w:top w:val="none" w:color="FFFFFF" w:sz="0"/>
+          <w:left w:val="none" w:color="FFFFFF" w:sz="0"/>
+          <w:bottom w:val="none" w:color="FFFFFF" w:sz="0"/>
+          <w:right w:val="none" w:color="FFFFFF" w:sz="0"/>
+          <w:insideH w:val="none" w:color="FFFFFF" w:sz="0"/>
+          <w:insideV w:val="none" w:color="FFFFFF" w:sz="0"/>
         </w:tblBorders>
       </w:tblPr>
       <w:tblGrid>
         <w:gridCol w:w="9648"/>
       </w:tblGrid>
       <w:tr>
-        <w:trPr>
-          <w:trHeight w:val="3600" w:hRule="atLeast"/>
-        </w:trPr>
         <w:tc>
           <w:tcPr>
             <w:tcW w:type="dxa" w:w="9648"/>
             <w:tcBorders>
-              <w:top w:val="dashed" w:color="8A94A6" w:sz="8"/>
-              <w:left w:val="dashed" w:color="8A94A6" w:sz="8"/>
-              <w:bottom w:val="dashed" w:color="8A94A6" w:sz="8"/>
-              <w:right w:val="dashed" w:color="8A94A6" w:sz="8"/>
+              <w:top w:val="none" w:color="FFFFFF" w:sz="0"/>
+              <w:left w:val="none" w:color="FFFFFF" w:sz="0"/>
+              <w:bottom w:val="none" w:color="FFFFFF" w:sz="0"/>
+              <w:right w:val="none" w:color="FFFFFF" w:sz="0"/>
             </w:tcBorders>
-            <w:shd w:fill="F7F8FA" w:color="auto" w:val="clear"/>
-            <w:vAlign w:val="center"/>
-          </w:tcPr>
-          <w:p>
-            <w:pPr>
-              <w:spacing w:after="60"/>
+            <w:tcMar>
+              <w:top w:type="dxa" w:w="0"/>
+              <w:left w:type="dxa" w:w="0"/>
+              <w:bottom w:type="dxa" w:w="0"/>
+              <w:right w:type="dxa" w:w="0"/>
+            </w:tcMar>
+            <w:vAlign w:val="center"/>
+          </w:tcPr>
+          <w:p>
+            <w:pPr>
+              <w:spacing w:after="40"/>
               <w:jc w:val="center"/>
             </w:pPr>
             <w:r>
-              <w:rPr>
-                <w:rFonts w:ascii="Calibri" w:cs="Calibri" w:eastAsia="Calibri" w:hAnsi="Calibri"/>
-                <w:b/>
-                <w:bCs/>
-                <w:color w:val="8A94A6"/>
-                <w:sz w:val="18"/>
-                <w:szCs w:val="18"/>
-              </w:rPr>
-              <w:t xml:space="preserve">IMAGE À INSÉRER</w:t>
+              <w:drawing>
+                <wp:inline distT="0" distB="0" distL="0" distR="0">
+                  <wp:extent cx="5486400" cy="3552825"/>
+                  <wp:effectExtent t="0" r="0" b="0" l="0"/>
+                  <wp:docPr id="1" name="" descr="" title=""/>
+                  <wp:cNvGraphicFramePr>
+                    <a:graphicFrameLocks xmlns:a="http://schemas.openxmlformats.org/drawingml/2006/main" noChangeAspect="1"/>
+                  </wp:cNvGraphicFramePr>
+                  <a:graphic xmlns:a="http://schemas.openxmlformats.org/drawingml/2006/main">
+                    <a:graphicData uri="http://schemas.openxmlformats.org/drawingml/2006/picture">
+                      <pic:pic xmlns:pic="http://schemas.openxmlformats.org/drawingml/2006/picture">
+                        <pic:nvPicPr>
+                          <pic:cNvPr id="0" name="" descr=""/>
+                          <pic:cNvPicPr>
+                            <a:picLocks noChangeAspect="1" noChangeArrowheads="1"/>
+                          </pic:cNvPicPr>
+                        </pic:nvPicPr>
+                        <pic:blipFill>
+                          <a:blip r:embed="rId14" cstate="none"/>
+                          <a:srcRect/>
+                          <a:stretch>
+                            <a:fillRect/>
+                          </a:stretch>
+                        </pic:blipFill>
+                        <pic:spPr bwMode="auto">
+                          <a:xfrm>
+                            <a:off x="0" y="0"/>
+                            <a:ext cx="5486400" cy="3552825"/>
+                          </a:xfrm>
+                          <a:prstGeom prst="rect">
+                            <a:avLst/>
+                          </a:prstGeom>
+                        </pic:spPr>
+                      </pic:pic>
+                    </a:graphicData>
+                  </a:graphic>
+                </wp:inline>
+              </w:drawing>
             </w:r>
           </w:p>
           <w:p>
@@ -7745,10 +7941,10 @@
                 <w:i/>
                 <w:iCs/>
                 <w:color w:val="8A94A6"/>
-                <w:sz w:val="19"/>
-                <w:szCs w:val="19"/>
-              </w:rPr>
-              <w:t xml:space="preserve">Plan d'aménagement du site : localisation des phases 1 et 2 (hôtel, villas, terrains saisonniers, spa, amphithéâtre, sentier)</w:t>
+                <w:sz w:val="17"/>
+                <w:szCs w:val="17"/>
+              </w:rPr>
+              <w:t xml:space="preserve">Plan d'aménagement actuel du site (source : Havana Resort)</w:t>
             </w:r>
           </w:p>
         </w:tc>
@@ -7796,7 +7992,7 @@
                     </pic:cNvPicPr>
                   </pic:nvPicPr>
                   <pic:blipFill>
-                    <a:blip r:embed="rId9" cstate="none"/>
+                    <a:blip r:embed="rId15" cstate="none"/>
                     <a:srcRect/>
                     <a:stretch>
                       <a:fillRect/>
@@ -8149,12 +8345,12 @@
       <w:tblPr>
         <w:tblW w:type="dxa" w:w="9648"/>
         <w:tblBorders>
-          <w:top w:val="single" w:color="auto" w:sz="4"/>
-          <w:left w:val="single" w:color="auto" w:sz="4"/>
-          <w:bottom w:val="single" w:color="auto" w:sz="4"/>
-          <w:right w:val="single" w:color="auto" w:sz="4"/>
-          <w:insideH w:val="single" w:color="auto" w:sz="4"/>
-          <w:insideV w:val="single" w:color="auto" w:sz="4"/>
+          <w:top w:val="none" w:color="FFFFFF" w:sz="0"/>
+          <w:left w:val="none" w:color="FFFFFF" w:sz="0"/>
+          <w:bottom w:val="none" w:color="FFFFFF" w:sz="0"/>
+          <w:right w:val="none" w:color="FFFFFF" w:sz="0"/>
+          <w:insideH w:val="none" w:color="FFFFFF" w:sz="0"/>
+          <w:insideV w:val="none" w:color="FFFFFF" w:sz="0"/>
         </w:tblBorders>
       </w:tblPr>
       <w:tblGrid>
@@ -12508,48 +12704,79 @@
       <w:tblPr>
         <w:tblW w:type="dxa" w:w="9648"/>
         <w:tblBorders>
-          <w:top w:val="single" w:color="auto" w:sz="4"/>
-          <w:left w:val="single" w:color="auto" w:sz="4"/>
-          <w:bottom w:val="single" w:color="auto" w:sz="4"/>
-          <w:right w:val="single" w:color="auto" w:sz="4"/>
-          <w:insideH w:val="single" w:color="auto" w:sz="4"/>
-          <w:insideV w:val="single" w:color="auto" w:sz="4"/>
+          <w:top w:val="none" w:color="FFFFFF" w:sz="0"/>
+          <w:left w:val="none" w:color="FFFFFF" w:sz="0"/>
+          <w:bottom w:val="none" w:color="FFFFFF" w:sz="0"/>
+          <w:right w:val="none" w:color="FFFFFF" w:sz="0"/>
+          <w:insideH w:val="none" w:color="FFFFFF" w:sz="0"/>
+          <w:insideV w:val="none" w:color="FFFFFF" w:sz="0"/>
         </w:tblBorders>
       </w:tblPr>
       <w:tblGrid>
         <w:gridCol w:w="9648"/>
       </w:tblGrid>
       <w:tr>
-        <w:trPr>
-          <w:trHeight w:val="2400" w:hRule="atLeast"/>
-        </w:trPr>
         <w:tc>
           <w:tcPr>
             <w:tcW w:type="dxa" w:w="9648"/>
             <w:tcBorders>
-              <w:top w:val="dashed" w:color="8A94A6" w:sz="8"/>
-              <w:left w:val="dashed" w:color="8A94A6" w:sz="8"/>
-              <w:bottom w:val="dashed" w:color="8A94A6" w:sz="8"/>
-              <w:right w:val="dashed" w:color="8A94A6" w:sz="8"/>
+              <w:top w:val="none" w:color="FFFFFF" w:sz="0"/>
+              <w:left w:val="none" w:color="FFFFFF" w:sz="0"/>
+              <w:bottom w:val="none" w:color="FFFFFF" w:sz="0"/>
+              <w:right w:val="none" w:color="FFFFFF" w:sz="0"/>
             </w:tcBorders>
-            <w:shd w:fill="F7F8FA" w:color="auto" w:val="clear"/>
-            <w:vAlign w:val="center"/>
-          </w:tcPr>
-          <w:p>
-            <w:pPr>
-              <w:spacing w:after="60"/>
+            <w:tcMar>
+              <w:top w:type="dxa" w:w="0"/>
+              <w:left w:type="dxa" w:w="0"/>
+              <w:bottom w:type="dxa" w:w="0"/>
+              <w:right w:type="dxa" w:w="0"/>
+            </w:tcMar>
+            <w:vAlign w:val="center"/>
+          </w:tcPr>
+          <w:p>
+            <w:pPr>
+              <w:spacing w:after="40"/>
               <w:jc w:val="center"/>
             </w:pPr>
             <w:r>
-              <w:rPr>
-                <w:rFonts w:ascii="Calibri" w:cs="Calibri" w:eastAsia="Calibri" w:hAnsi="Calibri"/>
-                <w:b/>
-                <w:bCs/>
-                <w:color w:val="8A94A6"/>
-                <w:sz w:val="18"/>
-                <w:szCs w:val="18"/>
-              </w:rPr>
-              <w:t xml:space="preserve">IMAGE À INSÉRER</w:t>
+              <w:drawing>
+                <wp:inline distT="0" distB="0" distL="0" distR="0">
+                  <wp:extent cx="3552825" cy="2667000"/>
+                  <wp:effectExtent t="0" r="0" b="0" l="0"/>
+                  <wp:docPr id="1" name="" descr="" title=""/>
+                  <wp:cNvGraphicFramePr>
+                    <a:graphicFrameLocks xmlns:a="http://schemas.openxmlformats.org/drawingml/2006/main" noChangeAspect="1"/>
+                  </wp:cNvGraphicFramePr>
+                  <a:graphic xmlns:a="http://schemas.openxmlformats.org/drawingml/2006/main">
+                    <a:graphicData uri="http://schemas.openxmlformats.org/drawingml/2006/picture">
+                      <pic:pic xmlns:pic="http://schemas.openxmlformats.org/drawingml/2006/picture">
+                        <pic:nvPicPr>
+                          <pic:cNvPr id="0" name="" descr=""/>
+                          <pic:cNvPicPr>
+                            <a:picLocks noChangeAspect="1" noChangeArrowheads="1"/>
+                          </pic:cNvPicPr>
+                        </pic:nvPicPr>
+                        <pic:blipFill>
+                          <a:blip r:embed="rId16" cstate="none"/>
+                          <a:srcRect/>
+                          <a:stretch>
+                            <a:fillRect/>
+                          </a:stretch>
+                        </pic:blipFill>
+                        <pic:spPr bwMode="auto">
+                          <a:xfrm>
+                            <a:off x="0" y="0"/>
+                            <a:ext cx="3552825" cy="2667000"/>
+                          </a:xfrm>
+                          <a:prstGeom prst="rect">
+                            <a:avLst/>
+                          </a:prstGeom>
+                        </pic:spPr>
+                      </pic:pic>
+                    </a:graphicData>
+                  </a:graphic>
+                </wp:inline>
+              </w:drawing>
             </w:r>
           </w:p>
           <w:p>
@@ -12563,10 +12790,10 @@
                 <w:i/>
                 <w:iCs/>
                 <w:color w:val="8A94A6"/>
-                <w:sz w:val="19"/>
-                <w:szCs w:val="19"/>
-              </w:rPr>
-              <w:t xml:space="preserve">Exemples de matériel promotionnel : visuels de campagne, affiche du festival cubain, capture du site web</w:t>
+                <w:sz w:val="17"/>
+                <w:szCs w:val="17"/>
+              </w:rPr>
+              <w:t xml:space="preserve">Soirée de spectacle sur la scène extérieure, devant le café Cubano</w:t>
             </w:r>
           </w:p>
         </w:tc>
@@ -14400,48 +14627,79 @@
       <w:tblPr>
         <w:tblW w:type="dxa" w:w="9648"/>
         <w:tblBorders>
-          <w:top w:val="single" w:color="auto" w:sz="4"/>
-          <w:left w:val="single" w:color="auto" w:sz="4"/>
-          <w:bottom w:val="single" w:color="auto" w:sz="4"/>
-          <w:right w:val="single" w:color="auto" w:sz="4"/>
-          <w:insideH w:val="single" w:color="auto" w:sz="4"/>
-          <w:insideV w:val="single" w:color="auto" w:sz="4"/>
+          <w:top w:val="none" w:color="FFFFFF" w:sz="0"/>
+          <w:left w:val="none" w:color="FFFFFF" w:sz="0"/>
+          <w:bottom w:val="none" w:color="FFFFFF" w:sz="0"/>
+          <w:right w:val="none" w:color="FFFFFF" w:sz="0"/>
+          <w:insideH w:val="none" w:color="FFFFFF" w:sz="0"/>
+          <w:insideV w:val="none" w:color="FFFFFF" w:sz="0"/>
         </w:tblBorders>
       </w:tblPr>
       <w:tblGrid>
         <w:gridCol w:w="9648"/>
       </w:tblGrid>
       <w:tr>
-        <w:trPr>
-          <w:trHeight w:val="2600" w:hRule="atLeast"/>
-        </w:trPr>
         <w:tc>
           <w:tcPr>
             <w:tcW w:type="dxa" w:w="9648"/>
             <w:tcBorders>
-              <w:top w:val="dashed" w:color="8A94A6" w:sz="8"/>
-              <w:left w:val="dashed" w:color="8A94A6" w:sz="8"/>
-              <w:bottom w:val="dashed" w:color="8A94A6" w:sz="8"/>
-              <w:right w:val="dashed" w:color="8A94A6" w:sz="8"/>
+              <w:top w:val="none" w:color="FFFFFF" w:sz="0"/>
+              <w:left w:val="none" w:color="FFFFFF" w:sz="0"/>
+              <w:bottom w:val="none" w:color="FFFFFF" w:sz="0"/>
+              <w:right w:val="none" w:color="FFFFFF" w:sz="0"/>
             </w:tcBorders>
-            <w:shd w:fill="F7F8FA" w:color="auto" w:val="clear"/>
-            <w:vAlign w:val="center"/>
-          </w:tcPr>
-          <w:p>
-            <w:pPr>
-              <w:spacing w:after="60"/>
+            <w:tcMar>
+              <w:top w:type="dxa" w:w="0"/>
+              <w:left w:type="dxa" w:w="0"/>
+              <w:bottom w:type="dxa" w:w="0"/>
+              <w:right w:type="dxa" w:w="0"/>
+            </w:tcMar>
+            <w:vAlign w:val="center"/>
+          </w:tcPr>
+          <w:p>
+            <w:pPr>
+              <w:spacing w:after="40"/>
               <w:jc w:val="center"/>
             </w:pPr>
             <w:r>
-              <w:rPr>
-                <w:rFonts w:ascii="Calibri" w:cs="Calibri" w:eastAsia="Calibri" w:hAnsi="Calibri"/>
-                <w:b/>
-                <w:bCs/>
-                <w:color w:val="8A94A6"/>
-                <w:sz w:val="18"/>
-                <w:szCs w:val="18"/>
-              </w:rPr>
-              <w:t xml:space="preserve">IMAGE À INSÉRER</w:t>
+              <w:drawing>
+                <wp:inline distT="0" distB="0" distL="0" distR="0">
+                  <wp:extent cx="3028950" cy="1647825"/>
+                  <wp:effectExtent t="0" r="0" b="0" l="0"/>
+                  <wp:docPr id="1" name="" descr="" title=""/>
+                  <wp:cNvGraphicFramePr>
+                    <a:graphicFrameLocks xmlns:a="http://schemas.openxmlformats.org/drawingml/2006/main" noChangeAspect="1"/>
+                  </wp:cNvGraphicFramePr>
+                  <a:graphic xmlns:a="http://schemas.openxmlformats.org/drawingml/2006/main">
+                    <a:graphicData uri="http://schemas.openxmlformats.org/drawingml/2006/picture">
+                      <pic:pic xmlns:pic="http://schemas.openxmlformats.org/drawingml/2006/picture">
+                        <pic:nvPicPr>
+                          <pic:cNvPr id="0" name="" descr=""/>
+                          <pic:cNvPicPr>
+                            <a:picLocks noChangeAspect="1" noChangeArrowheads="1"/>
+                          </pic:cNvPicPr>
+                        </pic:nvPicPr>
+                        <pic:blipFill>
+                          <a:blip r:embed="rId17" cstate="none"/>
+                          <a:srcRect/>
+                          <a:stretch>
+                            <a:fillRect/>
+                          </a:stretch>
+                        </pic:blipFill>
+                        <pic:spPr bwMode="auto">
+                          <a:xfrm>
+                            <a:off x="0" y="0"/>
+                            <a:ext cx="3028950" cy="1647825"/>
+                          </a:xfrm>
+                          <a:prstGeom prst="rect">
+                            <a:avLst/>
+                          </a:prstGeom>
+                        </pic:spPr>
+                      </pic:pic>
+                    </a:graphicData>
+                  </a:graphic>
+                </wp:inline>
+              </w:drawing>
             </w:r>
           </w:p>
           <w:p>
@@ -14455,10 +14713,10 @@
                 <w:i/>
                 <w:iCs/>
                 <w:color w:val="8A94A6"/>
-                <w:sz w:val="19"/>
-                <w:szCs w:val="19"/>
-              </w:rPr>
-              <w:t xml:space="preserve">Organigramme de l'entreprise (direction générale, cinq services, responsables)</w:t>
+                <w:sz w:val="17"/>
+                <w:szCs w:val="17"/>
+              </w:rPr>
+              <w:t xml:space="preserve">L'équipe du Complexe Havana lors d'un événement Apzara [identifier les membres de la direction]</w:t>
             </w:r>
           </w:p>
         </w:tc>
@@ -17218,7 +17476,7 @@
                     </pic:cNvPicPr>
                   </pic:nvPicPr>
                   <pic:blipFill>
-                    <a:blip r:embed="rId10" cstate="none"/>
+                    <a:blip r:embed="rId18" cstate="none"/>
                     <a:srcRect/>
                     <a:stretch>
                       <a:fillRect/>
@@ -17984,7 +18242,7 @@
                     </pic:cNvPicPr>
                   </pic:nvPicPr>
                   <pic:blipFill>
-                    <a:blip r:embed="rId11" cstate="none"/>
+                    <a:blip r:embed="rId19" cstate="none"/>
                     <a:srcRect/>
                     <a:stretch>
                       <a:fillRect/>
@@ -24615,7 +24873,7 @@
                     </pic:cNvPicPr>
                   </pic:nvPicPr>
                   <pic:blipFill>
-                    <a:blip r:embed="rId12" cstate="none"/>
+                    <a:blip r:embed="rId20" cstate="none"/>
                     <a:srcRect/>
                     <a:stretch>
                       <a:fillRect/>
@@ -27157,7 +27415,7 @@
                     </pic:cNvPicPr>
                   </pic:nvPicPr>
                   <pic:blipFill>
-                    <a:blip r:embed="rId13" cstate="none"/>
+                    <a:blip r:embed="rId21" cstate="none"/>
                     <a:srcRect/>
                     <a:stretch>
                       <a:fillRect/>
@@ -31523,48 +31781,84 @@
       <w:tblPr>
         <w:tblW w:type="dxa" w:w="9648"/>
         <w:tblBorders>
-          <w:top w:val="single" w:color="auto" w:sz="4"/>
-          <w:left w:val="single" w:color="auto" w:sz="4"/>
-          <w:bottom w:val="single" w:color="auto" w:sz="4"/>
-          <w:right w:val="single" w:color="auto" w:sz="4"/>
-          <w:insideH w:val="single" w:color="auto" w:sz="4"/>
-          <w:insideV w:val="single" w:color="auto" w:sz="4"/>
+          <w:top w:val="none" w:color="FFFFFF" w:sz="0"/>
+          <w:left w:val="none" w:color="FFFFFF" w:sz="0"/>
+          <w:bottom w:val="none" w:color="FFFFFF" w:sz="0"/>
+          <w:right w:val="none" w:color="FFFFFF" w:sz="0"/>
+          <w:insideH w:val="none" w:color="FFFFFF" w:sz="0"/>
+          <w:insideV w:val="none" w:color="FFFFFF" w:sz="0"/>
         </w:tblBorders>
       </w:tblPr>
       <w:tblGrid>
-        <w:gridCol w:w="9648"/>
+        <w:gridCol w:w="4724"/>
+        <w:gridCol w:w="200"/>
+        <w:gridCol w:w="4724"/>
       </w:tblGrid>
       <w:tr>
         <w:trPr>
-          <w:trHeight w:val="3600" w:hRule="atLeast"/>
+          <w:cantSplit/>
         </w:trPr>
         <w:tc>
           <w:tcPr>
-            <w:tcW w:type="dxa" w:w="9648"/>
+            <w:tcW w:type="dxa" w:w="4724"/>
             <w:tcBorders>
-              <w:top w:val="dashed" w:color="8A94A6" w:sz="8"/>
-              <w:left w:val="dashed" w:color="8A94A6" w:sz="8"/>
-              <w:bottom w:val="dashed" w:color="8A94A6" w:sz="8"/>
-              <w:right w:val="dashed" w:color="8A94A6" w:sz="8"/>
+              <w:top w:val="none" w:color="FFFFFF" w:sz="0"/>
+              <w:left w:val="none" w:color="FFFFFF" w:sz="0"/>
+              <w:bottom w:val="none" w:color="FFFFFF" w:sz="0"/>
+              <w:right w:val="none" w:color="FFFFFF" w:sz="0"/>
             </w:tcBorders>
-            <w:shd w:fill="F7F8FA" w:color="auto" w:val="clear"/>
-            <w:vAlign w:val="center"/>
-          </w:tcPr>
-          <w:p>
-            <w:pPr>
-              <w:spacing w:after="60"/>
+            <w:tcMar>
+              <w:top w:type="dxa" w:w="0"/>
+              <w:left w:type="dxa" w:w="0"/>
+              <w:bottom w:type="dxa" w:w="0"/>
+              <w:right w:type="dxa" w:w="0"/>
+            </w:tcMar>
+            <w:vAlign w:val="center"/>
+          </w:tcPr>
+          <w:p>
+            <w:pPr>
+              <w:spacing w:after="40"/>
               <w:jc w:val="center"/>
             </w:pPr>
             <w:r>
-              <w:rPr>
-                <w:rFonts w:ascii="Calibri" w:cs="Calibri" w:eastAsia="Calibri" w:hAnsi="Calibri"/>
-                <w:b/>
-                <w:bCs/>
-                <w:color w:val="8A94A6"/>
-                <w:sz w:val="18"/>
-                <w:szCs w:val="18"/>
-              </w:rPr>
-              <w:t xml:space="preserve">IMAGE À INSÉRER</w:t>
+              <w:drawing>
+                <wp:inline distT="0" distB="0" distL="0" distR="0">
+                  <wp:extent cx="3000375" cy="2143125"/>
+                  <wp:effectExtent t="0" r="0" b="0" l="0"/>
+                  <wp:docPr id="1" name="" descr="" title=""/>
+                  <wp:cNvGraphicFramePr>
+                    <a:graphicFrameLocks xmlns:a="http://schemas.openxmlformats.org/drawingml/2006/main" noChangeAspect="1"/>
+                  </wp:cNvGraphicFramePr>
+                  <a:graphic xmlns:a="http://schemas.openxmlformats.org/drawingml/2006/main">
+                    <a:graphicData uri="http://schemas.openxmlformats.org/drawingml/2006/picture">
+                      <pic:pic xmlns:pic="http://schemas.openxmlformats.org/drawingml/2006/picture">
+                        <pic:nvPicPr>
+                          <pic:cNvPr id="0" name="" descr=""/>
+                          <pic:cNvPicPr>
+                            <a:picLocks noChangeAspect="1" noChangeArrowheads="1"/>
+                          </pic:cNvPicPr>
+                        </pic:nvPicPr>
+                        <pic:blipFill>
+                          <a:blip r:embed="rId9" cstate="none"/>
+                          <a:srcRect/>
+                          <a:stretch>
+                            <a:fillRect/>
+                          </a:stretch>
+                        </pic:blipFill>
+                        <pic:spPr bwMode="auto">
+                          <a:xfrm>
+                            <a:off x="0" y="0"/>
+                            <a:ext cx="3000375" cy="2143125"/>
+                          </a:xfrm>
+                          <a:prstGeom prst="rect">
+                            <a:avLst/>
+                          </a:prstGeom>
+                        </pic:spPr>
+                      </pic:pic>
+                    </a:graphicData>
+                  </a:graphic>
+                </wp:inline>
+              </w:drawing>
             </w:r>
           </w:p>
           <w:p>
@@ -31578,10 +31872,1089 @@
                 <w:i/>
                 <w:iCs/>
                 <w:color w:val="8A94A6"/>
-                <w:sz w:val="19"/>
-                <w:szCs w:val="19"/>
-              </w:rPr>
-              <w:t xml:space="preserve">Annexe F – Galerie photos : hébergements, piscine, animation, restauration, vues du site en quatre saisons</w:t>
+                <w:sz w:val="17"/>
+                <w:szCs w:val="17"/>
+              </w:rPr>
+              <w:t xml:space="preserve">La piscine centrale vue du ciel, un jour d'été</w:t>
+            </w:r>
+          </w:p>
+        </w:tc>
+        <w:tc>
+          <w:tcPr>
+            <w:tcW w:type="dxa" w:w="200"/>
+            <w:tcBorders>
+              <w:top w:val="none" w:color="FFFFFF" w:sz="0"/>
+              <w:left w:val="none" w:color="FFFFFF" w:sz="0"/>
+              <w:bottom w:val="none" w:color="FFFFFF" w:sz="0"/>
+              <w:right w:val="none" w:color="FFFFFF" w:sz="0"/>
+            </w:tcBorders>
+          </w:tcPr>
+          <w:p>
+            <w:r>
+              <w:t xml:space="preserve"/>
+            </w:r>
+          </w:p>
+        </w:tc>
+        <w:tc>
+          <w:tcPr>
+            <w:tcW w:type="dxa" w:w="4724"/>
+            <w:tcBorders>
+              <w:top w:val="none" w:color="FFFFFF" w:sz="0"/>
+              <w:left w:val="none" w:color="FFFFFF" w:sz="0"/>
+              <w:bottom w:val="none" w:color="FFFFFF" w:sz="0"/>
+              <w:right w:val="none" w:color="FFFFFF" w:sz="0"/>
+            </w:tcBorders>
+            <w:tcMar>
+              <w:top w:type="dxa" w:w="0"/>
+              <w:left w:type="dxa" w:w="0"/>
+              <w:bottom w:type="dxa" w:w="0"/>
+              <w:right w:type="dxa" w:w="0"/>
+            </w:tcMar>
+            <w:vAlign w:val="center"/>
+          </w:tcPr>
+          <w:p>
+            <w:pPr>
+              <w:spacing w:after="40"/>
+              <w:jc w:val="center"/>
+            </w:pPr>
+            <w:r>
+              <w:drawing>
+                <wp:inline distT="0" distB="0" distL="0" distR="0">
+                  <wp:extent cx="3000375" cy="2190750"/>
+                  <wp:effectExtent t="0" r="0" b="0" l="0"/>
+                  <wp:docPr id="1" name="" descr="" title=""/>
+                  <wp:cNvGraphicFramePr>
+                    <a:graphicFrameLocks xmlns:a="http://schemas.openxmlformats.org/drawingml/2006/main" noChangeAspect="1"/>
+                  </wp:cNvGraphicFramePr>
+                  <a:graphic xmlns:a="http://schemas.openxmlformats.org/drawingml/2006/main">
+                    <a:graphicData uri="http://schemas.openxmlformats.org/drawingml/2006/picture">
+                      <pic:pic xmlns:pic="http://schemas.openxmlformats.org/drawingml/2006/picture">
+                        <pic:nvPicPr>
+                          <pic:cNvPr id="0" name="" descr=""/>
+                          <pic:cNvPicPr>
+                            <a:picLocks noChangeAspect="1" noChangeArrowheads="1"/>
+                          </pic:cNvPicPr>
+                        </pic:nvPicPr>
+                        <pic:blipFill>
+                          <a:blip r:embed="rId11" cstate="none"/>
+                          <a:srcRect/>
+                          <a:stretch>
+                            <a:fillRect/>
+                          </a:stretch>
+                        </pic:blipFill>
+                        <pic:spPr bwMode="auto">
+                          <a:xfrm>
+                            <a:off x="0" y="0"/>
+                            <a:ext cx="3000375" cy="2190750"/>
+                          </a:xfrm>
+                          <a:prstGeom prst="rect">
+                            <a:avLst/>
+                          </a:prstGeom>
+                        </pic:spPr>
+                      </pic:pic>
+                    </a:graphicData>
+                  </a:graphic>
+                </wp:inline>
+              </w:drawing>
+            </w:r>
+          </w:p>
+          <w:p>
+            <w:pPr>
+              <w:spacing w:after="0"/>
+              <w:jc w:val="center"/>
+            </w:pPr>
+            <w:r>
+              <w:rPr>
+                <w:rFonts w:ascii="Calibri" w:cs="Calibri" w:eastAsia="Calibri" w:hAnsi="Calibri"/>
+                <w:i/>
+                <w:iCs/>
+                <w:color w:val="8A94A6"/>
+                <w:sz w:val="17"/>
+                <w:szCs w:val="17"/>
+              </w:rPr>
+              <w:t xml:space="preserve">La piscine centrale, fête de la mousse</w:t>
+            </w:r>
+          </w:p>
+        </w:tc>
+      </w:tr>
+      <w:tr>
+        <w:trPr>
+          <w:trHeight w:val="160" w:hRule="exact"/>
+        </w:trPr>
+        <w:tc>
+          <w:tcPr>
+            <w:tcW w:type="dxa" w:w="9648"/>
+            <w:gridSpan w:val="3"/>
+            <w:tcBorders>
+              <w:top w:val="none" w:color="FFFFFF" w:sz="0"/>
+              <w:left w:val="none" w:color="FFFFFF" w:sz="0"/>
+              <w:bottom w:val="none" w:color="FFFFFF" w:sz="0"/>
+              <w:right w:val="none" w:color="FFFFFF" w:sz="0"/>
+            </w:tcBorders>
+          </w:tcPr>
+          <w:p>
+            <w:r>
+              <w:t xml:space="preserve"/>
+            </w:r>
+          </w:p>
+        </w:tc>
+      </w:tr>
+      <w:tr>
+        <w:trPr>
+          <w:cantSplit/>
+        </w:trPr>
+        <w:tc>
+          <w:tcPr>
+            <w:tcW w:type="dxa" w:w="4724"/>
+            <w:tcBorders>
+              <w:top w:val="none" w:color="FFFFFF" w:sz="0"/>
+              <w:left w:val="none" w:color="FFFFFF" w:sz="0"/>
+              <w:bottom w:val="none" w:color="FFFFFF" w:sz="0"/>
+              <w:right w:val="none" w:color="FFFFFF" w:sz="0"/>
+            </w:tcBorders>
+            <w:tcMar>
+              <w:top w:type="dxa" w:w="0"/>
+              <w:left w:type="dxa" w:w="0"/>
+              <w:bottom w:type="dxa" w:w="0"/>
+              <w:right w:type="dxa" w:w="0"/>
+            </w:tcMar>
+            <w:vAlign w:val="center"/>
+          </w:tcPr>
+          <w:p>
+            <w:pPr>
+              <w:spacing w:after="40"/>
+              <w:jc w:val="center"/>
+            </w:pPr>
+            <w:r>
+              <w:drawing>
+                <wp:inline distT="0" distB="0" distL="0" distR="0">
+                  <wp:extent cx="3000375" cy="1809750"/>
+                  <wp:effectExtent t="0" r="0" b="0" l="0"/>
+                  <wp:docPr id="1" name="" descr="" title=""/>
+                  <wp:cNvGraphicFramePr>
+                    <a:graphicFrameLocks xmlns:a="http://schemas.openxmlformats.org/drawingml/2006/main" noChangeAspect="1"/>
+                  </wp:cNvGraphicFramePr>
+                  <a:graphic xmlns:a="http://schemas.openxmlformats.org/drawingml/2006/main">
+                    <a:graphicData uri="http://schemas.openxmlformats.org/drawingml/2006/picture">
+                      <pic:pic xmlns:pic="http://schemas.openxmlformats.org/drawingml/2006/picture">
+                        <pic:nvPicPr>
+                          <pic:cNvPr id="0" name="" descr=""/>
+                          <pic:cNvPicPr>
+                            <a:picLocks noChangeAspect="1" noChangeArrowheads="1"/>
+                          </pic:cNvPicPr>
+                        </pic:nvPicPr>
+                        <pic:blipFill>
+                          <a:blip r:embed="rId13" cstate="none"/>
+                          <a:srcRect/>
+                          <a:stretch>
+                            <a:fillRect/>
+                          </a:stretch>
+                        </pic:blipFill>
+                        <pic:spPr bwMode="auto">
+                          <a:xfrm>
+                            <a:off x="0" y="0"/>
+                            <a:ext cx="3000375" cy="1809750"/>
+                          </a:xfrm>
+                          <a:prstGeom prst="rect">
+                            <a:avLst/>
+                          </a:prstGeom>
+                        </pic:spPr>
+                      </pic:pic>
+                    </a:graphicData>
+                  </a:graphic>
+                </wp:inline>
+              </w:drawing>
+            </w:r>
+          </w:p>
+          <w:p>
+            <w:pPr>
+              <w:spacing w:after="0"/>
+              <w:jc w:val="center"/>
+            </w:pPr>
+            <w:r>
+              <w:rPr>
+                <w:rFonts w:ascii="Calibri" w:cs="Calibri" w:eastAsia="Calibri" w:hAnsi="Calibri"/>
+                <w:i/>
+                <w:iCs/>
+                <w:color w:val="8A94A6"/>
+                <w:sz w:val="17"/>
+                <w:szCs w:val="17"/>
+              </w:rPr>
+              <w:t xml:space="preserve">Les chalets aux couleurs cubaines</w:t>
+            </w:r>
+          </w:p>
+        </w:tc>
+        <w:tc>
+          <w:tcPr>
+            <w:tcW w:type="dxa" w:w="200"/>
+            <w:tcBorders>
+              <w:top w:val="none" w:color="FFFFFF" w:sz="0"/>
+              <w:left w:val="none" w:color="FFFFFF" w:sz="0"/>
+              <w:bottom w:val="none" w:color="FFFFFF" w:sz="0"/>
+              <w:right w:val="none" w:color="FFFFFF" w:sz="0"/>
+            </w:tcBorders>
+          </w:tcPr>
+          <w:p>
+            <w:r>
+              <w:t xml:space="preserve"/>
+            </w:r>
+          </w:p>
+        </w:tc>
+        <w:tc>
+          <w:tcPr>
+            <w:tcW w:type="dxa" w:w="4724"/>
+            <w:tcBorders>
+              <w:top w:val="none" w:color="FFFFFF" w:sz="0"/>
+              <w:left w:val="none" w:color="FFFFFF" w:sz="0"/>
+              <w:bottom w:val="none" w:color="FFFFFF" w:sz="0"/>
+              <w:right w:val="none" w:color="FFFFFF" w:sz="0"/>
+            </w:tcBorders>
+            <w:tcMar>
+              <w:top w:type="dxa" w:w="0"/>
+              <w:left w:type="dxa" w:w="0"/>
+              <w:bottom w:type="dxa" w:w="0"/>
+              <w:right w:type="dxa" w:w="0"/>
+            </w:tcMar>
+            <w:vAlign w:val="center"/>
+          </w:tcPr>
+          <w:p>
+            <w:pPr>
+              <w:spacing w:after="40"/>
+              <w:jc w:val="center"/>
+            </w:pPr>
+            <w:r>
+              <w:drawing>
+                <wp:inline distT="0" distB="0" distL="0" distR="0">
+                  <wp:extent cx="2286000" cy="2286000"/>
+                  <wp:effectExtent t="0" r="0" b="0" l="0"/>
+                  <wp:docPr id="1" name="" descr="" title=""/>
+                  <wp:cNvGraphicFramePr>
+                    <a:graphicFrameLocks xmlns:a="http://schemas.openxmlformats.org/drawingml/2006/main" noChangeAspect="1"/>
+                  </wp:cNvGraphicFramePr>
+                  <a:graphic xmlns:a="http://schemas.openxmlformats.org/drawingml/2006/main">
+                    <a:graphicData uri="http://schemas.openxmlformats.org/drawingml/2006/picture">
+                      <pic:pic xmlns:pic="http://schemas.openxmlformats.org/drawingml/2006/picture">
+                        <pic:nvPicPr>
+                          <pic:cNvPr id="0" name="" descr=""/>
+                          <pic:cNvPicPr>
+                            <a:picLocks noChangeAspect="1" noChangeArrowheads="1"/>
+                          </pic:cNvPicPr>
+                        </pic:nvPicPr>
+                        <pic:blipFill>
+                          <a:blip r:embed="rId22" cstate="none"/>
+                          <a:srcRect/>
+                          <a:stretch>
+                            <a:fillRect/>
+                          </a:stretch>
+                        </pic:blipFill>
+                        <pic:spPr bwMode="auto">
+                          <a:xfrm>
+                            <a:off x="0" y="0"/>
+                            <a:ext cx="2286000" cy="2286000"/>
+                          </a:xfrm>
+                          <a:prstGeom prst="rect">
+                            <a:avLst/>
+                          </a:prstGeom>
+                        </pic:spPr>
+                      </pic:pic>
+                    </a:graphicData>
+                  </a:graphic>
+                </wp:inline>
+              </w:drawing>
+            </w:r>
+          </w:p>
+          <w:p>
+            <w:pPr>
+              <w:spacing w:after="0"/>
+              <w:jc w:val="center"/>
+            </w:pPr>
+            <w:r>
+              <w:rPr>
+                <w:rFonts w:ascii="Calibri" w:cs="Calibri" w:eastAsia="Calibri" w:hAnsi="Calibri"/>
+                <w:i/>
+                <w:iCs/>
+                <w:color w:val="8A94A6"/>
+                <w:sz w:val="17"/>
+                <w:szCs w:val="17"/>
+              </w:rPr>
+              <w:t xml:space="preserve">Une famille d'invités sur la chaise géante « I ♥ Havana Resort »</w:t>
+            </w:r>
+          </w:p>
+        </w:tc>
+      </w:tr>
+      <w:tr>
+        <w:trPr>
+          <w:trHeight w:val="160" w:hRule="exact"/>
+        </w:trPr>
+        <w:tc>
+          <w:tcPr>
+            <w:tcW w:type="dxa" w:w="9648"/>
+            <w:gridSpan w:val="3"/>
+            <w:tcBorders>
+              <w:top w:val="none" w:color="FFFFFF" w:sz="0"/>
+              <w:left w:val="none" w:color="FFFFFF" w:sz="0"/>
+              <w:bottom w:val="none" w:color="FFFFFF" w:sz="0"/>
+              <w:right w:val="none" w:color="FFFFFF" w:sz="0"/>
+            </w:tcBorders>
+          </w:tcPr>
+          <w:p>
+            <w:r>
+              <w:t xml:space="preserve"/>
+            </w:r>
+          </w:p>
+        </w:tc>
+      </w:tr>
+      <w:tr>
+        <w:trPr>
+          <w:cantSplit/>
+        </w:trPr>
+        <w:tc>
+          <w:tcPr>
+            <w:tcW w:type="dxa" w:w="4724"/>
+            <w:tcBorders>
+              <w:top w:val="none" w:color="FFFFFF" w:sz="0"/>
+              <w:left w:val="none" w:color="FFFFFF" w:sz="0"/>
+              <w:bottom w:val="none" w:color="FFFFFF" w:sz="0"/>
+              <w:right w:val="none" w:color="FFFFFF" w:sz="0"/>
+            </w:tcBorders>
+            <w:tcMar>
+              <w:top w:type="dxa" w:w="0"/>
+              <w:left w:type="dxa" w:w="0"/>
+              <w:bottom w:type="dxa" w:w="0"/>
+              <w:right w:type="dxa" w:w="0"/>
+            </w:tcMar>
+            <w:vAlign w:val="center"/>
+          </w:tcPr>
+          <w:p>
+            <w:pPr>
+              <w:spacing w:after="40"/>
+              <w:jc w:val="center"/>
+            </w:pPr>
+            <w:r>
+              <w:drawing>
+                <wp:inline distT="0" distB="0" distL="0" distR="0">
+                  <wp:extent cx="3000375" cy="1343025"/>
+                  <wp:effectExtent t="0" r="0" b="0" l="0"/>
+                  <wp:docPr id="1" name="" descr="" title=""/>
+                  <wp:cNvGraphicFramePr>
+                    <a:graphicFrameLocks xmlns:a="http://schemas.openxmlformats.org/drawingml/2006/main" noChangeAspect="1"/>
+                  </wp:cNvGraphicFramePr>
+                  <a:graphic xmlns:a="http://schemas.openxmlformats.org/drawingml/2006/main">
+                    <a:graphicData uri="http://schemas.openxmlformats.org/drawingml/2006/picture">
+                      <pic:pic xmlns:pic="http://schemas.openxmlformats.org/drawingml/2006/picture">
+                        <pic:nvPicPr>
+                          <pic:cNvPr id="0" name="" descr=""/>
+                          <pic:cNvPicPr>
+                            <a:picLocks noChangeAspect="1" noChangeArrowheads="1"/>
+                          </pic:cNvPicPr>
+                        </pic:nvPicPr>
+                        <pic:blipFill>
+                          <a:blip r:embed="rId23" cstate="none"/>
+                          <a:srcRect/>
+                          <a:stretch>
+                            <a:fillRect/>
+                          </a:stretch>
+                        </pic:blipFill>
+                        <pic:spPr bwMode="auto">
+                          <a:xfrm>
+                            <a:off x="0" y="0"/>
+                            <a:ext cx="3000375" cy="1343025"/>
+                          </a:xfrm>
+                          <a:prstGeom prst="rect">
+                            <a:avLst/>
+                          </a:prstGeom>
+                        </pic:spPr>
+                      </pic:pic>
+                    </a:graphicData>
+                  </a:graphic>
+                </wp:inline>
+              </w:drawing>
+            </w:r>
+          </w:p>
+          <w:p>
+            <w:pPr>
+              <w:spacing w:after="0"/>
+              <w:jc w:val="center"/>
+            </w:pPr>
+            <w:r>
+              <w:rPr>
+                <w:rFonts w:ascii="Calibri" w:cs="Calibri" w:eastAsia="Calibri" w:hAnsi="Calibri"/>
+                <w:i/>
+                <w:iCs/>
+                <w:color w:val="8A94A6"/>
+                <w:sz w:val="17"/>
+                <w:szCs w:val="17"/>
+              </w:rPr>
+              <w:t xml:space="preserve">Les Coolbox, mini-maisons en conteneur</w:t>
+            </w:r>
+          </w:p>
+        </w:tc>
+        <w:tc>
+          <w:tcPr>
+            <w:tcW w:type="dxa" w:w="200"/>
+            <w:tcBorders>
+              <w:top w:val="none" w:color="FFFFFF" w:sz="0"/>
+              <w:left w:val="none" w:color="FFFFFF" w:sz="0"/>
+              <w:bottom w:val="none" w:color="FFFFFF" w:sz="0"/>
+              <w:right w:val="none" w:color="FFFFFF" w:sz="0"/>
+            </w:tcBorders>
+          </w:tcPr>
+          <w:p>
+            <w:r>
+              <w:t xml:space="preserve"/>
+            </w:r>
+          </w:p>
+        </w:tc>
+        <w:tc>
+          <w:tcPr>
+            <w:tcW w:type="dxa" w:w="4724"/>
+            <w:tcBorders>
+              <w:top w:val="none" w:color="FFFFFF" w:sz="0"/>
+              <w:left w:val="none" w:color="FFFFFF" w:sz="0"/>
+              <w:bottom w:val="none" w:color="FFFFFF" w:sz="0"/>
+              <w:right w:val="none" w:color="FFFFFF" w:sz="0"/>
+            </w:tcBorders>
+            <w:tcMar>
+              <w:top w:type="dxa" w:w="0"/>
+              <w:left w:type="dxa" w:w="0"/>
+              <w:bottom w:type="dxa" w:w="0"/>
+              <w:right w:type="dxa" w:w="0"/>
+            </w:tcMar>
+            <w:vAlign w:val="center"/>
+          </w:tcPr>
+          <w:p>
+            <w:pPr>
+              <w:spacing w:after="40"/>
+              <w:jc w:val="center"/>
+            </w:pPr>
+            <w:r>
+              <w:drawing>
+                <wp:inline distT="0" distB="0" distL="0" distR="0">
+                  <wp:extent cx="3000375" cy="1809750"/>
+                  <wp:effectExtent t="0" r="0" b="0" l="0"/>
+                  <wp:docPr id="1" name="" descr="" title=""/>
+                  <wp:cNvGraphicFramePr>
+                    <a:graphicFrameLocks xmlns:a="http://schemas.openxmlformats.org/drawingml/2006/main" noChangeAspect="1"/>
+                  </wp:cNvGraphicFramePr>
+                  <a:graphic xmlns:a="http://schemas.openxmlformats.org/drawingml/2006/main">
+                    <a:graphicData uri="http://schemas.openxmlformats.org/drawingml/2006/picture">
+                      <pic:pic xmlns:pic="http://schemas.openxmlformats.org/drawingml/2006/picture">
+                        <pic:nvPicPr>
+                          <pic:cNvPr id="0" name="" descr=""/>
+                          <pic:cNvPicPr>
+                            <a:picLocks noChangeAspect="1" noChangeArrowheads="1"/>
+                          </pic:cNvPicPr>
+                        </pic:nvPicPr>
+                        <pic:blipFill>
+                          <a:blip r:embed="rId10" cstate="none"/>
+                          <a:srcRect/>
+                          <a:stretch>
+                            <a:fillRect/>
+                          </a:stretch>
+                        </pic:blipFill>
+                        <pic:spPr bwMode="auto">
+                          <a:xfrm>
+                            <a:off x="0" y="0"/>
+                            <a:ext cx="3000375" cy="1809750"/>
+                          </a:xfrm>
+                          <a:prstGeom prst="rect">
+                            <a:avLst/>
+                          </a:prstGeom>
+                        </pic:spPr>
+                      </pic:pic>
+                    </a:graphicData>
+                  </a:graphic>
+                </wp:inline>
+              </w:drawing>
+            </w:r>
+          </w:p>
+          <w:p>
+            <w:pPr>
+              <w:spacing w:after="0"/>
+              <w:jc w:val="center"/>
+            </w:pPr>
+            <w:r>
+              <w:rPr>
+                <w:rFonts w:ascii="Calibri" w:cs="Calibri" w:eastAsia="Calibri" w:hAnsi="Calibri"/>
+                <w:i/>
+                <w:iCs/>
+                <w:color w:val="8A94A6"/>
+                <w:sz w:val="17"/>
+                <w:szCs w:val="17"/>
+              </w:rPr>
+              <w:t xml:space="preserve">Le pavillon d'accueil au toit de chaume</w:t>
+            </w:r>
+          </w:p>
+        </w:tc>
+      </w:tr>
+      <w:tr>
+        <w:trPr>
+          <w:trHeight w:val="160" w:hRule="exact"/>
+        </w:trPr>
+        <w:tc>
+          <w:tcPr>
+            <w:tcW w:type="dxa" w:w="9648"/>
+            <w:gridSpan w:val="3"/>
+            <w:tcBorders>
+              <w:top w:val="none" w:color="FFFFFF" w:sz="0"/>
+              <w:left w:val="none" w:color="FFFFFF" w:sz="0"/>
+              <w:bottom w:val="none" w:color="FFFFFF" w:sz="0"/>
+              <w:right w:val="none" w:color="FFFFFF" w:sz="0"/>
+            </w:tcBorders>
+          </w:tcPr>
+          <w:p>
+            <w:r>
+              <w:t xml:space="preserve"/>
+            </w:r>
+          </w:p>
+        </w:tc>
+      </w:tr>
+      <w:tr>
+        <w:trPr>
+          <w:cantSplit/>
+        </w:trPr>
+        <w:tc>
+          <w:tcPr>
+            <w:tcW w:type="dxa" w:w="4724"/>
+            <w:tcBorders>
+              <w:top w:val="none" w:color="FFFFFF" w:sz="0"/>
+              <w:left w:val="none" w:color="FFFFFF" w:sz="0"/>
+              <w:bottom w:val="none" w:color="FFFFFF" w:sz="0"/>
+              <w:right w:val="none" w:color="FFFFFF" w:sz="0"/>
+            </w:tcBorders>
+            <w:tcMar>
+              <w:top w:type="dxa" w:w="0"/>
+              <w:left w:type="dxa" w:w="0"/>
+              <w:bottom w:type="dxa" w:w="0"/>
+              <w:right w:type="dxa" w:w="0"/>
+            </w:tcMar>
+            <w:vAlign w:val="center"/>
+          </w:tcPr>
+          <w:p>
+            <w:pPr>
+              <w:spacing w:after="40"/>
+              <w:jc w:val="center"/>
+            </w:pPr>
+            <w:r>
+              <w:drawing>
+                <wp:inline distT="0" distB="0" distL="0" distR="0">
+                  <wp:extent cx="3000375" cy="2247900"/>
+                  <wp:effectExtent t="0" r="0" b="0" l="0"/>
+                  <wp:docPr id="1" name="" descr="" title=""/>
+                  <wp:cNvGraphicFramePr>
+                    <a:graphicFrameLocks xmlns:a="http://schemas.openxmlformats.org/drawingml/2006/main" noChangeAspect="1"/>
+                  </wp:cNvGraphicFramePr>
+                  <a:graphic xmlns:a="http://schemas.openxmlformats.org/drawingml/2006/main">
+                    <a:graphicData uri="http://schemas.openxmlformats.org/drawingml/2006/picture">
+                      <pic:pic xmlns:pic="http://schemas.openxmlformats.org/drawingml/2006/picture">
+                        <pic:nvPicPr>
+                          <pic:cNvPr id="0" name="" descr=""/>
+                          <pic:cNvPicPr>
+                            <a:picLocks noChangeAspect="1" noChangeArrowheads="1"/>
+                          </pic:cNvPicPr>
+                        </pic:nvPicPr>
+                        <pic:blipFill>
+                          <a:blip r:embed="rId16" cstate="none"/>
+                          <a:srcRect/>
+                          <a:stretch>
+                            <a:fillRect/>
+                          </a:stretch>
+                        </pic:blipFill>
+                        <pic:spPr bwMode="auto">
+                          <a:xfrm>
+                            <a:off x="0" y="0"/>
+                            <a:ext cx="3000375" cy="2247900"/>
+                          </a:xfrm>
+                          <a:prstGeom prst="rect">
+                            <a:avLst/>
+                          </a:prstGeom>
+                        </pic:spPr>
+                      </pic:pic>
+                    </a:graphicData>
+                  </a:graphic>
+                </wp:inline>
+              </w:drawing>
+            </w:r>
+          </w:p>
+          <w:p>
+            <w:pPr>
+              <w:spacing w:after="0"/>
+              <w:jc w:val="center"/>
+            </w:pPr>
+            <w:r>
+              <w:rPr>
+                <w:rFonts w:ascii="Calibri" w:cs="Calibri" w:eastAsia="Calibri" w:hAnsi="Calibri"/>
+                <w:i/>
+                <w:iCs/>
+                <w:color w:val="8A94A6"/>
+                <w:sz w:val="17"/>
+                <w:szCs w:val="17"/>
+              </w:rPr>
+              <w:t xml:space="preserve">Spectacle en soirée sur la scène extérieure</w:t>
+            </w:r>
+          </w:p>
+        </w:tc>
+        <w:tc>
+          <w:tcPr>
+            <w:tcW w:type="dxa" w:w="200"/>
+            <w:tcBorders>
+              <w:top w:val="none" w:color="FFFFFF" w:sz="0"/>
+              <w:left w:val="none" w:color="FFFFFF" w:sz="0"/>
+              <w:bottom w:val="none" w:color="FFFFFF" w:sz="0"/>
+              <w:right w:val="none" w:color="FFFFFF" w:sz="0"/>
+            </w:tcBorders>
+          </w:tcPr>
+          <w:p>
+            <w:r>
+              <w:t xml:space="preserve"/>
+            </w:r>
+          </w:p>
+        </w:tc>
+        <w:tc>
+          <w:tcPr>
+            <w:tcW w:type="dxa" w:w="4724"/>
+            <w:tcBorders>
+              <w:top w:val="none" w:color="FFFFFF" w:sz="0"/>
+              <w:left w:val="none" w:color="FFFFFF" w:sz="0"/>
+              <w:bottom w:val="none" w:color="FFFFFF" w:sz="0"/>
+              <w:right w:val="none" w:color="FFFFFF" w:sz="0"/>
+            </w:tcBorders>
+            <w:tcMar>
+              <w:top w:type="dxa" w:w="0"/>
+              <w:left w:type="dxa" w:w="0"/>
+              <w:bottom w:type="dxa" w:w="0"/>
+              <w:right w:type="dxa" w:w="0"/>
+            </w:tcMar>
+            <w:vAlign w:val="center"/>
+          </w:tcPr>
+          <w:p>
+            <w:pPr>
+              <w:spacing w:after="40"/>
+              <w:jc w:val="center"/>
+            </w:pPr>
+            <w:r>
+              <w:drawing>
+                <wp:inline distT="0" distB="0" distL="0" distR="0">
+                  <wp:extent cx="3000375" cy="2247900"/>
+                  <wp:effectExtent t="0" r="0" b="0" l="0"/>
+                  <wp:docPr id="1" name="" descr="" title=""/>
+                  <wp:cNvGraphicFramePr>
+                    <a:graphicFrameLocks xmlns:a="http://schemas.openxmlformats.org/drawingml/2006/main" noChangeAspect="1"/>
+                  </wp:cNvGraphicFramePr>
+                  <a:graphic xmlns:a="http://schemas.openxmlformats.org/drawingml/2006/main">
+                    <a:graphicData uri="http://schemas.openxmlformats.org/drawingml/2006/picture">
+                      <pic:pic xmlns:pic="http://schemas.openxmlformats.org/drawingml/2006/picture">
+                        <pic:nvPicPr>
+                          <pic:cNvPr id="0" name="" descr=""/>
+                          <pic:cNvPicPr>
+                            <a:picLocks noChangeAspect="1" noChangeArrowheads="1"/>
+                          </pic:cNvPicPr>
+                        </pic:nvPicPr>
+                        <pic:blipFill>
+                          <a:blip r:embed="rId24" cstate="none"/>
+                          <a:srcRect/>
+                          <a:stretch>
+                            <a:fillRect/>
+                          </a:stretch>
+                        </pic:blipFill>
+                        <pic:spPr bwMode="auto">
+                          <a:xfrm>
+                            <a:off x="0" y="0"/>
+                            <a:ext cx="3000375" cy="2247900"/>
+                          </a:xfrm>
+                          <a:prstGeom prst="rect">
+                            <a:avLst/>
+                          </a:prstGeom>
+                        </pic:spPr>
+                      </pic:pic>
+                    </a:graphicData>
+                  </a:graphic>
+                </wp:inline>
+              </w:drawing>
+            </w:r>
+          </w:p>
+          <w:p>
+            <w:pPr>
+              <w:spacing w:after="0"/>
+              <w:jc w:val="center"/>
+            </w:pPr>
+            <w:r>
+              <w:rPr>
+                <w:rFonts w:ascii="Calibri" w:cs="Calibri" w:eastAsia="Calibri" w:hAnsi="Calibri"/>
+                <w:i/>
+                <w:iCs/>
+                <w:color w:val="8A94A6"/>
+                <w:sz w:val="17"/>
+                <w:szCs w:val="17"/>
+              </w:rPr>
+              <w:t xml:space="preserve">Les kiosques de restauration et les concessions</w:t>
+            </w:r>
+          </w:p>
+        </w:tc>
+      </w:tr>
+      <w:tr>
+        <w:trPr>
+          <w:trHeight w:val="160" w:hRule="exact"/>
+        </w:trPr>
+        <w:tc>
+          <w:tcPr>
+            <w:tcW w:type="dxa" w:w="9648"/>
+            <w:gridSpan w:val="3"/>
+            <w:tcBorders>
+              <w:top w:val="none" w:color="FFFFFF" w:sz="0"/>
+              <w:left w:val="none" w:color="FFFFFF" w:sz="0"/>
+              <w:bottom w:val="none" w:color="FFFFFF" w:sz="0"/>
+              <w:right w:val="none" w:color="FFFFFF" w:sz="0"/>
+            </w:tcBorders>
+          </w:tcPr>
+          <w:p>
+            <w:r>
+              <w:t xml:space="preserve"/>
+            </w:r>
+          </w:p>
+        </w:tc>
+      </w:tr>
+      <w:tr>
+        <w:trPr>
+          <w:cantSplit/>
+        </w:trPr>
+        <w:tc>
+          <w:tcPr>
+            <w:tcW w:type="dxa" w:w="4724"/>
+            <w:tcBorders>
+              <w:top w:val="none" w:color="FFFFFF" w:sz="0"/>
+              <w:left w:val="none" w:color="FFFFFF" w:sz="0"/>
+              <w:bottom w:val="none" w:color="FFFFFF" w:sz="0"/>
+              <w:right w:val="none" w:color="FFFFFF" w:sz="0"/>
+            </w:tcBorders>
+            <w:tcMar>
+              <w:top w:type="dxa" w:w="0"/>
+              <w:left w:type="dxa" w:w="0"/>
+              <w:bottom w:type="dxa" w:w="0"/>
+              <w:right w:type="dxa" w:w="0"/>
+            </w:tcMar>
+            <w:vAlign w:val="center"/>
+          </w:tcPr>
+          <w:p>
+            <w:pPr>
+              <w:spacing w:after="40"/>
+              <w:jc w:val="center"/>
+            </w:pPr>
+            <w:r>
+              <w:drawing>
+                <wp:inline distT="0" distB="0" distL="0" distR="0">
+                  <wp:extent cx="2295525" cy="2286000"/>
+                  <wp:effectExtent t="0" r="0" b="0" l="0"/>
+                  <wp:docPr id="1" name="" descr="" title=""/>
+                  <wp:cNvGraphicFramePr>
+                    <a:graphicFrameLocks xmlns:a="http://schemas.openxmlformats.org/drawingml/2006/main" noChangeAspect="1"/>
+                  </wp:cNvGraphicFramePr>
+                  <a:graphic xmlns:a="http://schemas.openxmlformats.org/drawingml/2006/main">
+                    <a:graphicData uri="http://schemas.openxmlformats.org/drawingml/2006/picture">
+                      <pic:pic xmlns:pic="http://schemas.openxmlformats.org/drawingml/2006/picture">
+                        <pic:nvPicPr>
+                          <pic:cNvPr id="0" name="" descr=""/>
+                          <pic:cNvPicPr>
+                            <a:picLocks noChangeAspect="1" noChangeArrowheads="1"/>
+                          </pic:cNvPicPr>
+                        </pic:nvPicPr>
+                        <pic:blipFill>
+                          <a:blip r:embed="rId25" cstate="none"/>
+                          <a:srcRect/>
+                          <a:stretch>
+                            <a:fillRect/>
+                          </a:stretch>
+                        </pic:blipFill>
+                        <pic:spPr bwMode="auto">
+                          <a:xfrm>
+                            <a:off x="0" y="0"/>
+                            <a:ext cx="2295525" cy="2286000"/>
+                          </a:xfrm>
+                          <a:prstGeom prst="rect">
+                            <a:avLst/>
+                          </a:prstGeom>
+                        </pic:spPr>
+                      </pic:pic>
+                    </a:graphicData>
+                  </a:graphic>
+                </wp:inline>
+              </w:drawing>
+            </w:r>
+          </w:p>
+          <w:p>
+            <w:pPr>
+              <w:spacing w:after="0"/>
+              <w:jc w:val="center"/>
+            </w:pPr>
+            <w:r>
+              <w:rPr>
+                <w:rFonts w:ascii="Calibri" w:cs="Calibri" w:eastAsia="Calibri" w:hAnsi="Calibri"/>
+                <w:i/>
+                <w:iCs/>
+                <w:color w:val="8A94A6"/>
+                <w:sz w:val="17"/>
+                <w:szCs w:val="17"/>
+              </w:rPr>
+              <w:t xml:space="preserve">Le train du resort et les guirlandes lumineuses, en soirée</w:t>
+            </w:r>
+          </w:p>
+        </w:tc>
+        <w:tc>
+          <w:tcPr>
+            <w:tcW w:type="dxa" w:w="200"/>
+            <w:tcBorders>
+              <w:top w:val="none" w:color="FFFFFF" w:sz="0"/>
+              <w:left w:val="none" w:color="FFFFFF" w:sz="0"/>
+              <w:bottom w:val="none" w:color="FFFFFF" w:sz="0"/>
+              <w:right w:val="none" w:color="FFFFFF" w:sz="0"/>
+            </w:tcBorders>
+          </w:tcPr>
+          <w:p>
+            <w:r>
+              <w:t xml:space="preserve"/>
+            </w:r>
+          </w:p>
+        </w:tc>
+        <w:tc>
+          <w:tcPr>
+            <w:tcW w:type="dxa" w:w="4724"/>
+            <w:tcBorders>
+              <w:top w:val="none" w:color="FFFFFF" w:sz="0"/>
+              <w:left w:val="none" w:color="FFFFFF" w:sz="0"/>
+              <w:bottom w:val="none" w:color="FFFFFF" w:sz="0"/>
+              <w:right w:val="none" w:color="FFFFFF" w:sz="0"/>
+            </w:tcBorders>
+            <w:tcMar>
+              <w:top w:type="dxa" w:w="0"/>
+              <w:left w:type="dxa" w:w="0"/>
+              <w:bottom w:type="dxa" w:w="0"/>
+              <w:right w:type="dxa" w:w="0"/>
+            </w:tcMar>
+            <w:vAlign w:val="center"/>
+          </w:tcPr>
+          <w:p>
+            <w:pPr>
+              <w:spacing w:after="40"/>
+              <w:jc w:val="center"/>
+            </w:pPr>
+            <w:r>
+              <w:drawing>
+                <wp:inline distT="0" distB="0" distL="0" distR="0">
+                  <wp:extent cx="3000375" cy="2247900"/>
+                  <wp:effectExtent t="0" r="0" b="0" l="0"/>
+                  <wp:docPr id="1" name="" descr="" title=""/>
+                  <wp:cNvGraphicFramePr>
+                    <a:graphicFrameLocks xmlns:a="http://schemas.openxmlformats.org/drawingml/2006/main" noChangeAspect="1"/>
+                  </wp:cNvGraphicFramePr>
+                  <a:graphic xmlns:a="http://schemas.openxmlformats.org/drawingml/2006/main">
+                    <a:graphicData uri="http://schemas.openxmlformats.org/drawingml/2006/picture">
+                      <pic:pic xmlns:pic="http://schemas.openxmlformats.org/drawingml/2006/picture">
+                        <pic:nvPicPr>
+                          <pic:cNvPr id="0" name="" descr=""/>
+                          <pic:cNvPicPr>
+                            <a:picLocks noChangeAspect="1" noChangeArrowheads="1"/>
+                          </pic:cNvPicPr>
+                        </pic:nvPicPr>
+                        <pic:blipFill>
+                          <a:blip r:embed="rId12" cstate="none"/>
+                          <a:srcRect/>
+                          <a:stretch>
+                            <a:fillRect/>
+                          </a:stretch>
+                        </pic:blipFill>
+                        <pic:spPr bwMode="auto">
+                          <a:xfrm>
+                            <a:off x="0" y="0"/>
+                            <a:ext cx="3000375" cy="2247900"/>
+                          </a:xfrm>
+                          <a:prstGeom prst="rect">
+                            <a:avLst/>
+                          </a:prstGeom>
+                        </pic:spPr>
+                      </pic:pic>
+                    </a:graphicData>
+                  </a:graphic>
+                </wp:inline>
+              </w:drawing>
+            </w:r>
+          </w:p>
+          <w:p>
+            <w:pPr>
+              <w:spacing w:after="0"/>
+              <w:jc w:val="center"/>
+            </w:pPr>
+            <w:r>
+              <w:rPr>
+                <w:rFonts w:ascii="Calibri" w:cs="Calibri" w:eastAsia="Calibri" w:hAnsi="Calibri"/>
+                <w:i/>
+                <w:iCs/>
+                <w:color w:val="8A94A6"/>
+                <w:sz w:val="17"/>
+                <w:szCs w:val="17"/>
+              </w:rPr>
+              <w:t xml:space="preserve">L'entrée de l'hôtel</w:t>
+            </w:r>
+          </w:p>
+        </w:tc>
+      </w:tr>
+      <w:tr>
+        <w:trPr>
+          <w:trHeight w:val="160" w:hRule="exact"/>
+        </w:trPr>
+        <w:tc>
+          <w:tcPr>
+            <w:tcW w:type="dxa" w:w="9648"/>
+            <w:gridSpan w:val="3"/>
+            <w:tcBorders>
+              <w:top w:val="none" w:color="FFFFFF" w:sz="0"/>
+              <w:left w:val="none" w:color="FFFFFF" w:sz="0"/>
+              <w:bottom w:val="none" w:color="FFFFFF" w:sz="0"/>
+              <w:right w:val="none" w:color="FFFFFF" w:sz="0"/>
+            </w:tcBorders>
+          </w:tcPr>
+          <w:p>
+            <w:r>
+              <w:t xml:space="preserve"/>
+            </w:r>
+          </w:p>
+        </w:tc>
+      </w:tr>
+      <w:tr>
+        <w:trPr>
+          <w:cantSplit/>
+        </w:trPr>
+        <w:tc>
+          <w:tcPr>
+            <w:tcW w:type="dxa" w:w="4724"/>
+            <w:tcBorders>
+              <w:top w:val="none" w:color="FFFFFF" w:sz="0"/>
+              <w:left w:val="none" w:color="FFFFFF" w:sz="0"/>
+              <w:bottom w:val="none" w:color="FFFFFF" w:sz="0"/>
+              <w:right w:val="none" w:color="FFFFFF" w:sz="0"/>
+            </w:tcBorders>
+            <w:tcMar>
+              <w:top w:type="dxa" w:w="0"/>
+              <w:left w:type="dxa" w:w="0"/>
+              <w:bottom w:type="dxa" w:w="0"/>
+              <w:right w:type="dxa" w:w="0"/>
+            </w:tcMar>
+            <w:vAlign w:val="center"/>
+          </w:tcPr>
+          <w:p>
+            <w:pPr>
+              <w:spacing w:after="40"/>
+              <w:jc w:val="center"/>
+            </w:pPr>
+            <w:r>
+              <w:drawing>
+                <wp:inline distT="0" distB="0" distL="0" distR="0">
+                  <wp:extent cx="3000375" cy="1685925"/>
+                  <wp:effectExtent t="0" r="0" b="0" l="0"/>
+                  <wp:docPr id="1" name="" descr="" title=""/>
+                  <wp:cNvGraphicFramePr>
+                    <a:graphicFrameLocks xmlns:a="http://schemas.openxmlformats.org/drawingml/2006/main" noChangeAspect="1"/>
+                  </wp:cNvGraphicFramePr>
+                  <a:graphic xmlns:a="http://schemas.openxmlformats.org/drawingml/2006/main">
+                    <a:graphicData uri="http://schemas.openxmlformats.org/drawingml/2006/picture">
+                      <pic:pic xmlns:pic="http://schemas.openxmlformats.org/drawingml/2006/picture">
+                        <pic:nvPicPr>
+                          <pic:cNvPr id="0" name="" descr=""/>
+                          <pic:cNvPicPr>
+                            <a:picLocks noChangeAspect="1" noChangeArrowheads="1"/>
+                          </pic:cNvPicPr>
+                        </pic:nvPicPr>
+                        <pic:blipFill>
+                          <a:blip r:embed="rId26" cstate="none"/>
+                          <a:srcRect/>
+                          <a:stretch>
+                            <a:fillRect/>
+                          </a:stretch>
+                        </pic:blipFill>
+                        <pic:spPr bwMode="auto">
+                          <a:xfrm>
+                            <a:off x="0" y="0"/>
+                            <a:ext cx="3000375" cy="1685925"/>
+                          </a:xfrm>
+                          <a:prstGeom prst="rect">
+                            <a:avLst/>
+                          </a:prstGeom>
+                        </pic:spPr>
+                      </pic:pic>
+                    </a:graphicData>
+                  </a:graphic>
+                </wp:inline>
+              </w:drawing>
+            </w:r>
+          </w:p>
+          <w:p>
+            <w:pPr>
+              <w:spacing w:after="0"/>
+              <w:jc w:val="center"/>
+            </w:pPr>
+            <w:r>
+              <w:rPr>
+                <w:rFonts w:ascii="Calibri" w:cs="Calibri" w:eastAsia="Calibri" w:hAnsi="Calibri"/>
+                <w:i/>
+                <w:iCs/>
+                <w:color w:val="8A94A6"/>
+                <w:sz w:val="17"/>
+                <w:szCs w:val="17"/>
+              </w:rPr>
+              <w:t xml:space="preserve">L'hôtel vu de l'arrière, côté condos</w:t>
+            </w:r>
+          </w:p>
+        </w:tc>
+        <w:tc>
+          <w:tcPr>
+            <w:tcW w:type="dxa" w:w="200"/>
+            <w:tcBorders>
+              <w:top w:val="none" w:color="FFFFFF" w:sz="0"/>
+              <w:left w:val="none" w:color="FFFFFF" w:sz="0"/>
+              <w:bottom w:val="none" w:color="FFFFFF" w:sz="0"/>
+              <w:right w:val="none" w:color="FFFFFF" w:sz="0"/>
+            </w:tcBorders>
+          </w:tcPr>
+          <w:p>
+            <w:r>
+              <w:t xml:space="preserve"/>
+            </w:r>
+          </w:p>
+        </w:tc>
+        <w:tc>
+          <w:tcPr>
+            <w:tcW w:type="dxa" w:w="4724"/>
+            <w:tcBorders>
+              <w:top w:val="none" w:color="FFFFFF" w:sz="0"/>
+              <w:left w:val="none" w:color="FFFFFF" w:sz="0"/>
+              <w:bottom w:val="none" w:color="FFFFFF" w:sz="0"/>
+              <w:right w:val="none" w:color="FFFFFF" w:sz="0"/>
+            </w:tcBorders>
+          </w:tcPr>
+          <w:p>
+            <w:r>
+              <w:t xml:space="preserve"/>
+            </w:r>
+          </w:p>
+        </w:tc>
+      </w:tr>
+      <w:tr>
+        <w:trPr>
+          <w:trHeight w:val="160" w:hRule="exact"/>
+        </w:trPr>
+        <w:tc>
+          <w:tcPr>
+            <w:tcW w:type="dxa" w:w="9648"/>
+            <w:gridSpan w:val="3"/>
+            <w:tcBorders>
+              <w:top w:val="none" w:color="FFFFFF" w:sz="0"/>
+              <w:left w:val="none" w:color="FFFFFF" w:sz="0"/>
+              <w:bottom w:val="none" w:color="FFFFFF" w:sz="0"/>
+              <w:right w:val="none" w:color="FFFFFF" w:sz="0"/>
+            </w:tcBorders>
+          </w:tcPr>
+          <w:p>
+            <w:r>
+              <w:t xml:space="preserve"/>
             </w:r>
           </w:p>
         </w:tc>

</xml_diff>

<commit_message>
Ajouter la photo de la piscine et de la plage à la galerie
Co-Authored-By: Claude Fable 5.1 <noreply@anthropic.com>
Claude-Session: https://claude.ai/code/session_01SZvZuYXZ3BuNTXPMcsdahV
</commit_message>
<xml_diff>
--- a/plan-affaires/Plan_affaires_Complexe_Havana.docx
+++ b/plan-affaires/Plan_affaires_Complexe_Havana.docx
@@ -31920,6 +31920,114 @@
             <w:r>
               <w:drawing>
                 <wp:inline distT="0" distB="0" distL="0" distR="0">
+                  <wp:extent cx="2286000" cy="2286000"/>
+                  <wp:effectExtent t="0" r="0" b="0" l="0"/>
+                  <wp:docPr id="1" name="" descr="" title=""/>
+                  <wp:cNvGraphicFramePr>
+                    <a:graphicFrameLocks xmlns:a="http://schemas.openxmlformats.org/drawingml/2006/main" noChangeAspect="1"/>
+                  </wp:cNvGraphicFramePr>
+                  <a:graphic xmlns:a="http://schemas.openxmlformats.org/drawingml/2006/main">
+                    <a:graphicData uri="http://schemas.openxmlformats.org/drawingml/2006/picture">
+                      <pic:pic xmlns:pic="http://schemas.openxmlformats.org/drawingml/2006/picture">
+                        <pic:nvPicPr>
+                          <pic:cNvPr id="0" name="" descr=""/>
+                          <pic:cNvPicPr>
+                            <a:picLocks noChangeAspect="1" noChangeArrowheads="1"/>
+                          </pic:cNvPicPr>
+                        </pic:nvPicPr>
+                        <pic:blipFill>
+                          <a:blip r:embed="rId22" cstate="none"/>
+                          <a:srcRect/>
+                          <a:stretch>
+                            <a:fillRect/>
+                          </a:stretch>
+                        </pic:blipFill>
+                        <pic:spPr bwMode="auto">
+                          <a:xfrm>
+                            <a:off x="0" y="0"/>
+                            <a:ext cx="2286000" cy="2286000"/>
+                          </a:xfrm>
+                          <a:prstGeom prst="rect">
+                            <a:avLst/>
+                          </a:prstGeom>
+                        </pic:spPr>
+                      </pic:pic>
+                    </a:graphicData>
+                  </a:graphic>
+                </wp:inline>
+              </w:drawing>
+            </w:r>
+          </w:p>
+          <w:p>
+            <w:pPr>
+              <w:spacing w:after="0"/>
+              <w:jc w:val="center"/>
+            </w:pPr>
+            <w:r>
+              <w:rPr>
+                <w:rFonts w:ascii="Calibri" w:cs="Calibri" w:eastAsia="Calibri" w:hAnsi="Calibri"/>
+                <w:i/>
+                <w:iCs/>
+                <w:color w:val="8A94A6"/>
+                <w:sz w:val="17"/>
+                <w:szCs w:val="17"/>
+              </w:rPr>
+              <w:t xml:space="preserve">La piscine, la plage de sable et les palapas</w:t>
+            </w:r>
+          </w:p>
+        </w:tc>
+      </w:tr>
+      <w:tr>
+        <w:trPr>
+          <w:trHeight w:val="160" w:hRule="exact"/>
+        </w:trPr>
+        <w:tc>
+          <w:tcPr>
+            <w:tcW w:type="dxa" w:w="9648"/>
+            <w:gridSpan w:val="3"/>
+            <w:tcBorders>
+              <w:top w:val="none" w:color="FFFFFF" w:sz="0"/>
+              <w:left w:val="none" w:color="FFFFFF" w:sz="0"/>
+              <w:bottom w:val="none" w:color="FFFFFF" w:sz="0"/>
+              <w:right w:val="none" w:color="FFFFFF" w:sz="0"/>
+            </w:tcBorders>
+          </w:tcPr>
+          <w:p>
+            <w:r>
+              <w:t xml:space="preserve"/>
+            </w:r>
+          </w:p>
+        </w:tc>
+      </w:tr>
+      <w:tr>
+        <w:trPr>
+          <w:cantSplit/>
+        </w:trPr>
+        <w:tc>
+          <w:tcPr>
+            <w:tcW w:type="dxa" w:w="4724"/>
+            <w:tcBorders>
+              <w:top w:val="none" w:color="FFFFFF" w:sz="0"/>
+              <w:left w:val="none" w:color="FFFFFF" w:sz="0"/>
+              <w:bottom w:val="none" w:color="FFFFFF" w:sz="0"/>
+              <w:right w:val="none" w:color="FFFFFF" w:sz="0"/>
+            </w:tcBorders>
+            <w:tcMar>
+              <w:top w:type="dxa" w:w="0"/>
+              <w:left w:type="dxa" w:w="0"/>
+              <w:bottom w:type="dxa" w:w="0"/>
+              <w:right w:type="dxa" w:w="0"/>
+            </w:tcMar>
+            <w:vAlign w:val="center"/>
+          </w:tcPr>
+          <w:p>
+            <w:pPr>
+              <w:spacing w:after="40"/>
+              <w:jc w:val="center"/>
+            </w:pPr>
+            <w:r>
+              <w:drawing>
+                <wp:inline distT="0" distB="0" distL="0" distR="0">
                   <wp:extent cx="3000375" cy="2190750"/>
                   <wp:effectExtent t="0" r="0" b="0" l="0"/>
                   <wp:docPr id="1" name="" descr="" title=""/>
@@ -31976,15 +32084,9 @@
             </w:r>
           </w:p>
         </w:tc>
-      </w:tr>
-      <w:tr>
-        <w:trPr>
-          <w:trHeight w:val="160" w:hRule="exact"/>
-        </w:trPr>
-        <w:tc>
-          <w:tcPr>
-            <w:tcW w:type="dxa" w:w="9648"/>
-            <w:gridSpan w:val="3"/>
+        <w:tc>
+          <w:tcPr>
+            <w:tcW w:type="dxa" w:w="200"/>
             <w:tcBorders>
               <w:top w:val="none" w:color="FFFFFF" w:sz="0"/>
               <w:left w:val="none" w:color="FFFFFF" w:sz="0"/>
@@ -31998,11 +32100,6 @@
             </w:r>
           </w:p>
         </w:tc>
-      </w:tr>
-      <w:tr>
-        <w:trPr>
-          <w:cantSplit/>
-        </w:trPr>
         <w:tc>
           <w:tcPr>
             <w:tcW w:type="dxa" w:w="4724"/>
@@ -32084,103 +32181,6 @@
             </w:r>
           </w:p>
         </w:tc>
-        <w:tc>
-          <w:tcPr>
-            <w:tcW w:type="dxa" w:w="200"/>
-            <w:tcBorders>
-              <w:top w:val="none" w:color="FFFFFF" w:sz="0"/>
-              <w:left w:val="none" w:color="FFFFFF" w:sz="0"/>
-              <w:bottom w:val="none" w:color="FFFFFF" w:sz="0"/>
-              <w:right w:val="none" w:color="FFFFFF" w:sz="0"/>
-            </w:tcBorders>
-          </w:tcPr>
-          <w:p>
-            <w:r>
-              <w:t xml:space="preserve"/>
-            </w:r>
-          </w:p>
-        </w:tc>
-        <w:tc>
-          <w:tcPr>
-            <w:tcW w:type="dxa" w:w="4724"/>
-            <w:tcBorders>
-              <w:top w:val="none" w:color="FFFFFF" w:sz="0"/>
-              <w:left w:val="none" w:color="FFFFFF" w:sz="0"/>
-              <w:bottom w:val="none" w:color="FFFFFF" w:sz="0"/>
-              <w:right w:val="none" w:color="FFFFFF" w:sz="0"/>
-            </w:tcBorders>
-            <w:tcMar>
-              <w:top w:type="dxa" w:w="0"/>
-              <w:left w:type="dxa" w:w="0"/>
-              <w:bottom w:type="dxa" w:w="0"/>
-              <w:right w:type="dxa" w:w="0"/>
-            </w:tcMar>
-            <w:vAlign w:val="center"/>
-          </w:tcPr>
-          <w:p>
-            <w:pPr>
-              <w:spacing w:after="40"/>
-              <w:jc w:val="center"/>
-            </w:pPr>
-            <w:r>
-              <w:drawing>
-                <wp:inline distT="0" distB="0" distL="0" distR="0">
-                  <wp:extent cx="2286000" cy="2286000"/>
-                  <wp:effectExtent t="0" r="0" b="0" l="0"/>
-                  <wp:docPr id="1" name="" descr="" title=""/>
-                  <wp:cNvGraphicFramePr>
-                    <a:graphicFrameLocks xmlns:a="http://schemas.openxmlformats.org/drawingml/2006/main" noChangeAspect="1"/>
-                  </wp:cNvGraphicFramePr>
-                  <a:graphic xmlns:a="http://schemas.openxmlformats.org/drawingml/2006/main">
-                    <a:graphicData uri="http://schemas.openxmlformats.org/drawingml/2006/picture">
-                      <pic:pic xmlns:pic="http://schemas.openxmlformats.org/drawingml/2006/picture">
-                        <pic:nvPicPr>
-                          <pic:cNvPr id="0" name="" descr=""/>
-                          <pic:cNvPicPr>
-                            <a:picLocks noChangeAspect="1" noChangeArrowheads="1"/>
-                          </pic:cNvPicPr>
-                        </pic:nvPicPr>
-                        <pic:blipFill>
-                          <a:blip r:embed="rId22" cstate="none"/>
-                          <a:srcRect/>
-                          <a:stretch>
-                            <a:fillRect/>
-                          </a:stretch>
-                        </pic:blipFill>
-                        <pic:spPr bwMode="auto">
-                          <a:xfrm>
-                            <a:off x="0" y="0"/>
-                            <a:ext cx="2286000" cy="2286000"/>
-                          </a:xfrm>
-                          <a:prstGeom prst="rect">
-                            <a:avLst/>
-                          </a:prstGeom>
-                        </pic:spPr>
-                      </pic:pic>
-                    </a:graphicData>
-                  </a:graphic>
-                </wp:inline>
-              </w:drawing>
-            </w:r>
-          </w:p>
-          <w:p>
-            <w:pPr>
-              <w:spacing w:after="0"/>
-              <w:jc w:val="center"/>
-            </w:pPr>
-            <w:r>
-              <w:rPr>
-                <w:rFonts w:ascii="Calibri" w:cs="Calibri" w:eastAsia="Calibri" w:hAnsi="Calibri"/>
-                <w:i/>
-                <w:iCs/>
-                <w:color w:val="8A94A6"/>
-                <w:sz w:val="17"/>
-                <w:szCs w:val="17"/>
-              </w:rPr>
-              <w:t xml:space="preserve">Une famille d'invités sur la chaise géante « I ♥ Havana Resort »</w:t>
-            </w:r>
-          </w:p>
-        </w:tc>
       </w:tr>
       <w:tr>
         <w:trPr>
@@ -32233,7 +32233,7 @@
             <w:r>
               <w:drawing>
                 <wp:inline distT="0" distB="0" distL="0" distR="0">
-                  <wp:extent cx="3000375" cy="1343025"/>
+                  <wp:extent cx="2286000" cy="2286000"/>
                   <wp:effectExtent t="0" r="0" b="0" l="0"/>
                   <wp:docPr id="1" name="" descr="" title=""/>
                   <wp:cNvGraphicFramePr>
@@ -32258,6 +32258,103 @@
                         <pic:spPr bwMode="auto">
                           <a:xfrm>
                             <a:off x="0" y="0"/>
+                            <a:ext cx="2286000" cy="2286000"/>
+                          </a:xfrm>
+                          <a:prstGeom prst="rect">
+                            <a:avLst/>
+                          </a:prstGeom>
+                        </pic:spPr>
+                      </pic:pic>
+                    </a:graphicData>
+                  </a:graphic>
+                </wp:inline>
+              </w:drawing>
+            </w:r>
+          </w:p>
+          <w:p>
+            <w:pPr>
+              <w:spacing w:after="0"/>
+              <w:jc w:val="center"/>
+            </w:pPr>
+            <w:r>
+              <w:rPr>
+                <w:rFonts w:ascii="Calibri" w:cs="Calibri" w:eastAsia="Calibri" w:hAnsi="Calibri"/>
+                <w:i/>
+                <w:iCs/>
+                <w:color w:val="8A94A6"/>
+                <w:sz w:val="17"/>
+                <w:szCs w:val="17"/>
+              </w:rPr>
+              <w:t xml:space="preserve">Une famille d'invités sur la chaise géante « I ♥ Havana Resort »</w:t>
+            </w:r>
+          </w:p>
+        </w:tc>
+        <w:tc>
+          <w:tcPr>
+            <w:tcW w:type="dxa" w:w="200"/>
+            <w:tcBorders>
+              <w:top w:val="none" w:color="FFFFFF" w:sz="0"/>
+              <w:left w:val="none" w:color="FFFFFF" w:sz="0"/>
+              <w:bottom w:val="none" w:color="FFFFFF" w:sz="0"/>
+              <w:right w:val="none" w:color="FFFFFF" w:sz="0"/>
+            </w:tcBorders>
+          </w:tcPr>
+          <w:p>
+            <w:r>
+              <w:t xml:space="preserve"/>
+            </w:r>
+          </w:p>
+        </w:tc>
+        <w:tc>
+          <w:tcPr>
+            <w:tcW w:type="dxa" w:w="4724"/>
+            <w:tcBorders>
+              <w:top w:val="none" w:color="FFFFFF" w:sz="0"/>
+              <w:left w:val="none" w:color="FFFFFF" w:sz="0"/>
+              <w:bottom w:val="none" w:color="FFFFFF" w:sz="0"/>
+              <w:right w:val="none" w:color="FFFFFF" w:sz="0"/>
+            </w:tcBorders>
+            <w:tcMar>
+              <w:top w:type="dxa" w:w="0"/>
+              <w:left w:type="dxa" w:w="0"/>
+              <w:bottom w:type="dxa" w:w="0"/>
+              <w:right w:type="dxa" w:w="0"/>
+            </w:tcMar>
+            <w:vAlign w:val="center"/>
+          </w:tcPr>
+          <w:p>
+            <w:pPr>
+              <w:spacing w:after="40"/>
+              <w:jc w:val="center"/>
+            </w:pPr>
+            <w:r>
+              <w:drawing>
+                <wp:inline distT="0" distB="0" distL="0" distR="0">
+                  <wp:extent cx="3000375" cy="1343025"/>
+                  <wp:effectExtent t="0" r="0" b="0" l="0"/>
+                  <wp:docPr id="1" name="" descr="" title=""/>
+                  <wp:cNvGraphicFramePr>
+                    <a:graphicFrameLocks xmlns:a="http://schemas.openxmlformats.org/drawingml/2006/main" noChangeAspect="1"/>
+                  </wp:cNvGraphicFramePr>
+                  <a:graphic xmlns:a="http://schemas.openxmlformats.org/drawingml/2006/main">
+                    <a:graphicData uri="http://schemas.openxmlformats.org/drawingml/2006/picture">
+                      <pic:pic xmlns:pic="http://schemas.openxmlformats.org/drawingml/2006/picture">
+                        <pic:nvPicPr>
+                          <pic:cNvPr id="0" name="" descr=""/>
+                          <pic:cNvPicPr>
+                            <a:picLocks noChangeAspect="1" noChangeArrowheads="1"/>
+                          </pic:cNvPicPr>
+                        </pic:nvPicPr>
+                        <pic:blipFill>
+                          <a:blip r:embed="rId24" cstate="none"/>
+                          <a:srcRect/>
+                          <a:stretch>
+                            <a:fillRect/>
+                          </a:stretch>
+                        </pic:blipFill>
+                        <pic:spPr bwMode="auto">
+                          <a:xfrm>
+                            <a:off x="0" y="0"/>
                             <a:ext cx="3000375" cy="1343025"/>
                           </a:xfrm>
                           <a:prstGeom prst="rect">
@@ -32289,9 +32386,15 @@
             </w:r>
           </w:p>
         </w:tc>
-        <w:tc>
-          <w:tcPr>
-            <w:tcW w:type="dxa" w:w="200"/>
+      </w:tr>
+      <w:tr>
+        <w:trPr>
+          <w:trHeight w:val="160" w:hRule="exact"/>
+        </w:trPr>
+        <w:tc>
+          <w:tcPr>
+            <w:tcW w:type="dxa" w:w="9648"/>
+            <w:gridSpan w:val="3"/>
             <w:tcBorders>
               <w:top w:val="none" w:color="FFFFFF" w:sz="0"/>
               <w:left w:val="none" w:color="FFFFFF" w:sz="0"/>
@@ -32305,6 +32408,11 @@
             </w:r>
           </w:p>
         </w:tc>
+      </w:tr>
+      <w:tr>
+        <w:trPr>
+          <w:cantSplit/>
+        </w:trPr>
         <w:tc>
           <w:tcPr>
             <w:tcW w:type="dxa" w:w="4724"/>
@@ -32386,15 +32494,9 @@
             </w:r>
           </w:p>
         </w:tc>
-      </w:tr>
-      <w:tr>
-        <w:trPr>
-          <w:trHeight w:val="160" w:hRule="exact"/>
-        </w:trPr>
-        <w:tc>
-          <w:tcPr>
-            <w:tcW w:type="dxa" w:w="9648"/>
-            <w:gridSpan w:val="3"/>
+        <w:tc>
+          <w:tcPr>
+            <w:tcW w:type="dxa" w:w="200"/>
             <w:tcBorders>
               <w:top w:val="none" w:color="FFFFFF" w:sz="0"/>
               <w:left w:val="none" w:color="FFFFFF" w:sz="0"/>
@@ -32408,11 +32510,6 @@
             </w:r>
           </w:p>
         </w:tc>
-      </w:tr>
-      <w:tr>
-        <w:trPr>
-          <w:cantSplit/>
-        </w:trPr>
         <w:tc>
           <w:tcPr>
             <w:tcW w:type="dxa" w:w="4724"/>
@@ -32494,103 +32591,6 @@
             </w:r>
           </w:p>
         </w:tc>
-        <w:tc>
-          <w:tcPr>
-            <w:tcW w:type="dxa" w:w="200"/>
-            <w:tcBorders>
-              <w:top w:val="none" w:color="FFFFFF" w:sz="0"/>
-              <w:left w:val="none" w:color="FFFFFF" w:sz="0"/>
-              <w:bottom w:val="none" w:color="FFFFFF" w:sz="0"/>
-              <w:right w:val="none" w:color="FFFFFF" w:sz="0"/>
-            </w:tcBorders>
-          </w:tcPr>
-          <w:p>
-            <w:r>
-              <w:t xml:space="preserve"/>
-            </w:r>
-          </w:p>
-        </w:tc>
-        <w:tc>
-          <w:tcPr>
-            <w:tcW w:type="dxa" w:w="4724"/>
-            <w:tcBorders>
-              <w:top w:val="none" w:color="FFFFFF" w:sz="0"/>
-              <w:left w:val="none" w:color="FFFFFF" w:sz="0"/>
-              <w:bottom w:val="none" w:color="FFFFFF" w:sz="0"/>
-              <w:right w:val="none" w:color="FFFFFF" w:sz="0"/>
-            </w:tcBorders>
-            <w:tcMar>
-              <w:top w:type="dxa" w:w="0"/>
-              <w:left w:type="dxa" w:w="0"/>
-              <w:bottom w:type="dxa" w:w="0"/>
-              <w:right w:type="dxa" w:w="0"/>
-            </w:tcMar>
-            <w:vAlign w:val="center"/>
-          </w:tcPr>
-          <w:p>
-            <w:pPr>
-              <w:spacing w:after="40"/>
-              <w:jc w:val="center"/>
-            </w:pPr>
-            <w:r>
-              <w:drawing>
-                <wp:inline distT="0" distB="0" distL="0" distR="0">
-                  <wp:extent cx="3000375" cy="2247900"/>
-                  <wp:effectExtent t="0" r="0" b="0" l="0"/>
-                  <wp:docPr id="1" name="" descr="" title=""/>
-                  <wp:cNvGraphicFramePr>
-                    <a:graphicFrameLocks xmlns:a="http://schemas.openxmlformats.org/drawingml/2006/main" noChangeAspect="1"/>
-                  </wp:cNvGraphicFramePr>
-                  <a:graphic xmlns:a="http://schemas.openxmlformats.org/drawingml/2006/main">
-                    <a:graphicData uri="http://schemas.openxmlformats.org/drawingml/2006/picture">
-                      <pic:pic xmlns:pic="http://schemas.openxmlformats.org/drawingml/2006/picture">
-                        <pic:nvPicPr>
-                          <pic:cNvPr id="0" name="" descr=""/>
-                          <pic:cNvPicPr>
-                            <a:picLocks noChangeAspect="1" noChangeArrowheads="1"/>
-                          </pic:cNvPicPr>
-                        </pic:nvPicPr>
-                        <pic:blipFill>
-                          <a:blip r:embed="rId24" cstate="none"/>
-                          <a:srcRect/>
-                          <a:stretch>
-                            <a:fillRect/>
-                          </a:stretch>
-                        </pic:blipFill>
-                        <pic:spPr bwMode="auto">
-                          <a:xfrm>
-                            <a:off x="0" y="0"/>
-                            <a:ext cx="3000375" cy="2247900"/>
-                          </a:xfrm>
-                          <a:prstGeom prst="rect">
-                            <a:avLst/>
-                          </a:prstGeom>
-                        </pic:spPr>
-                      </pic:pic>
-                    </a:graphicData>
-                  </a:graphic>
-                </wp:inline>
-              </w:drawing>
-            </w:r>
-          </w:p>
-          <w:p>
-            <w:pPr>
-              <w:spacing w:after="0"/>
-              <w:jc w:val="center"/>
-            </w:pPr>
-            <w:r>
-              <w:rPr>
-                <w:rFonts w:ascii="Calibri" w:cs="Calibri" w:eastAsia="Calibri" w:hAnsi="Calibri"/>
-                <w:i/>
-                <w:iCs/>
-                <w:color w:val="8A94A6"/>
-                <w:sz w:val="17"/>
-                <w:szCs w:val="17"/>
-              </w:rPr>
-              <w:t xml:space="preserve">Les kiosques de restauration et les concessions</w:t>
-            </w:r>
-          </w:p>
-        </w:tc>
       </w:tr>
       <w:tr>
         <w:trPr>
@@ -32643,7 +32643,7 @@
             <w:r>
               <w:drawing>
                 <wp:inline distT="0" distB="0" distL="0" distR="0">
-                  <wp:extent cx="2295525" cy="2286000"/>
+                  <wp:extent cx="3000375" cy="2247900"/>
                   <wp:effectExtent t="0" r="0" b="0" l="0"/>
                   <wp:docPr id="1" name="" descr="" title=""/>
                   <wp:cNvGraphicFramePr>
@@ -32668,6 +32668,103 @@
                         <pic:spPr bwMode="auto">
                           <a:xfrm>
                             <a:off x="0" y="0"/>
+                            <a:ext cx="3000375" cy="2247900"/>
+                          </a:xfrm>
+                          <a:prstGeom prst="rect">
+                            <a:avLst/>
+                          </a:prstGeom>
+                        </pic:spPr>
+                      </pic:pic>
+                    </a:graphicData>
+                  </a:graphic>
+                </wp:inline>
+              </w:drawing>
+            </w:r>
+          </w:p>
+          <w:p>
+            <w:pPr>
+              <w:spacing w:after="0"/>
+              <w:jc w:val="center"/>
+            </w:pPr>
+            <w:r>
+              <w:rPr>
+                <w:rFonts w:ascii="Calibri" w:cs="Calibri" w:eastAsia="Calibri" w:hAnsi="Calibri"/>
+                <w:i/>
+                <w:iCs/>
+                <w:color w:val="8A94A6"/>
+                <w:sz w:val="17"/>
+                <w:szCs w:val="17"/>
+              </w:rPr>
+              <w:t xml:space="preserve">Les kiosques de restauration et les concessions</w:t>
+            </w:r>
+          </w:p>
+        </w:tc>
+        <w:tc>
+          <w:tcPr>
+            <w:tcW w:type="dxa" w:w="200"/>
+            <w:tcBorders>
+              <w:top w:val="none" w:color="FFFFFF" w:sz="0"/>
+              <w:left w:val="none" w:color="FFFFFF" w:sz="0"/>
+              <w:bottom w:val="none" w:color="FFFFFF" w:sz="0"/>
+              <w:right w:val="none" w:color="FFFFFF" w:sz="0"/>
+            </w:tcBorders>
+          </w:tcPr>
+          <w:p>
+            <w:r>
+              <w:t xml:space="preserve"/>
+            </w:r>
+          </w:p>
+        </w:tc>
+        <w:tc>
+          <w:tcPr>
+            <w:tcW w:type="dxa" w:w="4724"/>
+            <w:tcBorders>
+              <w:top w:val="none" w:color="FFFFFF" w:sz="0"/>
+              <w:left w:val="none" w:color="FFFFFF" w:sz="0"/>
+              <w:bottom w:val="none" w:color="FFFFFF" w:sz="0"/>
+              <w:right w:val="none" w:color="FFFFFF" w:sz="0"/>
+            </w:tcBorders>
+            <w:tcMar>
+              <w:top w:type="dxa" w:w="0"/>
+              <w:left w:type="dxa" w:w="0"/>
+              <w:bottom w:type="dxa" w:w="0"/>
+              <w:right w:type="dxa" w:w="0"/>
+            </w:tcMar>
+            <w:vAlign w:val="center"/>
+          </w:tcPr>
+          <w:p>
+            <w:pPr>
+              <w:spacing w:after="40"/>
+              <w:jc w:val="center"/>
+            </w:pPr>
+            <w:r>
+              <w:drawing>
+                <wp:inline distT="0" distB="0" distL="0" distR="0">
+                  <wp:extent cx="2295525" cy="2286000"/>
+                  <wp:effectExtent t="0" r="0" b="0" l="0"/>
+                  <wp:docPr id="1" name="" descr="" title=""/>
+                  <wp:cNvGraphicFramePr>
+                    <a:graphicFrameLocks xmlns:a="http://schemas.openxmlformats.org/drawingml/2006/main" noChangeAspect="1"/>
+                  </wp:cNvGraphicFramePr>
+                  <a:graphic xmlns:a="http://schemas.openxmlformats.org/drawingml/2006/main">
+                    <a:graphicData uri="http://schemas.openxmlformats.org/drawingml/2006/picture">
+                      <pic:pic xmlns:pic="http://schemas.openxmlformats.org/drawingml/2006/picture">
+                        <pic:nvPicPr>
+                          <pic:cNvPr id="0" name="" descr=""/>
+                          <pic:cNvPicPr>
+                            <a:picLocks noChangeAspect="1" noChangeArrowheads="1"/>
+                          </pic:cNvPicPr>
+                        </pic:nvPicPr>
+                        <pic:blipFill>
+                          <a:blip r:embed="rId26" cstate="none"/>
+                          <a:srcRect/>
+                          <a:stretch>
+                            <a:fillRect/>
+                          </a:stretch>
+                        </pic:blipFill>
+                        <pic:spPr bwMode="auto">
+                          <a:xfrm>
+                            <a:off x="0" y="0"/>
                             <a:ext cx="2295525" cy="2286000"/>
                           </a:xfrm>
                           <a:prstGeom prst="rect">
@@ -32699,9 +32796,15 @@
             </w:r>
           </w:p>
         </w:tc>
-        <w:tc>
-          <w:tcPr>
-            <w:tcW w:type="dxa" w:w="200"/>
+      </w:tr>
+      <w:tr>
+        <w:trPr>
+          <w:trHeight w:val="160" w:hRule="exact"/>
+        </w:trPr>
+        <w:tc>
+          <w:tcPr>
+            <w:tcW w:type="dxa" w:w="9648"/>
+            <w:gridSpan w:val="3"/>
             <w:tcBorders>
               <w:top w:val="none" w:color="FFFFFF" w:sz="0"/>
               <w:left w:val="none" w:color="FFFFFF" w:sz="0"/>
@@ -32715,6 +32818,11 @@
             </w:r>
           </w:p>
         </w:tc>
+      </w:tr>
+      <w:tr>
+        <w:trPr>
+          <w:cantSplit/>
+        </w:trPr>
         <w:tc>
           <w:tcPr>
             <w:tcW w:type="dxa" w:w="4724"/>
@@ -32796,15 +32904,9 @@
             </w:r>
           </w:p>
         </w:tc>
-      </w:tr>
-      <w:tr>
-        <w:trPr>
-          <w:trHeight w:val="160" w:hRule="exact"/>
-        </w:trPr>
-        <w:tc>
-          <w:tcPr>
-            <w:tcW w:type="dxa" w:w="9648"/>
-            <w:gridSpan w:val="3"/>
+        <w:tc>
+          <w:tcPr>
+            <w:tcW w:type="dxa" w:w="200"/>
             <w:tcBorders>
               <w:top w:val="none" w:color="FFFFFF" w:sz="0"/>
               <w:left w:val="none" w:color="FFFFFF" w:sz="0"/>
@@ -32818,11 +32920,6 @@
             </w:r>
           </w:p>
         </w:tc>
-      </w:tr>
-      <w:tr>
-        <w:trPr>
-          <w:cantSplit/>
-        </w:trPr>
         <w:tc>
           <w:tcPr>
             <w:tcW w:type="dxa" w:w="4724"/>
@@ -32864,7 +32961,7 @@
                           </pic:cNvPicPr>
                         </pic:nvPicPr>
                         <pic:blipFill>
-                          <a:blip r:embed="rId26" cstate="none"/>
+                          <a:blip r:embed="rId27" cstate="none"/>
                           <a:srcRect/>
                           <a:stretch>
                             <a:fillRect/>
@@ -32901,38 +32998,6 @@
                 <w:szCs w:val="17"/>
               </w:rPr>
               <w:t xml:space="preserve">L'hôtel vu de l'arrière, côté condos</w:t>
-            </w:r>
-          </w:p>
-        </w:tc>
-        <w:tc>
-          <w:tcPr>
-            <w:tcW w:type="dxa" w:w="200"/>
-            <w:tcBorders>
-              <w:top w:val="none" w:color="FFFFFF" w:sz="0"/>
-              <w:left w:val="none" w:color="FFFFFF" w:sz="0"/>
-              <w:bottom w:val="none" w:color="FFFFFF" w:sz="0"/>
-              <w:right w:val="none" w:color="FFFFFF" w:sz="0"/>
-            </w:tcBorders>
-          </w:tcPr>
-          <w:p>
-            <w:r>
-              <w:t xml:space="preserve"/>
-            </w:r>
-          </w:p>
-        </w:tc>
-        <w:tc>
-          <w:tcPr>
-            <w:tcW w:type="dxa" w:w="4724"/>
-            <w:tcBorders>
-              <w:top w:val="none" w:color="FFFFFF" w:sz="0"/>
-              <w:left w:val="none" w:color="FFFFFF" w:sz="0"/>
-              <w:bottom w:val="none" w:color="FFFFFF" w:sz="0"/>
-              <w:right w:val="none" w:color="FFFFFF" w:sz="0"/>
-            </w:tcBorders>
-          </w:tcPr>
-          <w:p>
-            <w:r>
-              <w:t xml:space="preserve"/>
             </w:r>
           </w:p>
         </w:tc>

</xml_diff>

<commit_message>
Ajouter l'Aqua Bar, le lac et un visuel des réseaux sociaux
Ajoute trois photos à la galerie et une ligne « lac, plage et palapas »
au tableau des installations.

Co-Authored-By: Claude Fable 5.1 <noreply@anthropic.com>
Claude-Session: https://claude.ai/code/session_01SZvZuYXZ3BuNTXPMcsdahV
</commit_message>
<xml_diff>
--- a/plan-affaires/Plan_affaires_Complexe_Havana.docx
+++ b/plan-affaires/Plan_affaires_Complexe_Havana.docx
@@ -4316,7 +4316,7 @@
                 <w:sz w:val="19"/>
                 <w:szCs w:val="19"/>
               </w:rPr>
-              <w:t xml:space="preserve">Piscine centrale et café-bar</w:t>
+              <w:t xml:space="preserve">Piscine centrale, Aqua Bar et café-bar</w:t>
             </w:r>
           </w:p>
         </w:tc>
@@ -4441,7 +4441,7 @@
                 <w:sz w:val="19"/>
                 <w:szCs w:val="19"/>
               </w:rPr>
-              <w:t xml:space="preserve">Cantine, jeux gonflables, concessions</w:t>
+              <w:t xml:space="preserve">Lac, plage de sable et palapas</w:t>
             </w:r>
           </w:p>
         </w:tc>
@@ -4471,7 +4471,7 @@
                 <w:sz w:val="19"/>
                 <w:szCs w:val="19"/>
               </w:rPr>
-              <w:t xml:space="preserve">—</w:t>
+              <w:t xml:space="preserve">1</w:t>
             </w:r>
           </w:p>
         </w:tc>
@@ -4501,7 +4501,7 @@
                 <w:sz w:val="19"/>
                 <w:szCs w:val="19"/>
               </w:rPr>
-              <w:t xml:space="preserve">Variable</w:t>
+              <w:t xml:space="preserve">Inclus</w:t>
             </w:r>
           </w:p>
         </w:tc>
@@ -4509,6 +4509,131 @@
           <w:tcPr>
             <w:tcW w:type="dxa" w:w="2448"/>
             <w:shd w:fill="F2F4F7" w:color="auto" w:val="clear"/>
+            <w:tcMar>
+              <w:top w:type="dxa" w:w="40"/>
+              <w:left w:type="dxa" w:w="70"/>
+              <w:bottom w:type="dxa" w:w="40"/>
+              <w:right w:type="dxa" w:w="70"/>
+            </w:tcMar>
+            <w:vAlign w:val="center"/>
+          </w:tcPr>
+          <w:p>
+            <w:pPr>
+              <w:spacing w:after="40" w:before="40" w:line="240"/>
+              <w:jc w:val="right"/>
+            </w:pPr>
+            <w:r>
+              <w:rPr>
+                <w:rFonts w:ascii="Calibri" w:cs="Calibri" w:eastAsia="Calibri" w:hAnsi="Calibri"/>
+                <w:b w:val="false"/>
+                <w:bCs w:val="false"/>
+                <w:color w:val="1F2933"/>
+                <w:sz w:val="19"/>
+                <w:szCs w:val="19"/>
+              </w:rPr>
+              <w:t xml:space="preserve">Été</w:t>
+            </w:r>
+          </w:p>
+        </w:tc>
+      </w:tr>
+      <w:tr>
+        <w:trPr>
+          <w:cantSplit/>
+        </w:trPr>
+        <w:tc>
+          <w:tcPr>
+            <w:tcW w:type="dxa" w:w="3600"/>
+            <w:shd w:fill="FFFFFF" w:color="auto" w:val="clear"/>
+            <w:tcMar>
+              <w:top w:type="dxa" w:w="40"/>
+              <w:left w:type="dxa" w:w="70"/>
+              <w:bottom w:type="dxa" w:w="40"/>
+              <w:right w:type="dxa" w:w="70"/>
+            </w:tcMar>
+            <w:vAlign w:val="center"/>
+          </w:tcPr>
+          <w:p>
+            <w:pPr>
+              <w:spacing w:after="40" w:before="40" w:line="240"/>
+              <w:jc w:val="left"/>
+            </w:pPr>
+            <w:r>
+              <w:rPr>
+                <w:rFonts w:ascii="Calibri" w:cs="Calibri" w:eastAsia="Calibri" w:hAnsi="Calibri"/>
+                <w:b w:val="false"/>
+                <w:bCs w:val="false"/>
+                <w:color w:val="1F2933"/>
+                <w:sz w:val="19"/>
+                <w:szCs w:val="19"/>
+              </w:rPr>
+              <w:t xml:space="preserve">Cantine, jeux gonflables, concessions</w:t>
+            </w:r>
+          </w:p>
+        </w:tc>
+        <w:tc>
+          <w:tcPr>
+            <w:tcW w:type="dxa" w:w="1300"/>
+            <w:shd w:fill="FFFFFF" w:color="auto" w:val="clear"/>
+            <w:tcMar>
+              <w:top w:type="dxa" w:w="40"/>
+              <w:left w:type="dxa" w:w="70"/>
+              <w:bottom w:type="dxa" w:w="40"/>
+              <w:right w:type="dxa" w:w="70"/>
+            </w:tcMar>
+            <w:vAlign w:val="center"/>
+          </w:tcPr>
+          <w:p>
+            <w:pPr>
+              <w:spacing w:after="40" w:before="40" w:line="240"/>
+              <w:jc w:val="right"/>
+            </w:pPr>
+            <w:r>
+              <w:rPr>
+                <w:rFonts w:ascii="Calibri" w:cs="Calibri" w:eastAsia="Calibri" w:hAnsi="Calibri"/>
+                <w:b w:val="false"/>
+                <w:bCs w:val="false"/>
+                <w:color w:val="1F2933"/>
+                <w:sz w:val="19"/>
+                <w:szCs w:val="19"/>
+              </w:rPr>
+              <w:t xml:space="preserve">—</w:t>
+            </w:r>
+          </w:p>
+        </w:tc>
+        <w:tc>
+          <w:tcPr>
+            <w:tcW w:type="dxa" w:w="2300"/>
+            <w:shd w:fill="FFFFFF" w:color="auto" w:val="clear"/>
+            <w:tcMar>
+              <w:top w:type="dxa" w:w="40"/>
+              <w:left w:type="dxa" w:w="70"/>
+              <w:bottom w:type="dxa" w:w="40"/>
+              <w:right w:type="dxa" w:w="70"/>
+            </w:tcMar>
+            <w:vAlign w:val="center"/>
+          </w:tcPr>
+          <w:p>
+            <w:pPr>
+              <w:spacing w:after="40" w:before="40" w:line="240"/>
+              <w:jc w:val="right"/>
+            </w:pPr>
+            <w:r>
+              <w:rPr>
+                <w:rFonts w:ascii="Calibri" w:cs="Calibri" w:eastAsia="Calibri" w:hAnsi="Calibri"/>
+                <w:b w:val="false"/>
+                <w:bCs w:val="false"/>
+                <w:color w:val="1F2933"/>
+                <w:sz w:val="19"/>
+                <w:szCs w:val="19"/>
+              </w:rPr>
+              <w:t xml:space="preserve">Variable</w:t>
+            </w:r>
+          </w:p>
+        </w:tc>
+        <w:tc>
+          <w:tcPr>
+            <w:tcW w:type="dxa" w:w="2448"/>
+            <w:shd w:fill="FFFFFF" w:color="auto" w:val="clear"/>
             <w:tcMar>
               <w:top w:type="dxa" w:w="40"/>
               <w:left w:type="dxa" w:w="70"/>
@@ -32028,6 +32153,211 @@
             <w:r>
               <w:drawing>
                 <wp:inline distT="0" distB="0" distL="0" distR="0">
+                  <wp:extent cx="1714500" cy="2286000"/>
+                  <wp:effectExtent t="0" r="0" b="0" l="0"/>
+                  <wp:docPr id="1" name="" descr="" title=""/>
+                  <wp:cNvGraphicFramePr>
+                    <a:graphicFrameLocks xmlns:a="http://schemas.openxmlformats.org/drawingml/2006/main" noChangeAspect="1"/>
+                  </wp:cNvGraphicFramePr>
+                  <a:graphic xmlns:a="http://schemas.openxmlformats.org/drawingml/2006/main">
+                    <a:graphicData uri="http://schemas.openxmlformats.org/drawingml/2006/picture">
+                      <pic:pic xmlns:pic="http://schemas.openxmlformats.org/drawingml/2006/picture">
+                        <pic:nvPicPr>
+                          <pic:cNvPr id="0" name="" descr=""/>
+                          <pic:cNvPicPr>
+                            <a:picLocks noChangeAspect="1" noChangeArrowheads="1"/>
+                          </pic:cNvPicPr>
+                        </pic:nvPicPr>
+                        <pic:blipFill>
+                          <a:blip r:embed="rId23" cstate="none"/>
+                          <a:srcRect/>
+                          <a:stretch>
+                            <a:fillRect/>
+                          </a:stretch>
+                        </pic:blipFill>
+                        <pic:spPr bwMode="auto">
+                          <a:xfrm>
+                            <a:off x="0" y="0"/>
+                            <a:ext cx="1714500" cy="2286000"/>
+                          </a:xfrm>
+                          <a:prstGeom prst="rect">
+                            <a:avLst/>
+                          </a:prstGeom>
+                        </pic:spPr>
+                      </pic:pic>
+                    </a:graphicData>
+                  </a:graphic>
+                </wp:inline>
+              </w:drawing>
+            </w:r>
+          </w:p>
+          <w:p>
+            <w:pPr>
+              <w:spacing w:after="0"/>
+              <w:jc w:val="center"/>
+            </w:pPr>
+            <w:r>
+              <w:rPr>
+                <w:rFonts w:ascii="Calibri" w:cs="Calibri" w:eastAsia="Calibri" w:hAnsi="Calibri"/>
+                <w:i/>
+                <w:iCs/>
+                <w:color w:val="8A94A6"/>
+                <w:sz w:val="17"/>
+                <w:szCs w:val="17"/>
+              </w:rPr>
+              <w:t xml:space="preserve">L'Aqua Bar, le bar dans la piscine</w:t>
+            </w:r>
+          </w:p>
+        </w:tc>
+        <w:tc>
+          <w:tcPr>
+            <w:tcW w:type="dxa" w:w="200"/>
+            <w:tcBorders>
+              <w:top w:val="none" w:color="FFFFFF" w:sz="0"/>
+              <w:left w:val="none" w:color="FFFFFF" w:sz="0"/>
+              <w:bottom w:val="none" w:color="FFFFFF" w:sz="0"/>
+              <w:right w:val="none" w:color="FFFFFF" w:sz="0"/>
+            </w:tcBorders>
+          </w:tcPr>
+          <w:p>
+            <w:r>
+              <w:t xml:space="preserve"/>
+            </w:r>
+          </w:p>
+        </w:tc>
+        <w:tc>
+          <w:tcPr>
+            <w:tcW w:type="dxa" w:w="4724"/>
+            <w:tcBorders>
+              <w:top w:val="none" w:color="FFFFFF" w:sz="0"/>
+              <w:left w:val="none" w:color="FFFFFF" w:sz="0"/>
+              <w:bottom w:val="none" w:color="FFFFFF" w:sz="0"/>
+              <w:right w:val="none" w:color="FFFFFF" w:sz="0"/>
+            </w:tcBorders>
+            <w:tcMar>
+              <w:top w:type="dxa" w:w="0"/>
+              <w:left w:type="dxa" w:w="0"/>
+              <w:bottom w:type="dxa" w:w="0"/>
+              <w:right w:type="dxa" w:w="0"/>
+            </w:tcMar>
+            <w:vAlign w:val="center"/>
+          </w:tcPr>
+          <w:p>
+            <w:pPr>
+              <w:spacing w:after="40"/>
+              <w:jc w:val="center"/>
+            </w:pPr>
+            <w:r>
+              <w:drawing>
+                <wp:inline distT="0" distB="0" distL="0" distR="0">
+                  <wp:extent cx="1819275" cy="2286000"/>
+                  <wp:effectExtent t="0" r="0" b="0" l="0"/>
+                  <wp:docPr id="1" name="" descr="" title=""/>
+                  <wp:cNvGraphicFramePr>
+                    <a:graphicFrameLocks xmlns:a="http://schemas.openxmlformats.org/drawingml/2006/main" noChangeAspect="1"/>
+                  </wp:cNvGraphicFramePr>
+                  <a:graphic xmlns:a="http://schemas.openxmlformats.org/drawingml/2006/main">
+                    <a:graphicData uri="http://schemas.openxmlformats.org/drawingml/2006/picture">
+                      <pic:pic xmlns:pic="http://schemas.openxmlformats.org/drawingml/2006/picture">
+                        <pic:nvPicPr>
+                          <pic:cNvPr id="0" name="" descr=""/>
+                          <pic:cNvPicPr>
+                            <a:picLocks noChangeAspect="1" noChangeArrowheads="1"/>
+                          </pic:cNvPicPr>
+                        </pic:nvPicPr>
+                        <pic:blipFill>
+                          <a:blip r:embed="rId24" cstate="none"/>
+                          <a:srcRect/>
+                          <a:stretch>
+                            <a:fillRect/>
+                          </a:stretch>
+                        </pic:blipFill>
+                        <pic:spPr bwMode="auto">
+                          <a:xfrm>
+                            <a:off x="0" y="0"/>
+                            <a:ext cx="1819275" cy="2286000"/>
+                          </a:xfrm>
+                          <a:prstGeom prst="rect">
+                            <a:avLst/>
+                          </a:prstGeom>
+                        </pic:spPr>
+                      </pic:pic>
+                    </a:graphicData>
+                  </a:graphic>
+                </wp:inline>
+              </w:drawing>
+            </w:r>
+          </w:p>
+          <w:p>
+            <w:pPr>
+              <w:spacing w:after="0"/>
+              <w:jc w:val="center"/>
+            </w:pPr>
+            <w:r>
+              <w:rPr>
+                <w:rFonts w:ascii="Calibri" w:cs="Calibri" w:eastAsia="Calibri" w:hAnsi="Calibri"/>
+                <w:i/>
+                <w:iCs/>
+                <w:color w:val="8A94A6"/>
+                <w:sz w:val="17"/>
+                <w:szCs w:val="17"/>
+              </w:rPr>
+              <w:t xml:space="preserve">Le lac, sa plage de sable et ses palapas</w:t>
+            </w:r>
+          </w:p>
+        </w:tc>
+      </w:tr>
+      <w:tr>
+        <w:trPr>
+          <w:trHeight w:val="160" w:hRule="exact"/>
+        </w:trPr>
+        <w:tc>
+          <w:tcPr>
+            <w:tcW w:type="dxa" w:w="9648"/>
+            <w:gridSpan w:val="3"/>
+            <w:tcBorders>
+              <w:top w:val="none" w:color="FFFFFF" w:sz="0"/>
+              <w:left w:val="none" w:color="FFFFFF" w:sz="0"/>
+              <w:bottom w:val="none" w:color="FFFFFF" w:sz="0"/>
+              <w:right w:val="none" w:color="FFFFFF" w:sz="0"/>
+            </w:tcBorders>
+          </w:tcPr>
+          <w:p>
+            <w:r>
+              <w:t xml:space="preserve"/>
+            </w:r>
+          </w:p>
+        </w:tc>
+      </w:tr>
+      <w:tr>
+        <w:trPr>
+          <w:cantSplit/>
+        </w:trPr>
+        <w:tc>
+          <w:tcPr>
+            <w:tcW w:type="dxa" w:w="4724"/>
+            <w:tcBorders>
+              <w:top w:val="none" w:color="FFFFFF" w:sz="0"/>
+              <w:left w:val="none" w:color="FFFFFF" w:sz="0"/>
+              <w:bottom w:val="none" w:color="FFFFFF" w:sz="0"/>
+              <w:right w:val="none" w:color="FFFFFF" w:sz="0"/>
+            </w:tcBorders>
+            <w:tcMar>
+              <w:top w:type="dxa" w:w="0"/>
+              <w:left w:type="dxa" w:w="0"/>
+              <w:bottom w:type="dxa" w:w="0"/>
+              <w:right w:type="dxa" w:w="0"/>
+            </w:tcMar>
+            <w:vAlign w:val="center"/>
+          </w:tcPr>
+          <w:p>
+            <w:pPr>
+              <w:spacing w:after="40"/>
+              <w:jc w:val="center"/>
+            </w:pPr>
+            <w:r>
+              <w:drawing>
+                <wp:inline distT="0" distB="0" distL="0" distR="0">
                   <wp:extent cx="3000375" cy="2190750"/>
                   <wp:effectExtent t="0" r="0" b="0" l="0"/>
                   <wp:docPr id="1" name="" descr="" title=""/>
@@ -32249,7 +32579,7 @@
                           </pic:cNvPicPr>
                         </pic:nvPicPr>
                         <pic:blipFill>
-                          <a:blip r:embed="rId23" cstate="none"/>
+                          <a:blip r:embed="rId25" cstate="none"/>
                           <a:srcRect/>
                           <a:stretch>
                             <a:fillRect/>
@@ -32346,7 +32676,7 @@
                           </pic:cNvPicPr>
                         </pic:nvPicPr>
                         <pic:blipFill>
-                          <a:blip r:embed="rId24" cstate="none"/>
+                          <a:blip r:embed="rId26" cstate="none"/>
                           <a:srcRect/>
                           <a:stretch>
                             <a:fillRect/>
@@ -32659,7 +32989,7 @@
                           </pic:cNvPicPr>
                         </pic:nvPicPr>
                         <pic:blipFill>
-                          <a:blip r:embed="rId25" cstate="none"/>
+                          <a:blip r:embed="rId27" cstate="none"/>
                           <a:srcRect/>
                           <a:stretch>
                             <a:fillRect/>
@@ -32756,7 +33086,7 @@
                           </pic:cNvPicPr>
                         </pic:nvPicPr>
                         <pic:blipFill>
-                          <a:blip r:embed="rId26" cstate="none"/>
+                          <a:blip r:embed="rId28" cstate="none"/>
                           <a:srcRect/>
                           <a:stretch>
                             <a:fillRect/>
@@ -32961,7 +33291,7 @@
                           </pic:cNvPicPr>
                         </pic:nvPicPr>
                         <pic:blipFill>
-                          <a:blip r:embed="rId27" cstate="none"/>
+                          <a:blip r:embed="rId29" cstate="none"/>
                           <a:srcRect/>
                           <a:stretch>
                             <a:fillRect/>
@@ -32998,6 +33328,146 @@
                 <w:szCs w:val="17"/>
               </w:rPr>
               <w:t xml:space="preserve">L'hôtel vu de l'arrière, côté condos</w:t>
+            </w:r>
+          </w:p>
+        </w:tc>
+      </w:tr>
+      <w:tr>
+        <w:trPr>
+          <w:trHeight w:val="160" w:hRule="exact"/>
+        </w:trPr>
+        <w:tc>
+          <w:tcPr>
+            <w:tcW w:type="dxa" w:w="9648"/>
+            <w:gridSpan w:val="3"/>
+            <w:tcBorders>
+              <w:top w:val="none" w:color="FFFFFF" w:sz="0"/>
+              <w:left w:val="none" w:color="FFFFFF" w:sz="0"/>
+              <w:bottom w:val="none" w:color="FFFFFF" w:sz="0"/>
+              <w:right w:val="none" w:color="FFFFFF" w:sz="0"/>
+            </w:tcBorders>
+          </w:tcPr>
+          <w:p>
+            <w:r>
+              <w:t xml:space="preserve"/>
+            </w:r>
+          </w:p>
+        </w:tc>
+      </w:tr>
+      <w:tr>
+        <w:trPr>
+          <w:cantSplit/>
+        </w:trPr>
+        <w:tc>
+          <w:tcPr>
+            <w:tcW w:type="dxa" w:w="4724"/>
+            <w:tcBorders>
+              <w:top w:val="none" w:color="FFFFFF" w:sz="0"/>
+              <w:left w:val="none" w:color="FFFFFF" w:sz="0"/>
+              <w:bottom w:val="none" w:color="FFFFFF" w:sz="0"/>
+              <w:right w:val="none" w:color="FFFFFF" w:sz="0"/>
+            </w:tcBorders>
+            <w:tcMar>
+              <w:top w:type="dxa" w:w="0"/>
+              <w:left w:type="dxa" w:w="0"/>
+              <w:bottom w:type="dxa" w:w="0"/>
+              <w:right w:type="dxa" w:w="0"/>
+            </w:tcMar>
+            <w:vAlign w:val="center"/>
+          </w:tcPr>
+          <w:p>
+            <w:pPr>
+              <w:spacing w:after="40"/>
+              <w:jc w:val="center"/>
+            </w:pPr>
+            <w:r>
+              <w:drawing>
+                <wp:inline distT="0" distB="0" distL="0" distR="0">
+                  <wp:extent cx="1276350" cy="2286000"/>
+                  <wp:effectExtent t="0" r="0" b="0" l="0"/>
+                  <wp:docPr id="1" name="" descr="" title=""/>
+                  <wp:cNvGraphicFramePr>
+                    <a:graphicFrameLocks xmlns:a="http://schemas.openxmlformats.org/drawingml/2006/main" noChangeAspect="1"/>
+                  </wp:cNvGraphicFramePr>
+                  <a:graphic xmlns:a="http://schemas.openxmlformats.org/drawingml/2006/main">
+                    <a:graphicData uri="http://schemas.openxmlformats.org/drawingml/2006/picture">
+                      <pic:pic xmlns:pic="http://schemas.openxmlformats.org/drawingml/2006/picture">
+                        <pic:nvPicPr>
+                          <pic:cNvPr id="0" name="" descr=""/>
+                          <pic:cNvPicPr>
+                            <a:picLocks noChangeAspect="1" noChangeArrowheads="1"/>
+                          </pic:cNvPicPr>
+                        </pic:nvPicPr>
+                        <pic:blipFill>
+                          <a:blip r:embed="rId30" cstate="none"/>
+                          <a:srcRect/>
+                          <a:stretch>
+                            <a:fillRect/>
+                          </a:stretch>
+                        </pic:blipFill>
+                        <pic:spPr bwMode="auto">
+                          <a:xfrm>
+                            <a:off x="0" y="0"/>
+                            <a:ext cx="1276350" cy="2286000"/>
+                          </a:xfrm>
+                          <a:prstGeom prst="rect">
+                            <a:avLst/>
+                          </a:prstGeom>
+                        </pic:spPr>
+                      </pic:pic>
+                    </a:graphicData>
+                  </a:graphic>
+                </wp:inline>
+              </w:drawing>
+            </w:r>
+          </w:p>
+          <w:p>
+            <w:pPr>
+              <w:spacing w:after="0"/>
+              <w:jc w:val="center"/>
+            </w:pPr>
+            <w:r>
+              <w:rPr>
+                <w:rFonts w:ascii="Calibri" w:cs="Calibri" w:eastAsia="Calibri" w:hAnsi="Calibri"/>
+                <w:i/>
+                <w:iCs/>
+                <w:color w:val="8A94A6"/>
+                <w:sz w:val="17"/>
+                <w:szCs w:val="17"/>
+              </w:rPr>
+              <w:t xml:space="preserve">Visuel des réseaux sociaux : animation aquatique</w:t>
+            </w:r>
+          </w:p>
+        </w:tc>
+        <w:tc>
+          <w:tcPr>
+            <w:tcW w:type="dxa" w:w="200"/>
+            <w:tcBorders>
+              <w:top w:val="none" w:color="FFFFFF" w:sz="0"/>
+              <w:left w:val="none" w:color="FFFFFF" w:sz="0"/>
+              <w:bottom w:val="none" w:color="FFFFFF" w:sz="0"/>
+              <w:right w:val="none" w:color="FFFFFF" w:sz="0"/>
+            </w:tcBorders>
+          </w:tcPr>
+          <w:p>
+            <w:r>
+              <w:t xml:space="preserve"/>
+            </w:r>
+          </w:p>
+        </w:tc>
+        <w:tc>
+          <w:tcPr>
+            <w:tcW w:type="dxa" w:w="4724"/>
+            <w:tcBorders>
+              <w:top w:val="none" w:color="FFFFFF" w:sz="0"/>
+              <w:left w:val="none" w:color="FFFFFF" w:sz="0"/>
+              <w:bottom w:val="none" w:color="FFFFFF" w:sz="0"/>
+              <w:right w:val="none" w:color="FFFFFF" w:sz="0"/>
+            </w:tcBorders>
+          </w:tcPr>
+          <w:p>
+            <w:r>
+              <w:t xml:space="preserve"/>
             </w:r>
           </w:p>
         </w:tc>

</xml_diff>

<commit_message>
Réordonner la galerie de photos
Co-Authored-By: Claude Fable 5.1 <noreply@anthropic.com>
Claude-Session: https://claude.ai/code/session_01SZvZuYXZ3BuNTXPMcsdahV
</commit_message>
<xml_diff>
--- a/plan-affaires/Plan_affaires_Complexe_Havana.docx
+++ b/plan-affaires/Plan_affaires_Complexe_Havana.docx
@@ -32563,7 +32563,7 @@
             <w:r>
               <w:drawing>
                 <wp:inline distT="0" distB="0" distL="0" distR="0">
-                  <wp:extent cx="2286000" cy="2286000"/>
+                  <wp:extent cx="3000375" cy="1343025"/>
                   <wp:effectExtent t="0" r="0" b="0" l="0"/>
                   <wp:docPr id="1" name="" descr="" title=""/>
                   <wp:cNvGraphicFramePr>
@@ -32588,103 +32588,6 @@
                         <pic:spPr bwMode="auto">
                           <a:xfrm>
                             <a:off x="0" y="0"/>
-                            <a:ext cx="2286000" cy="2286000"/>
-                          </a:xfrm>
-                          <a:prstGeom prst="rect">
-                            <a:avLst/>
-                          </a:prstGeom>
-                        </pic:spPr>
-                      </pic:pic>
-                    </a:graphicData>
-                  </a:graphic>
-                </wp:inline>
-              </w:drawing>
-            </w:r>
-          </w:p>
-          <w:p>
-            <w:pPr>
-              <w:spacing w:after="0"/>
-              <w:jc w:val="center"/>
-            </w:pPr>
-            <w:r>
-              <w:rPr>
-                <w:rFonts w:ascii="Calibri" w:cs="Calibri" w:eastAsia="Calibri" w:hAnsi="Calibri"/>
-                <w:i/>
-                <w:iCs/>
-                <w:color w:val="8A94A6"/>
-                <w:sz w:val="17"/>
-                <w:szCs w:val="17"/>
-              </w:rPr>
-              <w:t xml:space="preserve">Une famille d'invités sur la chaise géante « I ♥ Havana Resort »</w:t>
-            </w:r>
-          </w:p>
-        </w:tc>
-        <w:tc>
-          <w:tcPr>
-            <w:tcW w:type="dxa" w:w="200"/>
-            <w:tcBorders>
-              <w:top w:val="none" w:color="FFFFFF" w:sz="0"/>
-              <w:left w:val="none" w:color="FFFFFF" w:sz="0"/>
-              <w:bottom w:val="none" w:color="FFFFFF" w:sz="0"/>
-              <w:right w:val="none" w:color="FFFFFF" w:sz="0"/>
-            </w:tcBorders>
-          </w:tcPr>
-          <w:p>
-            <w:r>
-              <w:t xml:space="preserve"/>
-            </w:r>
-          </w:p>
-        </w:tc>
-        <w:tc>
-          <w:tcPr>
-            <w:tcW w:type="dxa" w:w="4724"/>
-            <w:tcBorders>
-              <w:top w:val="none" w:color="FFFFFF" w:sz="0"/>
-              <w:left w:val="none" w:color="FFFFFF" w:sz="0"/>
-              <w:bottom w:val="none" w:color="FFFFFF" w:sz="0"/>
-              <w:right w:val="none" w:color="FFFFFF" w:sz="0"/>
-            </w:tcBorders>
-            <w:tcMar>
-              <w:top w:type="dxa" w:w="0"/>
-              <w:left w:type="dxa" w:w="0"/>
-              <w:bottom w:type="dxa" w:w="0"/>
-              <w:right w:type="dxa" w:w="0"/>
-            </w:tcMar>
-            <w:vAlign w:val="center"/>
-          </w:tcPr>
-          <w:p>
-            <w:pPr>
-              <w:spacing w:after="40"/>
-              <w:jc w:val="center"/>
-            </w:pPr>
-            <w:r>
-              <w:drawing>
-                <wp:inline distT="0" distB="0" distL="0" distR="0">
-                  <wp:extent cx="3000375" cy="1343025"/>
-                  <wp:effectExtent t="0" r="0" b="0" l="0"/>
-                  <wp:docPr id="1" name="" descr="" title=""/>
-                  <wp:cNvGraphicFramePr>
-                    <a:graphicFrameLocks xmlns:a="http://schemas.openxmlformats.org/drawingml/2006/main" noChangeAspect="1"/>
-                  </wp:cNvGraphicFramePr>
-                  <a:graphic xmlns:a="http://schemas.openxmlformats.org/drawingml/2006/main">
-                    <a:graphicData uri="http://schemas.openxmlformats.org/drawingml/2006/picture">
-                      <pic:pic xmlns:pic="http://schemas.openxmlformats.org/drawingml/2006/picture">
-                        <pic:nvPicPr>
-                          <pic:cNvPr id="0" name="" descr=""/>
-                          <pic:cNvPicPr>
-                            <a:picLocks noChangeAspect="1" noChangeArrowheads="1"/>
-                          </pic:cNvPicPr>
-                        </pic:nvPicPr>
-                        <pic:blipFill>
-                          <a:blip r:embed="rId26" cstate="none"/>
-                          <a:srcRect/>
-                          <a:stretch>
-                            <a:fillRect/>
-                          </a:stretch>
-                        </pic:blipFill>
-                        <pic:spPr bwMode="auto">
-                          <a:xfrm>
-                            <a:off x="0" y="0"/>
                             <a:ext cx="3000375" cy="1343025"/>
                           </a:xfrm>
                           <a:prstGeom prst="rect">
@@ -32716,15 +32619,9 @@
             </w:r>
           </w:p>
         </w:tc>
-      </w:tr>
-      <w:tr>
-        <w:trPr>
-          <w:trHeight w:val="160" w:hRule="exact"/>
-        </w:trPr>
-        <w:tc>
-          <w:tcPr>
-            <w:tcW w:type="dxa" w:w="9648"/>
-            <w:gridSpan w:val="3"/>
+        <w:tc>
+          <w:tcPr>
+            <w:tcW w:type="dxa" w:w="200"/>
             <w:tcBorders>
               <w:top w:val="none" w:color="FFFFFF" w:sz="0"/>
               <w:left w:val="none" w:color="FFFFFF" w:sz="0"/>
@@ -32738,11 +32635,6 @@
             </w:r>
           </w:p>
         </w:tc>
-      </w:tr>
-      <w:tr>
-        <w:trPr>
-          <w:cantSplit/>
-        </w:trPr>
         <w:tc>
           <w:tcPr>
             <w:tcW w:type="dxa" w:w="4724"/>
@@ -32824,9 +32716,15 @@
             </w:r>
           </w:p>
         </w:tc>
-        <w:tc>
-          <w:tcPr>
-            <w:tcW w:type="dxa" w:w="200"/>
+      </w:tr>
+      <w:tr>
+        <w:trPr>
+          <w:trHeight w:val="160" w:hRule="exact"/>
+        </w:trPr>
+        <w:tc>
+          <w:tcPr>
+            <w:tcW w:type="dxa" w:w="9648"/>
+            <w:gridSpan w:val="3"/>
             <w:tcBorders>
               <w:top w:val="none" w:color="FFFFFF" w:sz="0"/>
               <w:left w:val="none" w:color="FFFFFF" w:sz="0"/>
@@ -32840,6 +32738,11 @@
             </w:r>
           </w:p>
         </w:tc>
+      </w:tr>
+      <w:tr>
+        <w:trPr>
+          <w:cantSplit/>
+        </w:trPr>
         <w:tc>
           <w:tcPr>
             <w:tcW w:type="dxa" w:w="4724"/>
@@ -32921,15 +32824,9 @@
             </w:r>
           </w:p>
         </w:tc>
-      </w:tr>
-      <w:tr>
-        <w:trPr>
-          <w:trHeight w:val="160" w:hRule="exact"/>
-        </w:trPr>
-        <w:tc>
-          <w:tcPr>
-            <w:tcW w:type="dxa" w:w="9648"/>
-            <w:gridSpan w:val="3"/>
+        <w:tc>
+          <w:tcPr>
+            <w:tcW w:type="dxa" w:w="200"/>
             <w:tcBorders>
               <w:top w:val="none" w:color="FFFFFF" w:sz="0"/>
               <w:left w:val="none" w:color="FFFFFF" w:sz="0"/>
@@ -32943,11 +32840,6 @@
             </w:r>
           </w:p>
         </w:tc>
-      </w:tr>
-      <w:tr>
-        <w:trPr>
-          <w:cantSplit/>
-        </w:trPr>
         <w:tc>
           <w:tcPr>
             <w:tcW w:type="dxa" w:w="4724"/>
@@ -32989,7 +32881,7 @@
                           </pic:cNvPicPr>
                         </pic:nvPicPr>
                         <pic:blipFill>
-                          <a:blip r:embed="rId27" cstate="none"/>
+                          <a:blip r:embed="rId26" cstate="none"/>
                           <a:srcRect/>
                           <a:stretch>
                             <a:fillRect/>
@@ -33026,103 +32918,6 @@
                 <w:szCs w:val="17"/>
               </w:rPr>
               <w:t xml:space="preserve">Les kiosques de restauration et les concessions</w:t>
-            </w:r>
-          </w:p>
-        </w:tc>
-        <w:tc>
-          <w:tcPr>
-            <w:tcW w:type="dxa" w:w="200"/>
-            <w:tcBorders>
-              <w:top w:val="none" w:color="FFFFFF" w:sz="0"/>
-              <w:left w:val="none" w:color="FFFFFF" w:sz="0"/>
-              <w:bottom w:val="none" w:color="FFFFFF" w:sz="0"/>
-              <w:right w:val="none" w:color="FFFFFF" w:sz="0"/>
-            </w:tcBorders>
-          </w:tcPr>
-          <w:p>
-            <w:r>
-              <w:t xml:space="preserve"/>
-            </w:r>
-          </w:p>
-        </w:tc>
-        <w:tc>
-          <w:tcPr>
-            <w:tcW w:type="dxa" w:w="4724"/>
-            <w:tcBorders>
-              <w:top w:val="none" w:color="FFFFFF" w:sz="0"/>
-              <w:left w:val="none" w:color="FFFFFF" w:sz="0"/>
-              <w:bottom w:val="none" w:color="FFFFFF" w:sz="0"/>
-              <w:right w:val="none" w:color="FFFFFF" w:sz="0"/>
-            </w:tcBorders>
-            <w:tcMar>
-              <w:top w:type="dxa" w:w="0"/>
-              <w:left w:type="dxa" w:w="0"/>
-              <w:bottom w:type="dxa" w:w="0"/>
-              <w:right w:type="dxa" w:w="0"/>
-            </w:tcMar>
-            <w:vAlign w:val="center"/>
-          </w:tcPr>
-          <w:p>
-            <w:pPr>
-              <w:spacing w:after="40"/>
-              <w:jc w:val="center"/>
-            </w:pPr>
-            <w:r>
-              <w:drawing>
-                <wp:inline distT="0" distB="0" distL="0" distR="0">
-                  <wp:extent cx="2295525" cy="2286000"/>
-                  <wp:effectExtent t="0" r="0" b="0" l="0"/>
-                  <wp:docPr id="1" name="" descr="" title=""/>
-                  <wp:cNvGraphicFramePr>
-                    <a:graphicFrameLocks xmlns:a="http://schemas.openxmlformats.org/drawingml/2006/main" noChangeAspect="1"/>
-                  </wp:cNvGraphicFramePr>
-                  <a:graphic xmlns:a="http://schemas.openxmlformats.org/drawingml/2006/main">
-                    <a:graphicData uri="http://schemas.openxmlformats.org/drawingml/2006/picture">
-                      <pic:pic xmlns:pic="http://schemas.openxmlformats.org/drawingml/2006/picture">
-                        <pic:nvPicPr>
-                          <pic:cNvPr id="0" name="" descr=""/>
-                          <pic:cNvPicPr>
-                            <a:picLocks noChangeAspect="1" noChangeArrowheads="1"/>
-                          </pic:cNvPicPr>
-                        </pic:nvPicPr>
-                        <pic:blipFill>
-                          <a:blip r:embed="rId28" cstate="none"/>
-                          <a:srcRect/>
-                          <a:stretch>
-                            <a:fillRect/>
-                          </a:stretch>
-                        </pic:blipFill>
-                        <pic:spPr bwMode="auto">
-                          <a:xfrm>
-                            <a:off x="0" y="0"/>
-                            <a:ext cx="2295525" cy="2286000"/>
-                          </a:xfrm>
-                          <a:prstGeom prst="rect">
-                            <a:avLst/>
-                          </a:prstGeom>
-                        </pic:spPr>
-                      </pic:pic>
-                    </a:graphicData>
-                  </a:graphic>
-                </wp:inline>
-              </w:drawing>
-            </w:r>
-          </w:p>
-          <w:p>
-            <w:pPr>
-              <w:spacing w:after="0"/>
-              <w:jc w:val="center"/>
-            </w:pPr>
-            <w:r>
-              <w:rPr>
-                <w:rFonts w:ascii="Calibri" w:cs="Calibri" w:eastAsia="Calibri" w:hAnsi="Calibri"/>
-                <w:i/>
-                <w:iCs/>
-                <w:color w:val="8A94A6"/>
-                <w:sz w:val="17"/>
-                <w:szCs w:val="17"/>
-              </w:rPr>
-              <w:t xml:space="preserve">Le train du resort et les guirlandes lumineuses, en soirée</w:t>
             </w:r>
           </w:p>
         </w:tc>
@@ -33291,7 +33086,7 @@
                           </pic:cNvPicPr>
                         </pic:nvPicPr>
                         <pic:blipFill>
-                          <a:blip r:embed="rId29" cstate="none"/>
+                          <a:blip r:embed="rId27" cstate="none"/>
                           <a:srcRect/>
                           <a:stretch>
                             <a:fillRect/>
@@ -33383,6 +33178,103 @@
             <w:r>
               <w:drawing>
                 <wp:inline distT="0" distB="0" distL="0" distR="0">
+                  <wp:extent cx="2286000" cy="2286000"/>
+                  <wp:effectExtent t="0" r="0" b="0" l="0"/>
+                  <wp:docPr id="1" name="" descr="" title=""/>
+                  <wp:cNvGraphicFramePr>
+                    <a:graphicFrameLocks xmlns:a="http://schemas.openxmlformats.org/drawingml/2006/main" noChangeAspect="1"/>
+                  </wp:cNvGraphicFramePr>
+                  <a:graphic xmlns:a="http://schemas.openxmlformats.org/drawingml/2006/main">
+                    <a:graphicData uri="http://schemas.openxmlformats.org/drawingml/2006/picture">
+                      <pic:pic xmlns:pic="http://schemas.openxmlformats.org/drawingml/2006/picture">
+                        <pic:nvPicPr>
+                          <pic:cNvPr id="0" name="" descr=""/>
+                          <pic:cNvPicPr>
+                            <a:picLocks noChangeAspect="1" noChangeArrowheads="1"/>
+                          </pic:cNvPicPr>
+                        </pic:nvPicPr>
+                        <pic:blipFill>
+                          <a:blip r:embed="rId28" cstate="none"/>
+                          <a:srcRect/>
+                          <a:stretch>
+                            <a:fillRect/>
+                          </a:stretch>
+                        </pic:blipFill>
+                        <pic:spPr bwMode="auto">
+                          <a:xfrm>
+                            <a:off x="0" y="0"/>
+                            <a:ext cx="2286000" cy="2286000"/>
+                          </a:xfrm>
+                          <a:prstGeom prst="rect">
+                            <a:avLst/>
+                          </a:prstGeom>
+                        </pic:spPr>
+                      </pic:pic>
+                    </a:graphicData>
+                  </a:graphic>
+                </wp:inline>
+              </w:drawing>
+            </w:r>
+          </w:p>
+          <w:p>
+            <w:pPr>
+              <w:spacing w:after="0"/>
+              <w:jc w:val="center"/>
+            </w:pPr>
+            <w:r>
+              <w:rPr>
+                <w:rFonts w:ascii="Calibri" w:cs="Calibri" w:eastAsia="Calibri" w:hAnsi="Calibri"/>
+                <w:i/>
+                <w:iCs/>
+                <w:color w:val="8A94A6"/>
+                <w:sz w:val="17"/>
+                <w:szCs w:val="17"/>
+              </w:rPr>
+              <w:t xml:space="preserve">Une famille d'invités sur la chaise géante « I ♥ Havana Resort »</w:t>
+            </w:r>
+          </w:p>
+        </w:tc>
+        <w:tc>
+          <w:tcPr>
+            <w:tcW w:type="dxa" w:w="200"/>
+            <w:tcBorders>
+              <w:top w:val="none" w:color="FFFFFF" w:sz="0"/>
+              <w:left w:val="none" w:color="FFFFFF" w:sz="0"/>
+              <w:bottom w:val="none" w:color="FFFFFF" w:sz="0"/>
+              <w:right w:val="none" w:color="FFFFFF" w:sz="0"/>
+            </w:tcBorders>
+          </w:tcPr>
+          <w:p>
+            <w:r>
+              <w:t xml:space="preserve"/>
+            </w:r>
+          </w:p>
+        </w:tc>
+        <w:tc>
+          <w:tcPr>
+            <w:tcW w:type="dxa" w:w="4724"/>
+            <w:tcBorders>
+              <w:top w:val="none" w:color="FFFFFF" w:sz="0"/>
+              <w:left w:val="none" w:color="FFFFFF" w:sz="0"/>
+              <w:bottom w:val="none" w:color="FFFFFF" w:sz="0"/>
+              <w:right w:val="none" w:color="FFFFFF" w:sz="0"/>
+            </w:tcBorders>
+            <w:tcMar>
+              <w:top w:type="dxa" w:w="0"/>
+              <w:left w:type="dxa" w:w="0"/>
+              <w:bottom w:type="dxa" w:w="0"/>
+              <w:right w:type="dxa" w:w="0"/>
+            </w:tcMar>
+            <w:vAlign w:val="center"/>
+          </w:tcPr>
+          <w:p>
+            <w:pPr>
+              <w:spacing w:after="40"/>
+              <w:jc w:val="center"/>
+            </w:pPr>
+            <w:r>
+              <w:drawing>
+                <wp:inline distT="0" distB="0" distL="0" distR="0">
                   <wp:extent cx="1276350" cy="2286000"/>
                   <wp:effectExtent t="0" r="0" b="0" l="0"/>
                   <wp:docPr id="1" name="" descr="" title=""/>
@@ -33399,7 +33291,7 @@
                           </pic:cNvPicPr>
                         </pic:nvPicPr>
                         <pic:blipFill>
-                          <a:blip r:embed="rId30" cstate="none"/>
+                          <a:blip r:embed="rId29" cstate="none"/>
                           <a:srcRect/>
                           <a:stretch>
                             <a:fillRect/>
@@ -33436,38 +33328,6 @@
                 <w:szCs w:val="17"/>
               </w:rPr>
               <w:t xml:space="preserve">Visuel des réseaux sociaux : animation aquatique</w:t>
-            </w:r>
-          </w:p>
-        </w:tc>
-        <w:tc>
-          <w:tcPr>
-            <w:tcW w:type="dxa" w:w="200"/>
-            <w:tcBorders>
-              <w:top w:val="none" w:color="FFFFFF" w:sz="0"/>
-              <w:left w:val="none" w:color="FFFFFF" w:sz="0"/>
-              <w:bottom w:val="none" w:color="FFFFFF" w:sz="0"/>
-              <w:right w:val="none" w:color="FFFFFF" w:sz="0"/>
-            </w:tcBorders>
-          </w:tcPr>
-          <w:p>
-            <w:r>
-              <w:t xml:space="preserve"/>
-            </w:r>
-          </w:p>
-        </w:tc>
-        <w:tc>
-          <w:tcPr>
-            <w:tcW w:type="dxa" w:w="4724"/>
-            <w:tcBorders>
-              <w:top w:val="none" w:color="FFFFFF" w:sz="0"/>
-              <w:left w:val="none" w:color="FFFFFF" w:sz="0"/>
-              <w:bottom w:val="none" w:color="FFFFFF" w:sz="0"/>
-              <w:right w:val="none" w:color="FFFFFF" w:sz="0"/>
-            </w:tcBorders>
-          </w:tcPr>
-          <w:p>
-            <w:r>
-              <w:t xml:space="preserve"/>
             </w:r>
           </w:p>
         </w:tc>

</xml_diff>

<commit_message>
Replacer chaque photo dans la section qu'elle appuie
Chaque photo est désormais associée à un argument précis avec une
légende qui fait le lien avec les chiffres : terrains et chalets dans
les actifs, hôtel, restauration, piscine et scène dans les composantes
du projet, famille et lac dans la clientèle, visuels dans la promotion.
La galerie en annexe ne garde que les photos non utilisées ailleurs.

Co-Authored-By: Claude Fable 5.1 <noreply@anthropic.com>
Claude-Session: https://claude.ai/code/session_01SZvZuYXZ3BuNTXPMcsdahV
</commit_message>
<xml_diff>
--- a/plan-affaires/Plan_affaires_Complexe_Havana.docx
+++ b/plan-affaires/Plan_affaires_Complexe_Havana.docx
@@ -122,7 +122,7 @@
             <w:r>
               <w:drawing>
                 <wp:inline distT="0" distB="0" distL="0" distR="0">
-                  <wp:extent cx="5867400" cy="4191000"/>
+                  <wp:extent cx="4705350" cy="3362325"/>
                   <wp:effectExtent t="0" r="0" b="0" l="0"/>
                   <wp:docPr id="1" name="" descr="" title=""/>
                   <wp:cNvGraphicFramePr>
@@ -147,7 +147,7 @@
                         <pic:spPr bwMode="auto">
                           <a:xfrm>
                             <a:off x="0" y="0"/>
-                            <a:ext cx="5867400" cy="4191000"/>
+                            <a:ext cx="4705350" cy="3362325"/>
                           </a:xfrm>
                           <a:prstGeom prst="rect">
                             <a:avLst/>
@@ -2574,6 +2574,105 @@
         <w:t xml:space="preserve">Le concept s'articule autour d'une piscine centrale avec café-bar intégré, où se déploient l'animation, la musique et l'ambiance festive et familiale des grandes destinations vacances. Au fil des saisons, l'offre s'est enrichie de chalets, de cabanas prêt-à-camper, d'un premier bâtiment hôtelier de six chambres et d'activités récréatives. Le camping est aujourd'hui devenu trop petit pour la demande.</w:t>
       </w:r>
     </w:p>
+    <w:tbl>
+      <w:tblPr>
+        <w:tblW w:type="dxa" w:w="9648"/>
+        <w:tblBorders>
+          <w:top w:val="none" w:color="FFFFFF" w:sz="0"/>
+          <w:left w:val="none" w:color="FFFFFF" w:sz="0"/>
+          <w:bottom w:val="none" w:color="FFFFFF" w:sz="0"/>
+          <w:right w:val="none" w:color="FFFFFF" w:sz="0"/>
+          <w:insideH w:val="none" w:color="FFFFFF" w:sz="0"/>
+          <w:insideV w:val="none" w:color="FFFFFF" w:sz="0"/>
+        </w:tblBorders>
+      </w:tblPr>
+      <w:tblGrid>
+        <w:gridCol w:w="9648"/>
+      </w:tblGrid>
+      <w:tr>
+        <w:tc>
+          <w:tcPr>
+            <w:tcW w:type="dxa" w:w="9648"/>
+            <w:tcBorders>
+              <w:top w:val="none" w:color="FFFFFF" w:sz="0"/>
+              <w:left w:val="none" w:color="FFFFFF" w:sz="0"/>
+              <w:bottom w:val="none" w:color="FFFFFF" w:sz="0"/>
+              <w:right w:val="none" w:color="FFFFFF" w:sz="0"/>
+            </w:tcBorders>
+            <w:tcMar>
+              <w:top w:type="dxa" w:w="0"/>
+              <w:left w:type="dxa" w:w="0"/>
+              <w:bottom w:type="dxa" w:w="0"/>
+              <w:right w:type="dxa" w:w="0"/>
+            </w:tcMar>
+            <w:vAlign w:val="center"/>
+          </w:tcPr>
+          <w:p>
+            <w:pPr>
+              <w:spacing w:after="40"/>
+              <w:jc w:val="center"/>
+            </w:pPr>
+            <w:r>
+              <w:drawing>
+                <wp:inline distT="0" distB="0" distL="0" distR="0">
+                  <wp:extent cx="2952750" cy="1781175"/>
+                  <wp:effectExtent t="0" r="0" b="0" l="0"/>
+                  <wp:docPr id="1" name="" descr="" title=""/>
+                  <wp:cNvGraphicFramePr>
+                    <a:graphicFrameLocks xmlns:a="http://schemas.openxmlformats.org/drawingml/2006/main" noChangeAspect="1"/>
+                  </wp:cNvGraphicFramePr>
+                  <a:graphic xmlns:a="http://schemas.openxmlformats.org/drawingml/2006/main">
+                    <a:graphicData uri="http://schemas.openxmlformats.org/drawingml/2006/picture">
+                      <pic:pic xmlns:pic="http://schemas.openxmlformats.org/drawingml/2006/picture">
+                        <pic:nvPicPr>
+                          <pic:cNvPr id="0" name="" descr=""/>
+                          <pic:cNvPicPr>
+                            <a:picLocks noChangeAspect="1" noChangeArrowheads="1"/>
+                          </pic:cNvPicPr>
+                        </pic:nvPicPr>
+                        <pic:blipFill>
+                          <a:blip r:embed="rId10" cstate="none"/>
+                          <a:srcRect/>
+                          <a:stretch>
+                            <a:fillRect/>
+                          </a:stretch>
+                        </pic:blipFill>
+                        <pic:spPr bwMode="auto">
+                          <a:xfrm>
+                            <a:off x="0" y="0"/>
+                            <a:ext cx="2952750" cy="1781175"/>
+                          </a:xfrm>
+                          <a:prstGeom prst="rect">
+                            <a:avLst/>
+                          </a:prstGeom>
+                        </pic:spPr>
+                      </pic:pic>
+                    </a:graphicData>
+                  </a:graphic>
+                </wp:inline>
+              </w:drawing>
+            </w:r>
+          </w:p>
+          <w:p>
+            <w:pPr>
+              <w:spacing w:after="0"/>
+              <w:jc w:val="center"/>
+            </w:pPr>
+            <w:r>
+              <w:rPr>
+                <w:rFonts w:ascii="Calibri" w:cs="Calibri" w:eastAsia="Calibri" w:hAnsi="Calibri"/>
+                <w:i/>
+                <w:iCs/>
+                <w:color w:val="8A94A6"/>
+                <w:sz w:val="17"/>
+                <w:szCs w:val="17"/>
+              </w:rPr>
+              <w:t xml:space="preserve">Le pavillon d'accueil : dès l'entrée, le toit de chaume annonce le concept cubain</w:t>
+            </w:r>
+          </w:p>
+        </w:tc>
+      </w:tr>
+    </w:tbl>
     <w:p>
       <w:pPr>
         <w:pStyle w:val="Heading2"/>
@@ -4710,104 +4809,7 @@
             <w:r>
               <w:drawing>
                 <wp:inline distT="0" distB="0" distL="0" distR="0">
-                  <wp:extent cx="3000375" cy="1809750"/>
-                  <wp:effectExtent t="0" r="0" b="0" l="0"/>
-                  <wp:docPr id="1" name="" descr="" title=""/>
-                  <wp:cNvGraphicFramePr>
-                    <a:graphicFrameLocks xmlns:a="http://schemas.openxmlformats.org/drawingml/2006/main" noChangeAspect="1"/>
-                  </wp:cNvGraphicFramePr>
-                  <a:graphic xmlns:a="http://schemas.openxmlformats.org/drawingml/2006/main">
-                    <a:graphicData uri="http://schemas.openxmlformats.org/drawingml/2006/picture">
-                      <pic:pic xmlns:pic="http://schemas.openxmlformats.org/drawingml/2006/picture">
-                        <pic:nvPicPr>
-                          <pic:cNvPr id="0" name="" descr=""/>
-                          <pic:cNvPicPr>
-                            <a:picLocks noChangeAspect="1" noChangeArrowheads="1"/>
-                          </pic:cNvPicPr>
-                        </pic:nvPicPr>
-                        <pic:blipFill>
-                          <a:blip r:embed="rId10" cstate="none"/>
-                          <a:srcRect/>
-                          <a:stretch>
-                            <a:fillRect/>
-                          </a:stretch>
-                        </pic:blipFill>
-                        <pic:spPr bwMode="auto">
-                          <a:xfrm>
-                            <a:off x="0" y="0"/>
-                            <a:ext cx="3000375" cy="1809750"/>
-                          </a:xfrm>
-                          <a:prstGeom prst="rect">
-                            <a:avLst/>
-                          </a:prstGeom>
-                        </pic:spPr>
-                      </pic:pic>
-                    </a:graphicData>
-                  </a:graphic>
-                </wp:inline>
-              </w:drawing>
-            </w:r>
-          </w:p>
-          <w:p>
-            <w:pPr>
-              <w:spacing w:after="0"/>
-              <w:jc w:val="center"/>
-            </w:pPr>
-            <w:r>
-              <w:rPr>
-                <w:rFonts w:ascii="Calibri" w:cs="Calibri" w:eastAsia="Calibri" w:hAnsi="Calibri"/>
-                <w:i/>
-                <w:iCs/>
-                <w:color w:val="8A94A6"/>
-                <w:sz w:val="17"/>
-                <w:szCs w:val="17"/>
-              </w:rPr>
-              <w:t xml:space="preserve">Le pavillon d'accueil, au toit de chaume</w:t>
-            </w:r>
-          </w:p>
-        </w:tc>
-        <w:tc>
-          <w:tcPr>
-            <w:tcW w:type="dxa" w:w="200"/>
-            <w:tcBorders>
-              <w:top w:val="none" w:color="FFFFFF" w:sz="0"/>
-              <w:left w:val="none" w:color="FFFFFF" w:sz="0"/>
-              <w:bottom w:val="none" w:color="FFFFFF" w:sz="0"/>
-              <w:right w:val="none" w:color="FFFFFF" w:sz="0"/>
-            </w:tcBorders>
-          </w:tcPr>
-          <w:p>
-            <w:r>
-              <w:t xml:space="preserve"/>
-            </w:r>
-          </w:p>
-        </w:tc>
-        <w:tc>
-          <w:tcPr>
-            <w:tcW w:type="dxa" w:w="4724"/>
-            <w:tcBorders>
-              <w:top w:val="none" w:color="FFFFFF" w:sz="0"/>
-              <w:left w:val="none" w:color="FFFFFF" w:sz="0"/>
-              <w:bottom w:val="none" w:color="FFFFFF" w:sz="0"/>
-              <w:right w:val="none" w:color="FFFFFF" w:sz="0"/>
-            </w:tcBorders>
-            <w:tcMar>
-              <w:top w:type="dxa" w:w="0"/>
-              <w:left w:type="dxa" w:w="0"/>
-              <w:bottom w:type="dxa" w:w="0"/>
-              <w:right w:type="dxa" w:w="0"/>
-            </w:tcMar>
-            <w:vAlign w:val="center"/>
-          </w:tcPr>
-          <w:p>
-            <w:pPr>
-              <w:spacing w:after="40"/>
-              <w:jc w:val="center"/>
-            </w:pPr>
-            <w:r>
-              <w:drawing>
-                <wp:inline distT="0" distB="0" distL="0" distR="0">
-                  <wp:extent cx="2876550" cy="2095500"/>
+                  <wp:extent cx="2790825" cy="2095500"/>
                   <wp:effectExtent t="0" r="0" b="0" l="0"/>
                   <wp:docPr id="1" name="" descr="" title=""/>
                   <wp:cNvGraphicFramePr>
@@ -4832,7 +4834,7 @@
                         <pic:spPr bwMode="auto">
                           <a:xfrm>
                             <a:off x="0" y="0"/>
-                            <a:ext cx="2876550" cy="2095500"/>
+                            <a:ext cx="2790825" cy="2095500"/>
                           </a:xfrm>
                           <a:prstGeom prst="rect">
                             <a:avLst/>
@@ -4859,7 +4861,104 @@
                 <w:sz w:val="17"/>
                 <w:szCs w:val="17"/>
               </w:rPr>
-              <w:t xml:space="preserve">La piscine centrale un jour de fête de la mousse</w:t>
+              <w:t xml:space="preserve">Les 265 terrains de camping : 52 % des revenus 2026, complets en haute saison</w:t>
+            </w:r>
+          </w:p>
+        </w:tc>
+        <w:tc>
+          <w:tcPr>
+            <w:tcW w:type="dxa" w:w="200"/>
+            <w:tcBorders>
+              <w:top w:val="none" w:color="FFFFFF" w:sz="0"/>
+              <w:left w:val="none" w:color="FFFFFF" w:sz="0"/>
+              <w:bottom w:val="none" w:color="FFFFFF" w:sz="0"/>
+              <w:right w:val="none" w:color="FFFFFF" w:sz="0"/>
+            </w:tcBorders>
+          </w:tcPr>
+          <w:p>
+            <w:r>
+              <w:t xml:space="preserve"/>
+            </w:r>
+          </w:p>
+        </w:tc>
+        <w:tc>
+          <w:tcPr>
+            <w:tcW w:type="dxa" w:w="4724"/>
+            <w:tcBorders>
+              <w:top w:val="none" w:color="FFFFFF" w:sz="0"/>
+              <w:left w:val="none" w:color="FFFFFF" w:sz="0"/>
+              <w:bottom w:val="none" w:color="FFFFFF" w:sz="0"/>
+              <w:right w:val="none" w:color="FFFFFF" w:sz="0"/>
+            </w:tcBorders>
+            <w:tcMar>
+              <w:top w:type="dxa" w:w="0"/>
+              <w:left w:type="dxa" w:w="0"/>
+              <w:bottom w:type="dxa" w:w="0"/>
+              <w:right w:type="dxa" w:w="0"/>
+            </w:tcMar>
+            <w:vAlign w:val="center"/>
+          </w:tcPr>
+          <w:p>
+            <w:pPr>
+              <w:spacing w:after="40"/>
+              <w:jc w:val="center"/>
+            </w:pPr>
+            <w:r>
+              <w:drawing>
+                <wp:inline distT="0" distB="0" distL="0" distR="0">
+                  <wp:extent cx="3000375" cy="1809750"/>
+                  <wp:effectExtent t="0" r="0" b="0" l="0"/>
+                  <wp:docPr id="1" name="" descr="" title=""/>
+                  <wp:cNvGraphicFramePr>
+                    <a:graphicFrameLocks xmlns:a="http://schemas.openxmlformats.org/drawingml/2006/main" noChangeAspect="1"/>
+                  </wp:cNvGraphicFramePr>
+                  <a:graphic xmlns:a="http://schemas.openxmlformats.org/drawingml/2006/main">
+                    <a:graphicData uri="http://schemas.openxmlformats.org/drawingml/2006/picture">
+                      <pic:pic xmlns:pic="http://schemas.openxmlformats.org/drawingml/2006/picture">
+                        <pic:nvPicPr>
+                          <pic:cNvPr id="0" name="" descr=""/>
+                          <pic:cNvPicPr>
+                            <a:picLocks noChangeAspect="1" noChangeArrowheads="1"/>
+                          </pic:cNvPicPr>
+                        </pic:nvPicPr>
+                        <pic:blipFill>
+                          <a:blip r:embed="rId12" cstate="none"/>
+                          <a:srcRect/>
+                          <a:stretch>
+                            <a:fillRect/>
+                          </a:stretch>
+                        </pic:blipFill>
+                        <pic:spPr bwMode="auto">
+                          <a:xfrm>
+                            <a:off x="0" y="0"/>
+                            <a:ext cx="3000375" cy="1809750"/>
+                          </a:xfrm>
+                          <a:prstGeom prst="rect">
+                            <a:avLst/>
+                          </a:prstGeom>
+                        </pic:spPr>
+                      </pic:pic>
+                    </a:graphicData>
+                  </a:graphic>
+                </wp:inline>
+              </w:drawing>
+            </w:r>
+          </w:p>
+          <w:p>
+            <w:pPr>
+              <w:spacing w:after="0"/>
+              <w:jc w:val="center"/>
+            </w:pPr>
+            <w:r>
+              <w:rPr>
+                <w:rFonts w:ascii="Calibri" w:cs="Calibri" w:eastAsia="Calibri" w:hAnsi="Calibri"/>
+                <w:i/>
+                <w:iCs/>
+                <w:color w:val="8A94A6"/>
+                <w:sz w:val="17"/>
+                <w:szCs w:val="17"/>
+              </w:rPr>
+              <w:t xml:space="preserve">Les chalets et chambres : 33 % des revenus 2026, en hausse de 24 % en un an</w:t>
             </w:r>
           </w:p>
         </w:tc>
@@ -7618,6 +7717,209 @@
         <w:t xml:space="preserve">Rénovation et agrandissement du bâtiment hôtelier existant pour porter la capacité à 17 chambres isolées et chauffées, avec une salle de conférence attenante. L'hôtel devient la pierre angulaire de l'exploitation hivernale : clientèle de couples, de groupes et d'entreprises (réunions, retraites, mariages hors saison).</w:t>
       </w:r>
     </w:p>
+    <w:tbl>
+      <w:tblPr>
+        <w:tblW w:type="dxa" w:w="9648"/>
+        <w:tblBorders>
+          <w:top w:val="none" w:color="FFFFFF" w:sz="0"/>
+          <w:left w:val="none" w:color="FFFFFF" w:sz="0"/>
+          <w:bottom w:val="none" w:color="FFFFFF" w:sz="0"/>
+          <w:right w:val="none" w:color="FFFFFF" w:sz="0"/>
+          <w:insideH w:val="none" w:color="FFFFFF" w:sz="0"/>
+          <w:insideV w:val="none" w:color="FFFFFF" w:sz="0"/>
+        </w:tblBorders>
+      </w:tblPr>
+      <w:tblGrid>
+        <w:gridCol w:w="4724"/>
+        <w:gridCol w:w="200"/>
+        <w:gridCol w:w="4724"/>
+      </w:tblGrid>
+      <w:tr>
+        <w:tc>
+          <w:tcPr>
+            <w:tcW w:type="dxa" w:w="4724"/>
+            <w:tcBorders>
+              <w:top w:val="none" w:color="FFFFFF" w:sz="0"/>
+              <w:left w:val="none" w:color="FFFFFF" w:sz="0"/>
+              <w:bottom w:val="none" w:color="FFFFFF" w:sz="0"/>
+              <w:right w:val="none" w:color="FFFFFF" w:sz="0"/>
+            </w:tcBorders>
+            <w:tcMar>
+              <w:top w:type="dxa" w:w="0"/>
+              <w:left w:type="dxa" w:w="0"/>
+              <w:bottom w:type="dxa" w:w="0"/>
+              <w:right w:type="dxa" w:w="0"/>
+            </w:tcMar>
+            <w:vAlign w:val="center"/>
+          </w:tcPr>
+          <w:p>
+            <w:pPr>
+              <w:spacing w:after="40"/>
+              <w:jc w:val="center"/>
+            </w:pPr>
+            <w:r>
+              <w:drawing>
+                <wp:inline distT="0" distB="0" distL="0" distR="0">
+                  <wp:extent cx="2543175" cy="1905000"/>
+                  <wp:effectExtent t="0" r="0" b="0" l="0"/>
+                  <wp:docPr id="1" name="" descr="" title=""/>
+                  <wp:cNvGraphicFramePr>
+                    <a:graphicFrameLocks xmlns:a="http://schemas.openxmlformats.org/drawingml/2006/main" noChangeAspect="1"/>
+                  </wp:cNvGraphicFramePr>
+                  <a:graphic xmlns:a="http://schemas.openxmlformats.org/drawingml/2006/main">
+                    <a:graphicData uri="http://schemas.openxmlformats.org/drawingml/2006/picture">
+                      <pic:pic xmlns:pic="http://schemas.openxmlformats.org/drawingml/2006/picture">
+                        <pic:nvPicPr>
+                          <pic:cNvPr id="0" name="" descr=""/>
+                          <pic:cNvPicPr>
+                            <a:picLocks noChangeAspect="1" noChangeArrowheads="1"/>
+                          </pic:cNvPicPr>
+                        </pic:nvPicPr>
+                        <pic:blipFill>
+                          <a:blip r:embed="rId13" cstate="none"/>
+                          <a:srcRect/>
+                          <a:stretch>
+                            <a:fillRect/>
+                          </a:stretch>
+                        </pic:blipFill>
+                        <pic:spPr bwMode="auto">
+                          <a:xfrm>
+                            <a:off x="0" y="0"/>
+                            <a:ext cx="2543175" cy="1905000"/>
+                          </a:xfrm>
+                          <a:prstGeom prst="rect">
+                            <a:avLst/>
+                          </a:prstGeom>
+                        </pic:spPr>
+                      </pic:pic>
+                    </a:graphicData>
+                  </a:graphic>
+                </wp:inline>
+              </w:drawing>
+            </w:r>
+          </w:p>
+          <w:p>
+            <w:pPr>
+              <w:spacing w:after="0"/>
+              <w:jc w:val="center"/>
+            </w:pPr>
+            <w:r>
+              <w:rPr>
+                <w:rFonts w:ascii="Calibri" w:cs="Calibri" w:eastAsia="Calibri" w:hAnsi="Calibri"/>
+                <w:i/>
+                <w:iCs/>
+                <w:color w:val="8A94A6"/>
+                <w:sz w:val="17"/>
+                <w:szCs w:val="17"/>
+              </w:rPr>
+              <w:t xml:space="preserve">L'entrée de l'hôtel actuel : 6 chambres, à porter à 17</w:t>
+            </w:r>
+          </w:p>
+        </w:tc>
+        <w:tc>
+          <w:tcPr>
+            <w:tcW w:type="dxa" w:w="200"/>
+            <w:tcBorders>
+              <w:top w:val="none" w:color="FFFFFF" w:sz="0"/>
+              <w:left w:val="none" w:color="FFFFFF" w:sz="0"/>
+              <w:bottom w:val="none" w:color="FFFFFF" w:sz="0"/>
+              <w:right w:val="none" w:color="FFFFFF" w:sz="0"/>
+            </w:tcBorders>
+          </w:tcPr>
+          <w:p>
+            <w:r>
+              <w:t xml:space="preserve"/>
+            </w:r>
+          </w:p>
+        </w:tc>
+        <w:tc>
+          <w:tcPr>
+            <w:tcW w:type="dxa" w:w="4724"/>
+            <w:tcBorders>
+              <w:top w:val="none" w:color="FFFFFF" w:sz="0"/>
+              <w:left w:val="none" w:color="FFFFFF" w:sz="0"/>
+              <w:bottom w:val="none" w:color="FFFFFF" w:sz="0"/>
+              <w:right w:val="none" w:color="FFFFFF" w:sz="0"/>
+            </w:tcBorders>
+            <w:tcMar>
+              <w:top w:type="dxa" w:w="0"/>
+              <w:left w:type="dxa" w:w="0"/>
+              <w:bottom w:type="dxa" w:w="0"/>
+              <w:right w:type="dxa" w:w="0"/>
+            </w:tcMar>
+            <w:vAlign w:val="center"/>
+          </w:tcPr>
+          <w:p>
+            <w:pPr>
+              <w:spacing w:after="40"/>
+              <w:jc w:val="center"/>
+            </w:pPr>
+            <w:r>
+              <w:drawing>
+                <wp:inline distT="0" distB="0" distL="0" distR="0">
+                  <wp:extent cx="3000375" cy="1685925"/>
+                  <wp:effectExtent t="0" r="0" b="0" l="0"/>
+                  <wp:docPr id="1" name="" descr="" title=""/>
+                  <wp:cNvGraphicFramePr>
+                    <a:graphicFrameLocks xmlns:a="http://schemas.openxmlformats.org/drawingml/2006/main" noChangeAspect="1"/>
+                  </wp:cNvGraphicFramePr>
+                  <a:graphic xmlns:a="http://schemas.openxmlformats.org/drawingml/2006/main">
+                    <a:graphicData uri="http://schemas.openxmlformats.org/drawingml/2006/picture">
+                      <pic:pic xmlns:pic="http://schemas.openxmlformats.org/drawingml/2006/picture">
+                        <pic:nvPicPr>
+                          <pic:cNvPr id="0" name="" descr=""/>
+                          <pic:cNvPicPr>
+                            <a:picLocks noChangeAspect="1" noChangeArrowheads="1"/>
+                          </pic:cNvPicPr>
+                        </pic:nvPicPr>
+                        <pic:blipFill>
+                          <a:blip r:embed="rId14" cstate="none"/>
+                          <a:srcRect/>
+                          <a:stretch>
+                            <a:fillRect/>
+                          </a:stretch>
+                        </pic:blipFill>
+                        <pic:spPr bwMode="auto">
+                          <a:xfrm>
+                            <a:off x="0" y="0"/>
+                            <a:ext cx="3000375" cy="1685925"/>
+                          </a:xfrm>
+                          <a:prstGeom prst="rect">
+                            <a:avLst/>
+                          </a:prstGeom>
+                        </pic:spPr>
+                      </pic:pic>
+                    </a:graphicData>
+                  </a:graphic>
+                </wp:inline>
+              </w:drawing>
+            </w:r>
+          </w:p>
+          <w:p>
+            <w:pPr>
+              <w:spacing w:after="0"/>
+              <w:jc w:val="center"/>
+            </w:pPr>
+            <w:r>
+              <w:rPr>
+                <w:rFonts w:ascii="Calibri" w:cs="Calibri" w:eastAsia="Calibri" w:hAnsi="Calibri"/>
+                <w:i/>
+                <w:iCs/>
+                <w:color w:val="8A94A6"/>
+                <w:sz w:val="17"/>
+                <w:szCs w:val="17"/>
+              </w:rPr>
+              <w:t xml:space="preserve">L'aile arrière de l'hôtel : les chambres à rénover pour une exploitation 12 mois</w:t>
+            </w:r>
+          </w:p>
+        </w:tc>
+      </w:tr>
+    </w:tbl>
+    <w:p>
+      <w:pPr>
+        <w:spacing w:after="80"/>
+      </w:pPr>
+    </w:p>
     <w:p>
       <w:pPr>
         <w:pStyle w:val="Heading3"/>
@@ -7647,6 +7949,209 @@
         </w:rPr>
         <w:t xml:space="preserve">Aménagement d'un restaurant de cuisine cubaine et latino-américaine dans l'hôtel, ouvert à la clientèle du site et au public régional. Le restaurant, le café Cubano et le Mojito bar forment un pôle de restauration qui capte une part des dépenses des invités aujourd'hui réalisées hors site.</w:t>
       </w:r>
+    </w:p>
+    <w:tbl>
+      <w:tblPr>
+        <w:tblW w:type="dxa" w:w="9648"/>
+        <w:tblBorders>
+          <w:top w:val="none" w:color="FFFFFF" w:sz="0"/>
+          <w:left w:val="none" w:color="FFFFFF" w:sz="0"/>
+          <w:bottom w:val="none" w:color="FFFFFF" w:sz="0"/>
+          <w:right w:val="none" w:color="FFFFFF" w:sz="0"/>
+          <w:insideH w:val="none" w:color="FFFFFF" w:sz="0"/>
+          <w:insideV w:val="none" w:color="FFFFFF" w:sz="0"/>
+        </w:tblBorders>
+      </w:tblPr>
+      <w:tblGrid>
+        <w:gridCol w:w="4724"/>
+        <w:gridCol w:w="200"/>
+        <w:gridCol w:w="4724"/>
+      </w:tblGrid>
+      <w:tr>
+        <w:tc>
+          <w:tcPr>
+            <w:tcW w:type="dxa" w:w="4724"/>
+            <w:tcBorders>
+              <w:top w:val="none" w:color="FFFFFF" w:sz="0"/>
+              <w:left w:val="none" w:color="FFFFFF" w:sz="0"/>
+              <w:bottom w:val="none" w:color="FFFFFF" w:sz="0"/>
+              <w:right w:val="none" w:color="FFFFFF" w:sz="0"/>
+            </w:tcBorders>
+            <w:tcMar>
+              <w:top w:type="dxa" w:w="0"/>
+              <w:left w:type="dxa" w:w="0"/>
+              <w:bottom w:type="dxa" w:w="0"/>
+              <w:right w:type="dxa" w:w="0"/>
+            </w:tcMar>
+            <w:vAlign w:val="center"/>
+          </w:tcPr>
+          <w:p>
+            <w:pPr>
+              <w:spacing w:after="40"/>
+              <w:jc w:val="center"/>
+            </w:pPr>
+            <w:r>
+              <w:drawing>
+                <wp:inline distT="0" distB="0" distL="0" distR="0">
+                  <wp:extent cx="1428750" cy="1905000"/>
+                  <wp:effectExtent t="0" r="0" b="0" l="0"/>
+                  <wp:docPr id="1" name="" descr="" title=""/>
+                  <wp:cNvGraphicFramePr>
+                    <a:graphicFrameLocks xmlns:a="http://schemas.openxmlformats.org/drawingml/2006/main" noChangeAspect="1"/>
+                  </wp:cNvGraphicFramePr>
+                  <a:graphic xmlns:a="http://schemas.openxmlformats.org/drawingml/2006/main">
+                    <a:graphicData uri="http://schemas.openxmlformats.org/drawingml/2006/picture">
+                      <pic:pic xmlns:pic="http://schemas.openxmlformats.org/drawingml/2006/picture">
+                        <pic:nvPicPr>
+                          <pic:cNvPr id="0" name="" descr=""/>
+                          <pic:cNvPicPr>
+                            <a:picLocks noChangeAspect="1" noChangeArrowheads="1"/>
+                          </pic:cNvPicPr>
+                        </pic:nvPicPr>
+                        <pic:blipFill>
+                          <a:blip r:embed="rId15" cstate="none"/>
+                          <a:srcRect/>
+                          <a:stretch>
+                            <a:fillRect/>
+                          </a:stretch>
+                        </pic:blipFill>
+                        <pic:spPr bwMode="auto">
+                          <a:xfrm>
+                            <a:off x="0" y="0"/>
+                            <a:ext cx="1428750" cy="1905000"/>
+                          </a:xfrm>
+                          <a:prstGeom prst="rect">
+                            <a:avLst/>
+                          </a:prstGeom>
+                        </pic:spPr>
+                      </pic:pic>
+                    </a:graphicData>
+                  </a:graphic>
+                </wp:inline>
+              </w:drawing>
+            </w:r>
+          </w:p>
+          <w:p>
+            <w:pPr>
+              <w:spacing w:after="0"/>
+              <w:jc w:val="center"/>
+            </w:pPr>
+            <w:r>
+              <w:rPr>
+                <w:rFonts w:ascii="Calibri" w:cs="Calibri" w:eastAsia="Calibri" w:hAnsi="Calibri"/>
+                <w:i/>
+                <w:iCs/>
+                <w:color w:val="8A94A6"/>
+                <w:sz w:val="17"/>
+                <w:szCs w:val="17"/>
+              </w:rPr>
+              <w:t xml:space="preserve">L'Aqua Bar : la vente de boissons fonctionne déjà, le restaurant Madera y ajoute les repas</w:t>
+            </w:r>
+          </w:p>
+        </w:tc>
+        <w:tc>
+          <w:tcPr>
+            <w:tcW w:type="dxa" w:w="200"/>
+            <w:tcBorders>
+              <w:top w:val="none" w:color="FFFFFF" w:sz="0"/>
+              <w:left w:val="none" w:color="FFFFFF" w:sz="0"/>
+              <w:bottom w:val="none" w:color="FFFFFF" w:sz="0"/>
+              <w:right w:val="none" w:color="FFFFFF" w:sz="0"/>
+            </w:tcBorders>
+          </w:tcPr>
+          <w:p>
+            <w:r>
+              <w:t xml:space="preserve"/>
+            </w:r>
+          </w:p>
+        </w:tc>
+        <w:tc>
+          <w:tcPr>
+            <w:tcW w:type="dxa" w:w="4724"/>
+            <w:tcBorders>
+              <w:top w:val="none" w:color="FFFFFF" w:sz="0"/>
+              <w:left w:val="none" w:color="FFFFFF" w:sz="0"/>
+              <w:bottom w:val="none" w:color="FFFFFF" w:sz="0"/>
+              <w:right w:val="none" w:color="FFFFFF" w:sz="0"/>
+            </w:tcBorders>
+            <w:tcMar>
+              <w:top w:type="dxa" w:w="0"/>
+              <w:left w:type="dxa" w:w="0"/>
+              <w:bottom w:type="dxa" w:w="0"/>
+              <w:right w:type="dxa" w:w="0"/>
+            </w:tcMar>
+            <w:vAlign w:val="center"/>
+          </w:tcPr>
+          <w:p>
+            <w:pPr>
+              <w:spacing w:after="40"/>
+              <w:jc w:val="center"/>
+            </w:pPr>
+            <w:r>
+              <w:drawing>
+                <wp:inline distT="0" distB="0" distL="0" distR="0">
+                  <wp:extent cx="2543175" cy="1905000"/>
+                  <wp:effectExtent t="0" r="0" b="0" l="0"/>
+                  <wp:docPr id="1" name="" descr="" title=""/>
+                  <wp:cNvGraphicFramePr>
+                    <a:graphicFrameLocks xmlns:a="http://schemas.openxmlformats.org/drawingml/2006/main" noChangeAspect="1"/>
+                  </wp:cNvGraphicFramePr>
+                  <a:graphic xmlns:a="http://schemas.openxmlformats.org/drawingml/2006/main">
+                    <a:graphicData uri="http://schemas.openxmlformats.org/drawingml/2006/picture">
+                      <pic:pic xmlns:pic="http://schemas.openxmlformats.org/drawingml/2006/picture">
+                        <pic:nvPicPr>
+                          <pic:cNvPr id="0" name="" descr=""/>
+                          <pic:cNvPicPr>
+                            <a:picLocks noChangeAspect="1" noChangeArrowheads="1"/>
+                          </pic:cNvPicPr>
+                        </pic:nvPicPr>
+                        <pic:blipFill>
+                          <a:blip r:embed="rId16" cstate="none"/>
+                          <a:srcRect/>
+                          <a:stretch>
+                            <a:fillRect/>
+                          </a:stretch>
+                        </pic:blipFill>
+                        <pic:spPr bwMode="auto">
+                          <a:xfrm>
+                            <a:off x="0" y="0"/>
+                            <a:ext cx="2543175" cy="1905000"/>
+                          </a:xfrm>
+                          <a:prstGeom prst="rect">
+                            <a:avLst/>
+                          </a:prstGeom>
+                        </pic:spPr>
+                      </pic:pic>
+                    </a:graphicData>
+                  </a:graphic>
+                </wp:inline>
+              </w:drawing>
+            </w:r>
+          </w:p>
+          <w:p>
+            <w:pPr>
+              <w:spacing w:after="0"/>
+              <w:jc w:val="center"/>
+            </w:pPr>
+            <w:r>
+              <w:rPr>
+                <w:rFonts w:ascii="Calibri" w:cs="Calibri" w:eastAsia="Calibri" w:hAnsi="Calibri"/>
+                <w:i/>
+                <w:iCs/>
+                <w:color w:val="8A94A6"/>
+                <w:sz w:val="17"/>
+                <w:szCs w:val="17"/>
+              </w:rPr>
+              <w:t xml:space="preserve">Les kiosques et concessions actuels : une offre saisonnière que le restaurant rend permanente</w:t>
+            </w:r>
+          </w:p>
+        </w:tc>
+      </w:tr>
+    </w:tbl>
+    <w:p>
+      <w:pPr>
+        <w:spacing w:after="80"/>
+      </w:pPr>
     </w:p>
     <w:p>
       <w:pPr>
@@ -7738,6 +8243,110 @@
         <w:t xml:space="preserve">Construction d'une piscine intérieure-extérieure chauffée et d'un spa de type nordique (bains chauds, sauna, aires de détente). Le spa attire une clientèle de jour en toute saison et prolonge la durée des séjours en hiver. Il s'agit de l'investissement le plus important du projet et du principal moteur de fréquentation hivernale.</w:t>
       </w:r>
     </w:p>
+    <w:tbl>
+      <w:tblPr>
+        <w:tblW w:type="dxa" w:w="9648"/>
+        <w:tblBorders>
+          <w:top w:val="none" w:color="FFFFFF" w:sz="0"/>
+          <w:left w:val="none" w:color="FFFFFF" w:sz="0"/>
+          <w:bottom w:val="none" w:color="FFFFFF" w:sz="0"/>
+          <w:right w:val="none" w:color="FFFFFF" w:sz="0"/>
+          <w:insideH w:val="none" w:color="FFFFFF" w:sz="0"/>
+          <w:insideV w:val="none" w:color="FFFFFF" w:sz="0"/>
+        </w:tblBorders>
+      </w:tblPr>
+      <w:tblGrid>
+        <w:gridCol w:w="9648"/>
+      </w:tblGrid>
+      <w:tr>
+        <w:tc>
+          <w:tcPr>
+            <w:tcW w:type="dxa" w:w="9648"/>
+            <w:tcBorders>
+              <w:top w:val="none" w:color="FFFFFF" w:sz="0"/>
+              <w:left w:val="none" w:color="FFFFFF" w:sz="0"/>
+              <w:bottom w:val="none" w:color="FFFFFF" w:sz="0"/>
+              <w:right w:val="none" w:color="FFFFFF" w:sz="0"/>
+            </w:tcBorders>
+            <w:tcMar>
+              <w:top w:type="dxa" w:w="0"/>
+              <w:left w:type="dxa" w:w="0"/>
+              <w:bottom w:type="dxa" w:w="0"/>
+              <w:right w:type="dxa" w:w="0"/>
+            </w:tcMar>
+            <w:vAlign w:val="center"/>
+          </w:tcPr>
+          <w:p>
+            <w:pPr>
+              <w:spacing w:after="40"/>
+              <w:jc w:val="center"/>
+            </w:pPr>
+            <w:r>
+              <w:drawing>
+                <wp:inline distT="0" distB="0" distL="0" distR="0">
+                  <wp:extent cx="2962275" cy="2162175"/>
+                  <wp:effectExtent t="0" r="0" b="0" l="0"/>
+                  <wp:docPr id="1" name="" descr="" title=""/>
+                  <wp:cNvGraphicFramePr>
+                    <a:graphicFrameLocks xmlns:a="http://schemas.openxmlformats.org/drawingml/2006/main" noChangeAspect="1"/>
+                  </wp:cNvGraphicFramePr>
+                  <a:graphic xmlns:a="http://schemas.openxmlformats.org/drawingml/2006/main">
+                    <a:graphicData uri="http://schemas.openxmlformats.org/drawingml/2006/picture">
+                      <pic:pic xmlns:pic="http://schemas.openxmlformats.org/drawingml/2006/picture">
+                        <pic:nvPicPr>
+                          <pic:cNvPr id="0" name="" descr=""/>
+                          <pic:cNvPicPr>
+                            <a:picLocks noChangeAspect="1" noChangeArrowheads="1"/>
+                          </pic:cNvPicPr>
+                        </pic:nvPicPr>
+                        <pic:blipFill>
+                          <a:blip r:embed="rId17" cstate="none"/>
+                          <a:srcRect/>
+                          <a:stretch>
+                            <a:fillRect/>
+                          </a:stretch>
+                        </pic:blipFill>
+                        <pic:spPr bwMode="auto">
+                          <a:xfrm>
+                            <a:off x="0" y="0"/>
+                            <a:ext cx="2962275" cy="2162175"/>
+                          </a:xfrm>
+                          <a:prstGeom prst="rect">
+                            <a:avLst/>
+                          </a:prstGeom>
+                        </pic:spPr>
+                      </pic:pic>
+                    </a:graphicData>
+                  </a:graphic>
+                </wp:inline>
+              </w:drawing>
+            </w:r>
+          </w:p>
+          <w:p>
+            <w:pPr>
+              <w:spacing w:after="0"/>
+              <w:jc w:val="center"/>
+            </w:pPr>
+            <w:r>
+              <w:rPr>
+                <w:rFonts w:ascii="Calibri" w:cs="Calibri" w:eastAsia="Calibri" w:hAnsi="Calibri"/>
+                <w:i/>
+                <w:iCs/>
+                <w:color w:val="8A94A6"/>
+                <w:sz w:val="17"/>
+                <w:szCs w:val="17"/>
+              </w:rPr>
+              <w:t xml:space="preserve">La piscine actuelle, pleine chaque été : le spa 4 saisons prolonge cette attraction à l'année</w:t>
+            </w:r>
+          </w:p>
+        </w:tc>
+      </w:tr>
+    </w:tbl>
+    <w:p>
+      <w:pPr>
+        <w:spacing w:after="80"/>
+      </w:pPr>
+    </w:p>
     <w:p>
       <w:pPr>
         <w:pStyle w:val="Heading3"/>
@@ -7768,11 +8377,6 @@
         <w:t xml:space="preserve">L'amphithéâtre extérieur accueille spectacles, soirées cubaines et festivals ; le sentier lumineux, un parcours nocturne illuminé exploité d'octobre à avril, crée une raison de visiter le site en basse saison.</w:t>
       </w:r>
     </w:p>
-    <w:p>
-      <w:pPr>
-        <w:spacing w:after="120"/>
-      </w:pPr>
-    </w:p>
     <w:tbl>
       <w:tblPr>
         <w:tblW w:type="dxa" w:w="9648"/>
@@ -7816,7 +8420,7 @@
             <w:r>
               <w:drawing>
                 <wp:inline distT="0" distB="0" distL="0" distR="0">
-                  <wp:extent cx="2790825" cy="2095500"/>
+                  <wp:extent cx="2543175" cy="1905000"/>
                   <wp:effectExtent t="0" r="0" b="0" l="0"/>
                   <wp:docPr id="1" name="" descr="" title=""/>
                   <wp:cNvGraphicFramePr>
@@ -7832,7 +8436,7 @@
                           </pic:cNvPicPr>
                         </pic:nvPicPr>
                         <pic:blipFill>
-                          <a:blip r:embed="rId12" cstate="none"/>
+                          <a:blip r:embed="rId18" cstate="none"/>
                           <a:srcRect/>
                           <a:stretch>
                             <a:fillRect/>
@@ -7841,7 +8445,7 @@
                         <pic:spPr bwMode="auto">
                           <a:xfrm>
                             <a:off x="0" y="0"/>
-                            <a:ext cx="2790825" cy="2095500"/>
+                            <a:ext cx="2543175" cy="1905000"/>
                           </a:xfrm>
                           <a:prstGeom prst="rect">
                             <a:avLst/>
@@ -7868,7 +8472,7 @@
                 <w:sz w:val="17"/>
                 <w:szCs w:val="17"/>
               </w:rPr>
-              <w:t xml:space="preserve">Le bâtiment hôtelier actuel, à agrandir à 17 chambres</w:t>
+              <w:t xml:space="preserve">La scène extérieure actuelle, un soir de spectacle : l'amphithéâtre lui donne une capacité permanente</w:t>
             </w:r>
           </w:p>
         </w:tc>
@@ -7913,7 +8517,7 @@
             <w:r>
               <w:drawing>
                 <wp:inline distT="0" distB="0" distL="0" distR="0">
-                  <wp:extent cx="3000375" cy="1809750"/>
+                  <wp:extent cx="1914525" cy="1905000"/>
                   <wp:effectExtent t="0" r="0" b="0" l="0"/>
                   <wp:docPr id="1" name="" descr="" title=""/>
                   <wp:cNvGraphicFramePr>
@@ -7929,7 +8533,7 @@
                           </pic:cNvPicPr>
                         </pic:nvPicPr>
                         <pic:blipFill>
-                          <a:blip r:embed="rId13" cstate="none"/>
+                          <a:blip r:embed="rId19" cstate="none"/>
                           <a:srcRect/>
                           <a:stretch>
                             <a:fillRect/>
@@ -7938,7 +8542,7 @@
                         <pic:spPr bwMode="auto">
                           <a:xfrm>
                             <a:off x="0" y="0"/>
-                            <a:ext cx="3000375" cy="1809750"/>
+                            <a:ext cx="1914525" cy="1905000"/>
                           </a:xfrm>
                           <a:prstGeom prst="rect">
                             <a:avLst/>
@@ -7965,7 +8569,7 @@
                 <w:sz w:val="17"/>
                 <w:szCs w:val="17"/>
               </w:rPr>
-              <w:t xml:space="preserve">Les chalets existants, à mettre à niveau pour l'exploitation quatre saisons</w:t>
+              <w:t xml:space="preserve">Le train et les guirlandes en soirée : l'animation nocturne existe, le sentier lumineux l'étend à l'hiver</w:t>
             </w:r>
           </w:p>
         </w:tc>
@@ -8033,7 +8637,7 @@
                           </pic:cNvPicPr>
                         </pic:nvPicPr>
                         <pic:blipFill>
-                          <a:blip r:embed="rId14" cstate="none"/>
+                          <a:blip r:embed="rId20" cstate="none"/>
                           <a:srcRect/>
                           <a:stretch>
                             <a:fillRect/>
@@ -8117,7 +8721,7 @@
                     </pic:cNvPicPr>
                   </pic:nvPicPr>
                   <pic:blipFill>
-                    <a:blip r:embed="rId15" cstate="none"/>
+                    <a:blip r:embed="rId21" cstate="none"/>
                     <a:srcRect/>
                     <a:stretch>
                       <a:fillRect/>
@@ -9448,6 +10052,209 @@
     </w:tbl>
     <w:p>
       <w:pPr>
+        <w:spacing w:after="80"/>
+      </w:pPr>
+    </w:p>
+    <w:tbl>
+      <w:tblPr>
+        <w:tblW w:type="dxa" w:w="9648"/>
+        <w:tblBorders>
+          <w:top w:val="none" w:color="FFFFFF" w:sz="0"/>
+          <w:left w:val="none" w:color="FFFFFF" w:sz="0"/>
+          <w:bottom w:val="none" w:color="FFFFFF" w:sz="0"/>
+          <w:right w:val="none" w:color="FFFFFF" w:sz="0"/>
+          <w:insideH w:val="none" w:color="FFFFFF" w:sz="0"/>
+          <w:insideV w:val="none" w:color="FFFFFF" w:sz="0"/>
+        </w:tblBorders>
+      </w:tblPr>
+      <w:tblGrid>
+        <w:gridCol w:w="4724"/>
+        <w:gridCol w:w="200"/>
+        <w:gridCol w:w="4724"/>
+      </w:tblGrid>
+      <w:tr>
+        <w:tc>
+          <w:tcPr>
+            <w:tcW w:type="dxa" w:w="4724"/>
+            <w:tcBorders>
+              <w:top w:val="none" w:color="FFFFFF" w:sz="0"/>
+              <w:left w:val="none" w:color="FFFFFF" w:sz="0"/>
+              <w:bottom w:val="none" w:color="FFFFFF" w:sz="0"/>
+              <w:right w:val="none" w:color="FFFFFF" w:sz="0"/>
+            </w:tcBorders>
+            <w:tcMar>
+              <w:top w:type="dxa" w:w="0"/>
+              <w:left w:type="dxa" w:w="0"/>
+              <w:bottom w:type="dxa" w:w="0"/>
+              <w:right w:type="dxa" w:w="0"/>
+            </w:tcMar>
+            <w:vAlign w:val="center"/>
+          </w:tcPr>
+          <w:p>
+            <w:pPr>
+              <w:spacing w:after="40"/>
+              <w:jc w:val="center"/>
+            </w:pPr>
+            <w:r>
+              <w:drawing>
+                <wp:inline distT="0" distB="0" distL="0" distR="0">
+                  <wp:extent cx="1905000" cy="1905000"/>
+                  <wp:effectExtent t="0" r="0" b="0" l="0"/>
+                  <wp:docPr id="1" name="" descr="" title=""/>
+                  <wp:cNvGraphicFramePr>
+                    <a:graphicFrameLocks xmlns:a="http://schemas.openxmlformats.org/drawingml/2006/main" noChangeAspect="1"/>
+                  </wp:cNvGraphicFramePr>
+                  <a:graphic xmlns:a="http://schemas.openxmlformats.org/drawingml/2006/main">
+                    <a:graphicData uri="http://schemas.openxmlformats.org/drawingml/2006/picture">
+                      <pic:pic xmlns:pic="http://schemas.openxmlformats.org/drawingml/2006/picture">
+                        <pic:nvPicPr>
+                          <pic:cNvPr id="0" name="" descr=""/>
+                          <pic:cNvPicPr>
+                            <a:picLocks noChangeAspect="1" noChangeArrowheads="1"/>
+                          </pic:cNvPicPr>
+                        </pic:nvPicPr>
+                        <pic:blipFill>
+                          <a:blip r:embed="rId22" cstate="none"/>
+                          <a:srcRect/>
+                          <a:stretch>
+                            <a:fillRect/>
+                          </a:stretch>
+                        </pic:blipFill>
+                        <pic:spPr bwMode="auto">
+                          <a:xfrm>
+                            <a:off x="0" y="0"/>
+                            <a:ext cx="1905000" cy="1905000"/>
+                          </a:xfrm>
+                          <a:prstGeom prst="rect">
+                            <a:avLst/>
+                          </a:prstGeom>
+                        </pic:spPr>
+                      </pic:pic>
+                    </a:graphicData>
+                  </a:graphic>
+                </wp:inline>
+              </w:drawing>
+            </w:r>
+          </w:p>
+          <w:p>
+            <w:pPr>
+              <w:spacing w:after="0"/>
+              <w:jc w:val="center"/>
+            </w:pPr>
+            <w:r>
+              <w:rPr>
+                <w:rFonts w:ascii="Calibri" w:cs="Calibri" w:eastAsia="Calibri" w:hAnsi="Calibri"/>
+                <w:i/>
+                <w:iCs/>
+                <w:color w:val="8A94A6"/>
+                <w:sz w:val="17"/>
+                <w:szCs w:val="17"/>
+              </w:rPr>
+              <w:t xml:space="preserve">Le cœur de la clientèle : les familles, qui reviennent d'une année à l'autre</w:t>
+            </w:r>
+          </w:p>
+        </w:tc>
+        <w:tc>
+          <w:tcPr>
+            <w:tcW w:type="dxa" w:w="200"/>
+            <w:tcBorders>
+              <w:top w:val="none" w:color="FFFFFF" w:sz="0"/>
+              <w:left w:val="none" w:color="FFFFFF" w:sz="0"/>
+              <w:bottom w:val="none" w:color="FFFFFF" w:sz="0"/>
+              <w:right w:val="none" w:color="FFFFFF" w:sz="0"/>
+            </w:tcBorders>
+          </w:tcPr>
+          <w:p>
+            <w:r>
+              <w:t xml:space="preserve"/>
+            </w:r>
+          </w:p>
+        </w:tc>
+        <w:tc>
+          <w:tcPr>
+            <w:tcW w:type="dxa" w:w="4724"/>
+            <w:tcBorders>
+              <w:top w:val="none" w:color="FFFFFF" w:sz="0"/>
+              <w:left w:val="none" w:color="FFFFFF" w:sz="0"/>
+              <w:bottom w:val="none" w:color="FFFFFF" w:sz="0"/>
+              <w:right w:val="none" w:color="FFFFFF" w:sz="0"/>
+            </w:tcBorders>
+            <w:tcMar>
+              <w:top w:type="dxa" w:w="0"/>
+              <w:left w:type="dxa" w:w="0"/>
+              <w:bottom w:type="dxa" w:w="0"/>
+              <w:right w:type="dxa" w:w="0"/>
+            </w:tcMar>
+            <w:vAlign w:val="center"/>
+          </w:tcPr>
+          <w:p>
+            <w:pPr>
+              <w:spacing w:after="40"/>
+              <w:jc w:val="center"/>
+            </w:pPr>
+            <w:r>
+              <w:drawing>
+                <wp:inline distT="0" distB="0" distL="0" distR="0">
+                  <wp:extent cx="1514475" cy="1905000"/>
+                  <wp:effectExtent t="0" r="0" b="0" l="0"/>
+                  <wp:docPr id="1" name="" descr="" title=""/>
+                  <wp:cNvGraphicFramePr>
+                    <a:graphicFrameLocks xmlns:a="http://schemas.openxmlformats.org/drawingml/2006/main" noChangeAspect="1"/>
+                  </wp:cNvGraphicFramePr>
+                  <a:graphic xmlns:a="http://schemas.openxmlformats.org/drawingml/2006/main">
+                    <a:graphicData uri="http://schemas.openxmlformats.org/drawingml/2006/picture">
+                      <pic:pic xmlns:pic="http://schemas.openxmlformats.org/drawingml/2006/picture">
+                        <pic:nvPicPr>
+                          <pic:cNvPr id="0" name="" descr=""/>
+                          <pic:cNvPicPr>
+                            <a:picLocks noChangeAspect="1" noChangeArrowheads="1"/>
+                          </pic:cNvPicPr>
+                        </pic:nvPicPr>
+                        <pic:blipFill>
+                          <a:blip r:embed="rId23" cstate="none"/>
+                          <a:srcRect/>
+                          <a:stretch>
+                            <a:fillRect/>
+                          </a:stretch>
+                        </pic:blipFill>
+                        <pic:spPr bwMode="auto">
+                          <a:xfrm>
+                            <a:off x="0" y="0"/>
+                            <a:ext cx="1514475" cy="1905000"/>
+                          </a:xfrm>
+                          <a:prstGeom prst="rect">
+                            <a:avLst/>
+                          </a:prstGeom>
+                        </pic:spPr>
+                      </pic:pic>
+                    </a:graphicData>
+                  </a:graphic>
+                </wp:inline>
+              </w:drawing>
+            </w:r>
+          </w:p>
+          <w:p>
+            <w:pPr>
+              <w:spacing w:after="0"/>
+              <w:jc w:val="center"/>
+            </w:pPr>
+            <w:r>
+              <w:rPr>
+                <w:rFonts w:ascii="Calibri" w:cs="Calibri" w:eastAsia="Calibri" w:hAnsi="Calibri"/>
+                <w:i/>
+                <w:iCs/>
+                <w:color w:val="8A94A6"/>
+                <w:sz w:val="17"/>
+                <w:szCs w:val="17"/>
+              </w:rPr>
+              <w:t xml:space="preserve">Le lac et sa plage : l'offre détente qui attire couples et clientèle de jour</w:t>
+            </w:r>
+          </w:p>
+        </w:tc>
+      </w:tr>
+    </w:tbl>
+    <w:p>
+      <w:pPr>
         <w:pStyle w:val="Heading2"/>
         <w:keepNext/>
         <w:spacing w:after="120" w:before="300"/>
@@ -11469,6 +12276,204 @@
         <w:t xml:space="preserve">festival cubain estival, soirées à l'amphithéâtre, programmation hivernale du sentier lumineux.</w:t>
       </w:r>
     </w:p>
+    <w:tbl>
+      <w:tblPr>
+        <w:tblW w:type="dxa" w:w="9648"/>
+        <w:tblBorders>
+          <w:top w:val="none" w:color="FFFFFF" w:sz="0"/>
+          <w:left w:val="none" w:color="FFFFFF" w:sz="0"/>
+          <w:bottom w:val="none" w:color="FFFFFF" w:sz="0"/>
+          <w:right w:val="none" w:color="FFFFFF" w:sz="0"/>
+          <w:insideH w:val="none" w:color="FFFFFF" w:sz="0"/>
+          <w:insideV w:val="none" w:color="FFFFFF" w:sz="0"/>
+        </w:tblBorders>
+      </w:tblPr>
+      <w:tblGrid>
+        <w:gridCol w:w="4724"/>
+        <w:gridCol w:w="200"/>
+        <w:gridCol w:w="4724"/>
+      </w:tblGrid>
+      <w:tr>
+        <w:tc>
+          <w:tcPr>
+            <w:tcW w:type="dxa" w:w="4724"/>
+            <w:tcBorders>
+              <w:top w:val="none" w:color="FFFFFF" w:sz="0"/>
+              <w:left w:val="none" w:color="FFFFFF" w:sz="0"/>
+              <w:bottom w:val="none" w:color="FFFFFF" w:sz="0"/>
+              <w:right w:val="none" w:color="FFFFFF" w:sz="0"/>
+            </w:tcBorders>
+            <w:tcMar>
+              <w:top w:type="dxa" w:w="0"/>
+              <w:left w:type="dxa" w:w="0"/>
+              <w:bottom w:type="dxa" w:w="0"/>
+              <w:right w:type="dxa" w:w="0"/>
+            </w:tcMar>
+            <w:vAlign w:val="center"/>
+          </w:tcPr>
+          <w:p>
+            <w:pPr>
+              <w:spacing w:after="40"/>
+              <w:jc w:val="center"/>
+            </w:pPr>
+            <w:r>
+              <w:drawing>
+                <wp:inline distT="0" distB="0" distL="0" distR="0">
+                  <wp:extent cx="1133475" cy="2028825"/>
+                  <wp:effectExtent t="0" r="0" b="0" l="0"/>
+                  <wp:docPr id="1" name="" descr="" title=""/>
+                  <wp:cNvGraphicFramePr>
+                    <a:graphicFrameLocks xmlns:a="http://schemas.openxmlformats.org/drawingml/2006/main" noChangeAspect="1"/>
+                  </wp:cNvGraphicFramePr>
+                  <a:graphic xmlns:a="http://schemas.openxmlformats.org/drawingml/2006/main">
+                    <a:graphicData uri="http://schemas.openxmlformats.org/drawingml/2006/picture">
+                      <pic:pic xmlns:pic="http://schemas.openxmlformats.org/drawingml/2006/picture">
+                        <pic:nvPicPr>
+                          <pic:cNvPr id="0" name="" descr=""/>
+                          <pic:cNvPicPr>
+                            <a:picLocks noChangeAspect="1" noChangeArrowheads="1"/>
+                          </pic:cNvPicPr>
+                        </pic:nvPicPr>
+                        <pic:blipFill>
+                          <a:blip r:embed="rId24" cstate="none"/>
+                          <a:srcRect/>
+                          <a:stretch>
+                            <a:fillRect/>
+                          </a:stretch>
+                        </pic:blipFill>
+                        <pic:spPr bwMode="auto">
+                          <a:xfrm>
+                            <a:off x="0" y="0"/>
+                            <a:ext cx="1133475" cy="2028825"/>
+                          </a:xfrm>
+                          <a:prstGeom prst="rect">
+                            <a:avLst/>
+                          </a:prstGeom>
+                        </pic:spPr>
+                      </pic:pic>
+                    </a:graphicData>
+                  </a:graphic>
+                </wp:inline>
+              </w:drawing>
+            </w:r>
+          </w:p>
+          <w:p>
+            <w:pPr>
+              <w:spacing w:after="0"/>
+              <w:jc w:val="center"/>
+            </w:pPr>
+            <w:r>
+              <w:rPr>
+                <w:rFonts w:ascii="Calibri" w:cs="Calibri" w:eastAsia="Calibri" w:hAnsi="Calibri"/>
+                <w:i/>
+                <w:iCs/>
+                <w:color w:val="8A94A6"/>
+                <w:sz w:val="17"/>
+                <w:szCs w:val="17"/>
+              </w:rPr>
+              <w:t xml:space="preserve">Contenu vidéo des réseaux sociaux : animation aquatique</w:t>
+            </w:r>
+          </w:p>
+        </w:tc>
+        <w:tc>
+          <w:tcPr>
+            <w:tcW w:type="dxa" w:w="200"/>
+            <w:tcBorders>
+              <w:top w:val="none" w:color="FFFFFF" w:sz="0"/>
+              <w:left w:val="none" w:color="FFFFFF" w:sz="0"/>
+              <w:bottom w:val="none" w:color="FFFFFF" w:sz="0"/>
+              <w:right w:val="none" w:color="FFFFFF" w:sz="0"/>
+            </w:tcBorders>
+          </w:tcPr>
+          <w:p>
+            <w:r>
+              <w:t xml:space="preserve"/>
+            </w:r>
+          </w:p>
+        </w:tc>
+        <w:tc>
+          <w:tcPr>
+            <w:tcW w:type="dxa" w:w="4724"/>
+            <w:tcBorders>
+              <w:top w:val="none" w:color="FFFFFF" w:sz="0"/>
+              <w:left w:val="none" w:color="FFFFFF" w:sz="0"/>
+              <w:bottom w:val="none" w:color="FFFFFF" w:sz="0"/>
+              <w:right w:val="none" w:color="FFFFFF" w:sz="0"/>
+            </w:tcBorders>
+            <w:tcMar>
+              <w:top w:type="dxa" w:w="0"/>
+              <w:left w:type="dxa" w:w="0"/>
+              <w:bottom w:type="dxa" w:w="0"/>
+              <w:right w:type="dxa" w:w="0"/>
+            </w:tcMar>
+            <w:vAlign w:val="center"/>
+          </w:tcPr>
+          <w:p>
+            <w:pPr>
+              <w:spacing w:after="40"/>
+              <w:jc w:val="center"/>
+            </w:pPr>
+            <w:r>
+              <w:drawing>
+                <wp:inline distT="0" distB="0" distL="0" distR="0">
+                  <wp:extent cx="1143000" cy="2028825"/>
+                  <wp:effectExtent t="0" r="0" b="0" l="0"/>
+                  <wp:docPr id="1" name="" descr="" title=""/>
+                  <wp:cNvGraphicFramePr>
+                    <a:graphicFrameLocks xmlns:a="http://schemas.openxmlformats.org/drawingml/2006/main" noChangeAspect="1"/>
+                  </wp:cNvGraphicFramePr>
+                  <a:graphic xmlns:a="http://schemas.openxmlformats.org/drawingml/2006/main">
+                    <a:graphicData uri="http://schemas.openxmlformats.org/drawingml/2006/picture">
+                      <pic:pic xmlns:pic="http://schemas.openxmlformats.org/drawingml/2006/picture">
+                        <pic:nvPicPr>
+                          <pic:cNvPr id="0" name="" descr=""/>
+                          <pic:cNvPicPr>
+                            <a:picLocks noChangeAspect="1" noChangeArrowheads="1"/>
+                          </pic:cNvPicPr>
+                        </pic:nvPicPr>
+                        <pic:blipFill>
+                          <a:blip r:embed="rId25" cstate="none"/>
+                          <a:srcRect/>
+                          <a:stretch>
+                            <a:fillRect/>
+                          </a:stretch>
+                        </pic:blipFill>
+                        <pic:spPr bwMode="auto">
+                          <a:xfrm>
+                            <a:off x="0" y="0"/>
+                            <a:ext cx="1143000" cy="2028825"/>
+                          </a:xfrm>
+                          <a:prstGeom prst="rect">
+                            <a:avLst/>
+                          </a:prstGeom>
+                        </pic:spPr>
+                      </pic:pic>
+                    </a:graphicData>
+                  </a:graphic>
+                </wp:inline>
+              </w:drawing>
+            </w:r>
+          </w:p>
+          <w:p>
+            <w:pPr>
+              <w:spacing w:after="0"/>
+              <w:jc w:val="center"/>
+            </w:pPr>
+            <w:r>
+              <w:rPr>
+                <w:rFonts w:ascii="Calibri" w:cs="Calibri" w:eastAsia="Calibri" w:hAnsi="Calibri"/>
+                <w:i/>
+                <w:iCs/>
+                <w:color w:val="8A94A6"/>
+                <w:sz w:val="17"/>
+                <w:szCs w:val="17"/>
+              </w:rPr>
+              <w:t xml:space="preserve">Contenu vidéo des réseaux sociaux : le train du resort</w:t>
+            </w:r>
+          </w:p>
+        </w:tc>
+      </w:tr>
+    </w:tbl>
     <w:p>
       <w:pPr>
         <w:spacing w:after="120" w:before="0" w:line="276"/>
@@ -12815,110 +13820,6 @@
                 <w:szCs w:val="19"/>
               </w:rPr>
               <w:t xml:space="preserve">26 %</w:t>
-            </w:r>
-          </w:p>
-        </w:tc>
-      </w:tr>
-    </w:tbl>
-    <w:p>
-      <w:pPr>
-        <w:spacing w:after="120"/>
-      </w:pPr>
-    </w:p>
-    <w:tbl>
-      <w:tblPr>
-        <w:tblW w:type="dxa" w:w="9648"/>
-        <w:tblBorders>
-          <w:top w:val="none" w:color="FFFFFF" w:sz="0"/>
-          <w:left w:val="none" w:color="FFFFFF" w:sz="0"/>
-          <w:bottom w:val="none" w:color="FFFFFF" w:sz="0"/>
-          <w:right w:val="none" w:color="FFFFFF" w:sz="0"/>
-          <w:insideH w:val="none" w:color="FFFFFF" w:sz="0"/>
-          <w:insideV w:val="none" w:color="FFFFFF" w:sz="0"/>
-        </w:tblBorders>
-      </w:tblPr>
-      <w:tblGrid>
-        <w:gridCol w:w="9648"/>
-      </w:tblGrid>
-      <w:tr>
-        <w:tc>
-          <w:tcPr>
-            <w:tcW w:type="dxa" w:w="9648"/>
-            <w:tcBorders>
-              <w:top w:val="none" w:color="FFFFFF" w:sz="0"/>
-              <w:left w:val="none" w:color="FFFFFF" w:sz="0"/>
-              <w:bottom w:val="none" w:color="FFFFFF" w:sz="0"/>
-              <w:right w:val="none" w:color="FFFFFF" w:sz="0"/>
-            </w:tcBorders>
-            <w:tcMar>
-              <w:top w:type="dxa" w:w="0"/>
-              <w:left w:type="dxa" w:w="0"/>
-              <w:bottom w:type="dxa" w:w="0"/>
-              <w:right w:type="dxa" w:w="0"/>
-            </w:tcMar>
-            <w:vAlign w:val="center"/>
-          </w:tcPr>
-          <w:p>
-            <w:pPr>
-              <w:spacing w:after="40"/>
-              <w:jc w:val="center"/>
-            </w:pPr>
-            <w:r>
-              <w:drawing>
-                <wp:inline distT="0" distB="0" distL="0" distR="0">
-                  <wp:extent cx="3552825" cy="2667000"/>
-                  <wp:effectExtent t="0" r="0" b="0" l="0"/>
-                  <wp:docPr id="1" name="" descr="" title=""/>
-                  <wp:cNvGraphicFramePr>
-                    <a:graphicFrameLocks xmlns:a="http://schemas.openxmlformats.org/drawingml/2006/main" noChangeAspect="1"/>
-                  </wp:cNvGraphicFramePr>
-                  <a:graphic xmlns:a="http://schemas.openxmlformats.org/drawingml/2006/main">
-                    <a:graphicData uri="http://schemas.openxmlformats.org/drawingml/2006/picture">
-                      <pic:pic xmlns:pic="http://schemas.openxmlformats.org/drawingml/2006/picture">
-                        <pic:nvPicPr>
-                          <pic:cNvPr id="0" name="" descr=""/>
-                          <pic:cNvPicPr>
-                            <a:picLocks noChangeAspect="1" noChangeArrowheads="1"/>
-                          </pic:cNvPicPr>
-                        </pic:nvPicPr>
-                        <pic:blipFill>
-                          <a:blip r:embed="rId16" cstate="none"/>
-                          <a:srcRect/>
-                          <a:stretch>
-                            <a:fillRect/>
-                          </a:stretch>
-                        </pic:blipFill>
-                        <pic:spPr bwMode="auto">
-                          <a:xfrm>
-                            <a:off x="0" y="0"/>
-                            <a:ext cx="3552825" cy="2667000"/>
-                          </a:xfrm>
-                          <a:prstGeom prst="rect">
-                            <a:avLst/>
-                          </a:prstGeom>
-                        </pic:spPr>
-                      </pic:pic>
-                    </a:graphicData>
-                  </a:graphic>
-                </wp:inline>
-              </w:drawing>
-            </w:r>
-          </w:p>
-          <w:p>
-            <w:pPr>
-              <w:spacing w:after="0"/>
-              <w:jc w:val="center"/>
-            </w:pPr>
-            <w:r>
-              <w:rPr>
-                <w:rFonts w:ascii="Calibri" w:cs="Calibri" w:eastAsia="Calibri" w:hAnsi="Calibri"/>
-                <w:i/>
-                <w:iCs/>
-                <w:color w:val="8A94A6"/>
-                <w:sz w:val="17"/>
-                <w:szCs w:val="17"/>
-              </w:rPr>
-              <w:t xml:space="preserve">Soirée de spectacle sur la scène extérieure, devant le café Cubano</w:t>
             </w:r>
           </w:p>
         </w:tc>
@@ -14805,7 +15706,7 @@
                           </pic:cNvPicPr>
                         </pic:nvPicPr>
                         <pic:blipFill>
-                          <a:blip r:embed="rId17" cstate="none"/>
+                          <a:blip r:embed="rId26" cstate="none"/>
                           <a:srcRect/>
                           <a:stretch>
                             <a:fillRect/>
@@ -17601,7 +18502,7 @@
                     </pic:cNvPicPr>
                   </pic:nvPicPr>
                   <pic:blipFill>
-                    <a:blip r:embed="rId18" cstate="none"/>
+                    <a:blip r:embed="rId27" cstate="none"/>
                     <a:srcRect/>
                     <a:stretch>
                       <a:fillRect/>
@@ -18367,7 +19268,7 @@
                     </pic:cNvPicPr>
                   </pic:nvPicPr>
                   <pic:blipFill>
-                    <a:blip r:embed="rId19" cstate="none"/>
+                    <a:blip r:embed="rId28" cstate="none"/>
                     <a:srcRect/>
                     <a:stretch>
                       <a:fillRect/>
@@ -24998,7 +25899,7 @@
                     </pic:cNvPicPr>
                   </pic:nvPicPr>
                   <pic:blipFill>
-                    <a:blip r:embed="rId20" cstate="none"/>
+                    <a:blip r:embed="rId29" cstate="none"/>
                     <a:srcRect/>
                     <a:stretch>
                       <a:fillRect/>
@@ -27540,7 +28441,7 @@
                     </pic:cNvPicPr>
                   </pic:nvPicPr>
                   <pic:blipFill>
-                    <a:blip r:embed="rId21" cstate="none"/>
+                    <a:blip r:embed="rId30" cstate="none"/>
                     <a:srcRect/>
                     <a:stretch>
                       <a:fillRect/>
@@ -31902,6 +32803,21 @@
         <w:spacing w:after="120"/>
       </w:pPr>
     </w:p>
+    <w:p>
+      <w:pPr>
+        <w:spacing w:after="120" w:before="0" w:line="276"/>
+        <w:jc w:val="left"/>
+      </w:pPr>
+      <w:r>
+        <w:rPr>
+          <w:rFonts w:ascii="Calibri" w:cs="Calibri" w:eastAsia="Calibri" w:hAnsi="Calibri"/>
+          <w:b/>
+          <w:bCs/>
+          <w:color w:val="0B2A4A"/>
+        </w:rPr>
+        <w:t xml:space="preserve">Annexe F – Autres photos du site</w:t>
+      </w:r>
+    </w:p>
     <w:tbl>
       <w:tblPr>
         <w:tblW w:type="dxa" w:w="9648"/>
@@ -31948,103 +32864,6 @@
             <w:r>
               <w:drawing>
                 <wp:inline distT="0" distB="0" distL="0" distR="0">
-                  <wp:extent cx="3000375" cy="2143125"/>
-                  <wp:effectExtent t="0" r="0" b="0" l="0"/>
-                  <wp:docPr id="1" name="" descr="" title=""/>
-                  <wp:cNvGraphicFramePr>
-                    <a:graphicFrameLocks xmlns:a="http://schemas.openxmlformats.org/drawingml/2006/main" noChangeAspect="1"/>
-                  </wp:cNvGraphicFramePr>
-                  <a:graphic xmlns:a="http://schemas.openxmlformats.org/drawingml/2006/main">
-                    <a:graphicData uri="http://schemas.openxmlformats.org/drawingml/2006/picture">
-                      <pic:pic xmlns:pic="http://schemas.openxmlformats.org/drawingml/2006/picture">
-                        <pic:nvPicPr>
-                          <pic:cNvPr id="0" name="" descr=""/>
-                          <pic:cNvPicPr>
-                            <a:picLocks noChangeAspect="1" noChangeArrowheads="1"/>
-                          </pic:cNvPicPr>
-                        </pic:nvPicPr>
-                        <pic:blipFill>
-                          <a:blip r:embed="rId9" cstate="none"/>
-                          <a:srcRect/>
-                          <a:stretch>
-                            <a:fillRect/>
-                          </a:stretch>
-                        </pic:blipFill>
-                        <pic:spPr bwMode="auto">
-                          <a:xfrm>
-                            <a:off x="0" y="0"/>
-                            <a:ext cx="3000375" cy="2143125"/>
-                          </a:xfrm>
-                          <a:prstGeom prst="rect">
-                            <a:avLst/>
-                          </a:prstGeom>
-                        </pic:spPr>
-                      </pic:pic>
-                    </a:graphicData>
-                  </a:graphic>
-                </wp:inline>
-              </w:drawing>
-            </w:r>
-          </w:p>
-          <w:p>
-            <w:pPr>
-              <w:spacing w:after="0"/>
-              <w:jc w:val="center"/>
-            </w:pPr>
-            <w:r>
-              <w:rPr>
-                <w:rFonts w:ascii="Calibri" w:cs="Calibri" w:eastAsia="Calibri" w:hAnsi="Calibri"/>
-                <w:i/>
-                <w:iCs/>
-                <w:color w:val="8A94A6"/>
-                <w:sz w:val="17"/>
-                <w:szCs w:val="17"/>
-              </w:rPr>
-              <w:t xml:space="preserve">La piscine centrale vue du ciel, un jour d'été</w:t>
-            </w:r>
-          </w:p>
-        </w:tc>
-        <w:tc>
-          <w:tcPr>
-            <w:tcW w:type="dxa" w:w="200"/>
-            <w:tcBorders>
-              <w:top w:val="none" w:color="FFFFFF" w:sz="0"/>
-              <w:left w:val="none" w:color="FFFFFF" w:sz="0"/>
-              <w:bottom w:val="none" w:color="FFFFFF" w:sz="0"/>
-              <w:right w:val="none" w:color="FFFFFF" w:sz="0"/>
-            </w:tcBorders>
-          </w:tcPr>
-          <w:p>
-            <w:r>
-              <w:t xml:space="preserve"/>
-            </w:r>
-          </w:p>
-        </w:tc>
-        <w:tc>
-          <w:tcPr>
-            <w:tcW w:type="dxa" w:w="4724"/>
-            <w:tcBorders>
-              <w:top w:val="none" w:color="FFFFFF" w:sz="0"/>
-              <w:left w:val="none" w:color="FFFFFF" w:sz="0"/>
-              <w:bottom w:val="none" w:color="FFFFFF" w:sz="0"/>
-              <w:right w:val="none" w:color="FFFFFF" w:sz="0"/>
-            </w:tcBorders>
-            <w:tcMar>
-              <w:top w:type="dxa" w:w="0"/>
-              <w:left w:type="dxa" w:w="0"/>
-              <w:bottom w:type="dxa" w:w="0"/>
-              <w:right w:type="dxa" w:w="0"/>
-            </w:tcMar>
-            <w:vAlign w:val="center"/>
-          </w:tcPr>
-          <w:p>
-            <w:pPr>
-              <w:spacing w:after="40"/>
-              <w:jc w:val="center"/>
-            </w:pPr>
-            <w:r>
-              <w:drawing>
-                <wp:inline distT="0" distB="0" distL="0" distR="0">
                   <wp:extent cx="2286000" cy="2286000"/>
                   <wp:effectExtent t="0" r="0" b="0" l="0"/>
                   <wp:docPr id="1" name="" descr="" title=""/>
@@ -32061,7 +32880,7 @@
                           </pic:cNvPicPr>
                         </pic:nvPicPr>
                         <pic:blipFill>
-                          <a:blip r:embed="rId22" cstate="none"/>
+                          <a:blip r:embed="rId31" cstate="none"/>
                           <a:srcRect/>
                           <a:stretch>
                             <a:fillRect/>
@@ -32101,114 +32920,6 @@
             </w:r>
           </w:p>
         </w:tc>
-      </w:tr>
-      <w:tr>
-        <w:trPr>
-          <w:trHeight w:val="160" w:hRule="exact"/>
-        </w:trPr>
-        <w:tc>
-          <w:tcPr>
-            <w:tcW w:type="dxa" w:w="9648"/>
-            <w:gridSpan w:val="3"/>
-            <w:tcBorders>
-              <w:top w:val="none" w:color="FFFFFF" w:sz="0"/>
-              <w:left w:val="none" w:color="FFFFFF" w:sz="0"/>
-              <w:bottom w:val="none" w:color="FFFFFF" w:sz="0"/>
-              <w:right w:val="none" w:color="FFFFFF" w:sz="0"/>
-            </w:tcBorders>
-          </w:tcPr>
-          <w:p>
-            <w:r>
-              <w:t xml:space="preserve"/>
-            </w:r>
-          </w:p>
-        </w:tc>
-      </w:tr>
-      <w:tr>
-        <w:trPr>
-          <w:cantSplit/>
-        </w:trPr>
-        <w:tc>
-          <w:tcPr>
-            <w:tcW w:type="dxa" w:w="4724"/>
-            <w:tcBorders>
-              <w:top w:val="none" w:color="FFFFFF" w:sz="0"/>
-              <w:left w:val="none" w:color="FFFFFF" w:sz="0"/>
-              <w:bottom w:val="none" w:color="FFFFFF" w:sz="0"/>
-              <w:right w:val="none" w:color="FFFFFF" w:sz="0"/>
-            </w:tcBorders>
-            <w:tcMar>
-              <w:top w:type="dxa" w:w="0"/>
-              <w:left w:type="dxa" w:w="0"/>
-              <w:bottom w:type="dxa" w:w="0"/>
-              <w:right w:type="dxa" w:w="0"/>
-            </w:tcMar>
-            <w:vAlign w:val="center"/>
-          </w:tcPr>
-          <w:p>
-            <w:pPr>
-              <w:spacing w:after="40"/>
-              <w:jc w:val="center"/>
-            </w:pPr>
-            <w:r>
-              <w:drawing>
-                <wp:inline distT="0" distB="0" distL="0" distR="0">
-                  <wp:extent cx="1714500" cy="2286000"/>
-                  <wp:effectExtent t="0" r="0" b="0" l="0"/>
-                  <wp:docPr id="1" name="" descr="" title=""/>
-                  <wp:cNvGraphicFramePr>
-                    <a:graphicFrameLocks xmlns:a="http://schemas.openxmlformats.org/drawingml/2006/main" noChangeAspect="1"/>
-                  </wp:cNvGraphicFramePr>
-                  <a:graphic xmlns:a="http://schemas.openxmlformats.org/drawingml/2006/main">
-                    <a:graphicData uri="http://schemas.openxmlformats.org/drawingml/2006/picture">
-                      <pic:pic xmlns:pic="http://schemas.openxmlformats.org/drawingml/2006/picture">
-                        <pic:nvPicPr>
-                          <pic:cNvPr id="0" name="" descr=""/>
-                          <pic:cNvPicPr>
-                            <a:picLocks noChangeAspect="1" noChangeArrowheads="1"/>
-                          </pic:cNvPicPr>
-                        </pic:nvPicPr>
-                        <pic:blipFill>
-                          <a:blip r:embed="rId23" cstate="none"/>
-                          <a:srcRect/>
-                          <a:stretch>
-                            <a:fillRect/>
-                          </a:stretch>
-                        </pic:blipFill>
-                        <pic:spPr bwMode="auto">
-                          <a:xfrm>
-                            <a:off x="0" y="0"/>
-                            <a:ext cx="1714500" cy="2286000"/>
-                          </a:xfrm>
-                          <a:prstGeom prst="rect">
-                            <a:avLst/>
-                          </a:prstGeom>
-                        </pic:spPr>
-                      </pic:pic>
-                    </a:graphicData>
-                  </a:graphic>
-                </wp:inline>
-              </w:drawing>
-            </w:r>
-          </w:p>
-          <w:p>
-            <w:pPr>
-              <w:spacing w:after="0"/>
-              <w:jc w:val="center"/>
-            </w:pPr>
-            <w:r>
-              <w:rPr>
-                <w:rFonts w:ascii="Calibri" w:cs="Calibri" w:eastAsia="Calibri" w:hAnsi="Calibri"/>
-                <w:i/>
-                <w:iCs/>
-                <w:color w:val="8A94A6"/>
-                <w:sz w:val="17"/>
-                <w:szCs w:val="17"/>
-              </w:rPr>
-              <w:t xml:space="preserve">L'Aqua Bar, le bar dans la piscine</w:t>
-            </w:r>
-          </w:p>
-        </w:tc>
         <w:tc>
           <w:tcPr>
             <w:tcW w:type="dxa" w:w="200"/>
@@ -32225,319 +32936,6 @@
             </w:r>
           </w:p>
         </w:tc>
-        <w:tc>
-          <w:tcPr>
-            <w:tcW w:type="dxa" w:w="4724"/>
-            <w:tcBorders>
-              <w:top w:val="none" w:color="FFFFFF" w:sz="0"/>
-              <w:left w:val="none" w:color="FFFFFF" w:sz="0"/>
-              <w:bottom w:val="none" w:color="FFFFFF" w:sz="0"/>
-              <w:right w:val="none" w:color="FFFFFF" w:sz="0"/>
-            </w:tcBorders>
-            <w:tcMar>
-              <w:top w:type="dxa" w:w="0"/>
-              <w:left w:type="dxa" w:w="0"/>
-              <w:bottom w:type="dxa" w:w="0"/>
-              <w:right w:type="dxa" w:w="0"/>
-            </w:tcMar>
-            <w:vAlign w:val="center"/>
-          </w:tcPr>
-          <w:p>
-            <w:pPr>
-              <w:spacing w:after="40"/>
-              <w:jc w:val="center"/>
-            </w:pPr>
-            <w:r>
-              <w:drawing>
-                <wp:inline distT="0" distB="0" distL="0" distR="0">
-                  <wp:extent cx="1819275" cy="2286000"/>
-                  <wp:effectExtent t="0" r="0" b="0" l="0"/>
-                  <wp:docPr id="1" name="" descr="" title=""/>
-                  <wp:cNvGraphicFramePr>
-                    <a:graphicFrameLocks xmlns:a="http://schemas.openxmlformats.org/drawingml/2006/main" noChangeAspect="1"/>
-                  </wp:cNvGraphicFramePr>
-                  <a:graphic xmlns:a="http://schemas.openxmlformats.org/drawingml/2006/main">
-                    <a:graphicData uri="http://schemas.openxmlformats.org/drawingml/2006/picture">
-                      <pic:pic xmlns:pic="http://schemas.openxmlformats.org/drawingml/2006/picture">
-                        <pic:nvPicPr>
-                          <pic:cNvPr id="0" name="" descr=""/>
-                          <pic:cNvPicPr>
-                            <a:picLocks noChangeAspect="1" noChangeArrowheads="1"/>
-                          </pic:cNvPicPr>
-                        </pic:nvPicPr>
-                        <pic:blipFill>
-                          <a:blip r:embed="rId24" cstate="none"/>
-                          <a:srcRect/>
-                          <a:stretch>
-                            <a:fillRect/>
-                          </a:stretch>
-                        </pic:blipFill>
-                        <pic:spPr bwMode="auto">
-                          <a:xfrm>
-                            <a:off x="0" y="0"/>
-                            <a:ext cx="1819275" cy="2286000"/>
-                          </a:xfrm>
-                          <a:prstGeom prst="rect">
-                            <a:avLst/>
-                          </a:prstGeom>
-                        </pic:spPr>
-                      </pic:pic>
-                    </a:graphicData>
-                  </a:graphic>
-                </wp:inline>
-              </w:drawing>
-            </w:r>
-          </w:p>
-          <w:p>
-            <w:pPr>
-              <w:spacing w:after="0"/>
-              <w:jc w:val="center"/>
-            </w:pPr>
-            <w:r>
-              <w:rPr>
-                <w:rFonts w:ascii="Calibri" w:cs="Calibri" w:eastAsia="Calibri" w:hAnsi="Calibri"/>
-                <w:i/>
-                <w:iCs/>
-                <w:color w:val="8A94A6"/>
-                <w:sz w:val="17"/>
-                <w:szCs w:val="17"/>
-              </w:rPr>
-              <w:t xml:space="preserve">Le lac, sa plage de sable et ses palapas</w:t>
-            </w:r>
-          </w:p>
-        </w:tc>
-      </w:tr>
-      <w:tr>
-        <w:trPr>
-          <w:trHeight w:val="160" w:hRule="exact"/>
-        </w:trPr>
-        <w:tc>
-          <w:tcPr>
-            <w:tcW w:type="dxa" w:w="9648"/>
-            <w:gridSpan w:val="3"/>
-            <w:tcBorders>
-              <w:top w:val="none" w:color="FFFFFF" w:sz="0"/>
-              <w:left w:val="none" w:color="FFFFFF" w:sz="0"/>
-              <w:bottom w:val="none" w:color="FFFFFF" w:sz="0"/>
-              <w:right w:val="none" w:color="FFFFFF" w:sz="0"/>
-            </w:tcBorders>
-          </w:tcPr>
-          <w:p>
-            <w:r>
-              <w:t xml:space="preserve"/>
-            </w:r>
-          </w:p>
-        </w:tc>
-      </w:tr>
-      <w:tr>
-        <w:trPr>
-          <w:cantSplit/>
-        </w:trPr>
-        <w:tc>
-          <w:tcPr>
-            <w:tcW w:type="dxa" w:w="4724"/>
-            <w:tcBorders>
-              <w:top w:val="none" w:color="FFFFFF" w:sz="0"/>
-              <w:left w:val="none" w:color="FFFFFF" w:sz="0"/>
-              <w:bottom w:val="none" w:color="FFFFFF" w:sz="0"/>
-              <w:right w:val="none" w:color="FFFFFF" w:sz="0"/>
-            </w:tcBorders>
-            <w:tcMar>
-              <w:top w:type="dxa" w:w="0"/>
-              <w:left w:type="dxa" w:w="0"/>
-              <w:bottom w:type="dxa" w:w="0"/>
-              <w:right w:type="dxa" w:w="0"/>
-            </w:tcMar>
-            <w:vAlign w:val="center"/>
-          </w:tcPr>
-          <w:p>
-            <w:pPr>
-              <w:spacing w:after="40"/>
-              <w:jc w:val="center"/>
-            </w:pPr>
-            <w:r>
-              <w:drawing>
-                <wp:inline distT="0" distB="0" distL="0" distR="0">
-                  <wp:extent cx="3000375" cy="2190750"/>
-                  <wp:effectExtent t="0" r="0" b="0" l="0"/>
-                  <wp:docPr id="1" name="" descr="" title=""/>
-                  <wp:cNvGraphicFramePr>
-                    <a:graphicFrameLocks xmlns:a="http://schemas.openxmlformats.org/drawingml/2006/main" noChangeAspect="1"/>
-                  </wp:cNvGraphicFramePr>
-                  <a:graphic xmlns:a="http://schemas.openxmlformats.org/drawingml/2006/main">
-                    <a:graphicData uri="http://schemas.openxmlformats.org/drawingml/2006/picture">
-                      <pic:pic xmlns:pic="http://schemas.openxmlformats.org/drawingml/2006/picture">
-                        <pic:nvPicPr>
-                          <pic:cNvPr id="0" name="" descr=""/>
-                          <pic:cNvPicPr>
-                            <a:picLocks noChangeAspect="1" noChangeArrowheads="1"/>
-                          </pic:cNvPicPr>
-                        </pic:nvPicPr>
-                        <pic:blipFill>
-                          <a:blip r:embed="rId11" cstate="none"/>
-                          <a:srcRect/>
-                          <a:stretch>
-                            <a:fillRect/>
-                          </a:stretch>
-                        </pic:blipFill>
-                        <pic:spPr bwMode="auto">
-                          <a:xfrm>
-                            <a:off x="0" y="0"/>
-                            <a:ext cx="3000375" cy="2190750"/>
-                          </a:xfrm>
-                          <a:prstGeom prst="rect">
-                            <a:avLst/>
-                          </a:prstGeom>
-                        </pic:spPr>
-                      </pic:pic>
-                    </a:graphicData>
-                  </a:graphic>
-                </wp:inline>
-              </w:drawing>
-            </w:r>
-          </w:p>
-          <w:p>
-            <w:pPr>
-              <w:spacing w:after="0"/>
-              <w:jc w:val="center"/>
-            </w:pPr>
-            <w:r>
-              <w:rPr>
-                <w:rFonts w:ascii="Calibri" w:cs="Calibri" w:eastAsia="Calibri" w:hAnsi="Calibri"/>
-                <w:i/>
-                <w:iCs/>
-                <w:color w:val="8A94A6"/>
-                <w:sz w:val="17"/>
-                <w:szCs w:val="17"/>
-              </w:rPr>
-              <w:t xml:space="preserve">La piscine centrale, fête de la mousse</w:t>
-            </w:r>
-          </w:p>
-        </w:tc>
-        <w:tc>
-          <w:tcPr>
-            <w:tcW w:type="dxa" w:w="200"/>
-            <w:tcBorders>
-              <w:top w:val="none" w:color="FFFFFF" w:sz="0"/>
-              <w:left w:val="none" w:color="FFFFFF" w:sz="0"/>
-              <w:bottom w:val="none" w:color="FFFFFF" w:sz="0"/>
-              <w:right w:val="none" w:color="FFFFFF" w:sz="0"/>
-            </w:tcBorders>
-          </w:tcPr>
-          <w:p>
-            <w:r>
-              <w:t xml:space="preserve"/>
-            </w:r>
-          </w:p>
-        </w:tc>
-        <w:tc>
-          <w:tcPr>
-            <w:tcW w:type="dxa" w:w="4724"/>
-            <w:tcBorders>
-              <w:top w:val="none" w:color="FFFFFF" w:sz="0"/>
-              <w:left w:val="none" w:color="FFFFFF" w:sz="0"/>
-              <w:bottom w:val="none" w:color="FFFFFF" w:sz="0"/>
-              <w:right w:val="none" w:color="FFFFFF" w:sz="0"/>
-            </w:tcBorders>
-            <w:tcMar>
-              <w:top w:type="dxa" w:w="0"/>
-              <w:left w:type="dxa" w:w="0"/>
-              <w:bottom w:type="dxa" w:w="0"/>
-              <w:right w:type="dxa" w:w="0"/>
-            </w:tcMar>
-            <w:vAlign w:val="center"/>
-          </w:tcPr>
-          <w:p>
-            <w:pPr>
-              <w:spacing w:after="40"/>
-              <w:jc w:val="center"/>
-            </w:pPr>
-            <w:r>
-              <w:drawing>
-                <wp:inline distT="0" distB="0" distL="0" distR="0">
-                  <wp:extent cx="3000375" cy="1809750"/>
-                  <wp:effectExtent t="0" r="0" b="0" l="0"/>
-                  <wp:docPr id="1" name="" descr="" title=""/>
-                  <wp:cNvGraphicFramePr>
-                    <a:graphicFrameLocks xmlns:a="http://schemas.openxmlformats.org/drawingml/2006/main" noChangeAspect="1"/>
-                  </wp:cNvGraphicFramePr>
-                  <a:graphic xmlns:a="http://schemas.openxmlformats.org/drawingml/2006/main">
-                    <a:graphicData uri="http://schemas.openxmlformats.org/drawingml/2006/picture">
-                      <pic:pic xmlns:pic="http://schemas.openxmlformats.org/drawingml/2006/picture">
-                        <pic:nvPicPr>
-                          <pic:cNvPr id="0" name="" descr=""/>
-                          <pic:cNvPicPr>
-                            <a:picLocks noChangeAspect="1" noChangeArrowheads="1"/>
-                          </pic:cNvPicPr>
-                        </pic:nvPicPr>
-                        <pic:blipFill>
-                          <a:blip r:embed="rId13" cstate="none"/>
-                          <a:srcRect/>
-                          <a:stretch>
-                            <a:fillRect/>
-                          </a:stretch>
-                        </pic:blipFill>
-                        <pic:spPr bwMode="auto">
-                          <a:xfrm>
-                            <a:off x="0" y="0"/>
-                            <a:ext cx="3000375" cy="1809750"/>
-                          </a:xfrm>
-                          <a:prstGeom prst="rect">
-                            <a:avLst/>
-                          </a:prstGeom>
-                        </pic:spPr>
-                      </pic:pic>
-                    </a:graphicData>
-                  </a:graphic>
-                </wp:inline>
-              </w:drawing>
-            </w:r>
-          </w:p>
-          <w:p>
-            <w:pPr>
-              <w:spacing w:after="0"/>
-              <w:jc w:val="center"/>
-            </w:pPr>
-            <w:r>
-              <w:rPr>
-                <w:rFonts w:ascii="Calibri" w:cs="Calibri" w:eastAsia="Calibri" w:hAnsi="Calibri"/>
-                <w:i/>
-                <w:iCs/>
-                <w:color w:val="8A94A6"/>
-                <w:sz w:val="17"/>
-                <w:szCs w:val="17"/>
-              </w:rPr>
-              <w:t xml:space="preserve">Les chalets aux couleurs cubaines</w:t>
-            </w:r>
-          </w:p>
-        </w:tc>
-      </w:tr>
-      <w:tr>
-        <w:trPr>
-          <w:trHeight w:val="160" w:hRule="exact"/>
-        </w:trPr>
-        <w:tc>
-          <w:tcPr>
-            <w:tcW w:type="dxa" w:w="9648"/>
-            <w:gridSpan w:val="3"/>
-            <w:tcBorders>
-              <w:top w:val="none" w:color="FFFFFF" w:sz="0"/>
-              <w:left w:val="none" w:color="FFFFFF" w:sz="0"/>
-              <w:bottom w:val="none" w:color="FFFFFF" w:sz="0"/>
-              <w:right w:val="none" w:color="FFFFFF" w:sz="0"/>
-            </w:tcBorders>
-          </w:tcPr>
-          <w:p>
-            <w:r>
-              <w:t xml:space="preserve"/>
-            </w:r>
-          </w:p>
-        </w:tc>
-      </w:tr>
-      <w:tr>
-        <w:trPr>
-          <w:cantSplit/>
-        </w:trPr>
         <w:tc>
           <w:tcPr>
             <w:tcW w:type="dxa" w:w="4724"/>
@@ -32579,7 +32977,7 @@
                           </pic:cNvPicPr>
                         </pic:nvPicPr>
                         <pic:blipFill>
-                          <a:blip r:embed="rId25" cstate="none"/>
+                          <a:blip r:embed="rId32" cstate="none"/>
                           <a:srcRect/>
                           <a:stretch>
                             <a:fillRect/>
@@ -32616,718 +33014,6 @@
                 <w:szCs w:val="17"/>
               </w:rPr>
               <w:t xml:space="preserve">Les Coolbox, mini-maisons en conteneur</w:t>
-            </w:r>
-          </w:p>
-        </w:tc>
-        <w:tc>
-          <w:tcPr>
-            <w:tcW w:type="dxa" w:w="200"/>
-            <w:tcBorders>
-              <w:top w:val="none" w:color="FFFFFF" w:sz="0"/>
-              <w:left w:val="none" w:color="FFFFFF" w:sz="0"/>
-              <w:bottom w:val="none" w:color="FFFFFF" w:sz="0"/>
-              <w:right w:val="none" w:color="FFFFFF" w:sz="0"/>
-            </w:tcBorders>
-          </w:tcPr>
-          <w:p>
-            <w:r>
-              <w:t xml:space="preserve"/>
-            </w:r>
-          </w:p>
-        </w:tc>
-        <w:tc>
-          <w:tcPr>
-            <w:tcW w:type="dxa" w:w="4724"/>
-            <w:tcBorders>
-              <w:top w:val="none" w:color="FFFFFF" w:sz="0"/>
-              <w:left w:val="none" w:color="FFFFFF" w:sz="0"/>
-              <w:bottom w:val="none" w:color="FFFFFF" w:sz="0"/>
-              <w:right w:val="none" w:color="FFFFFF" w:sz="0"/>
-            </w:tcBorders>
-            <w:tcMar>
-              <w:top w:type="dxa" w:w="0"/>
-              <w:left w:type="dxa" w:w="0"/>
-              <w:bottom w:type="dxa" w:w="0"/>
-              <w:right w:type="dxa" w:w="0"/>
-            </w:tcMar>
-            <w:vAlign w:val="center"/>
-          </w:tcPr>
-          <w:p>
-            <w:pPr>
-              <w:spacing w:after="40"/>
-              <w:jc w:val="center"/>
-            </w:pPr>
-            <w:r>
-              <w:drawing>
-                <wp:inline distT="0" distB="0" distL="0" distR="0">
-                  <wp:extent cx="3000375" cy="1809750"/>
-                  <wp:effectExtent t="0" r="0" b="0" l="0"/>
-                  <wp:docPr id="1" name="" descr="" title=""/>
-                  <wp:cNvGraphicFramePr>
-                    <a:graphicFrameLocks xmlns:a="http://schemas.openxmlformats.org/drawingml/2006/main" noChangeAspect="1"/>
-                  </wp:cNvGraphicFramePr>
-                  <a:graphic xmlns:a="http://schemas.openxmlformats.org/drawingml/2006/main">
-                    <a:graphicData uri="http://schemas.openxmlformats.org/drawingml/2006/picture">
-                      <pic:pic xmlns:pic="http://schemas.openxmlformats.org/drawingml/2006/picture">
-                        <pic:nvPicPr>
-                          <pic:cNvPr id="0" name="" descr=""/>
-                          <pic:cNvPicPr>
-                            <a:picLocks noChangeAspect="1" noChangeArrowheads="1"/>
-                          </pic:cNvPicPr>
-                        </pic:nvPicPr>
-                        <pic:blipFill>
-                          <a:blip r:embed="rId10" cstate="none"/>
-                          <a:srcRect/>
-                          <a:stretch>
-                            <a:fillRect/>
-                          </a:stretch>
-                        </pic:blipFill>
-                        <pic:spPr bwMode="auto">
-                          <a:xfrm>
-                            <a:off x="0" y="0"/>
-                            <a:ext cx="3000375" cy="1809750"/>
-                          </a:xfrm>
-                          <a:prstGeom prst="rect">
-                            <a:avLst/>
-                          </a:prstGeom>
-                        </pic:spPr>
-                      </pic:pic>
-                    </a:graphicData>
-                  </a:graphic>
-                </wp:inline>
-              </w:drawing>
-            </w:r>
-          </w:p>
-          <w:p>
-            <w:pPr>
-              <w:spacing w:after="0"/>
-              <w:jc w:val="center"/>
-            </w:pPr>
-            <w:r>
-              <w:rPr>
-                <w:rFonts w:ascii="Calibri" w:cs="Calibri" w:eastAsia="Calibri" w:hAnsi="Calibri"/>
-                <w:i/>
-                <w:iCs/>
-                <w:color w:val="8A94A6"/>
-                <w:sz w:val="17"/>
-                <w:szCs w:val="17"/>
-              </w:rPr>
-              <w:t xml:space="preserve">Le pavillon d'accueil au toit de chaume</w:t>
-            </w:r>
-          </w:p>
-        </w:tc>
-      </w:tr>
-      <w:tr>
-        <w:trPr>
-          <w:trHeight w:val="160" w:hRule="exact"/>
-        </w:trPr>
-        <w:tc>
-          <w:tcPr>
-            <w:tcW w:type="dxa" w:w="9648"/>
-            <w:gridSpan w:val="3"/>
-            <w:tcBorders>
-              <w:top w:val="none" w:color="FFFFFF" w:sz="0"/>
-              <w:left w:val="none" w:color="FFFFFF" w:sz="0"/>
-              <w:bottom w:val="none" w:color="FFFFFF" w:sz="0"/>
-              <w:right w:val="none" w:color="FFFFFF" w:sz="0"/>
-            </w:tcBorders>
-          </w:tcPr>
-          <w:p>
-            <w:r>
-              <w:t xml:space="preserve"/>
-            </w:r>
-          </w:p>
-        </w:tc>
-      </w:tr>
-      <w:tr>
-        <w:trPr>
-          <w:cantSplit/>
-        </w:trPr>
-        <w:tc>
-          <w:tcPr>
-            <w:tcW w:type="dxa" w:w="4724"/>
-            <w:tcBorders>
-              <w:top w:val="none" w:color="FFFFFF" w:sz="0"/>
-              <w:left w:val="none" w:color="FFFFFF" w:sz="0"/>
-              <w:bottom w:val="none" w:color="FFFFFF" w:sz="0"/>
-              <w:right w:val="none" w:color="FFFFFF" w:sz="0"/>
-            </w:tcBorders>
-            <w:tcMar>
-              <w:top w:type="dxa" w:w="0"/>
-              <w:left w:type="dxa" w:w="0"/>
-              <w:bottom w:type="dxa" w:w="0"/>
-              <w:right w:type="dxa" w:w="0"/>
-            </w:tcMar>
-            <w:vAlign w:val="center"/>
-          </w:tcPr>
-          <w:p>
-            <w:pPr>
-              <w:spacing w:after="40"/>
-              <w:jc w:val="center"/>
-            </w:pPr>
-            <w:r>
-              <w:drawing>
-                <wp:inline distT="0" distB="0" distL="0" distR="0">
-                  <wp:extent cx="3000375" cy="2247900"/>
-                  <wp:effectExtent t="0" r="0" b="0" l="0"/>
-                  <wp:docPr id="1" name="" descr="" title=""/>
-                  <wp:cNvGraphicFramePr>
-                    <a:graphicFrameLocks xmlns:a="http://schemas.openxmlformats.org/drawingml/2006/main" noChangeAspect="1"/>
-                  </wp:cNvGraphicFramePr>
-                  <a:graphic xmlns:a="http://schemas.openxmlformats.org/drawingml/2006/main">
-                    <a:graphicData uri="http://schemas.openxmlformats.org/drawingml/2006/picture">
-                      <pic:pic xmlns:pic="http://schemas.openxmlformats.org/drawingml/2006/picture">
-                        <pic:nvPicPr>
-                          <pic:cNvPr id="0" name="" descr=""/>
-                          <pic:cNvPicPr>
-                            <a:picLocks noChangeAspect="1" noChangeArrowheads="1"/>
-                          </pic:cNvPicPr>
-                        </pic:nvPicPr>
-                        <pic:blipFill>
-                          <a:blip r:embed="rId16" cstate="none"/>
-                          <a:srcRect/>
-                          <a:stretch>
-                            <a:fillRect/>
-                          </a:stretch>
-                        </pic:blipFill>
-                        <pic:spPr bwMode="auto">
-                          <a:xfrm>
-                            <a:off x="0" y="0"/>
-                            <a:ext cx="3000375" cy="2247900"/>
-                          </a:xfrm>
-                          <a:prstGeom prst="rect">
-                            <a:avLst/>
-                          </a:prstGeom>
-                        </pic:spPr>
-                      </pic:pic>
-                    </a:graphicData>
-                  </a:graphic>
-                </wp:inline>
-              </w:drawing>
-            </w:r>
-          </w:p>
-          <w:p>
-            <w:pPr>
-              <w:spacing w:after="0"/>
-              <w:jc w:val="center"/>
-            </w:pPr>
-            <w:r>
-              <w:rPr>
-                <w:rFonts w:ascii="Calibri" w:cs="Calibri" w:eastAsia="Calibri" w:hAnsi="Calibri"/>
-                <w:i/>
-                <w:iCs/>
-                <w:color w:val="8A94A6"/>
-                <w:sz w:val="17"/>
-                <w:szCs w:val="17"/>
-              </w:rPr>
-              <w:t xml:space="preserve">Spectacle en soirée sur la scène extérieure</w:t>
-            </w:r>
-          </w:p>
-        </w:tc>
-        <w:tc>
-          <w:tcPr>
-            <w:tcW w:type="dxa" w:w="200"/>
-            <w:tcBorders>
-              <w:top w:val="none" w:color="FFFFFF" w:sz="0"/>
-              <w:left w:val="none" w:color="FFFFFF" w:sz="0"/>
-              <w:bottom w:val="none" w:color="FFFFFF" w:sz="0"/>
-              <w:right w:val="none" w:color="FFFFFF" w:sz="0"/>
-            </w:tcBorders>
-          </w:tcPr>
-          <w:p>
-            <w:r>
-              <w:t xml:space="preserve"/>
-            </w:r>
-          </w:p>
-        </w:tc>
-        <w:tc>
-          <w:tcPr>
-            <w:tcW w:type="dxa" w:w="4724"/>
-            <w:tcBorders>
-              <w:top w:val="none" w:color="FFFFFF" w:sz="0"/>
-              <w:left w:val="none" w:color="FFFFFF" w:sz="0"/>
-              <w:bottom w:val="none" w:color="FFFFFF" w:sz="0"/>
-              <w:right w:val="none" w:color="FFFFFF" w:sz="0"/>
-            </w:tcBorders>
-            <w:tcMar>
-              <w:top w:type="dxa" w:w="0"/>
-              <w:left w:type="dxa" w:w="0"/>
-              <w:bottom w:type="dxa" w:w="0"/>
-              <w:right w:type="dxa" w:w="0"/>
-            </w:tcMar>
-            <w:vAlign w:val="center"/>
-          </w:tcPr>
-          <w:p>
-            <w:pPr>
-              <w:spacing w:after="40"/>
-              <w:jc w:val="center"/>
-            </w:pPr>
-            <w:r>
-              <w:drawing>
-                <wp:inline distT="0" distB="0" distL="0" distR="0">
-                  <wp:extent cx="3000375" cy="2247900"/>
-                  <wp:effectExtent t="0" r="0" b="0" l="0"/>
-                  <wp:docPr id="1" name="" descr="" title=""/>
-                  <wp:cNvGraphicFramePr>
-                    <a:graphicFrameLocks xmlns:a="http://schemas.openxmlformats.org/drawingml/2006/main" noChangeAspect="1"/>
-                  </wp:cNvGraphicFramePr>
-                  <a:graphic xmlns:a="http://schemas.openxmlformats.org/drawingml/2006/main">
-                    <a:graphicData uri="http://schemas.openxmlformats.org/drawingml/2006/picture">
-                      <pic:pic xmlns:pic="http://schemas.openxmlformats.org/drawingml/2006/picture">
-                        <pic:nvPicPr>
-                          <pic:cNvPr id="0" name="" descr=""/>
-                          <pic:cNvPicPr>
-                            <a:picLocks noChangeAspect="1" noChangeArrowheads="1"/>
-                          </pic:cNvPicPr>
-                        </pic:nvPicPr>
-                        <pic:blipFill>
-                          <a:blip r:embed="rId26" cstate="none"/>
-                          <a:srcRect/>
-                          <a:stretch>
-                            <a:fillRect/>
-                          </a:stretch>
-                        </pic:blipFill>
-                        <pic:spPr bwMode="auto">
-                          <a:xfrm>
-                            <a:off x="0" y="0"/>
-                            <a:ext cx="3000375" cy="2247900"/>
-                          </a:xfrm>
-                          <a:prstGeom prst="rect">
-                            <a:avLst/>
-                          </a:prstGeom>
-                        </pic:spPr>
-                      </pic:pic>
-                    </a:graphicData>
-                  </a:graphic>
-                </wp:inline>
-              </w:drawing>
-            </w:r>
-          </w:p>
-          <w:p>
-            <w:pPr>
-              <w:spacing w:after="0"/>
-              <w:jc w:val="center"/>
-            </w:pPr>
-            <w:r>
-              <w:rPr>
-                <w:rFonts w:ascii="Calibri" w:cs="Calibri" w:eastAsia="Calibri" w:hAnsi="Calibri"/>
-                <w:i/>
-                <w:iCs/>
-                <w:color w:val="8A94A6"/>
-                <w:sz w:val="17"/>
-                <w:szCs w:val="17"/>
-              </w:rPr>
-              <w:t xml:space="preserve">Les kiosques de restauration et les concessions</w:t>
-            </w:r>
-          </w:p>
-        </w:tc>
-      </w:tr>
-      <w:tr>
-        <w:trPr>
-          <w:trHeight w:val="160" w:hRule="exact"/>
-        </w:trPr>
-        <w:tc>
-          <w:tcPr>
-            <w:tcW w:type="dxa" w:w="9648"/>
-            <w:gridSpan w:val="3"/>
-            <w:tcBorders>
-              <w:top w:val="none" w:color="FFFFFF" w:sz="0"/>
-              <w:left w:val="none" w:color="FFFFFF" w:sz="0"/>
-              <w:bottom w:val="none" w:color="FFFFFF" w:sz="0"/>
-              <w:right w:val="none" w:color="FFFFFF" w:sz="0"/>
-            </w:tcBorders>
-          </w:tcPr>
-          <w:p>
-            <w:r>
-              <w:t xml:space="preserve"/>
-            </w:r>
-          </w:p>
-        </w:tc>
-      </w:tr>
-      <w:tr>
-        <w:trPr>
-          <w:cantSplit/>
-        </w:trPr>
-        <w:tc>
-          <w:tcPr>
-            <w:tcW w:type="dxa" w:w="4724"/>
-            <w:tcBorders>
-              <w:top w:val="none" w:color="FFFFFF" w:sz="0"/>
-              <w:left w:val="none" w:color="FFFFFF" w:sz="0"/>
-              <w:bottom w:val="none" w:color="FFFFFF" w:sz="0"/>
-              <w:right w:val="none" w:color="FFFFFF" w:sz="0"/>
-            </w:tcBorders>
-            <w:tcMar>
-              <w:top w:type="dxa" w:w="0"/>
-              <w:left w:type="dxa" w:w="0"/>
-              <w:bottom w:type="dxa" w:w="0"/>
-              <w:right w:type="dxa" w:w="0"/>
-            </w:tcMar>
-            <w:vAlign w:val="center"/>
-          </w:tcPr>
-          <w:p>
-            <w:pPr>
-              <w:spacing w:after="40"/>
-              <w:jc w:val="center"/>
-            </w:pPr>
-            <w:r>
-              <w:drawing>
-                <wp:inline distT="0" distB="0" distL="0" distR="0">
-                  <wp:extent cx="3000375" cy="2247900"/>
-                  <wp:effectExtent t="0" r="0" b="0" l="0"/>
-                  <wp:docPr id="1" name="" descr="" title=""/>
-                  <wp:cNvGraphicFramePr>
-                    <a:graphicFrameLocks xmlns:a="http://schemas.openxmlformats.org/drawingml/2006/main" noChangeAspect="1"/>
-                  </wp:cNvGraphicFramePr>
-                  <a:graphic xmlns:a="http://schemas.openxmlformats.org/drawingml/2006/main">
-                    <a:graphicData uri="http://schemas.openxmlformats.org/drawingml/2006/picture">
-                      <pic:pic xmlns:pic="http://schemas.openxmlformats.org/drawingml/2006/picture">
-                        <pic:nvPicPr>
-                          <pic:cNvPr id="0" name="" descr=""/>
-                          <pic:cNvPicPr>
-                            <a:picLocks noChangeAspect="1" noChangeArrowheads="1"/>
-                          </pic:cNvPicPr>
-                        </pic:nvPicPr>
-                        <pic:blipFill>
-                          <a:blip r:embed="rId12" cstate="none"/>
-                          <a:srcRect/>
-                          <a:stretch>
-                            <a:fillRect/>
-                          </a:stretch>
-                        </pic:blipFill>
-                        <pic:spPr bwMode="auto">
-                          <a:xfrm>
-                            <a:off x="0" y="0"/>
-                            <a:ext cx="3000375" cy="2247900"/>
-                          </a:xfrm>
-                          <a:prstGeom prst="rect">
-                            <a:avLst/>
-                          </a:prstGeom>
-                        </pic:spPr>
-                      </pic:pic>
-                    </a:graphicData>
-                  </a:graphic>
-                </wp:inline>
-              </w:drawing>
-            </w:r>
-          </w:p>
-          <w:p>
-            <w:pPr>
-              <w:spacing w:after="0"/>
-              <w:jc w:val="center"/>
-            </w:pPr>
-            <w:r>
-              <w:rPr>
-                <w:rFonts w:ascii="Calibri" w:cs="Calibri" w:eastAsia="Calibri" w:hAnsi="Calibri"/>
-                <w:i/>
-                <w:iCs/>
-                <w:color w:val="8A94A6"/>
-                <w:sz w:val="17"/>
-                <w:szCs w:val="17"/>
-              </w:rPr>
-              <w:t xml:space="preserve">L'entrée de l'hôtel</w:t>
-            </w:r>
-          </w:p>
-        </w:tc>
-        <w:tc>
-          <w:tcPr>
-            <w:tcW w:type="dxa" w:w="200"/>
-            <w:tcBorders>
-              <w:top w:val="none" w:color="FFFFFF" w:sz="0"/>
-              <w:left w:val="none" w:color="FFFFFF" w:sz="0"/>
-              <w:bottom w:val="none" w:color="FFFFFF" w:sz="0"/>
-              <w:right w:val="none" w:color="FFFFFF" w:sz="0"/>
-            </w:tcBorders>
-          </w:tcPr>
-          <w:p>
-            <w:r>
-              <w:t xml:space="preserve"/>
-            </w:r>
-          </w:p>
-        </w:tc>
-        <w:tc>
-          <w:tcPr>
-            <w:tcW w:type="dxa" w:w="4724"/>
-            <w:tcBorders>
-              <w:top w:val="none" w:color="FFFFFF" w:sz="0"/>
-              <w:left w:val="none" w:color="FFFFFF" w:sz="0"/>
-              <w:bottom w:val="none" w:color="FFFFFF" w:sz="0"/>
-              <w:right w:val="none" w:color="FFFFFF" w:sz="0"/>
-            </w:tcBorders>
-            <w:tcMar>
-              <w:top w:type="dxa" w:w="0"/>
-              <w:left w:type="dxa" w:w="0"/>
-              <w:bottom w:type="dxa" w:w="0"/>
-              <w:right w:type="dxa" w:w="0"/>
-            </w:tcMar>
-            <w:vAlign w:val="center"/>
-          </w:tcPr>
-          <w:p>
-            <w:pPr>
-              <w:spacing w:after="40"/>
-              <w:jc w:val="center"/>
-            </w:pPr>
-            <w:r>
-              <w:drawing>
-                <wp:inline distT="0" distB="0" distL="0" distR="0">
-                  <wp:extent cx="3000375" cy="1685925"/>
-                  <wp:effectExtent t="0" r="0" b="0" l="0"/>
-                  <wp:docPr id="1" name="" descr="" title=""/>
-                  <wp:cNvGraphicFramePr>
-                    <a:graphicFrameLocks xmlns:a="http://schemas.openxmlformats.org/drawingml/2006/main" noChangeAspect="1"/>
-                  </wp:cNvGraphicFramePr>
-                  <a:graphic xmlns:a="http://schemas.openxmlformats.org/drawingml/2006/main">
-                    <a:graphicData uri="http://schemas.openxmlformats.org/drawingml/2006/picture">
-                      <pic:pic xmlns:pic="http://schemas.openxmlformats.org/drawingml/2006/picture">
-                        <pic:nvPicPr>
-                          <pic:cNvPr id="0" name="" descr=""/>
-                          <pic:cNvPicPr>
-                            <a:picLocks noChangeAspect="1" noChangeArrowheads="1"/>
-                          </pic:cNvPicPr>
-                        </pic:nvPicPr>
-                        <pic:blipFill>
-                          <a:blip r:embed="rId27" cstate="none"/>
-                          <a:srcRect/>
-                          <a:stretch>
-                            <a:fillRect/>
-                          </a:stretch>
-                        </pic:blipFill>
-                        <pic:spPr bwMode="auto">
-                          <a:xfrm>
-                            <a:off x="0" y="0"/>
-                            <a:ext cx="3000375" cy="1685925"/>
-                          </a:xfrm>
-                          <a:prstGeom prst="rect">
-                            <a:avLst/>
-                          </a:prstGeom>
-                        </pic:spPr>
-                      </pic:pic>
-                    </a:graphicData>
-                  </a:graphic>
-                </wp:inline>
-              </w:drawing>
-            </w:r>
-          </w:p>
-          <w:p>
-            <w:pPr>
-              <w:spacing w:after="0"/>
-              <w:jc w:val="center"/>
-            </w:pPr>
-            <w:r>
-              <w:rPr>
-                <w:rFonts w:ascii="Calibri" w:cs="Calibri" w:eastAsia="Calibri" w:hAnsi="Calibri"/>
-                <w:i/>
-                <w:iCs/>
-                <w:color w:val="8A94A6"/>
-                <w:sz w:val="17"/>
-                <w:szCs w:val="17"/>
-              </w:rPr>
-              <w:t xml:space="preserve">L'hôtel vu de l'arrière, côté condos</w:t>
-            </w:r>
-          </w:p>
-        </w:tc>
-      </w:tr>
-      <w:tr>
-        <w:trPr>
-          <w:trHeight w:val="160" w:hRule="exact"/>
-        </w:trPr>
-        <w:tc>
-          <w:tcPr>
-            <w:tcW w:type="dxa" w:w="9648"/>
-            <w:gridSpan w:val="3"/>
-            <w:tcBorders>
-              <w:top w:val="none" w:color="FFFFFF" w:sz="0"/>
-              <w:left w:val="none" w:color="FFFFFF" w:sz="0"/>
-              <w:bottom w:val="none" w:color="FFFFFF" w:sz="0"/>
-              <w:right w:val="none" w:color="FFFFFF" w:sz="0"/>
-            </w:tcBorders>
-          </w:tcPr>
-          <w:p>
-            <w:r>
-              <w:t xml:space="preserve"/>
-            </w:r>
-          </w:p>
-        </w:tc>
-      </w:tr>
-      <w:tr>
-        <w:trPr>
-          <w:cantSplit/>
-        </w:trPr>
-        <w:tc>
-          <w:tcPr>
-            <w:tcW w:type="dxa" w:w="4724"/>
-            <w:tcBorders>
-              <w:top w:val="none" w:color="FFFFFF" w:sz="0"/>
-              <w:left w:val="none" w:color="FFFFFF" w:sz="0"/>
-              <w:bottom w:val="none" w:color="FFFFFF" w:sz="0"/>
-              <w:right w:val="none" w:color="FFFFFF" w:sz="0"/>
-            </w:tcBorders>
-            <w:tcMar>
-              <w:top w:type="dxa" w:w="0"/>
-              <w:left w:type="dxa" w:w="0"/>
-              <w:bottom w:type="dxa" w:w="0"/>
-              <w:right w:type="dxa" w:w="0"/>
-            </w:tcMar>
-            <w:vAlign w:val="center"/>
-          </w:tcPr>
-          <w:p>
-            <w:pPr>
-              <w:spacing w:after="40"/>
-              <w:jc w:val="center"/>
-            </w:pPr>
-            <w:r>
-              <w:drawing>
-                <wp:inline distT="0" distB="0" distL="0" distR="0">
-                  <wp:extent cx="2286000" cy="2286000"/>
-                  <wp:effectExtent t="0" r="0" b="0" l="0"/>
-                  <wp:docPr id="1" name="" descr="" title=""/>
-                  <wp:cNvGraphicFramePr>
-                    <a:graphicFrameLocks xmlns:a="http://schemas.openxmlformats.org/drawingml/2006/main" noChangeAspect="1"/>
-                  </wp:cNvGraphicFramePr>
-                  <a:graphic xmlns:a="http://schemas.openxmlformats.org/drawingml/2006/main">
-                    <a:graphicData uri="http://schemas.openxmlformats.org/drawingml/2006/picture">
-                      <pic:pic xmlns:pic="http://schemas.openxmlformats.org/drawingml/2006/picture">
-                        <pic:nvPicPr>
-                          <pic:cNvPr id="0" name="" descr=""/>
-                          <pic:cNvPicPr>
-                            <a:picLocks noChangeAspect="1" noChangeArrowheads="1"/>
-                          </pic:cNvPicPr>
-                        </pic:nvPicPr>
-                        <pic:blipFill>
-                          <a:blip r:embed="rId28" cstate="none"/>
-                          <a:srcRect/>
-                          <a:stretch>
-                            <a:fillRect/>
-                          </a:stretch>
-                        </pic:blipFill>
-                        <pic:spPr bwMode="auto">
-                          <a:xfrm>
-                            <a:off x="0" y="0"/>
-                            <a:ext cx="2286000" cy="2286000"/>
-                          </a:xfrm>
-                          <a:prstGeom prst="rect">
-                            <a:avLst/>
-                          </a:prstGeom>
-                        </pic:spPr>
-                      </pic:pic>
-                    </a:graphicData>
-                  </a:graphic>
-                </wp:inline>
-              </w:drawing>
-            </w:r>
-          </w:p>
-          <w:p>
-            <w:pPr>
-              <w:spacing w:after="0"/>
-              <w:jc w:val="center"/>
-            </w:pPr>
-            <w:r>
-              <w:rPr>
-                <w:rFonts w:ascii="Calibri" w:cs="Calibri" w:eastAsia="Calibri" w:hAnsi="Calibri"/>
-                <w:i/>
-                <w:iCs/>
-                <w:color w:val="8A94A6"/>
-                <w:sz w:val="17"/>
-                <w:szCs w:val="17"/>
-              </w:rPr>
-              <w:t xml:space="preserve">Une famille d'invités sur la chaise géante « I ♥ Havana Resort »</w:t>
-            </w:r>
-          </w:p>
-        </w:tc>
-        <w:tc>
-          <w:tcPr>
-            <w:tcW w:type="dxa" w:w="200"/>
-            <w:tcBorders>
-              <w:top w:val="none" w:color="FFFFFF" w:sz="0"/>
-              <w:left w:val="none" w:color="FFFFFF" w:sz="0"/>
-              <w:bottom w:val="none" w:color="FFFFFF" w:sz="0"/>
-              <w:right w:val="none" w:color="FFFFFF" w:sz="0"/>
-            </w:tcBorders>
-          </w:tcPr>
-          <w:p>
-            <w:r>
-              <w:t xml:space="preserve"/>
-            </w:r>
-          </w:p>
-        </w:tc>
-        <w:tc>
-          <w:tcPr>
-            <w:tcW w:type="dxa" w:w="4724"/>
-            <w:tcBorders>
-              <w:top w:val="none" w:color="FFFFFF" w:sz="0"/>
-              <w:left w:val="none" w:color="FFFFFF" w:sz="0"/>
-              <w:bottom w:val="none" w:color="FFFFFF" w:sz="0"/>
-              <w:right w:val="none" w:color="FFFFFF" w:sz="0"/>
-            </w:tcBorders>
-            <w:tcMar>
-              <w:top w:type="dxa" w:w="0"/>
-              <w:left w:type="dxa" w:w="0"/>
-              <w:bottom w:type="dxa" w:w="0"/>
-              <w:right w:type="dxa" w:w="0"/>
-            </w:tcMar>
-            <w:vAlign w:val="center"/>
-          </w:tcPr>
-          <w:p>
-            <w:pPr>
-              <w:spacing w:after="40"/>
-              <w:jc w:val="center"/>
-            </w:pPr>
-            <w:r>
-              <w:drawing>
-                <wp:inline distT="0" distB="0" distL="0" distR="0">
-                  <wp:extent cx="1276350" cy="2286000"/>
-                  <wp:effectExtent t="0" r="0" b="0" l="0"/>
-                  <wp:docPr id="1" name="" descr="" title=""/>
-                  <wp:cNvGraphicFramePr>
-                    <a:graphicFrameLocks xmlns:a="http://schemas.openxmlformats.org/drawingml/2006/main" noChangeAspect="1"/>
-                  </wp:cNvGraphicFramePr>
-                  <a:graphic xmlns:a="http://schemas.openxmlformats.org/drawingml/2006/main">
-                    <a:graphicData uri="http://schemas.openxmlformats.org/drawingml/2006/picture">
-                      <pic:pic xmlns:pic="http://schemas.openxmlformats.org/drawingml/2006/picture">
-                        <pic:nvPicPr>
-                          <pic:cNvPr id="0" name="" descr=""/>
-                          <pic:cNvPicPr>
-                            <a:picLocks noChangeAspect="1" noChangeArrowheads="1"/>
-                          </pic:cNvPicPr>
-                        </pic:nvPicPr>
-                        <pic:blipFill>
-                          <a:blip r:embed="rId29" cstate="none"/>
-                          <a:srcRect/>
-                          <a:stretch>
-                            <a:fillRect/>
-                          </a:stretch>
-                        </pic:blipFill>
-                        <pic:spPr bwMode="auto">
-                          <a:xfrm>
-                            <a:off x="0" y="0"/>
-                            <a:ext cx="1276350" cy="2286000"/>
-                          </a:xfrm>
-                          <a:prstGeom prst="rect">
-                            <a:avLst/>
-                          </a:prstGeom>
-                        </pic:spPr>
-                      </pic:pic>
-                    </a:graphicData>
-                  </a:graphic>
-                </wp:inline>
-              </w:drawing>
-            </w:r>
-          </w:p>
-          <w:p>
-            <w:pPr>
-              <w:spacing w:after="0"/>
-              <w:jc w:val="center"/>
-            </w:pPr>
-            <w:r>
-              <w:rPr>
-                <w:rFonts w:ascii="Calibri" w:cs="Calibri" w:eastAsia="Calibri" w:hAnsi="Calibri"/>
-                <w:i/>
-                <w:iCs/>
-                <w:color w:val="8A94A6"/>
-                <w:sz w:val="17"/>
-                <w:szCs w:val="17"/>
-              </w:rPr>
-              <w:t xml:space="preserve">Visuel des réseaux sociaux : animation aquatique</w:t>
             </w:r>
           </w:p>
         </w:tc>

</xml_diff>

<commit_message>
Mise en page magazine du plan d'affaires
Couverture photo pleine page avec titre en surimpression, page
d'ouverture de chaque chapitre avec bandeau photo pleine largeur et
titre en blanc, photos recadrées à format constant (3:2, 16:9),
tableaux sans traits verticaux, quatrième de couverture. Le script de
préparation compose les dégradés et les recadrages.

Co-Authored-By: Claude Fable 5.1 <noreply@anthropic.com>
Claude-Session: https://claude.ai/code/session_01SZvZuYXZ3BuNTXPMcsdahV
</commit_message>
<xml_diff>
--- a/plan-affaires/Plan_affaires_Complexe_Havana.docx
+++ b/plan-affaires/Plan_affaires_Complexe_Havana.docx
@@ -4,63 +4,104 @@
   <w:body>
     <w:p>
       <w:pPr>
-        <w:spacing w:after="0" w:before="1800"/>
+        <w:spacing w:after="0" w:before="0" w:line="20" w:lineRule="exact"/>
+      </w:pPr>
+      <w:r>
+        <w:drawing>
+          <wp:anchor distT="0" distB="0" distL="0" distR="0" simplePos="0" allowOverlap="1" behindDoc="1" locked="1" layoutInCell="0" relativeHeight="10058400">
+            <wp:simplePos x="0" y="0"/>
+            <wp:positionH relativeFrom="page">
+              <wp:posOffset>0</wp:posOffset>
+            </wp:positionH>
+            <wp:positionV relativeFrom="page">
+              <wp:posOffset>0</wp:posOffset>
+            </wp:positionV>
+            <wp:extent cx="7772400" cy="10058400"/>
+            <wp:effectExtent t="0" r="0" b="0" l="0"/>
+            <wp:wrapNone/>
+            <wp:docPr id="1" name="" descr="" title=""/>
+            <wp:cNvGraphicFramePr>
+              <a:graphicFrameLocks xmlns:a="http://schemas.openxmlformats.org/drawingml/2006/main" noChangeAspect="1"/>
+            </wp:cNvGraphicFramePr>
+            <a:graphic xmlns:a="http://schemas.openxmlformats.org/drawingml/2006/main">
+              <a:graphicData uri="http://schemas.openxmlformats.org/drawingml/2006/picture">
+                <pic:pic xmlns:pic="http://schemas.openxmlformats.org/drawingml/2006/picture">
+                  <pic:nvPicPr>
+                    <pic:cNvPr id="0" name="" descr=""/>
+                    <pic:cNvPicPr>
+                      <a:picLocks noChangeAspect="1" noChangeArrowheads="1"/>
+                    </pic:cNvPicPr>
+                  </pic:nvPicPr>
+                  <pic:blipFill>
+                    <a:blip r:embed="rId13" cstate="none"/>
+                    <a:srcRect/>
+                    <a:stretch>
+                      <a:fillRect/>
+                    </a:stretch>
+                  </pic:blipFill>
+                  <pic:spPr bwMode="auto">
+                    <a:xfrm>
+                      <a:off x="0" y="0"/>
+                      <a:ext cx="7772400" cy="10058400"/>
+                    </a:xfrm>
+                    <a:prstGeom prst="rect">
+                      <a:avLst/>
+                    </a:prstGeom>
+                  </pic:spPr>
+                </pic:pic>
+              </a:graphicData>
+            </a:graphic>
+          </wp:anchor>
+        </w:drawing>
+      </w:r>
+    </w:p>
+    <w:p>
+      <w:pPr>
+        <w:spacing w:after="0" w:before="0" w:line="7400" w:lineRule="exact"/>
+      </w:pPr>
+    </w:p>
+    <w:p>
+      <w:pPr>
+        <w:spacing w:after="0"/>
       </w:pPr>
       <w:r>
         <w:rPr>
           <w:rFonts w:ascii="Calibri" w:cs="Calibri" w:eastAsia="Calibri" w:hAnsi="Calibri"/>
           <w:b/>
           <w:bCs/>
-          <w:color w:val="0B2A4A"/>
-          <w:sz w:val="64"/>
-          <w:szCs w:val="64"/>
+          <w:color w:val="C9A227"/>
+          <w:sz w:val="22"/>
+          <w:szCs w:val="22"/>
+        </w:rPr>
+        <w:t xml:space="preserve">PLAN D'AFFAIRES 2027 – 2031</w:t>
+      </w:r>
+    </w:p>
+    <w:p>
+      <w:pPr>
+        <w:spacing w:after="0" w:before="80"/>
+      </w:pPr>
+      <w:r>
+        <w:rPr>
+          <w:rFonts w:ascii="Calibri" w:cs="Calibri" w:eastAsia="Calibri" w:hAnsi="Calibri"/>
+          <w:b/>
+          <w:bCs/>
+          <w:color w:val="FFFFFF"/>
+          <w:sz w:val="72"/>
+          <w:szCs w:val="72"/>
         </w:rPr>
         <w:t xml:space="preserve">COMPLEXE HAVANA</w:t>
       </w:r>
     </w:p>
     <w:p>
       <w:pPr>
-        <w:pBdr>
-          <w:bottom w:val="single" w:color="1B7F79" w:sz="18" w:space="10"/>
-        </w:pBdr>
         <w:spacing w:after="0" w:before="60"/>
       </w:pPr>
       <w:r>
         <w:rPr>
-          <w:rFonts w:ascii="Calibri" w:cs="Calibri" w:eastAsia="Calibri" w:hAnsi="Calibri"/>
-          <w:color w:val="8A94A6"/>
-          <w:sz w:val="24"/>
-          <w:szCs w:val="24"/>
-        </w:rPr>
-        <w:t xml:space="preserve">Maricourt, Cantons-de-l'Est</w:t>
-      </w:r>
-    </w:p>
-    <w:p>
-      <w:pPr>
-        <w:spacing w:after="100" w:before="400"/>
-      </w:pPr>
-      <w:r>
-        <w:rPr>
-          <w:rFonts w:ascii="Calibri" w:cs="Calibri" w:eastAsia="Calibri" w:hAnsi="Calibri"/>
-          <w:b/>
-          <w:bCs/>
-          <w:color w:val="0B2A4A"/>
-          <w:sz w:val="44"/>
-          <w:szCs w:val="44"/>
-        </w:rPr>
-        <w:t xml:space="preserve">Plan d'affaires 2027 – 2031</w:t>
-      </w:r>
-    </w:p>
-    <w:p>
-      <w:pPr>
-        <w:spacing w:after="100" w:before="0"/>
-      </w:pPr>
-      <w:r>
-        <w:rPr>
-          <w:rFonts w:ascii="Calibri" w:cs="Calibri" w:eastAsia="Calibri" w:hAnsi="Calibri"/>
+          <w:rFonts w:ascii="Georgia" w:cs="Georgia" w:eastAsia="Georgia" w:hAnsi="Georgia"/>
           <w:i/>
           <w:iCs/>
-          <w:color w:val="1B7F79"/>
+          <w:color w:val="FFFFFF"/>
           <w:sz w:val="28"/>
           <w:szCs w:val="28"/>
         </w:rPr>
@@ -69,206 +110,30 @@
     </w:p>
     <w:p>
       <w:pPr>
-        <w:spacing w:after="500" w:before="0"/>
+        <w:spacing w:after="0" w:before="260"/>
       </w:pPr>
       <w:r>
         <w:rPr>
           <w:rFonts w:ascii="Calibri" w:cs="Calibri" w:eastAsia="Calibri" w:hAnsi="Calibri"/>
-          <w:color w:val="1F2933"/>
-          <w:sz w:val="26"/>
-          <w:szCs w:val="26"/>
+          <w:color w:val="D6DEE8"/>
+          <w:sz w:val="20"/>
+          <w:szCs w:val="20"/>
         </w:rPr>
-        <w:t xml:space="preserve">Demande de financement de 10,3 M$</w:t>
+        <w:t xml:space="preserve">Demande de financement de 10,3 M$   ·   Maricourt, Cantons-de-l'Est   ·   Septembre 2026</w:t>
       </w:r>
     </w:p>
-    <w:tbl>
-      <w:tblPr>
-        <w:tblW w:type="dxa" w:w="9648"/>
-        <w:tblBorders>
-          <w:top w:val="none" w:color="FFFFFF" w:sz="0"/>
-          <w:left w:val="none" w:color="FFFFFF" w:sz="0"/>
-          <w:bottom w:val="none" w:color="FFFFFF" w:sz="0"/>
-          <w:right w:val="none" w:color="FFFFFF" w:sz="0"/>
-          <w:insideH w:val="none" w:color="FFFFFF" w:sz="0"/>
-          <w:insideV w:val="none" w:color="FFFFFF" w:sz="0"/>
-        </w:tblBorders>
-      </w:tblPr>
-      <w:tblGrid>
-        <w:gridCol w:w="9648"/>
-      </w:tblGrid>
-      <w:tr>
-        <w:tc>
-          <w:tcPr>
-            <w:tcW w:type="dxa" w:w="9648"/>
-            <w:tcBorders>
-              <w:top w:val="none" w:color="FFFFFF" w:sz="0"/>
-              <w:left w:val="none" w:color="FFFFFF" w:sz="0"/>
-              <w:bottom w:val="none" w:color="FFFFFF" w:sz="0"/>
-              <w:right w:val="none" w:color="FFFFFF" w:sz="0"/>
-            </w:tcBorders>
-            <w:tcMar>
-              <w:top w:type="dxa" w:w="0"/>
-              <w:left w:type="dxa" w:w="0"/>
-              <w:bottom w:type="dxa" w:w="0"/>
-              <w:right w:type="dxa" w:w="0"/>
-            </w:tcMar>
-            <w:vAlign w:val="center"/>
-          </w:tcPr>
-          <w:p>
-            <w:pPr>
-              <w:spacing w:after="40"/>
-              <w:jc w:val="center"/>
-            </w:pPr>
-            <w:r>
-              <w:drawing>
-                <wp:inline distT="0" distB="0" distL="0" distR="0">
-                  <wp:extent cx="4705350" cy="3362325"/>
-                  <wp:effectExtent t="0" r="0" b="0" l="0"/>
-                  <wp:docPr id="1" name="" descr="" title=""/>
-                  <wp:cNvGraphicFramePr>
-                    <a:graphicFrameLocks xmlns:a="http://schemas.openxmlformats.org/drawingml/2006/main" noChangeAspect="1"/>
-                  </wp:cNvGraphicFramePr>
-                  <a:graphic xmlns:a="http://schemas.openxmlformats.org/drawingml/2006/main">
-                    <a:graphicData uri="http://schemas.openxmlformats.org/drawingml/2006/picture">
-                      <pic:pic xmlns:pic="http://schemas.openxmlformats.org/drawingml/2006/picture">
-                        <pic:nvPicPr>
-                          <pic:cNvPr id="0" name="" descr=""/>
-                          <pic:cNvPicPr>
-                            <a:picLocks noChangeAspect="1" noChangeArrowheads="1"/>
-                          </pic:cNvPicPr>
-                        </pic:nvPicPr>
-                        <pic:blipFill>
-                          <a:blip r:embed="rId9" cstate="none"/>
-                          <a:srcRect/>
-                          <a:stretch>
-                            <a:fillRect/>
-                          </a:stretch>
-                        </pic:blipFill>
-                        <pic:spPr bwMode="auto">
-                          <a:xfrm>
-                            <a:off x="0" y="0"/>
-                            <a:ext cx="4705350" cy="3362325"/>
-                          </a:xfrm>
-                          <a:prstGeom prst="rect">
-                            <a:avLst/>
-                          </a:prstGeom>
-                        </pic:spPr>
-                      </pic:pic>
-                    </a:graphicData>
-                  </a:graphic>
-                </wp:inline>
-              </w:drawing>
-            </w:r>
-          </w:p>
-          <w:p>
-            <w:pPr>
-              <w:spacing w:after="0"/>
-              <w:jc w:val="center"/>
-            </w:pPr>
-            <w:r>
-              <w:rPr>
-                <w:rFonts w:ascii="Calibri" w:cs="Calibri" w:eastAsia="Calibri" w:hAnsi="Calibri"/>
-                <w:i/>
-                <w:iCs/>
-                <w:color w:val="8A94A6"/>
-                <w:sz w:val="17"/>
-                <w:szCs w:val="17"/>
-              </w:rPr>
-              <w:t xml:space="preserve"/>
-            </w:r>
-          </w:p>
-        </w:tc>
-      </w:tr>
-    </w:tbl>
     <w:p>
       <w:pPr>
-        <w:spacing w:after="60" w:before="500"/>
+        <w:spacing w:after="0" w:before="60"/>
       </w:pPr>
       <w:r>
         <w:rPr>
           <w:rFonts w:ascii="Calibri" w:cs="Calibri" w:eastAsia="Calibri" w:hAnsi="Calibri"/>
-          <w:b/>
-          <w:bCs/>
-          <w:color w:val="0B2A4A"/>
-          <w:sz w:val="21"/>
-          <w:szCs w:val="21"/>
-        </w:rPr>
-        <w:t xml:space="preserve">Présenté à : </w:t>
-      </w:r>
-      <w:r>
-        <w:rPr>
-          <w:rFonts w:ascii="Calibri" w:cs="Calibri" w:eastAsia="Calibri" w:hAnsi="Calibri"/>
-          <w:color w:val="1F2933"/>
-          <w:sz w:val="21"/>
-          <w:szCs w:val="21"/>
-        </w:rPr>
-        <w:t xml:space="preserve">[Nom de l'institution financière]</w:t>
-      </w:r>
-    </w:p>
-    <w:p>
-      <w:pPr>
-        <w:spacing w:after="60"/>
-      </w:pPr>
-      <w:r>
-        <w:rPr>
-          <w:rFonts w:ascii="Calibri" w:cs="Calibri" w:eastAsia="Calibri" w:hAnsi="Calibri"/>
-          <w:b/>
-          <w:bCs/>
-          <w:color w:val="0B2A4A"/>
-          <w:sz w:val="21"/>
-          <w:szCs w:val="21"/>
-        </w:rPr>
-        <w:t xml:space="preserve">Préparé par : </w:t>
-      </w:r>
-      <w:r>
-        <w:rPr>
-          <w:rFonts w:ascii="Calibri" w:cs="Calibri" w:eastAsia="Calibri" w:hAnsi="Calibri"/>
-          <w:color w:val="1F2933"/>
-          <w:sz w:val="21"/>
-          <w:szCs w:val="21"/>
-        </w:rPr>
-        <w:t xml:space="preserve">La direction du Complexe Havana</w:t>
-      </w:r>
-    </w:p>
-    <w:p>
-      <w:pPr>
-        <w:spacing w:after="60"/>
-      </w:pPr>
-      <w:r>
-        <w:rPr>
-          <w:rFonts w:ascii="Calibri" w:cs="Calibri" w:eastAsia="Calibri" w:hAnsi="Calibri"/>
-          <w:b/>
-          <w:bCs/>
-          <w:color w:val="0B2A4A"/>
-          <w:sz w:val="21"/>
-          <w:szCs w:val="21"/>
-        </w:rPr>
-        <w:t xml:space="preserve">Date : </w:t>
-      </w:r>
-      <w:r>
-        <w:rPr>
-          <w:rFonts w:ascii="Calibri" w:cs="Calibri" w:eastAsia="Calibri" w:hAnsi="Calibri"/>
-          <w:color w:val="1F2933"/>
-          <w:sz w:val="21"/>
-          <w:szCs w:val="21"/>
-        </w:rPr>
-        <w:t xml:space="preserve">Septembre 2026</w:t>
-      </w:r>
-    </w:p>
-    <w:p>
-      <w:pPr>
-        <w:spacing w:after="0" w:before="300"/>
-      </w:pPr>
-      <w:r>
-        <w:rPr>
-          <w:rFonts w:ascii="Calibri" w:cs="Calibri" w:eastAsia="Calibri" w:hAnsi="Calibri"/>
-          <w:b/>
-          <w:bCs/>
-          <w:color w:val="8A94A6"/>
+          <w:color w:val="AAB6C6"/>
           <w:sz w:val="18"/>
           <w:szCs w:val="18"/>
         </w:rPr>
-        <w:t xml:space="preserve">DOCUMENT CONFIDENTIEL</w:t>
+        <w:t xml:space="preserve">Présenté à [nom de l'institution financière]   ·   Document confidentiel</w:t>
       </w:r>
     </w:p>
     <w:p>
@@ -355,37 +220,113 @@
     </w:p>
     <w:p>
       <w:pPr>
-        <w:pStyle w:val="Heading1"/>
         <w:pageBreakBefore/>
-        <w:pBdr>
-          <w:bottom w:val="single" w:color="1B7F79" w:sz="12" w:space="6"/>
-        </w:pBdr>
-        <w:spacing w:after="200" w:before="0"/>
+        <w:spacing w:after="0" w:before="0" w:line="20" w:lineRule="exact"/>
+      </w:pPr>
+      <w:r>
+        <w:drawing>
+          <wp:anchor distT="0" distB="0" distL="0" distR="0" simplePos="0" allowOverlap="1" behindDoc="1" locked="1" layoutInCell="0" relativeHeight="3838575">
+            <wp:simplePos x="0" y="0"/>
+            <wp:positionH relativeFrom="page">
+              <wp:posOffset>0</wp:posOffset>
+            </wp:positionH>
+            <wp:positionV relativeFrom="page">
+              <wp:posOffset>566928</wp:posOffset>
+            </wp:positionV>
+            <wp:extent cx="7772400" cy="3838575"/>
+            <wp:effectExtent t="0" r="0" b="0" l="0"/>
+            <wp:wrapNone/>
+            <wp:docPr id="1" name="" descr="" title=""/>
+            <wp:cNvGraphicFramePr>
+              <a:graphicFrameLocks xmlns:a="http://schemas.openxmlformats.org/drawingml/2006/main" noChangeAspect="1"/>
+            </wp:cNvGraphicFramePr>
+            <a:graphic xmlns:a="http://schemas.openxmlformats.org/drawingml/2006/main">
+              <a:graphicData uri="http://schemas.openxmlformats.org/drawingml/2006/picture">
+                <pic:pic xmlns:pic="http://schemas.openxmlformats.org/drawingml/2006/picture">
+                  <pic:nvPicPr>
+                    <pic:cNvPr id="0" name="" descr=""/>
+                    <pic:cNvPicPr>
+                      <a:picLocks noChangeAspect="1" noChangeArrowheads="1"/>
+                    </pic:cNvPicPr>
+                  </pic:nvPicPr>
+                  <pic:blipFill>
+                    <a:blip r:embed="rId14" cstate="none"/>
+                    <a:srcRect/>
+                    <a:stretch>
+                      <a:fillRect/>
+                    </a:stretch>
+                  </pic:blipFill>
+                  <pic:spPr bwMode="auto">
+                    <a:xfrm>
+                      <a:off x="0" y="0"/>
+                      <a:ext cx="7772400" cy="3838575"/>
+                    </a:xfrm>
+                    <a:prstGeom prst="rect">
+                      <a:avLst/>
+                    </a:prstGeom>
+                  </pic:spPr>
+                </pic:pic>
+              </a:graphicData>
+            </a:graphic>
+          </wp:anchor>
+        </w:drawing>
+      </w:r>
+    </w:p>
+    <w:p>
+      <w:pPr>
+        <w:spacing w:after="0" w:before="0" w:line="3800" w:lineRule="exact"/>
+      </w:pPr>
+    </w:p>
+    <w:p>
+      <w:pPr>
+        <w:spacing w:after="60" w:before="0"/>
       </w:pPr>
       <w:r>
         <w:rPr>
           <w:rFonts w:ascii="Calibri" w:cs="Calibri" w:eastAsia="Calibri" w:hAnsi="Calibri"/>
           <w:b/>
           <w:bCs/>
-          <w:color w:val="0B2A4A"/>
-          <w:sz w:val="40"/>
-          <w:szCs w:val="40"/>
+          <w:color w:val="C9A227"/>
+          <w:sz w:val="26"/>
+          <w:szCs w:val="26"/>
         </w:rPr>
-        <w:t xml:space="preserve">1. Sommaire exécutif</w:t>
+        <w:t xml:space="preserve">01</w:t>
       </w:r>
     </w:p>
     <w:p>
       <w:pPr>
-        <w:spacing w:after="200" w:before="0" w:line="276"/>
+        <w:pStyle w:val="Heading1"/>
+        <w:spacing w:after="0" w:before="0"/>
       </w:pPr>
       <w:r>
         <w:rPr>
           <w:rFonts w:ascii="Calibri" w:cs="Calibri" w:eastAsia="Calibri" w:hAnsi="Calibri"/>
+          <w:b/>
+          <w:bCs/>
+          <w:color w:val="FFFFFF"/>
+          <w:sz w:val="46"/>
+          <w:szCs w:val="46"/>
+        </w:rPr>
+        <w:t xml:space="preserve">Sommaire exécutif</w:t>
+      </w:r>
+    </w:p>
+    <w:p>
+      <w:pPr>
+        <w:spacing w:after="0" w:before="0" w:line="1250" w:lineRule="exact"/>
+      </w:pPr>
+    </w:p>
+    <w:p>
+      <w:pPr>
+        <w:spacing w:after="240" w:before="0" w:line="300"/>
+      </w:pPr>
+      <w:r>
+        <w:rPr>
+          <w:rFonts w:ascii="Georgia" w:cs="Georgia" w:eastAsia="Georgia" w:hAnsi="Georgia"/>
           <w:i/>
           <w:iCs/>
           <w:color w:val="1B7F79"/>
-          <w:sz w:val="24"/>
-          <w:szCs w:val="24"/>
+          <w:sz w:val="25"/>
+          <w:szCs w:val="25"/>
         </w:rPr>
         <w:t xml:space="preserve">Un concept unique au Québec, un site qui affiche complet chaque été et une expansion structurée vers une exploitation douze mois par année.</w:t>
       </w:r>
@@ -436,8 +377,8 @@
                 <w:b/>
                 <w:bCs/>
                 <w:color w:val="0B2A4A"/>
-                <w:sz w:val="30"/>
-                <w:szCs w:val="30"/>
+                <w:sz w:val="36"/>
+                <w:szCs w:val="36"/>
               </w:rPr>
               <w:t xml:space="preserve">1,53 M$</w:t>
             </w:r>
@@ -484,8 +425,8 @@
                 <w:b/>
                 <w:bCs/>
                 <w:color w:val="0B2A4A"/>
-                <w:sz w:val="30"/>
-                <w:szCs w:val="30"/>
+                <w:sz w:val="36"/>
+                <w:szCs w:val="36"/>
               </w:rPr>
               <w:t xml:space="preserve">28 M$</w:t>
             </w:r>
@@ -532,8 +473,8 @@
                 <w:b/>
                 <w:bCs/>
                 <w:color w:val="0B2A4A"/>
-                <w:sz w:val="30"/>
-                <w:szCs w:val="30"/>
+                <w:sz w:val="36"/>
+                <w:szCs w:val="36"/>
               </w:rPr>
               <w:t xml:space="preserve">10,3 M$</w:t>
             </w:r>
@@ -580,8 +521,8 @@
                 <w:b/>
                 <w:bCs/>
                 <w:color w:val="0B2A4A"/>
-                <w:sz w:val="30"/>
-                <w:szCs w:val="30"/>
+                <w:sz w:val="36"/>
+                <w:szCs w:val="36"/>
               </w:rPr>
               <w:t xml:space="preserve">37 %</w:t>
             </w:r>
@@ -654,8 +595,8 @@
                 <w:b/>
                 <w:bCs/>
                 <w:color w:val="0B2A4A"/>
-                <w:sz w:val="30"/>
-                <w:szCs w:val="30"/>
+                <w:sz w:val="36"/>
+                <w:szCs w:val="36"/>
               </w:rPr>
               <w:t xml:space="preserve">5,9 M$</w:t>
             </w:r>
@@ -702,8 +643,8 @@
                 <w:b/>
                 <w:bCs/>
                 <w:color w:val="0B2A4A"/>
-                <w:sz w:val="30"/>
-                <w:szCs w:val="30"/>
+                <w:sz w:val="36"/>
+                <w:szCs w:val="36"/>
               </w:rPr>
               <w:t xml:space="preserve">2,0 M$</w:t>
             </w:r>
@@ -750,8 +691,8 @@
                 <w:b/>
                 <w:bCs/>
                 <w:color w:val="0B2A4A"/>
-                <w:sz w:val="30"/>
-                <w:szCs w:val="30"/>
+                <w:sz w:val="36"/>
+                <w:szCs w:val="36"/>
               </w:rPr>
               <w:t xml:space="preserve">1,79 x</w:t>
             </w:r>
@@ -798,8 +739,8 @@
                 <w:b/>
                 <w:bCs/>
                 <w:color w:val="0B2A4A"/>
-                <w:sz w:val="30"/>
-                <w:szCs w:val="30"/>
+                <w:sz w:val="36"/>
+                <w:szCs w:val="36"/>
               </w:rPr>
               <w:t xml:space="preserve">2,27 x</w:t>
             </w:r>
@@ -1178,12 +1119,12 @@
       <w:tblPr>
         <w:tblW w:type="dxa" w:w="9648"/>
         <w:tblBorders>
-          <w:top w:val="single" w:color="D9DEE7" w:sz="4"/>
-          <w:left w:val="single" w:color="D9DEE7" w:sz="4"/>
-          <w:bottom w:val="single" w:color="D9DEE7" w:sz="4"/>
-          <w:right w:val="single" w:color="D9DEE7" w:sz="4"/>
+          <w:top w:val="none" w:color="FFFFFF" w:sz="0"/>
+          <w:left w:val="none" w:color="FFFFFF" w:sz="0"/>
+          <w:bottom w:val="single" w:color="0B2A4A" w:sz="8"/>
+          <w:right w:val="none" w:color="FFFFFF" w:sz="0"/>
           <w:insideH w:val="single" w:color="D9DEE7" w:sz="4"/>
-          <w:insideV w:val="single" w:color="D9DEE7" w:sz="4"/>
+          <w:insideV w:val="none" w:color="FFFFFF" w:sz="0"/>
         </w:tblBorders>
       </w:tblPr>
       <w:tblGrid>
@@ -2497,37 +2438,113 @@
     </w:tbl>
     <w:p>
       <w:pPr>
-        <w:pStyle w:val="Heading1"/>
         <w:pageBreakBefore/>
-        <w:pBdr>
-          <w:bottom w:val="single" w:color="1B7F79" w:sz="12" w:space="6"/>
-        </w:pBdr>
-        <w:spacing w:after="200" w:before="0"/>
+        <w:spacing w:after="0" w:before="0" w:line="20" w:lineRule="exact"/>
+      </w:pPr>
+      <w:r>
+        <w:drawing>
+          <wp:anchor distT="0" distB="0" distL="0" distR="0" simplePos="0" allowOverlap="1" behindDoc="1" locked="1" layoutInCell="0" relativeHeight="3838575">
+            <wp:simplePos x="0" y="0"/>
+            <wp:positionH relativeFrom="page">
+              <wp:posOffset>0</wp:posOffset>
+            </wp:positionH>
+            <wp:positionV relativeFrom="page">
+              <wp:posOffset>566928</wp:posOffset>
+            </wp:positionV>
+            <wp:extent cx="7772400" cy="3838575"/>
+            <wp:effectExtent t="0" r="0" b="0" l="0"/>
+            <wp:wrapNone/>
+            <wp:docPr id="1" name="" descr="" title=""/>
+            <wp:cNvGraphicFramePr>
+              <a:graphicFrameLocks xmlns:a="http://schemas.openxmlformats.org/drawingml/2006/main" noChangeAspect="1"/>
+            </wp:cNvGraphicFramePr>
+            <a:graphic xmlns:a="http://schemas.openxmlformats.org/drawingml/2006/main">
+              <a:graphicData uri="http://schemas.openxmlformats.org/drawingml/2006/picture">
+                <pic:pic xmlns:pic="http://schemas.openxmlformats.org/drawingml/2006/picture">
+                  <pic:nvPicPr>
+                    <pic:cNvPr id="0" name="" descr=""/>
+                    <pic:cNvPicPr>
+                      <a:picLocks noChangeAspect="1" noChangeArrowheads="1"/>
+                    </pic:cNvPicPr>
+                  </pic:nvPicPr>
+                  <pic:blipFill>
+                    <a:blip r:embed="rId15" cstate="none"/>
+                    <a:srcRect/>
+                    <a:stretch>
+                      <a:fillRect/>
+                    </a:stretch>
+                  </pic:blipFill>
+                  <pic:spPr bwMode="auto">
+                    <a:xfrm>
+                      <a:off x="0" y="0"/>
+                      <a:ext cx="7772400" cy="3838575"/>
+                    </a:xfrm>
+                    <a:prstGeom prst="rect">
+                      <a:avLst/>
+                    </a:prstGeom>
+                  </pic:spPr>
+                </pic:pic>
+              </a:graphicData>
+            </a:graphic>
+          </wp:anchor>
+        </w:drawing>
+      </w:r>
+    </w:p>
+    <w:p>
+      <w:pPr>
+        <w:spacing w:after="0" w:before="0" w:line="3800" w:lineRule="exact"/>
+      </w:pPr>
+    </w:p>
+    <w:p>
+      <w:pPr>
+        <w:spacing w:after="60" w:before="0"/>
       </w:pPr>
       <w:r>
         <w:rPr>
           <w:rFonts w:ascii="Calibri" w:cs="Calibri" w:eastAsia="Calibri" w:hAnsi="Calibri"/>
           <w:b/>
           <w:bCs/>
-          <w:color w:val="0B2A4A"/>
-          <w:sz w:val="40"/>
-          <w:szCs w:val="40"/>
+          <w:color w:val="C9A227"/>
+          <w:sz w:val="26"/>
+          <w:szCs w:val="26"/>
         </w:rPr>
-        <w:t xml:space="preserve">2. L'entreprise</w:t>
+        <w:t xml:space="preserve">02</w:t>
       </w:r>
     </w:p>
     <w:p>
       <w:pPr>
-        <w:spacing w:after="200" w:before="0" w:line="276"/>
+        <w:pStyle w:val="Heading1"/>
+        <w:spacing w:after="0" w:before="0"/>
       </w:pPr>
       <w:r>
         <w:rPr>
           <w:rFonts w:ascii="Calibri" w:cs="Calibri" w:eastAsia="Calibri" w:hAnsi="Calibri"/>
+          <w:b/>
+          <w:bCs/>
+          <w:color w:val="FFFFFF"/>
+          <w:sz w:val="46"/>
+          <w:szCs w:val="46"/>
+        </w:rPr>
+        <w:t xml:space="preserve">L'entreprise</w:t>
+      </w:r>
+    </w:p>
+    <w:p>
+      <w:pPr>
+        <w:spacing w:after="0" w:before="0" w:line="1250" w:lineRule="exact"/>
+      </w:pPr>
+    </w:p>
+    <w:p>
+      <w:pPr>
+        <w:spacing w:after="240" w:before="0" w:line="300"/>
+      </w:pPr>
+      <w:r>
+        <w:rPr>
+          <w:rFonts w:ascii="Georgia" w:cs="Georgia" w:eastAsia="Georgia" w:hAnsi="Georgia"/>
           <w:i/>
           <w:iCs/>
           <w:color w:val="1B7F79"/>
-          <w:sz w:val="24"/>
-          <w:szCs w:val="24"/>
+          <w:sz w:val="25"/>
+          <w:szCs w:val="25"/>
         </w:rPr>
         <w:t xml:space="preserve">Dix ans d'exploitation, un concept qui n'existe nulle part ailleurs au Québec et un site de 263 acres qui vaut 28 M$.</w:t>
       </w:r>
@@ -2574,105 +2591,6 @@
         <w:t xml:space="preserve">Le concept s'articule autour d'une piscine centrale avec café-bar intégré, où se déploient l'animation, la musique et l'ambiance festive et familiale des grandes destinations vacances. Au fil des saisons, l'offre s'est enrichie de chalets, de cabanas prêt-à-camper, d'un premier bâtiment hôtelier de six chambres et d'activités récréatives. Le camping est aujourd'hui devenu trop petit pour la demande.</w:t>
       </w:r>
     </w:p>
-    <w:tbl>
-      <w:tblPr>
-        <w:tblW w:type="dxa" w:w="9648"/>
-        <w:tblBorders>
-          <w:top w:val="none" w:color="FFFFFF" w:sz="0"/>
-          <w:left w:val="none" w:color="FFFFFF" w:sz="0"/>
-          <w:bottom w:val="none" w:color="FFFFFF" w:sz="0"/>
-          <w:right w:val="none" w:color="FFFFFF" w:sz="0"/>
-          <w:insideH w:val="none" w:color="FFFFFF" w:sz="0"/>
-          <w:insideV w:val="none" w:color="FFFFFF" w:sz="0"/>
-        </w:tblBorders>
-      </w:tblPr>
-      <w:tblGrid>
-        <w:gridCol w:w="9648"/>
-      </w:tblGrid>
-      <w:tr>
-        <w:tc>
-          <w:tcPr>
-            <w:tcW w:type="dxa" w:w="9648"/>
-            <w:tcBorders>
-              <w:top w:val="none" w:color="FFFFFF" w:sz="0"/>
-              <w:left w:val="none" w:color="FFFFFF" w:sz="0"/>
-              <w:bottom w:val="none" w:color="FFFFFF" w:sz="0"/>
-              <w:right w:val="none" w:color="FFFFFF" w:sz="0"/>
-            </w:tcBorders>
-            <w:tcMar>
-              <w:top w:type="dxa" w:w="0"/>
-              <w:left w:type="dxa" w:w="0"/>
-              <w:bottom w:type="dxa" w:w="0"/>
-              <w:right w:type="dxa" w:w="0"/>
-            </w:tcMar>
-            <w:vAlign w:val="center"/>
-          </w:tcPr>
-          <w:p>
-            <w:pPr>
-              <w:spacing w:after="40"/>
-              <w:jc w:val="center"/>
-            </w:pPr>
-            <w:r>
-              <w:drawing>
-                <wp:inline distT="0" distB="0" distL="0" distR="0">
-                  <wp:extent cx="2952750" cy="1781175"/>
-                  <wp:effectExtent t="0" r="0" b="0" l="0"/>
-                  <wp:docPr id="1" name="" descr="" title=""/>
-                  <wp:cNvGraphicFramePr>
-                    <a:graphicFrameLocks xmlns:a="http://schemas.openxmlformats.org/drawingml/2006/main" noChangeAspect="1"/>
-                  </wp:cNvGraphicFramePr>
-                  <a:graphic xmlns:a="http://schemas.openxmlformats.org/drawingml/2006/main">
-                    <a:graphicData uri="http://schemas.openxmlformats.org/drawingml/2006/picture">
-                      <pic:pic xmlns:pic="http://schemas.openxmlformats.org/drawingml/2006/picture">
-                        <pic:nvPicPr>
-                          <pic:cNvPr id="0" name="" descr=""/>
-                          <pic:cNvPicPr>
-                            <a:picLocks noChangeAspect="1" noChangeArrowheads="1"/>
-                          </pic:cNvPicPr>
-                        </pic:nvPicPr>
-                        <pic:blipFill>
-                          <a:blip r:embed="rId10" cstate="none"/>
-                          <a:srcRect/>
-                          <a:stretch>
-                            <a:fillRect/>
-                          </a:stretch>
-                        </pic:blipFill>
-                        <pic:spPr bwMode="auto">
-                          <a:xfrm>
-                            <a:off x="0" y="0"/>
-                            <a:ext cx="2952750" cy="1781175"/>
-                          </a:xfrm>
-                          <a:prstGeom prst="rect">
-                            <a:avLst/>
-                          </a:prstGeom>
-                        </pic:spPr>
-                      </pic:pic>
-                    </a:graphicData>
-                  </a:graphic>
-                </wp:inline>
-              </w:drawing>
-            </w:r>
-          </w:p>
-          <w:p>
-            <w:pPr>
-              <w:spacing w:after="0"/>
-              <w:jc w:val="center"/>
-            </w:pPr>
-            <w:r>
-              <w:rPr>
-                <w:rFonts w:ascii="Calibri" w:cs="Calibri" w:eastAsia="Calibri" w:hAnsi="Calibri"/>
-                <w:i/>
-                <w:iCs/>
-                <w:color w:val="8A94A6"/>
-                <w:sz w:val="17"/>
-                <w:szCs w:val="17"/>
-              </w:rPr>
-              <w:t xml:space="preserve">Le pavillon d'accueil : dès l'entrée, le toit de chaume annonce le concept cubain</w:t>
-            </w:r>
-          </w:p>
-        </w:tc>
-      </w:tr>
-    </w:tbl>
     <w:p>
       <w:pPr>
         <w:pStyle w:val="Heading2"/>
@@ -2911,12 +2829,12 @@
       <w:tblPr>
         <w:tblW w:type="dxa" w:w="9648"/>
         <w:tblBorders>
-          <w:top w:val="single" w:color="D9DEE7" w:sz="4"/>
-          <w:left w:val="single" w:color="D9DEE7" w:sz="4"/>
-          <w:bottom w:val="single" w:color="D9DEE7" w:sz="4"/>
-          <w:right w:val="single" w:color="D9DEE7" w:sz="4"/>
+          <w:top w:val="none" w:color="FFFFFF" w:sz="0"/>
+          <w:left w:val="none" w:color="FFFFFF" w:sz="0"/>
+          <w:bottom w:val="single" w:color="0B2A4A" w:sz="8"/>
+          <w:right w:val="none" w:color="FFFFFF" w:sz="0"/>
           <w:insideH w:val="single" w:color="D9DEE7" w:sz="4"/>
-          <w:insideV w:val="single" w:color="D9DEE7" w:sz="4"/>
+          <w:insideV w:val="none" w:color="FFFFFF" w:sz="0"/>
         </w:tblBorders>
       </w:tblPr>
       <w:tblGrid>
@@ -3496,12 +3414,12 @@
       <w:tblPr>
         <w:tblW w:type="dxa" w:w="9648"/>
         <w:tblBorders>
-          <w:top w:val="single" w:color="D9DEE7" w:sz="4"/>
-          <w:left w:val="single" w:color="D9DEE7" w:sz="4"/>
-          <w:bottom w:val="single" w:color="D9DEE7" w:sz="4"/>
-          <w:right w:val="single" w:color="D9DEE7" w:sz="4"/>
+          <w:top w:val="none" w:color="FFFFFF" w:sz="0"/>
+          <w:left w:val="none" w:color="FFFFFF" w:sz="0"/>
+          <w:bottom w:val="single" w:color="0B2A4A" w:sz="8"/>
+          <w:right w:val="none" w:color="FFFFFF" w:sz="0"/>
           <w:insideH w:val="single" w:color="D9DEE7" w:sz="4"/>
-          <w:insideV w:val="single" w:color="D9DEE7" w:sz="4"/>
+          <w:insideV w:val="none" w:color="FFFFFF" w:sz="0"/>
         </w:tblBorders>
       </w:tblPr>
       <w:tblGrid>
@@ -4803,13 +4721,13 @@
           </w:tcPr>
           <w:p>
             <w:pPr>
-              <w:spacing w:after="40"/>
-              <w:jc w:val="center"/>
+              <w:spacing w:after="60"/>
+              <w:jc w:val="left"/>
             </w:pPr>
             <w:r>
               <w:drawing>
                 <wp:inline distT="0" distB="0" distL="0" distR="0">
-                  <wp:extent cx="2790825" cy="2095500"/>
+                  <wp:extent cx="3000375" cy="2000250"/>
                   <wp:effectExtent t="0" r="0" b="0" l="0"/>
                   <wp:docPr id="1" name="" descr="" title=""/>
                   <wp:cNvGraphicFramePr>
@@ -4825,7 +4743,7 @@
                           </pic:cNvPicPr>
                         </pic:nvPicPr>
                         <pic:blipFill>
-                          <a:blip r:embed="rId11" cstate="none"/>
+                          <a:blip r:embed="rId16" cstate="none"/>
                           <a:srcRect/>
                           <a:stretch>
                             <a:fillRect/>
@@ -4834,7 +4752,7 @@
                         <pic:spPr bwMode="auto">
                           <a:xfrm>
                             <a:off x="0" y="0"/>
-                            <a:ext cx="2790825" cy="2095500"/>
+                            <a:ext cx="3000375" cy="2000250"/>
                           </a:xfrm>
                           <a:prstGeom prst="rect">
                             <a:avLst/>
@@ -4849,19 +4767,20 @@
           </w:p>
           <w:p>
             <w:pPr>
-              <w:spacing w:after="0"/>
-              <w:jc w:val="center"/>
-            </w:pPr>
-            <w:r>
-              <w:rPr>
-                <w:rFonts w:ascii="Calibri" w:cs="Calibri" w:eastAsia="Calibri" w:hAnsi="Calibri"/>
-                <w:i/>
-                <w:iCs/>
+              <w:pBdr>
+                <w:top w:val="single" w:color="1B7F79" w:sz="6" w:space="3"/>
+              </w:pBdr>
+              <w:spacing w:after="0" w:line="240"/>
+              <w:jc w:val="left"/>
+            </w:pPr>
+            <w:r>
+              <w:rPr>
+                <w:rFonts w:ascii="Calibri" w:cs="Calibri" w:eastAsia="Calibri" w:hAnsi="Calibri"/>
                 <w:color w:val="8A94A6"/>
-                <w:sz w:val="17"/>
-                <w:szCs w:val="17"/>
-              </w:rPr>
-              <w:t xml:space="preserve">Les 265 terrains de camping : 52 % des revenus 2026, complets en haute saison</w:t>
+                <w:sz w:val="16"/>
+                <w:szCs w:val="16"/>
+              </w:rPr>
+              <w:t xml:space="preserve">265 terrains de camping : 52 % des revenus 2026, complets en haute saison</w:t>
             </w:r>
           </w:p>
         </w:tc>
@@ -4900,13 +4819,13 @@
           </w:tcPr>
           <w:p>
             <w:pPr>
-              <w:spacing w:after="40"/>
-              <w:jc w:val="center"/>
+              <w:spacing w:after="60"/>
+              <w:jc w:val="left"/>
             </w:pPr>
             <w:r>
               <w:drawing>
                 <wp:inline distT="0" distB="0" distL="0" distR="0">
-                  <wp:extent cx="3000375" cy="1809750"/>
+                  <wp:extent cx="3000375" cy="2000250"/>
                   <wp:effectExtent t="0" r="0" b="0" l="0"/>
                   <wp:docPr id="1" name="" descr="" title=""/>
                   <wp:cNvGraphicFramePr>
@@ -4922,7 +4841,7 @@
                           </pic:cNvPicPr>
                         </pic:nvPicPr>
                         <pic:blipFill>
-                          <a:blip r:embed="rId12" cstate="none"/>
+                          <a:blip r:embed="rId17" cstate="none"/>
                           <a:srcRect/>
                           <a:stretch>
                             <a:fillRect/>
@@ -4931,7 +4850,7 @@
                         <pic:spPr bwMode="auto">
                           <a:xfrm>
                             <a:off x="0" y="0"/>
-                            <a:ext cx="3000375" cy="1809750"/>
+                            <a:ext cx="3000375" cy="2000250"/>
                           </a:xfrm>
                           <a:prstGeom prst="rect">
                             <a:avLst/>
@@ -4946,19 +4865,20 @@
           </w:p>
           <w:p>
             <w:pPr>
-              <w:spacing w:after="0"/>
-              <w:jc w:val="center"/>
-            </w:pPr>
-            <w:r>
-              <w:rPr>
-                <w:rFonts w:ascii="Calibri" w:cs="Calibri" w:eastAsia="Calibri" w:hAnsi="Calibri"/>
-                <w:i/>
-                <w:iCs/>
+              <w:pBdr>
+                <w:top w:val="single" w:color="1B7F79" w:sz="6" w:space="3"/>
+              </w:pBdr>
+              <w:spacing w:after="0" w:line="240"/>
+              <w:jc w:val="left"/>
+            </w:pPr>
+            <w:r>
+              <w:rPr>
+                <w:rFonts w:ascii="Calibri" w:cs="Calibri" w:eastAsia="Calibri" w:hAnsi="Calibri"/>
                 <w:color w:val="8A94A6"/>
-                <w:sz w:val="17"/>
-                <w:szCs w:val="17"/>
-              </w:rPr>
-              <w:t xml:space="preserve">Les chalets et chambres : 33 % des revenus 2026, en hausse de 24 % en un an</w:t>
+                <w:sz w:val="16"/>
+                <w:szCs w:val="16"/>
+              </w:rPr>
+              <w:t xml:space="preserve">Chalets et chambres : 33 % des revenus 2026, en hausse de 24 % en un an</w:t>
             </w:r>
           </w:p>
         </w:tc>
@@ -5003,12 +4923,12 @@
       <w:tblPr>
         <w:tblW w:type="dxa" w:w="9648"/>
         <w:tblBorders>
-          <w:top w:val="single" w:color="D9DEE7" w:sz="4"/>
-          <w:left w:val="single" w:color="D9DEE7" w:sz="4"/>
-          <w:bottom w:val="single" w:color="D9DEE7" w:sz="4"/>
-          <w:right w:val="single" w:color="D9DEE7" w:sz="4"/>
+          <w:top w:val="none" w:color="FFFFFF" w:sz="0"/>
+          <w:left w:val="none" w:color="FFFFFF" w:sz="0"/>
+          <w:bottom w:val="single" w:color="0B2A4A" w:sz="8"/>
+          <w:right w:val="none" w:color="FFFFFF" w:sz="0"/>
           <w:insideH w:val="single" w:color="D9DEE7" w:sz="4"/>
-          <w:insideV w:val="single" w:color="D9DEE7" w:sz="4"/>
+          <w:insideV w:val="none" w:color="FFFFFF" w:sz="0"/>
         </w:tblBorders>
       </w:tblPr>
       <w:tblGrid>
@@ -6216,37 +6136,113 @@
     </w:tbl>
     <w:p>
       <w:pPr>
-        <w:pStyle w:val="Heading1"/>
         <w:pageBreakBefore/>
-        <w:pBdr>
-          <w:bottom w:val="single" w:color="1B7F79" w:sz="12" w:space="6"/>
-        </w:pBdr>
-        <w:spacing w:after="200" w:before="0"/>
+        <w:spacing w:after="0" w:before="0" w:line="20" w:lineRule="exact"/>
+      </w:pPr>
+      <w:r>
+        <w:drawing>
+          <wp:anchor distT="0" distB="0" distL="0" distR="0" simplePos="0" allowOverlap="1" behindDoc="1" locked="1" layoutInCell="0" relativeHeight="3838575">
+            <wp:simplePos x="0" y="0"/>
+            <wp:positionH relativeFrom="page">
+              <wp:posOffset>0</wp:posOffset>
+            </wp:positionH>
+            <wp:positionV relativeFrom="page">
+              <wp:posOffset>566928</wp:posOffset>
+            </wp:positionV>
+            <wp:extent cx="7772400" cy="3838575"/>
+            <wp:effectExtent t="0" r="0" b="0" l="0"/>
+            <wp:wrapNone/>
+            <wp:docPr id="1" name="" descr="" title=""/>
+            <wp:cNvGraphicFramePr>
+              <a:graphicFrameLocks xmlns:a="http://schemas.openxmlformats.org/drawingml/2006/main" noChangeAspect="1"/>
+            </wp:cNvGraphicFramePr>
+            <a:graphic xmlns:a="http://schemas.openxmlformats.org/drawingml/2006/main">
+              <a:graphicData uri="http://schemas.openxmlformats.org/drawingml/2006/picture">
+                <pic:pic xmlns:pic="http://schemas.openxmlformats.org/drawingml/2006/picture">
+                  <pic:nvPicPr>
+                    <pic:cNvPr id="0" name="" descr=""/>
+                    <pic:cNvPicPr>
+                      <a:picLocks noChangeAspect="1" noChangeArrowheads="1"/>
+                    </pic:cNvPicPr>
+                  </pic:nvPicPr>
+                  <pic:blipFill>
+                    <a:blip r:embed="rId18" cstate="none"/>
+                    <a:srcRect/>
+                    <a:stretch>
+                      <a:fillRect/>
+                    </a:stretch>
+                  </pic:blipFill>
+                  <pic:spPr bwMode="auto">
+                    <a:xfrm>
+                      <a:off x="0" y="0"/>
+                      <a:ext cx="7772400" cy="3838575"/>
+                    </a:xfrm>
+                    <a:prstGeom prst="rect">
+                      <a:avLst/>
+                    </a:prstGeom>
+                  </pic:spPr>
+                </pic:pic>
+              </a:graphicData>
+            </a:graphic>
+          </wp:anchor>
+        </w:drawing>
+      </w:r>
+    </w:p>
+    <w:p>
+      <w:pPr>
+        <w:spacing w:after="0" w:before="0" w:line="3800" w:lineRule="exact"/>
+      </w:pPr>
+    </w:p>
+    <w:p>
+      <w:pPr>
+        <w:spacing w:after="60" w:before="0"/>
       </w:pPr>
       <w:r>
         <w:rPr>
           <w:rFonts w:ascii="Calibri" w:cs="Calibri" w:eastAsia="Calibri" w:hAnsi="Calibri"/>
           <w:b/>
           <w:bCs/>
-          <w:color w:val="0B2A4A"/>
-          <w:sz w:val="40"/>
-          <w:szCs w:val="40"/>
+          <w:color w:val="C9A227"/>
+          <w:sz w:val="26"/>
+          <w:szCs w:val="26"/>
         </w:rPr>
-        <w:t xml:space="preserve">3. Le projet : un centre de villégiature quatre saisons</w:t>
+        <w:t xml:space="preserve">03</w:t>
       </w:r>
     </w:p>
     <w:p>
       <w:pPr>
-        <w:spacing w:after="200" w:before="0" w:line="276"/>
+        <w:pStyle w:val="Heading1"/>
+        <w:spacing w:after="0" w:before="0"/>
       </w:pPr>
       <w:r>
         <w:rPr>
           <w:rFonts w:ascii="Calibri" w:cs="Calibri" w:eastAsia="Calibri" w:hAnsi="Calibri"/>
+          <w:b/>
+          <w:bCs/>
+          <w:color w:val="FFFFFF"/>
+          <w:sz w:val="46"/>
+          <w:szCs w:val="46"/>
+        </w:rPr>
+        <w:t xml:space="preserve">Le projet</w:t>
+      </w:r>
+    </w:p>
+    <w:p>
+      <w:pPr>
+        <w:spacing w:after="0" w:before="0" w:line="1250" w:lineRule="exact"/>
+      </w:pPr>
+    </w:p>
+    <w:p>
+      <w:pPr>
+        <w:spacing w:after="240" w:before="0" w:line="300"/>
+      </w:pPr>
+      <w:r>
+        <w:rPr>
+          <w:rFonts w:ascii="Georgia" w:cs="Georgia" w:eastAsia="Georgia" w:hAnsi="Georgia"/>
           <w:i/>
           <w:iCs/>
           <w:color w:val="1B7F79"/>
-          <w:sz w:val="24"/>
-          <w:szCs w:val="24"/>
+          <w:sz w:val="25"/>
+          <w:szCs w:val="25"/>
         </w:rPr>
         <w:t xml:space="preserve">Huit composantes, deux phases, dix-huit mois : doubler la capacité en hébergement quatre saisons et ajouter des revenus de restauration, de spa et d'événements.</w:t>
       </w:r>
@@ -6303,12 +6299,12 @@
       <w:tblPr>
         <w:tblW w:type="dxa" w:w="9648"/>
         <w:tblBorders>
-          <w:top w:val="single" w:color="D9DEE7" w:sz="4"/>
-          <w:left w:val="single" w:color="D9DEE7" w:sz="4"/>
-          <w:bottom w:val="single" w:color="D9DEE7" w:sz="4"/>
-          <w:right w:val="single" w:color="D9DEE7" w:sz="4"/>
+          <w:top w:val="none" w:color="FFFFFF" w:sz="0"/>
+          <w:left w:val="none" w:color="FFFFFF" w:sz="0"/>
+          <w:bottom w:val="single" w:color="0B2A4A" w:sz="8"/>
+          <w:right w:val="none" w:color="FFFFFF" w:sz="0"/>
           <w:insideH w:val="single" w:color="D9DEE7" w:sz="4"/>
-          <w:insideV w:val="single" w:color="D9DEE7" w:sz="4"/>
+          <w:insideV w:val="none" w:color="FFFFFF" w:sz="0"/>
         </w:tblBorders>
       </w:tblPr>
       <w:tblGrid>
@@ -7754,13 +7750,13 @@
           </w:tcPr>
           <w:p>
             <w:pPr>
-              <w:spacing w:after="40"/>
-              <w:jc w:val="center"/>
+              <w:spacing w:after="60"/>
+              <w:jc w:val="left"/>
             </w:pPr>
             <w:r>
               <w:drawing>
                 <wp:inline distT="0" distB="0" distL="0" distR="0">
-                  <wp:extent cx="2543175" cy="1905000"/>
+                  <wp:extent cx="2857500" cy="1905000"/>
                   <wp:effectExtent t="0" r="0" b="0" l="0"/>
                   <wp:docPr id="1" name="" descr="" title=""/>
                   <wp:cNvGraphicFramePr>
@@ -7776,7 +7772,7 @@
                           </pic:cNvPicPr>
                         </pic:nvPicPr>
                         <pic:blipFill>
-                          <a:blip r:embed="rId13" cstate="none"/>
+                          <a:blip r:embed="rId19" cstate="none"/>
                           <a:srcRect/>
                           <a:stretch>
                             <a:fillRect/>
@@ -7785,7 +7781,7 @@
                         <pic:spPr bwMode="auto">
                           <a:xfrm>
                             <a:off x="0" y="0"/>
-                            <a:ext cx="2543175" cy="1905000"/>
+                            <a:ext cx="2857500" cy="1905000"/>
                           </a:xfrm>
                           <a:prstGeom prst="rect">
                             <a:avLst/>
@@ -7800,19 +7796,20 @@
           </w:p>
           <w:p>
             <w:pPr>
-              <w:spacing w:after="0"/>
-              <w:jc w:val="center"/>
-            </w:pPr>
-            <w:r>
-              <w:rPr>
-                <w:rFonts w:ascii="Calibri" w:cs="Calibri" w:eastAsia="Calibri" w:hAnsi="Calibri"/>
-                <w:i/>
-                <w:iCs/>
+              <w:pBdr>
+                <w:top w:val="single" w:color="1B7F79" w:sz="6" w:space="3"/>
+              </w:pBdr>
+              <w:spacing w:after="0" w:line="240"/>
+              <w:jc w:val="left"/>
+            </w:pPr>
+            <w:r>
+              <w:rPr>
+                <w:rFonts w:ascii="Calibri" w:cs="Calibri" w:eastAsia="Calibri" w:hAnsi="Calibri"/>
                 <w:color w:val="8A94A6"/>
-                <w:sz w:val="17"/>
-                <w:szCs w:val="17"/>
-              </w:rPr>
-              <w:t xml:space="preserve">L'entrée de l'hôtel actuel : 6 chambres, à porter à 17</w:t>
+                <w:sz w:val="16"/>
+                <w:szCs w:val="16"/>
+              </w:rPr>
+              <w:t xml:space="preserve">L'hôtel actuel : 6 chambres, à porter à 17</w:t>
             </w:r>
           </w:p>
         </w:tc>
@@ -7851,13 +7848,13 @@
           </w:tcPr>
           <w:p>
             <w:pPr>
-              <w:spacing w:after="40"/>
-              <w:jc w:val="center"/>
+              <w:spacing w:after="60"/>
+              <w:jc w:val="left"/>
             </w:pPr>
             <w:r>
               <w:drawing>
                 <wp:inline distT="0" distB="0" distL="0" distR="0">
-                  <wp:extent cx="3000375" cy="1685925"/>
+                  <wp:extent cx="2857500" cy="1905000"/>
                   <wp:effectExtent t="0" r="0" b="0" l="0"/>
                   <wp:docPr id="1" name="" descr="" title=""/>
                   <wp:cNvGraphicFramePr>
@@ -7873,7 +7870,7 @@
                           </pic:cNvPicPr>
                         </pic:nvPicPr>
                         <pic:blipFill>
-                          <a:blip r:embed="rId14" cstate="none"/>
+                          <a:blip r:embed="rId20" cstate="none"/>
                           <a:srcRect/>
                           <a:stretch>
                             <a:fillRect/>
@@ -7882,7 +7879,7 @@
                         <pic:spPr bwMode="auto">
                           <a:xfrm>
                             <a:off x="0" y="0"/>
-                            <a:ext cx="3000375" cy="1685925"/>
+                            <a:ext cx="2857500" cy="1905000"/>
                           </a:xfrm>
                           <a:prstGeom prst="rect">
                             <a:avLst/>
@@ -7897,19 +7894,20 @@
           </w:p>
           <w:p>
             <w:pPr>
-              <w:spacing w:after="0"/>
-              <w:jc w:val="center"/>
-            </w:pPr>
-            <w:r>
-              <w:rPr>
-                <w:rFonts w:ascii="Calibri" w:cs="Calibri" w:eastAsia="Calibri" w:hAnsi="Calibri"/>
-                <w:i/>
-                <w:iCs/>
+              <w:pBdr>
+                <w:top w:val="single" w:color="1B7F79" w:sz="6" w:space="3"/>
+              </w:pBdr>
+              <w:spacing w:after="0" w:line="240"/>
+              <w:jc w:val="left"/>
+            </w:pPr>
+            <w:r>
+              <w:rPr>
+                <w:rFonts w:ascii="Calibri" w:cs="Calibri" w:eastAsia="Calibri" w:hAnsi="Calibri"/>
                 <w:color w:val="8A94A6"/>
-                <w:sz w:val="17"/>
-                <w:szCs w:val="17"/>
-              </w:rPr>
-              <w:t xml:space="preserve">L'aile arrière de l'hôtel : les chambres à rénover pour une exploitation 12 mois</w:t>
+                <w:sz w:val="16"/>
+                <w:szCs w:val="16"/>
+              </w:rPr>
+              <w:t xml:space="preserve">L'aile arrière : les chambres à rénover pour une exploitation 12 mois</w:t>
             </w:r>
           </w:p>
         </w:tc>
@@ -7963,14 +7961,12 @@
         </w:tblBorders>
       </w:tblPr>
       <w:tblGrid>
-        <w:gridCol w:w="4724"/>
-        <w:gridCol w:w="200"/>
-        <w:gridCol w:w="4724"/>
+        <w:gridCol w:w="9648"/>
       </w:tblGrid>
       <w:tr>
         <w:tc>
           <w:tcPr>
-            <w:tcW w:type="dxa" w:w="4724"/>
+            <w:tcW w:type="dxa" w:w="9648"/>
             <w:tcBorders>
               <w:top w:val="none" w:color="FFFFFF" w:sz="0"/>
               <w:left w:val="none" w:color="FFFFFF" w:sz="0"/>
@@ -7987,13 +7983,13 @@
           </w:tcPr>
           <w:p>
             <w:pPr>
-              <w:spacing w:after="40"/>
-              <w:jc w:val="center"/>
+              <w:spacing w:after="60"/>
+              <w:jc w:val="left"/>
             </w:pPr>
             <w:r>
               <w:drawing>
                 <wp:inline distT="0" distB="0" distL="0" distR="0">
-                  <wp:extent cx="1428750" cy="1905000"/>
+                  <wp:extent cx="3838575" cy="2162175"/>
                   <wp:effectExtent t="0" r="0" b="0" l="0"/>
                   <wp:docPr id="1" name="" descr="" title=""/>
                   <wp:cNvGraphicFramePr>
@@ -8009,7 +8005,7 @@
                           </pic:cNvPicPr>
                         </pic:nvPicPr>
                         <pic:blipFill>
-                          <a:blip r:embed="rId15" cstate="none"/>
+                          <a:blip r:embed="rId21" cstate="none"/>
                           <a:srcRect/>
                           <a:stretch>
                             <a:fillRect/>
@@ -8018,7 +8014,7 @@
                         <pic:spPr bwMode="auto">
                           <a:xfrm>
                             <a:off x="0" y="0"/>
-                            <a:ext cx="1428750" cy="1905000"/>
+                            <a:ext cx="3838575" cy="2162175"/>
                           </a:xfrm>
                           <a:prstGeom prst="rect">
                             <a:avLst/>
@@ -8033,116 +8029,20 @@
           </w:p>
           <w:p>
             <w:pPr>
-              <w:spacing w:after="0"/>
-              <w:jc w:val="center"/>
-            </w:pPr>
-            <w:r>
-              <w:rPr>
-                <w:rFonts w:ascii="Calibri" w:cs="Calibri" w:eastAsia="Calibri" w:hAnsi="Calibri"/>
-                <w:i/>
-                <w:iCs/>
+              <w:pBdr>
+                <w:top w:val="single" w:color="1B7F79" w:sz="6" w:space="3"/>
+              </w:pBdr>
+              <w:spacing w:after="0" w:line="240"/>
+              <w:jc w:val="left"/>
+            </w:pPr>
+            <w:r>
+              <w:rPr>
+                <w:rFonts w:ascii="Calibri" w:cs="Calibri" w:eastAsia="Calibri" w:hAnsi="Calibri"/>
                 <w:color w:val="8A94A6"/>
-                <w:sz w:val="17"/>
-                <w:szCs w:val="17"/>
-              </w:rPr>
-              <w:t xml:space="preserve">L'Aqua Bar : la vente de boissons fonctionne déjà, le restaurant Madera y ajoute les repas</w:t>
-            </w:r>
-          </w:p>
-        </w:tc>
-        <w:tc>
-          <w:tcPr>
-            <w:tcW w:type="dxa" w:w="200"/>
-            <w:tcBorders>
-              <w:top w:val="none" w:color="FFFFFF" w:sz="0"/>
-              <w:left w:val="none" w:color="FFFFFF" w:sz="0"/>
-              <w:bottom w:val="none" w:color="FFFFFF" w:sz="0"/>
-              <w:right w:val="none" w:color="FFFFFF" w:sz="0"/>
-            </w:tcBorders>
-          </w:tcPr>
-          <w:p>
-            <w:r>
-              <w:t xml:space="preserve"/>
-            </w:r>
-          </w:p>
-        </w:tc>
-        <w:tc>
-          <w:tcPr>
-            <w:tcW w:type="dxa" w:w="4724"/>
-            <w:tcBorders>
-              <w:top w:val="none" w:color="FFFFFF" w:sz="0"/>
-              <w:left w:val="none" w:color="FFFFFF" w:sz="0"/>
-              <w:bottom w:val="none" w:color="FFFFFF" w:sz="0"/>
-              <w:right w:val="none" w:color="FFFFFF" w:sz="0"/>
-            </w:tcBorders>
-            <w:tcMar>
-              <w:top w:type="dxa" w:w="0"/>
-              <w:left w:type="dxa" w:w="0"/>
-              <w:bottom w:type="dxa" w:w="0"/>
-              <w:right w:type="dxa" w:w="0"/>
-            </w:tcMar>
-            <w:vAlign w:val="center"/>
-          </w:tcPr>
-          <w:p>
-            <w:pPr>
-              <w:spacing w:after="40"/>
-              <w:jc w:val="center"/>
-            </w:pPr>
-            <w:r>
-              <w:drawing>
-                <wp:inline distT="0" distB="0" distL="0" distR="0">
-                  <wp:extent cx="2543175" cy="1905000"/>
-                  <wp:effectExtent t="0" r="0" b="0" l="0"/>
-                  <wp:docPr id="1" name="" descr="" title=""/>
-                  <wp:cNvGraphicFramePr>
-                    <a:graphicFrameLocks xmlns:a="http://schemas.openxmlformats.org/drawingml/2006/main" noChangeAspect="1"/>
-                  </wp:cNvGraphicFramePr>
-                  <a:graphic xmlns:a="http://schemas.openxmlformats.org/drawingml/2006/main">
-                    <a:graphicData uri="http://schemas.openxmlformats.org/drawingml/2006/picture">
-                      <pic:pic xmlns:pic="http://schemas.openxmlformats.org/drawingml/2006/picture">
-                        <pic:nvPicPr>
-                          <pic:cNvPr id="0" name="" descr=""/>
-                          <pic:cNvPicPr>
-                            <a:picLocks noChangeAspect="1" noChangeArrowheads="1"/>
-                          </pic:cNvPicPr>
-                        </pic:nvPicPr>
-                        <pic:blipFill>
-                          <a:blip r:embed="rId16" cstate="none"/>
-                          <a:srcRect/>
-                          <a:stretch>
-                            <a:fillRect/>
-                          </a:stretch>
-                        </pic:blipFill>
-                        <pic:spPr bwMode="auto">
-                          <a:xfrm>
-                            <a:off x="0" y="0"/>
-                            <a:ext cx="2543175" cy="1905000"/>
-                          </a:xfrm>
-                          <a:prstGeom prst="rect">
-                            <a:avLst/>
-                          </a:prstGeom>
-                        </pic:spPr>
-                      </pic:pic>
-                    </a:graphicData>
-                  </a:graphic>
-                </wp:inline>
-              </w:drawing>
-            </w:r>
-          </w:p>
-          <w:p>
-            <w:pPr>
-              <w:spacing w:after="0"/>
-              <w:jc w:val="center"/>
-            </w:pPr>
-            <w:r>
-              <w:rPr>
-                <w:rFonts w:ascii="Calibri" w:cs="Calibri" w:eastAsia="Calibri" w:hAnsi="Calibri"/>
-                <w:i/>
-                <w:iCs/>
-                <w:color w:val="8A94A6"/>
-                <w:sz w:val="17"/>
-                <w:szCs w:val="17"/>
-              </w:rPr>
-              <w:t xml:space="preserve">Les kiosques et concessions actuels : une offre saisonnière que le restaurant rend permanente</w:t>
+                <w:sz w:val="16"/>
+                <w:szCs w:val="16"/>
+              </w:rPr>
+              <w:t xml:space="preserve">L'Aqua Bar : la vente de boissons fonctionne déjà ; le restaurant Madera y ajoute les repas et l'hiver</w:t>
             </w:r>
           </w:p>
         </w:tc>
@@ -8243,110 +8143,6 @@
         <w:t xml:space="preserve">Construction d'une piscine intérieure-extérieure chauffée et d'un spa de type nordique (bains chauds, sauna, aires de détente). Le spa attire une clientèle de jour en toute saison et prolonge la durée des séjours en hiver. Il s'agit de l'investissement le plus important du projet et du principal moteur de fréquentation hivernale.</w:t>
       </w:r>
     </w:p>
-    <w:tbl>
-      <w:tblPr>
-        <w:tblW w:type="dxa" w:w="9648"/>
-        <w:tblBorders>
-          <w:top w:val="none" w:color="FFFFFF" w:sz="0"/>
-          <w:left w:val="none" w:color="FFFFFF" w:sz="0"/>
-          <w:bottom w:val="none" w:color="FFFFFF" w:sz="0"/>
-          <w:right w:val="none" w:color="FFFFFF" w:sz="0"/>
-          <w:insideH w:val="none" w:color="FFFFFF" w:sz="0"/>
-          <w:insideV w:val="none" w:color="FFFFFF" w:sz="0"/>
-        </w:tblBorders>
-      </w:tblPr>
-      <w:tblGrid>
-        <w:gridCol w:w="9648"/>
-      </w:tblGrid>
-      <w:tr>
-        <w:tc>
-          <w:tcPr>
-            <w:tcW w:type="dxa" w:w="9648"/>
-            <w:tcBorders>
-              <w:top w:val="none" w:color="FFFFFF" w:sz="0"/>
-              <w:left w:val="none" w:color="FFFFFF" w:sz="0"/>
-              <w:bottom w:val="none" w:color="FFFFFF" w:sz="0"/>
-              <w:right w:val="none" w:color="FFFFFF" w:sz="0"/>
-            </w:tcBorders>
-            <w:tcMar>
-              <w:top w:type="dxa" w:w="0"/>
-              <w:left w:type="dxa" w:w="0"/>
-              <w:bottom w:type="dxa" w:w="0"/>
-              <w:right w:type="dxa" w:w="0"/>
-            </w:tcMar>
-            <w:vAlign w:val="center"/>
-          </w:tcPr>
-          <w:p>
-            <w:pPr>
-              <w:spacing w:after="40"/>
-              <w:jc w:val="center"/>
-            </w:pPr>
-            <w:r>
-              <w:drawing>
-                <wp:inline distT="0" distB="0" distL="0" distR="0">
-                  <wp:extent cx="2962275" cy="2162175"/>
-                  <wp:effectExtent t="0" r="0" b="0" l="0"/>
-                  <wp:docPr id="1" name="" descr="" title=""/>
-                  <wp:cNvGraphicFramePr>
-                    <a:graphicFrameLocks xmlns:a="http://schemas.openxmlformats.org/drawingml/2006/main" noChangeAspect="1"/>
-                  </wp:cNvGraphicFramePr>
-                  <a:graphic xmlns:a="http://schemas.openxmlformats.org/drawingml/2006/main">
-                    <a:graphicData uri="http://schemas.openxmlformats.org/drawingml/2006/picture">
-                      <pic:pic xmlns:pic="http://schemas.openxmlformats.org/drawingml/2006/picture">
-                        <pic:nvPicPr>
-                          <pic:cNvPr id="0" name="" descr=""/>
-                          <pic:cNvPicPr>
-                            <a:picLocks noChangeAspect="1" noChangeArrowheads="1"/>
-                          </pic:cNvPicPr>
-                        </pic:nvPicPr>
-                        <pic:blipFill>
-                          <a:blip r:embed="rId17" cstate="none"/>
-                          <a:srcRect/>
-                          <a:stretch>
-                            <a:fillRect/>
-                          </a:stretch>
-                        </pic:blipFill>
-                        <pic:spPr bwMode="auto">
-                          <a:xfrm>
-                            <a:off x="0" y="0"/>
-                            <a:ext cx="2962275" cy="2162175"/>
-                          </a:xfrm>
-                          <a:prstGeom prst="rect">
-                            <a:avLst/>
-                          </a:prstGeom>
-                        </pic:spPr>
-                      </pic:pic>
-                    </a:graphicData>
-                  </a:graphic>
-                </wp:inline>
-              </w:drawing>
-            </w:r>
-          </w:p>
-          <w:p>
-            <w:pPr>
-              <w:spacing w:after="0"/>
-              <w:jc w:val="center"/>
-            </w:pPr>
-            <w:r>
-              <w:rPr>
-                <w:rFonts w:ascii="Calibri" w:cs="Calibri" w:eastAsia="Calibri" w:hAnsi="Calibri"/>
-                <w:i/>
-                <w:iCs/>
-                <w:color w:val="8A94A6"/>
-                <w:sz w:val="17"/>
-                <w:szCs w:val="17"/>
-              </w:rPr>
-              <w:t xml:space="preserve">La piscine actuelle, pleine chaque été : le spa 4 saisons prolonge cette attraction à l'année</w:t>
-            </w:r>
-          </w:p>
-        </w:tc>
-      </w:tr>
-    </w:tbl>
-    <w:p>
-      <w:pPr>
-        <w:spacing w:after="80"/>
-      </w:pPr>
-    </w:p>
     <w:p>
       <w:pPr>
         <w:pStyle w:val="Heading3"/>
@@ -8377,204 +8173,6 @@
         <w:t xml:space="preserve">L'amphithéâtre extérieur accueille spectacles, soirées cubaines et festivals ; le sentier lumineux, un parcours nocturne illuminé exploité d'octobre à avril, crée une raison de visiter le site en basse saison.</w:t>
       </w:r>
     </w:p>
-    <w:tbl>
-      <w:tblPr>
-        <w:tblW w:type="dxa" w:w="9648"/>
-        <w:tblBorders>
-          <w:top w:val="none" w:color="FFFFFF" w:sz="0"/>
-          <w:left w:val="none" w:color="FFFFFF" w:sz="0"/>
-          <w:bottom w:val="none" w:color="FFFFFF" w:sz="0"/>
-          <w:right w:val="none" w:color="FFFFFF" w:sz="0"/>
-          <w:insideH w:val="none" w:color="FFFFFF" w:sz="0"/>
-          <w:insideV w:val="none" w:color="FFFFFF" w:sz="0"/>
-        </w:tblBorders>
-      </w:tblPr>
-      <w:tblGrid>
-        <w:gridCol w:w="4724"/>
-        <w:gridCol w:w="200"/>
-        <w:gridCol w:w="4724"/>
-      </w:tblGrid>
-      <w:tr>
-        <w:tc>
-          <w:tcPr>
-            <w:tcW w:type="dxa" w:w="4724"/>
-            <w:tcBorders>
-              <w:top w:val="none" w:color="FFFFFF" w:sz="0"/>
-              <w:left w:val="none" w:color="FFFFFF" w:sz="0"/>
-              <w:bottom w:val="none" w:color="FFFFFF" w:sz="0"/>
-              <w:right w:val="none" w:color="FFFFFF" w:sz="0"/>
-            </w:tcBorders>
-            <w:tcMar>
-              <w:top w:type="dxa" w:w="0"/>
-              <w:left w:type="dxa" w:w="0"/>
-              <w:bottom w:type="dxa" w:w="0"/>
-              <w:right w:type="dxa" w:w="0"/>
-            </w:tcMar>
-            <w:vAlign w:val="center"/>
-          </w:tcPr>
-          <w:p>
-            <w:pPr>
-              <w:spacing w:after="40"/>
-              <w:jc w:val="center"/>
-            </w:pPr>
-            <w:r>
-              <w:drawing>
-                <wp:inline distT="0" distB="0" distL="0" distR="0">
-                  <wp:extent cx="2543175" cy="1905000"/>
-                  <wp:effectExtent t="0" r="0" b="0" l="0"/>
-                  <wp:docPr id="1" name="" descr="" title=""/>
-                  <wp:cNvGraphicFramePr>
-                    <a:graphicFrameLocks xmlns:a="http://schemas.openxmlformats.org/drawingml/2006/main" noChangeAspect="1"/>
-                  </wp:cNvGraphicFramePr>
-                  <a:graphic xmlns:a="http://schemas.openxmlformats.org/drawingml/2006/main">
-                    <a:graphicData uri="http://schemas.openxmlformats.org/drawingml/2006/picture">
-                      <pic:pic xmlns:pic="http://schemas.openxmlformats.org/drawingml/2006/picture">
-                        <pic:nvPicPr>
-                          <pic:cNvPr id="0" name="" descr=""/>
-                          <pic:cNvPicPr>
-                            <a:picLocks noChangeAspect="1" noChangeArrowheads="1"/>
-                          </pic:cNvPicPr>
-                        </pic:nvPicPr>
-                        <pic:blipFill>
-                          <a:blip r:embed="rId18" cstate="none"/>
-                          <a:srcRect/>
-                          <a:stretch>
-                            <a:fillRect/>
-                          </a:stretch>
-                        </pic:blipFill>
-                        <pic:spPr bwMode="auto">
-                          <a:xfrm>
-                            <a:off x="0" y="0"/>
-                            <a:ext cx="2543175" cy="1905000"/>
-                          </a:xfrm>
-                          <a:prstGeom prst="rect">
-                            <a:avLst/>
-                          </a:prstGeom>
-                        </pic:spPr>
-                      </pic:pic>
-                    </a:graphicData>
-                  </a:graphic>
-                </wp:inline>
-              </w:drawing>
-            </w:r>
-          </w:p>
-          <w:p>
-            <w:pPr>
-              <w:spacing w:after="0"/>
-              <w:jc w:val="center"/>
-            </w:pPr>
-            <w:r>
-              <w:rPr>
-                <w:rFonts w:ascii="Calibri" w:cs="Calibri" w:eastAsia="Calibri" w:hAnsi="Calibri"/>
-                <w:i/>
-                <w:iCs/>
-                <w:color w:val="8A94A6"/>
-                <w:sz w:val="17"/>
-                <w:szCs w:val="17"/>
-              </w:rPr>
-              <w:t xml:space="preserve">La scène extérieure actuelle, un soir de spectacle : l'amphithéâtre lui donne une capacité permanente</w:t>
-            </w:r>
-          </w:p>
-        </w:tc>
-        <w:tc>
-          <w:tcPr>
-            <w:tcW w:type="dxa" w:w="200"/>
-            <w:tcBorders>
-              <w:top w:val="none" w:color="FFFFFF" w:sz="0"/>
-              <w:left w:val="none" w:color="FFFFFF" w:sz="0"/>
-              <w:bottom w:val="none" w:color="FFFFFF" w:sz="0"/>
-              <w:right w:val="none" w:color="FFFFFF" w:sz="0"/>
-            </w:tcBorders>
-          </w:tcPr>
-          <w:p>
-            <w:r>
-              <w:t xml:space="preserve"/>
-            </w:r>
-          </w:p>
-        </w:tc>
-        <w:tc>
-          <w:tcPr>
-            <w:tcW w:type="dxa" w:w="4724"/>
-            <w:tcBorders>
-              <w:top w:val="none" w:color="FFFFFF" w:sz="0"/>
-              <w:left w:val="none" w:color="FFFFFF" w:sz="0"/>
-              <w:bottom w:val="none" w:color="FFFFFF" w:sz="0"/>
-              <w:right w:val="none" w:color="FFFFFF" w:sz="0"/>
-            </w:tcBorders>
-            <w:tcMar>
-              <w:top w:type="dxa" w:w="0"/>
-              <w:left w:type="dxa" w:w="0"/>
-              <w:bottom w:type="dxa" w:w="0"/>
-              <w:right w:type="dxa" w:w="0"/>
-            </w:tcMar>
-            <w:vAlign w:val="center"/>
-          </w:tcPr>
-          <w:p>
-            <w:pPr>
-              <w:spacing w:after="40"/>
-              <w:jc w:val="center"/>
-            </w:pPr>
-            <w:r>
-              <w:drawing>
-                <wp:inline distT="0" distB="0" distL="0" distR="0">
-                  <wp:extent cx="1914525" cy="1905000"/>
-                  <wp:effectExtent t="0" r="0" b="0" l="0"/>
-                  <wp:docPr id="1" name="" descr="" title=""/>
-                  <wp:cNvGraphicFramePr>
-                    <a:graphicFrameLocks xmlns:a="http://schemas.openxmlformats.org/drawingml/2006/main" noChangeAspect="1"/>
-                  </wp:cNvGraphicFramePr>
-                  <a:graphic xmlns:a="http://schemas.openxmlformats.org/drawingml/2006/main">
-                    <a:graphicData uri="http://schemas.openxmlformats.org/drawingml/2006/picture">
-                      <pic:pic xmlns:pic="http://schemas.openxmlformats.org/drawingml/2006/picture">
-                        <pic:nvPicPr>
-                          <pic:cNvPr id="0" name="" descr=""/>
-                          <pic:cNvPicPr>
-                            <a:picLocks noChangeAspect="1" noChangeArrowheads="1"/>
-                          </pic:cNvPicPr>
-                        </pic:nvPicPr>
-                        <pic:blipFill>
-                          <a:blip r:embed="rId19" cstate="none"/>
-                          <a:srcRect/>
-                          <a:stretch>
-                            <a:fillRect/>
-                          </a:stretch>
-                        </pic:blipFill>
-                        <pic:spPr bwMode="auto">
-                          <a:xfrm>
-                            <a:off x="0" y="0"/>
-                            <a:ext cx="1914525" cy="1905000"/>
-                          </a:xfrm>
-                          <a:prstGeom prst="rect">
-                            <a:avLst/>
-                          </a:prstGeom>
-                        </pic:spPr>
-                      </pic:pic>
-                    </a:graphicData>
-                  </a:graphic>
-                </wp:inline>
-              </w:drawing>
-            </w:r>
-          </w:p>
-          <w:p>
-            <w:pPr>
-              <w:spacing w:after="0"/>
-              <w:jc w:val="center"/>
-            </w:pPr>
-            <w:r>
-              <w:rPr>
-                <w:rFonts w:ascii="Calibri" w:cs="Calibri" w:eastAsia="Calibri" w:hAnsi="Calibri"/>
-                <w:i/>
-                <w:iCs/>
-                <w:color w:val="8A94A6"/>
-                <w:sz w:val="17"/>
-                <w:szCs w:val="17"/>
-              </w:rPr>
-              <w:t xml:space="preserve">Le train et les guirlandes en soirée : l'animation nocturne existe, le sentier lumineux l'étend à l'hiver</w:t>
-            </w:r>
-          </w:p>
-        </w:tc>
-      </w:tr>
-    </w:tbl>
     <w:p>
       <w:pPr>
         <w:spacing w:after="120"/>
@@ -8615,8 +8213,8 @@
           </w:tcPr>
           <w:p>
             <w:pPr>
-              <w:spacing w:after="40"/>
-              <w:jc w:val="center"/>
+              <w:spacing w:after="60"/>
+              <w:jc w:val="left"/>
             </w:pPr>
             <w:r>
               <w:drawing>
@@ -8637,7 +8235,7 @@
                           </pic:cNvPicPr>
                         </pic:nvPicPr>
                         <pic:blipFill>
-                          <a:blip r:embed="rId20" cstate="none"/>
+                          <a:blip r:embed="rId22" cstate="none"/>
                           <a:srcRect/>
                           <a:stretch>
                             <a:fillRect/>
@@ -8661,17 +8259,18 @@
           </w:p>
           <w:p>
             <w:pPr>
-              <w:spacing w:after="0"/>
-              <w:jc w:val="center"/>
-            </w:pPr>
-            <w:r>
-              <w:rPr>
-                <w:rFonts w:ascii="Calibri" w:cs="Calibri" w:eastAsia="Calibri" w:hAnsi="Calibri"/>
-                <w:i/>
-                <w:iCs/>
+              <w:pBdr>
+                <w:top w:val="single" w:color="1B7F79" w:sz="6" w:space="3"/>
+              </w:pBdr>
+              <w:spacing w:after="0" w:line="240"/>
+              <w:jc w:val="left"/>
+            </w:pPr>
+            <w:r>
+              <w:rPr>
+                <w:rFonts w:ascii="Calibri" w:cs="Calibri" w:eastAsia="Calibri" w:hAnsi="Calibri"/>
                 <w:color w:val="8A94A6"/>
-                <w:sz w:val="17"/>
-                <w:szCs w:val="17"/>
+                <w:sz w:val="16"/>
+                <w:szCs w:val="16"/>
               </w:rPr>
               <w:t xml:space="preserve">Plan d'aménagement actuel du site (source : Havana Resort)</w:t>
             </w:r>
@@ -8721,7 +8320,7 @@
                     </pic:cNvPicPr>
                   </pic:nvPicPr>
                   <pic:blipFill>
-                    <a:blip r:embed="rId21" cstate="none"/>
+                    <a:blip r:embed="rId23" cstate="none"/>
                     <a:srcRect/>
                     <a:stretch>
                       <a:fillRect/>
@@ -8868,37 +8467,113 @@
     </w:p>
     <w:p>
       <w:pPr>
-        <w:pStyle w:val="Heading1"/>
         <w:pageBreakBefore/>
-        <w:pBdr>
-          <w:bottom w:val="single" w:color="1B7F79" w:sz="12" w:space="6"/>
-        </w:pBdr>
-        <w:spacing w:after="200" w:before="0"/>
+        <w:spacing w:after="0" w:before="0" w:line="20" w:lineRule="exact"/>
+      </w:pPr>
+      <w:r>
+        <w:drawing>
+          <wp:anchor distT="0" distB="0" distL="0" distR="0" simplePos="0" allowOverlap="1" behindDoc="1" locked="1" layoutInCell="0" relativeHeight="3838575">
+            <wp:simplePos x="0" y="0"/>
+            <wp:positionH relativeFrom="page">
+              <wp:posOffset>0</wp:posOffset>
+            </wp:positionH>
+            <wp:positionV relativeFrom="page">
+              <wp:posOffset>566928</wp:posOffset>
+            </wp:positionV>
+            <wp:extent cx="7772400" cy="3838575"/>
+            <wp:effectExtent t="0" r="0" b="0" l="0"/>
+            <wp:wrapNone/>
+            <wp:docPr id="1" name="" descr="" title=""/>
+            <wp:cNvGraphicFramePr>
+              <a:graphicFrameLocks xmlns:a="http://schemas.openxmlformats.org/drawingml/2006/main" noChangeAspect="1"/>
+            </wp:cNvGraphicFramePr>
+            <a:graphic xmlns:a="http://schemas.openxmlformats.org/drawingml/2006/main">
+              <a:graphicData uri="http://schemas.openxmlformats.org/drawingml/2006/picture">
+                <pic:pic xmlns:pic="http://schemas.openxmlformats.org/drawingml/2006/picture">
+                  <pic:nvPicPr>
+                    <pic:cNvPr id="0" name="" descr=""/>
+                    <pic:cNvPicPr>
+                      <a:picLocks noChangeAspect="1" noChangeArrowheads="1"/>
+                    </pic:cNvPicPr>
+                  </pic:nvPicPr>
+                  <pic:blipFill>
+                    <a:blip r:embed="rId24" cstate="none"/>
+                    <a:srcRect/>
+                    <a:stretch>
+                      <a:fillRect/>
+                    </a:stretch>
+                  </pic:blipFill>
+                  <pic:spPr bwMode="auto">
+                    <a:xfrm>
+                      <a:off x="0" y="0"/>
+                      <a:ext cx="7772400" cy="3838575"/>
+                    </a:xfrm>
+                    <a:prstGeom prst="rect">
+                      <a:avLst/>
+                    </a:prstGeom>
+                  </pic:spPr>
+                </pic:pic>
+              </a:graphicData>
+            </a:graphic>
+          </wp:anchor>
+        </w:drawing>
+      </w:r>
+    </w:p>
+    <w:p>
+      <w:pPr>
+        <w:spacing w:after="0" w:before="0" w:line="3800" w:lineRule="exact"/>
+      </w:pPr>
+    </w:p>
+    <w:p>
+      <w:pPr>
+        <w:spacing w:after="60" w:before="0"/>
       </w:pPr>
       <w:r>
         <w:rPr>
           <w:rFonts w:ascii="Calibri" w:cs="Calibri" w:eastAsia="Calibri" w:hAnsi="Calibri"/>
           <w:b/>
           <w:bCs/>
-          <w:color w:val="0B2A4A"/>
-          <w:sz w:val="40"/>
-          <w:szCs w:val="40"/>
+          <w:color w:val="C9A227"/>
+          <w:sz w:val="26"/>
+          <w:szCs w:val="26"/>
         </w:rPr>
-        <w:t xml:space="preserve">4. Analyse du marché</w:t>
+        <w:t xml:space="preserve">04</w:t>
       </w:r>
     </w:p>
     <w:p>
       <w:pPr>
-        <w:spacing w:after="200" w:before="0" w:line="276"/>
+        <w:pStyle w:val="Heading1"/>
+        <w:spacing w:after="0" w:before="0"/>
       </w:pPr>
       <w:r>
         <w:rPr>
           <w:rFonts w:ascii="Calibri" w:cs="Calibri" w:eastAsia="Calibri" w:hAnsi="Calibri"/>
+          <w:b/>
+          <w:bCs/>
+          <w:color w:val="FFFFFF"/>
+          <w:sz w:val="46"/>
+          <w:szCs w:val="46"/>
+        </w:rPr>
+        <w:t xml:space="preserve">Analyse du marché</w:t>
+      </w:r>
+    </w:p>
+    <w:p>
+      <w:pPr>
+        <w:spacing w:after="0" w:before="0" w:line="1250" w:lineRule="exact"/>
+      </w:pPr>
+    </w:p>
+    <w:p>
+      <w:pPr>
+        <w:spacing w:after="240" w:before="0" w:line="300"/>
+      </w:pPr>
+      <w:r>
+        <w:rPr>
+          <w:rFonts w:ascii="Georgia" w:cs="Georgia" w:eastAsia="Georgia" w:hAnsi="Georgia"/>
           <w:i/>
           <w:iCs/>
           <w:color w:val="1B7F79"/>
-          <w:sz w:val="24"/>
-          <w:szCs w:val="24"/>
+          <w:sz w:val="25"/>
+          <w:szCs w:val="25"/>
         </w:rPr>
         <w:t xml:space="preserve">Le camping et le plein air demeurent parmi les segments les plus dynamiques du tourisme québécois ; la demande se déplace vers le confort, les expériences et les quatre saisons.</w:t>
       </w:r>
@@ -9160,12 +8835,12 @@
       <w:tblPr>
         <w:tblW w:type="dxa" w:w="9648"/>
         <w:tblBorders>
-          <w:top w:val="single" w:color="D9DEE7" w:sz="4"/>
-          <w:left w:val="single" w:color="D9DEE7" w:sz="4"/>
-          <w:bottom w:val="single" w:color="D9DEE7" w:sz="4"/>
-          <w:right w:val="single" w:color="D9DEE7" w:sz="4"/>
+          <w:top w:val="none" w:color="FFFFFF" w:sz="0"/>
+          <w:left w:val="none" w:color="FFFFFF" w:sz="0"/>
+          <w:bottom w:val="single" w:color="0B2A4A" w:sz="8"/>
+          <w:right w:val="none" w:color="FFFFFF" w:sz="0"/>
           <w:insideH w:val="single" w:color="D9DEE7" w:sz="4"/>
-          <w:insideV w:val="single" w:color="D9DEE7" w:sz="4"/>
+          <w:insideV w:val="none" w:color="FFFFFF" w:sz="0"/>
         </w:tblBorders>
       </w:tblPr>
       <w:tblGrid>
@@ -10045,209 +9720,6 @@
                 <w:szCs w:val="19"/>
               </w:rPr>
               <w:t xml:space="preserve">4 saisons</w:t>
-            </w:r>
-          </w:p>
-        </w:tc>
-      </w:tr>
-    </w:tbl>
-    <w:p>
-      <w:pPr>
-        <w:spacing w:after="80"/>
-      </w:pPr>
-    </w:p>
-    <w:tbl>
-      <w:tblPr>
-        <w:tblW w:type="dxa" w:w="9648"/>
-        <w:tblBorders>
-          <w:top w:val="none" w:color="FFFFFF" w:sz="0"/>
-          <w:left w:val="none" w:color="FFFFFF" w:sz="0"/>
-          <w:bottom w:val="none" w:color="FFFFFF" w:sz="0"/>
-          <w:right w:val="none" w:color="FFFFFF" w:sz="0"/>
-          <w:insideH w:val="none" w:color="FFFFFF" w:sz="0"/>
-          <w:insideV w:val="none" w:color="FFFFFF" w:sz="0"/>
-        </w:tblBorders>
-      </w:tblPr>
-      <w:tblGrid>
-        <w:gridCol w:w="4724"/>
-        <w:gridCol w:w="200"/>
-        <w:gridCol w:w="4724"/>
-      </w:tblGrid>
-      <w:tr>
-        <w:tc>
-          <w:tcPr>
-            <w:tcW w:type="dxa" w:w="4724"/>
-            <w:tcBorders>
-              <w:top w:val="none" w:color="FFFFFF" w:sz="0"/>
-              <w:left w:val="none" w:color="FFFFFF" w:sz="0"/>
-              <w:bottom w:val="none" w:color="FFFFFF" w:sz="0"/>
-              <w:right w:val="none" w:color="FFFFFF" w:sz="0"/>
-            </w:tcBorders>
-            <w:tcMar>
-              <w:top w:type="dxa" w:w="0"/>
-              <w:left w:type="dxa" w:w="0"/>
-              <w:bottom w:type="dxa" w:w="0"/>
-              <w:right w:type="dxa" w:w="0"/>
-            </w:tcMar>
-            <w:vAlign w:val="center"/>
-          </w:tcPr>
-          <w:p>
-            <w:pPr>
-              <w:spacing w:after="40"/>
-              <w:jc w:val="center"/>
-            </w:pPr>
-            <w:r>
-              <w:drawing>
-                <wp:inline distT="0" distB="0" distL="0" distR="0">
-                  <wp:extent cx="1905000" cy="1905000"/>
-                  <wp:effectExtent t="0" r="0" b="0" l="0"/>
-                  <wp:docPr id="1" name="" descr="" title=""/>
-                  <wp:cNvGraphicFramePr>
-                    <a:graphicFrameLocks xmlns:a="http://schemas.openxmlformats.org/drawingml/2006/main" noChangeAspect="1"/>
-                  </wp:cNvGraphicFramePr>
-                  <a:graphic xmlns:a="http://schemas.openxmlformats.org/drawingml/2006/main">
-                    <a:graphicData uri="http://schemas.openxmlformats.org/drawingml/2006/picture">
-                      <pic:pic xmlns:pic="http://schemas.openxmlformats.org/drawingml/2006/picture">
-                        <pic:nvPicPr>
-                          <pic:cNvPr id="0" name="" descr=""/>
-                          <pic:cNvPicPr>
-                            <a:picLocks noChangeAspect="1" noChangeArrowheads="1"/>
-                          </pic:cNvPicPr>
-                        </pic:nvPicPr>
-                        <pic:blipFill>
-                          <a:blip r:embed="rId22" cstate="none"/>
-                          <a:srcRect/>
-                          <a:stretch>
-                            <a:fillRect/>
-                          </a:stretch>
-                        </pic:blipFill>
-                        <pic:spPr bwMode="auto">
-                          <a:xfrm>
-                            <a:off x="0" y="0"/>
-                            <a:ext cx="1905000" cy="1905000"/>
-                          </a:xfrm>
-                          <a:prstGeom prst="rect">
-                            <a:avLst/>
-                          </a:prstGeom>
-                        </pic:spPr>
-                      </pic:pic>
-                    </a:graphicData>
-                  </a:graphic>
-                </wp:inline>
-              </w:drawing>
-            </w:r>
-          </w:p>
-          <w:p>
-            <w:pPr>
-              <w:spacing w:after="0"/>
-              <w:jc w:val="center"/>
-            </w:pPr>
-            <w:r>
-              <w:rPr>
-                <w:rFonts w:ascii="Calibri" w:cs="Calibri" w:eastAsia="Calibri" w:hAnsi="Calibri"/>
-                <w:i/>
-                <w:iCs/>
-                <w:color w:val="8A94A6"/>
-                <w:sz w:val="17"/>
-                <w:szCs w:val="17"/>
-              </w:rPr>
-              <w:t xml:space="preserve">Le cœur de la clientèle : les familles, qui reviennent d'une année à l'autre</w:t>
-            </w:r>
-          </w:p>
-        </w:tc>
-        <w:tc>
-          <w:tcPr>
-            <w:tcW w:type="dxa" w:w="200"/>
-            <w:tcBorders>
-              <w:top w:val="none" w:color="FFFFFF" w:sz="0"/>
-              <w:left w:val="none" w:color="FFFFFF" w:sz="0"/>
-              <w:bottom w:val="none" w:color="FFFFFF" w:sz="0"/>
-              <w:right w:val="none" w:color="FFFFFF" w:sz="0"/>
-            </w:tcBorders>
-          </w:tcPr>
-          <w:p>
-            <w:r>
-              <w:t xml:space="preserve"/>
-            </w:r>
-          </w:p>
-        </w:tc>
-        <w:tc>
-          <w:tcPr>
-            <w:tcW w:type="dxa" w:w="4724"/>
-            <w:tcBorders>
-              <w:top w:val="none" w:color="FFFFFF" w:sz="0"/>
-              <w:left w:val="none" w:color="FFFFFF" w:sz="0"/>
-              <w:bottom w:val="none" w:color="FFFFFF" w:sz="0"/>
-              <w:right w:val="none" w:color="FFFFFF" w:sz="0"/>
-            </w:tcBorders>
-            <w:tcMar>
-              <w:top w:type="dxa" w:w="0"/>
-              <w:left w:type="dxa" w:w="0"/>
-              <w:bottom w:type="dxa" w:w="0"/>
-              <w:right w:type="dxa" w:w="0"/>
-            </w:tcMar>
-            <w:vAlign w:val="center"/>
-          </w:tcPr>
-          <w:p>
-            <w:pPr>
-              <w:spacing w:after="40"/>
-              <w:jc w:val="center"/>
-            </w:pPr>
-            <w:r>
-              <w:drawing>
-                <wp:inline distT="0" distB="0" distL="0" distR="0">
-                  <wp:extent cx="1514475" cy="1905000"/>
-                  <wp:effectExtent t="0" r="0" b="0" l="0"/>
-                  <wp:docPr id="1" name="" descr="" title=""/>
-                  <wp:cNvGraphicFramePr>
-                    <a:graphicFrameLocks xmlns:a="http://schemas.openxmlformats.org/drawingml/2006/main" noChangeAspect="1"/>
-                  </wp:cNvGraphicFramePr>
-                  <a:graphic xmlns:a="http://schemas.openxmlformats.org/drawingml/2006/main">
-                    <a:graphicData uri="http://schemas.openxmlformats.org/drawingml/2006/picture">
-                      <pic:pic xmlns:pic="http://schemas.openxmlformats.org/drawingml/2006/picture">
-                        <pic:nvPicPr>
-                          <pic:cNvPr id="0" name="" descr=""/>
-                          <pic:cNvPicPr>
-                            <a:picLocks noChangeAspect="1" noChangeArrowheads="1"/>
-                          </pic:cNvPicPr>
-                        </pic:nvPicPr>
-                        <pic:blipFill>
-                          <a:blip r:embed="rId23" cstate="none"/>
-                          <a:srcRect/>
-                          <a:stretch>
-                            <a:fillRect/>
-                          </a:stretch>
-                        </pic:blipFill>
-                        <pic:spPr bwMode="auto">
-                          <a:xfrm>
-                            <a:off x="0" y="0"/>
-                            <a:ext cx="1514475" cy="1905000"/>
-                          </a:xfrm>
-                          <a:prstGeom prst="rect">
-                            <a:avLst/>
-                          </a:prstGeom>
-                        </pic:spPr>
-                      </pic:pic>
-                    </a:graphicData>
-                  </a:graphic>
-                </wp:inline>
-              </w:drawing>
-            </w:r>
-          </w:p>
-          <w:p>
-            <w:pPr>
-              <w:spacing w:after="0"/>
-              <w:jc w:val="center"/>
-            </w:pPr>
-            <w:r>
-              <w:rPr>
-                <w:rFonts w:ascii="Calibri" w:cs="Calibri" w:eastAsia="Calibri" w:hAnsi="Calibri"/>
-                <w:i/>
-                <w:iCs/>
-                <w:color w:val="8A94A6"/>
-                <w:sz w:val="17"/>
-                <w:szCs w:val="17"/>
-              </w:rPr>
-              <w:t xml:space="preserve">Le lac et sa plage : l'offre détente qui attire couples et clientèle de jour</w:t>
             </w:r>
           </w:p>
         </w:tc>
@@ -10287,12 +9759,12 @@
       <w:tblPr>
         <w:tblW w:type="dxa" w:w="9648"/>
         <w:tblBorders>
-          <w:top w:val="single" w:color="D9DEE7" w:sz="4"/>
-          <w:left w:val="single" w:color="D9DEE7" w:sz="4"/>
-          <w:bottom w:val="single" w:color="D9DEE7" w:sz="4"/>
-          <w:right w:val="single" w:color="D9DEE7" w:sz="4"/>
+          <w:top w:val="none" w:color="FFFFFF" w:sz="0"/>
+          <w:left w:val="none" w:color="FFFFFF" w:sz="0"/>
+          <w:bottom w:val="single" w:color="0B2A4A" w:sz="8"/>
+          <w:right w:val="none" w:color="FFFFFF" w:sz="0"/>
           <w:insideH w:val="single" w:color="D9DEE7" w:sz="4"/>
-          <w:insideV w:val="single" w:color="D9DEE7" w:sz="4"/>
+          <w:insideV w:val="none" w:color="FFFFFF" w:sz="0"/>
         </w:tblBorders>
       </w:tblPr>
       <w:tblGrid>
@@ -10942,37 +10414,113 @@
     </w:p>
     <w:p>
       <w:pPr>
-        <w:pStyle w:val="Heading1"/>
         <w:pageBreakBefore/>
-        <w:pBdr>
-          <w:bottom w:val="single" w:color="1B7F79" w:sz="12" w:space="6"/>
-        </w:pBdr>
-        <w:spacing w:after="200" w:before="0"/>
+        <w:spacing w:after="0" w:before="0" w:line="20" w:lineRule="exact"/>
+      </w:pPr>
+      <w:r>
+        <w:drawing>
+          <wp:anchor distT="0" distB="0" distL="0" distR="0" simplePos="0" allowOverlap="1" behindDoc="1" locked="1" layoutInCell="0" relativeHeight="3838575">
+            <wp:simplePos x="0" y="0"/>
+            <wp:positionH relativeFrom="page">
+              <wp:posOffset>0</wp:posOffset>
+            </wp:positionH>
+            <wp:positionV relativeFrom="page">
+              <wp:posOffset>566928</wp:posOffset>
+            </wp:positionV>
+            <wp:extent cx="7772400" cy="3838575"/>
+            <wp:effectExtent t="0" r="0" b="0" l="0"/>
+            <wp:wrapNone/>
+            <wp:docPr id="1" name="" descr="" title=""/>
+            <wp:cNvGraphicFramePr>
+              <a:graphicFrameLocks xmlns:a="http://schemas.openxmlformats.org/drawingml/2006/main" noChangeAspect="1"/>
+            </wp:cNvGraphicFramePr>
+            <a:graphic xmlns:a="http://schemas.openxmlformats.org/drawingml/2006/main">
+              <a:graphicData uri="http://schemas.openxmlformats.org/drawingml/2006/picture">
+                <pic:pic xmlns:pic="http://schemas.openxmlformats.org/drawingml/2006/picture">
+                  <pic:nvPicPr>
+                    <pic:cNvPr id="0" name="" descr=""/>
+                    <pic:cNvPicPr>
+                      <a:picLocks noChangeAspect="1" noChangeArrowheads="1"/>
+                    </pic:cNvPicPr>
+                  </pic:nvPicPr>
+                  <pic:blipFill>
+                    <a:blip r:embed="rId25" cstate="none"/>
+                    <a:srcRect/>
+                    <a:stretch>
+                      <a:fillRect/>
+                    </a:stretch>
+                  </pic:blipFill>
+                  <pic:spPr bwMode="auto">
+                    <a:xfrm>
+                      <a:off x="0" y="0"/>
+                      <a:ext cx="7772400" cy="3838575"/>
+                    </a:xfrm>
+                    <a:prstGeom prst="rect">
+                      <a:avLst/>
+                    </a:prstGeom>
+                  </pic:spPr>
+                </pic:pic>
+              </a:graphicData>
+            </a:graphic>
+          </wp:anchor>
+        </w:drawing>
+      </w:r>
+    </w:p>
+    <w:p>
+      <w:pPr>
+        <w:spacing w:after="0" w:before="0" w:line="3800" w:lineRule="exact"/>
+      </w:pPr>
+    </w:p>
+    <w:p>
+      <w:pPr>
+        <w:spacing w:after="60" w:before="0"/>
       </w:pPr>
       <w:r>
         <w:rPr>
           <w:rFonts w:ascii="Calibri" w:cs="Calibri" w:eastAsia="Calibri" w:hAnsi="Calibri"/>
           <w:b/>
           <w:bCs/>
-          <w:color w:val="0B2A4A"/>
-          <w:sz w:val="40"/>
-          <w:szCs w:val="40"/>
+          <w:color w:val="C9A227"/>
+          <w:sz w:val="26"/>
+          <w:szCs w:val="26"/>
         </w:rPr>
-        <w:t xml:space="preserve">5. Stratégie de commercialisation</w:t>
+        <w:t xml:space="preserve">05</w:t>
       </w:r>
     </w:p>
     <w:p>
       <w:pPr>
-        <w:spacing w:after="200" w:before="0" w:line="276"/>
+        <w:pStyle w:val="Heading1"/>
+        <w:spacing w:after="0" w:before="0"/>
       </w:pPr>
       <w:r>
         <w:rPr>
           <w:rFonts w:ascii="Calibri" w:cs="Calibri" w:eastAsia="Calibri" w:hAnsi="Calibri"/>
+          <w:b/>
+          <w:bCs/>
+          <w:color w:val="FFFFFF"/>
+          <w:sz w:val="46"/>
+          <w:szCs w:val="46"/>
+        </w:rPr>
+        <w:t xml:space="preserve">Stratégie de commercialisation</w:t>
+      </w:r>
+    </w:p>
+    <w:p>
+      <w:pPr>
+        <w:spacing w:after="0" w:before="0" w:line="1250" w:lineRule="exact"/>
+      </w:pPr>
+    </w:p>
+    <w:p>
+      <w:pPr>
+        <w:spacing w:after="240" w:before="0" w:line="300"/>
+      </w:pPr>
+      <w:r>
+        <w:rPr>
+          <w:rFonts w:ascii="Georgia" w:cs="Georgia" w:eastAsia="Georgia" w:hAnsi="Georgia"/>
           <w:i/>
           <w:iCs/>
           <w:color w:val="1B7F79"/>
-          <w:sz w:val="24"/>
-          <w:szCs w:val="24"/>
+          <w:sz w:val="25"/>
+          <w:szCs w:val="25"/>
         </w:rPr>
         <w:t xml:space="preserve">Vendre d'abord la nouvelle capacité à la clientèle existante, puis conquérir les marchés de l'hiver et des groupes.</w:t>
       </w:r>
@@ -11029,12 +10577,12 @@
       <w:tblPr>
         <w:tblW w:type="dxa" w:w="9648"/>
         <w:tblBorders>
-          <w:top w:val="single" w:color="D9DEE7" w:sz="4"/>
-          <w:left w:val="single" w:color="D9DEE7" w:sz="4"/>
-          <w:bottom w:val="single" w:color="D9DEE7" w:sz="4"/>
-          <w:right w:val="single" w:color="D9DEE7" w:sz="4"/>
+          <w:top w:val="none" w:color="FFFFFF" w:sz="0"/>
+          <w:left w:val="none" w:color="FFFFFF" w:sz="0"/>
+          <w:bottom w:val="single" w:color="0B2A4A" w:sz="8"/>
+          <w:right w:val="none" w:color="FFFFFF" w:sz="0"/>
           <w:insideH w:val="single" w:color="D9DEE7" w:sz="4"/>
-          <w:insideV w:val="single" w:color="D9DEE7" w:sz="4"/>
+          <w:insideV w:val="none" w:color="FFFFFF" w:sz="0"/>
         </w:tblBorders>
       </w:tblPr>
       <w:tblGrid>
@@ -12313,8 +11861,8 @@
           </w:tcPr>
           <w:p>
             <w:pPr>
-              <w:spacing w:after="40"/>
-              <w:jc w:val="center"/>
+              <w:spacing w:after="60"/>
+              <w:jc w:val="left"/>
             </w:pPr>
             <w:r>
               <w:drawing>
@@ -12335,7 +11883,7 @@
                           </pic:cNvPicPr>
                         </pic:nvPicPr>
                         <pic:blipFill>
-                          <a:blip r:embed="rId24" cstate="none"/>
+                          <a:blip r:embed="rId26" cstate="none"/>
                           <a:srcRect/>
                           <a:stretch>
                             <a:fillRect/>
@@ -12359,17 +11907,18 @@
           </w:p>
           <w:p>
             <w:pPr>
-              <w:spacing w:after="0"/>
-              <w:jc w:val="center"/>
-            </w:pPr>
-            <w:r>
-              <w:rPr>
-                <w:rFonts w:ascii="Calibri" w:cs="Calibri" w:eastAsia="Calibri" w:hAnsi="Calibri"/>
-                <w:i/>
-                <w:iCs/>
+              <w:pBdr>
+                <w:top w:val="single" w:color="1B7F79" w:sz="6" w:space="3"/>
+              </w:pBdr>
+              <w:spacing w:after="0" w:line="240"/>
+              <w:jc w:val="left"/>
+            </w:pPr>
+            <w:r>
+              <w:rPr>
+                <w:rFonts w:ascii="Calibri" w:cs="Calibri" w:eastAsia="Calibri" w:hAnsi="Calibri"/>
                 <w:color w:val="8A94A6"/>
-                <w:sz w:val="17"/>
-                <w:szCs w:val="17"/>
+                <w:sz w:val="16"/>
+                <w:szCs w:val="16"/>
               </w:rPr>
               <w:t xml:space="preserve">Contenu vidéo des réseaux sociaux : animation aquatique</w:t>
             </w:r>
@@ -12410,8 +11959,8 @@
           </w:tcPr>
           <w:p>
             <w:pPr>
-              <w:spacing w:after="40"/>
-              <w:jc w:val="center"/>
+              <w:spacing w:after="60"/>
+              <w:jc w:val="left"/>
             </w:pPr>
             <w:r>
               <w:drawing>
@@ -12432,7 +11981,7 @@
                           </pic:cNvPicPr>
                         </pic:nvPicPr>
                         <pic:blipFill>
-                          <a:blip r:embed="rId25" cstate="none"/>
+                          <a:blip r:embed="rId27" cstate="none"/>
                           <a:srcRect/>
                           <a:stretch>
                             <a:fillRect/>
@@ -12456,17 +12005,18 @@
           </w:p>
           <w:p>
             <w:pPr>
-              <w:spacing w:after="0"/>
-              <w:jc w:val="center"/>
-            </w:pPr>
-            <w:r>
-              <w:rPr>
-                <w:rFonts w:ascii="Calibri" w:cs="Calibri" w:eastAsia="Calibri" w:hAnsi="Calibri"/>
-                <w:i/>
-                <w:iCs/>
+              <w:pBdr>
+                <w:top w:val="single" w:color="1B7F79" w:sz="6" w:space="3"/>
+              </w:pBdr>
+              <w:spacing w:after="0" w:line="240"/>
+              <w:jc w:val="left"/>
+            </w:pPr>
+            <w:r>
+              <w:rPr>
+                <w:rFonts w:ascii="Calibri" w:cs="Calibri" w:eastAsia="Calibri" w:hAnsi="Calibri"/>
                 <w:color w:val="8A94A6"/>
-                <w:sz w:val="17"/>
-                <w:szCs w:val="17"/>
+                <w:sz w:val="16"/>
+                <w:szCs w:val="16"/>
               </w:rPr>
               <w:t xml:space="preserve">Contenu vidéo des réseaux sociaux : le train du resort</w:t>
             </w:r>
@@ -12508,12 +12058,12 @@
       <w:tblPr>
         <w:tblW w:type="dxa" w:w="9648"/>
         <w:tblBorders>
-          <w:top w:val="single" w:color="D9DEE7" w:sz="4"/>
-          <w:left w:val="single" w:color="D9DEE7" w:sz="4"/>
-          <w:bottom w:val="single" w:color="D9DEE7" w:sz="4"/>
-          <w:right w:val="single" w:color="D9DEE7" w:sz="4"/>
+          <w:top w:val="none" w:color="FFFFFF" w:sz="0"/>
+          <w:left w:val="none" w:color="FFFFFF" w:sz="0"/>
+          <w:bottom w:val="single" w:color="0B2A4A" w:sz="8"/>
+          <w:right w:val="none" w:color="FFFFFF" w:sz="0"/>
           <w:insideH w:val="single" w:color="D9DEE7" w:sz="4"/>
-          <w:insideV w:val="single" w:color="D9DEE7" w:sz="4"/>
+          <w:insideV w:val="none" w:color="FFFFFF" w:sz="0"/>
         </w:tblBorders>
       </w:tblPr>
       <w:tblGrid>
@@ -13827,37 +13377,113 @@
     </w:tbl>
     <w:p>
       <w:pPr>
-        <w:pStyle w:val="Heading1"/>
         <w:pageBreakBefore/>
-        <w:pBdr>
-          <w:bottom w:val="single" w:color="1B7F79" w:sz="12" w:space="6"/>
-        </w:pBdr>
-        <w:spacing w:after="200" w:before="0"/>
+        <w:spacing w:after="0" w:before="0" w:line="20" w:lineRule="exact"/>
+      </w:pPr>
+      <w:r>
+        <w:drawing>
+          <wp:anchor distT="0" distB="0" distL="0" distR="0" simplePos="0" allowOverlap="1" behindDoc="1" locked="1" layoutInCell="0" relativeHeight="3838575">
+            <wp:simplePos x="0" y="0"/>
+            <wp:positionH relativeFrom="page">
+              <wp:posOffset>0</wp:posOffset>
+            </wp:positionH>
+            <wp:positionV relativeFrom="page">
+              <wp:posOffset>566928</wp:posOffset>
+            </wp:positionV>
+            <wp:extent cx="7772400" cy="3838575"/>
+            <wp:effectExtent t="0" r="0" b="0" l="0"/>
+            <wp:wrapNone/>
+            <wp:docPr id="1" name="" descr="" title=""/>
+            <wp:cNvGraphicFramePr>
+              <a:graphicFrameLocks xmlns:a="http://schemas.openxmlformats.org/drawingml/2006/main" noChangeAspect="1"/>
+            </wp:cNvGraphicFramePr>
+            <a:graphic xmlns:a="http://schemas.openxmlformats.org/drawingml/2006/main">
+              <a:graphicData uri="http://schemas.openxmlformats.org/drawingml/2006/picture">
+                <pic:pic xmlns:pic="http://schemas.openxmlformats.org/drawingml/2006/picture">
+                  <pic:nvPicPr>
+                    <pic:cNvPr id="0" name="" descr=""/>
+                    <pic:cNvPicPr>
+                      <a:picLocks noChangeAspect="1" noChangeArrowheads="1"/>
+                    </pic:cNvPicPr>
+                  </pic:nvPicPr>
+                  <pic:blipFill>
+                    <a:blip r:embed="rId28" cstate="none"/>
+                    <a:srcRect/>
+                    <a:stretch>
+                      <a:fillRect/>
+                    </a:stretch>
+                  </pic:blipFill>
+                  <pic:spPr bwMode="auto">
+                    <a:xfrm>
+                      <a:off x="0" y="0"/>
+                      <a:ext cx="7772400" cy="3838575"/>
+                    </a:xfrm>
+                    <a:prstGeom prst="rect">
+                      <a:avLst/>
+                    </a:prstGeom>
+                  </pic:spPr>
+                </pic:pic>
+              </a:graphicData>
+            </a:graphic>
+          </wp:anchor>
+        </w:drawing>
+      </w:r>
+    </w:p>
+    <w:p>
+      <w:pPr>
+        <w:spacing w:after="0" w:before="0" w:line="3800" w:lineRule="exact"/>
+      </w:pPr>
+    </w:p>
+    <w:p>
+      <w:pPr>
+        <w:spacing w:after="60" w:before="0"/>
       </w:pPr>
       <w:r>
         <w:rPr>
           <w:rFonts w:ascii="Calibri" w:cs="Calibri" w:eastAsia="Calibri" w:hAnsi="Calibri"/>
           <w:b/>
           <w:bCs/>
-          <w:color w:val="0B2A4A"/>
-          <w:sz w:val="40"/>
-          <w:szCs w:val="40"/>
+          <w:color w:val="C9A227"/>
+          <w:sz w:val="26"/>
+          <w:szCs w:val="26"/>
         </w:rPr>
-        <w:t xml:space="preserve">6. Plan d'exploitation</w:t>
+        <w:t xml:space="preserve">06</w:t>
       </w:r>
     </w:p>
     <w:p>
       <w:pPr>
-        <w:spacing w:after="200" w:before="0" w:line="276"/>
+        <w:pStyle w:val="Heading1"/>
+        <w:spacing w:after="0" w:before="0"/>
       </w:pPr>
       <w:r>
         <w:rPr>
           <w:rFonts w:ascii="Calibri" w:cs="Calibri" w:eastAsia="Calibri" w:hAnsi="Calibri"/>
+          <w:b/>
+          <w:bCs/>
+          <w:color w:val="FFFFFF"/>
+          <w:sz w:val="46"/>
+          <w:szCs w:val="46"/>
+        </w:rPr>
+        <w:t xml:space="preserve">Plan d'exploitation</w:t>
+      </w:r>
+    </w:p>
+    <w:p>
+      <w:pPr>
+        <w:spacing w:after="0" w:before="0" w:line="1250" w:lineRule="exact"/>
+      </w:pPr>
+    </w:p>
+    <w:p>
+      <w:pPr>
+        <w:spacing w:after="240" w:before="0" w:line="300"/>
+      </w:pPr>
+      <w:r>
+        <w:rPr>
+          <w:rFonts w:ascii="Georgia" w:cs="Georgia" w:eastAsia="Georgia" w:hAnsi="Georgia"/>
           <w:i/>
           <w:iCs/>
           <w:color w:val="1B7F79"/>
-          <w:sz w:val="24"/>
-          <w:szCs w:val="24"/>
+          <w:sz w:val="25"/>
+          <w:szCs w:val="25"/>
         </w:rPr>
         <w:t xml:space="preserve">Une organisation qui passe de 6 à 12 mois d'activité : effectifs, systèmes et fournisseurs sont dimensionnés en conséquence.</w:t>
       </w:r>
@@ -13914,12 +13540,12 @@
       <w:tblPr>
         <w:tblW w:type="dxa" w:w="9648"/>
         <w:tblBorders>
-          <w:top w:val="single" w:color="D9DEE7" w:sz="4"/>
-          <w:left w:val="single" w:color="D9DEE7" w:sz="4"/>
-          <w:bottom w:val="single" w:color="D9DEE7" w:sz="4"/>
-          <w:right w:val="single" w:color="D9DEE7" w:sz="4"/>
+          <w:top w:val="none" w:color="FFFFFF" w:sz="0"/>
+          <w:left w:val="none" w:color="FFFFFF" w:sz="0"/>
+          <w:bottom w:val="single" w:color="0B2A4A" w:sz="8"/>
+          <w:right w:val="none" w:color="FFFFFF" w:sz="0"/>
           <w:insideH w:val="single" w:color="D9DEE7" w:sz="4"/>
-          <w:insideV w:val="single" w:color="D9DEE7" w:sz="4"/>
+          <w:insideV w:val="none" w:color="FFFFFF" w:sz="0"/>
         </w:tblBorders>
       </w:tblPr>
       <w:tblGrid>
@@ -14926,37 +14552,113 @@
     </w:p>
     <w:p>
       <w:pPr>
-        <w:pStyle w:val="Heading1"/>
         <w:pageBreakBefore/>
-        <w:pBdr>
-          <w:bottom w:val="single" w:color="1B7F79" w:sz="12" w:space="6"/>
-        </w:pBdr>
-        <w:spacing w:after="200" w:before="0"/>
+        <w:spacing w:after="0" w:before="0" w:line="20" w:lineRule="exact"/>
+      </w:pPr>
+      <w:r>
+        <w:drawing>
+          <wp:anchor distT="0" distB="0" distL="0" distR="0" simplePos="0" allowOverlap="1" behindDoc="1" locked="1" layoutInCell="0" relativeHeight="3838575">
+            <wp:simplePos x="0" y="0"/>
+            <wp:positionH relativeFrom="page">
+              <wp:posOffset>0</wp:posOffset>
+            </wp:positionH>
+            <wp:positionV relativeFrom="page">
+              <wp:posOffset>566928</wp:posOffset>
+            </wp:positionV>
+            <wp:extent cx="7772400" cy="3838575"/>
+            <wp:effectExtent t="0" r="0" b="0" l="0"/>
+            <wp:wrapNone/>
+            <wp:docPr id="1" name="" descr="" title=""/>
+            <wp:cNvGraphicFramePr>
+              <a:graphicFrameLocks xmlns:a="http://schemas.openxmlformats.org/drawingml/2006/main" noChangeAspect="1"/>
+            </wp:cNvGraphicFramePr>
+            <a:graphic xmlns:a="http://schemas.openxmlformats.org/drawingml/2006/main">
+              <a:graphicData uri="http://schemas.openxmlformats.org/drawingml/2006/picture">
+                <pic:pic xmlns:pic="http://schemas.openxmlformats.org/drawingml/2006/picture">
+                  <pic:nvPicPr>
+                    <pic:cNvPr id="0" name="" descr=""/>
+                    <pic:cNvPicPr>
+                      <a:picLocks noChangeAspect="1" noChangeArrowheads="1"/>
+                    </pic:cNvPicPr>
+                  </pic:nvPicPr>
+                  <pic:blipFill>
+                    <a:blip r:embed="rId29" cstate="none"/>
+                    <a:srcRect/>
+                    <a:stretch>
+                      <a:fillRect/>
+                    </a:stretch>
+                  </pic:blipFill>
+                  <pic:spPr bwMode="auto">
+                    <a:xfrm>
+                      <a:off x="0" y="0"/>
+                      <a:ext cx="7772400" cy="3838575"/>
+                    </a:xfrm>
+                    <a:prstGeom prst="rect">
+                      <a:avLst/>
+                    </a:prstGeom>
+                  </pic:spPr>
+                </pic:pic>
+              </a:graphicData>
+            </a:graphic>
+          </wp:anchor>
+        </w:drawing>
+      </w:r>
+    </w:p>
+    <w:p>
+      <w:pPr>
+        <w:spacing w:after="0" w:before="0" w:line="3800" w:lineRule="exact"/>
+      </w:pPr>
+    </w:p>
+    <w:p>
+      <w:pPr>
+        <w:spacing w:after="60" w:before="0"/>
       </w:pPr>
       <w:r>
         <w:rPr>
           <w:rFonts w:ascii="Calibri" w:cs="Calibri" w:eastAsia="Calibri" w:hAnsi="Calibri"/>
           <w:b/>
           <w:bCs/>
-          <w:color w:val="0B2A4A"/>
-          <w:sz w:val="40"/>
-          <w:szCs w:val="40"/>
+          <w:color w:val="C9A227"/>
+          <w:sz w:val="26"/>
+          <w:szCs w:val="26"/>
         </w:rPr>
-        <w:t xml:space="preserve">7. Équipe de direction</w:t>
+        <w:t xml:space="preserve">07</w:t>
       </w:r>
     </w:p>
     <w:p>
       <w:pPr>
-        <w:spacing w:after="200" w:before="0" w:line="276"/>
+        <w:pStyle w:val="Heading1"/>
+        <w:spacing w:after="0" w:before="0"/>
       </w:pPr>
       <w:r>
         <w:rPr>
           <w:rFonts w:ascii="Calibri" w:cs="Calibri" w:eastAsia="Calibri" w:hAnsi="Calibri"/>
+          <w:b/>
+          <w:bCs/>
+          <w:color w:val="FFFFFF"/>
+          <w:sz w:val="46"/>
+          <w:szCs w:val="46"/>
+        </w:rPr>
+        <w:t xml:space="preserve">Équipe de direction</w:t>
+      </w:r>
+    </w:p>
+    <w:p>
+      <w:pPr>
+        <w:spacing w:after="0" w:before="0" w:line="1250" w:lineRule="exact"/>
+      </w:pPr>
+    </w:p>
+    <w:p>
+      <w:pPr>
+        <w:spacing w:after="240" w:before="0" w:line="300"/>
+      </w:pPr>
+      <w:r>
+        <w:rPr>
+          <w:rFonts w:ascii="Georgia" w:cs="Georgia" w:eastAsia="Georgia" w:hAnsi="Georgia"/>
           <w:i/>
           <w:iCs/>
           <w:color w:val="1B7F79"/>
-          <w:sz w:val="24"/>
-          <w:szCs w:val="24"/>
+          <w:sz w:val="25"/>
+          <w:szCs w:val="25"/>
         </w:rPr>
         <w:t xml:space="preserve">Une direction renouvelée en 2025, appuyée sur la famille fondatrice et sur des conseillers externes.</w:t>
       </w:r>
@@ -14965,12 +14667,12 @@
       <w:tblPr>
         <w:tblW w:type="dxa" w:w="9648"/>
         <w:tblBorders>
-          <w:top w:val="single" w:color="D9DEE7" w:sz="4"/>
-          <w:left w:val="single" w:color="D9DEE7" w:sz="4"/>
-          <w:bottom w:val="single" w:color="D9DEE7" w:sz="4"/>
-          <w:right w:val="single" w:color="D9DEE7" w:sz="4"/>
+          <w:top w:val="none" w:color="FFFFFF" w:sz="0"/>
+          <w:left w:val="none" w:color="FFFFFF" w:sz="0"/>
+          <w:bottom w:val="single" w:color="0B2A4A" w:sz="8"/>
+          <w:right w:val="none" w:color="FFFFFF" w:sz="0"/>
           <w:insideH w:val="single" w:color="D9DEE7" w:sz="4"/>
-          <w:insideV w:val="single" w:color="D9DEE7" w:sz="4"/>
+          <w:insideV w:val="none" w:color="FFFFFF" w:sz="0"/>
         </w:tblBorders>
       </w:tblPr>
       <w:tblGrid>
@@ -15665,67 +15367,36 @@
         <w:gridCol w:w="9648"/>
       </w:tblGrid>
       <w:tr>
+        <w:trPr>
+          <w:trHeight w:val="2600" w:hRule="atLeast"/>
+        </w:trPr>
         <w:tc>
           <w:tcPr>
             <w:tcW w:type="dxa" w:w="9648"/>
             <w:tcBorders>
-              <w:top w:val="none" w:color="FFFFFF" w:sz="0"/>
-              <w:left w:val="none" w:color="FFFFFF" w:sz="0"/>
-              <w:bottom w:val="none" w:color="FFFFFF" w:sz="0"/>
-              <w:right w:val="none" w:color="FFFFFF" w:sz="0"/>
+              <w:top w:val="dashed" w:color="8A94A6" w:sz="8"/>
+              <w:left w:val="dashed" w:color="8A94A6" w:sz="8"/>
+              <w:bottom w:val="dashed" w:color="8A94A6" w:sz="8"/>
+              <w:right w:val="dashed" w:color="8A94A6" w:sz="8"/>
             </w:tcBorders>
-            <w:tcMar>
-              <w:top w:type="dxa" w:w="0"/>
-              <w:left w:type="dxa" w:w="0"/>
-              <w:bottom w:type="dxa" w:w="0"/>
-              <w:right w:type="dxa" w:w="0"/>
-            </w:tcMar>
-            <w:vAlign w:val="center"/>
-          </w:tcPr>
-          <w:p>
-            <w:pPr>
-              <w:spacing w:after="40"/>
+            <w:shd w:fill="F7F8FA" w:color="auto" w:val="clear"/>
+            <w:vAlign w:val="center"/>
+          </w:tcPr>
+          <w:p>
+            <w:pPr>
+              <w:spacing w:after="60"/>
               <w:jc w:val="center"/>
             </w:pPr>
             <w:r>
-              <w:drawing>
-                <wp:inline distT="0" distB="0" distL="0" distR="0">
-                  <wp:extent cx="3028950" cy="1647825"/>
-                  <wp:effectExtent t="0" r="0" b="0" l="0"/>
-                  <wp:docPr id="1" name="" descr="" title=""/>
-                  <wp:cNvGraphicFramePr>
-                    <a:graphicFrameLocks xmlns:a="http://schemas.openxmlformats.org/drawingml/2006/main" noChangeAspect="1"/>
-                  </wp:cNvGraphicFramePr>
-                  <a:graphic xmlns:a="http://schemas.openxmlformats.org/drawingml/2006/main">
-                    <a:graphicData uri="http://schemas.openxmlformats.org/drawingml/2006/picture">
-                      <pic:pic xmlns:pic="http://schemas.openxmlformats.org/drawingml/2006/picture">
-                        <pic:nvPicPr>
-                          <pic:cNvPr id="0" name="" descr=""/>
-                          <pic:cNvPicPr>
-                            <a:picLocks noChangeAspect="1" noChangeArrowheads="1"/>
-                          </pic:cNvPicPr>
-                        </pic:nvPicPr>
-                        <pic:blipFill>
-                          <a:blip r:embed="rId26" cstate="none"/>
-                          <a:srcRect/>
-                          <a:stretch>
-                            <a:fillRect/>
-                          </a:stretch>
-                        </pic:blipFill>
-                        <pic:spPr bwMode="auto">
-                          <a:xfrm>
-                            <a:off x="0" y="0"/>
-                            <a:ext cx="3028950" cy="1647825"/>
-                          </a:xfrm>
-                          <a:prstGeom prst="rect">
-                            <a:avLst/>
-                          </a:prstGeom>
-                        </pic:spPr>
-                      </pic:pic>
-                    </a:graphicData>
-                  </a:graphic>
-                </wp:inline>
-              </w:drawing>
+              <w:rPr>
+                <w:rFonts w:ascii="Calibri" w:cs="Calibri" w:eastAsia="Calibri" w:hAnsi="Calibri"/>
+                <w:b/>
+                <w:bCs/>
+                <w:color w:val="8A94A6"/>
+                <w:sz w:val="18"/>
+                <w:szCs w:val="18"/>
+              </w:rPr>
+              <w:t xml:space="preserve">IMAGE À INSÉRER</w:t>
             </w:r>
           </w:p>
           <w:p>
@@ -15739,10 +15410,10 @@
                 <w:i/>
                 <w:iCs/>
                 <w:color w:val="8A94A6"/>
-                <w:sz w:val="17"/>
-                <w:szCs w:val="17"/>
-              </w:rPr>
-              <w:t xml:space="preserve">L'équipe du Complexe Havana lors d'un événement Apzara [identifier les membres de la direction]</w:t>
+                <w:sz w:val="19"/>
+                <w:szCs w:val="19"/>
+              </w:rPr>
+              <w:t xml:space="preserve">Organigramme de l'entreprise (direction générale, cinq services, responsables)</w:t>
             </w:r>
           </w:p>
         </w:tc>
@@ -15866,37 +15537,113 @@
     </w:p>
     <w:p>
       <w:pPr>
-        <w:pStyle w:val="Heading1"/>
         <w:pageBreakBefore/>
-        <w:pBdr>
-          <w:bottom w:val="single" w:color="1B7F79" w:sz="12" w:space="6"/>
-        </w:pBdr>
-        <w:spacing w:after="200" w:before="0"/>
+        <w:spacing w:after="0" w:before="0" w:line="20" w:lineRule="exact"/>
+      </w:pPr>
+      <w:r>
+        <w:drawing>
+          <wp:anchor distT="0" distB="0" distL="0" distR="0" simplePos="0" allowOverlap="1" behindDoc="1" locked="1" layoutInCell="0" relativeHeight="3838575">
+            <wp:simplePos x="0" y="0"/>
+            <wp:positionH relativeFrom="page">
+              <wp:posOffset>0</wp:posOffset>
+            </wp:positionH>
+            <wp:positionV relativeFrom="page">
+              <wp:posOffset>566928</wp:posOffset>
+            </wp:positionV>
+            <wp:extent cx="7772400" cy="3838575"/>
+            <wp:effectExtent t="0" r="0" b="0" l="0"/>
+            <wp:wrapNone/>
+            <wp:docPr id="1" name="" descr="" title=""/>
+            <wp:cNvGraphicFramePr>
+              <a:graphicFrameLocks xmlns:a="http://schemas.openxmlformats.org/drawingml/2006/main" noChangeAspect="1"/>
+            </wp:cNvGraphicFramePr>
+            <a:graphic xmlns:a="http://schemas.openxmlformats.org/drawingml/2006/main">
+              <a:graphicData uri="http://schemas.openxmlformats.org/drawingml/2006/picture">
+                <pic:pic xmlns:pic="http://schemas.openxmlformats.org/drawingml/2006/picture">
+                  <pic:nvPicPr>
+                    <pic:cNvPr id="0" name="" descr=""/>
+                    <pic:cNvPicPr>
+                      <a:picLocks noChangeAspect="1" noChangeArrowheads="1"/>
+                    </pic:cNvPicPr>
+                  </pic:nvPicPr>
+                  <pic:blipFill>
+                    <a:blip r:embed="rId30" cstate="none"/>
+                    <a:srcRect/>
+                    <a:stretch>
+                      <a:fillRect/>
+                    </a:stretch>
+                  </pic:blipFill>
+                  <pic:spPr bwMode="auto">
+                    <a:xfrm>
+                      <a:off x="0" y="0"/>
+                      <a:ext cx="7772400" cy="3838575"/>
+                    </a:xfrm>
+                    <a:prstGeom prst="rect">
+                      <a:avLst/>
+                    </a:prstGeom>
+                  </pic:spPr>
+                </pic:pic>
+              </a:graphicData>
+            </a:graphic>
+          </wp:anchor>
+        </w:drawing>
+      </w:r>
+    </w:p>
+    <w:p>
+      <w:pPr>
+        <w:spacing w:after="0" w:before="0" w:line="3800" w:lineRule="exact"/>
+      </w:pPr>
+    </w:p>
+    <w:p>
+      <w:pPr>
+        <w:spacing w:after="60" w:before="0"/>
       </w:pPr>
       <w:r>
         <w:rPr>
           <w:rFonts w:ascii="Calibri" w:cs="Calibri" w:eastAsia="Calibri" w:hAnsi="Calibri"/>
           <w:b/>
           <w:bCs/>
-          <w:color w:val="0B2A4A"/>
-          <w:sz w:val="40"/>
-          <w:szCs w:val="40"/>
+          <w:color w:val="C9A227"/>
+          <w:sz w:val="26"/>
+          <w:szCs w:val="26"/>
         </w:rPr>
-        <w:t xml:space="preserve">8. Plan financier</w:t>
+        <w:t xml:space="preserve">08</w:t>
       </w:r>
     </w:p>
     <w:p>
       <w:pPr>
-        <w:spacing w:after="200" w:before="0" w:line="276"/>
+        <w:pStyle w:val="Heading1"/>
+        <w:spacing w:after="0" w:before="0"/>
       </w:pPr>
       <w:r>
         <w:rPr>
           <w:rFonts w:ascii="Calibri" w:cs="Calibri" w:eastAsia="Calibri" w:hAnsi="Calibri"/>
+          <w:b/>
+          <w:bCs/>
+          <w:color w:val="FFFFFF"/>
+          <w:sz w:val="46"/>
+          <w:szCs w:val="46"/>
+        </w:rPr>
+        <w:t xml:space="preserve">Plan financier</w:t>
+      </w:r>
+    </w:p>
+    <w:p>
+      <w:pPr>
+        <w:spacing w:after="0" w:before="0" w:line="1250" w:lineRule="exact"/>
+      </w:pPr>
+    </w:p>
+    <w:p>
+      <w:pPr>
+        <w:spacing w:after="240" w:before="0" w:line="300"/>
+      </w:pPr>
+      <w:r>
+        <w:rPr>
+          <w:rFonts w:ascii="Georgia" w:cs="Georgia" w:eastAsia="Georgia" w:hAnsi="Georgia"/>
           <w:i/>
           <w:iCs/>
           <w:color w:val="1B7F79"/>
-          <w:sz w:val="24"/>
-          <w:szCs w:val="24"/>
+          <w:sz w:val="25"/>
+          <w:szCs w:val="25"/>
         </w:rPr>
         <w:t xml:space="preserve">Des projections bâties sur les revenus réels de 2026, des hypothèses d'occupation prudentes et une structure de financement qui respecte les ratios bancaires dès la première année.</w:t>
       </w:r>
@@ -15923,12 +15670,12 @@
       <w:tblPr>
         <w:tblW w:type="dxa" w:w="9648"/>
         <w:tblBorders>
-          <w:top w:val="single" w:color="D9DEE7" w:sz="4"/>
-          <w:left w:val="single" w:color="D9DEE7" w:sz="4"/>
-          <w:bottom w:val="single" w:color="D9DEE7" w:sz="4"/>
-          <w:right w:val="single" w:color="D9DEE7" w:sz="4"/>
+          <w:top w:val="none" w:color="FFFFFF" w:sz="0"/>
+          <w:left w:val="none" w:color="FFFFFF" w:sz="0"/>
+          <w:bottom w:val="single" w:color="0B2A4A" w:sz="8"/>
+          <w:right w:val="none" w:color="FFFFFF" w:sz="0"/>
           <w:insideH w:val="single" w:color="D9DEE7" w:sz="4"/>
-          <w:insideV w:val="single" w:color="D9DEE7" w:sz="4"/>
+          <w:insideV w:val="none" w:color="FFFFFF" w:sz="0"/>
         </w:tblBorders>
       </w:tblPr>
       <w:tblGrid>
@@ -17301,12 +17048,12 @@
       <w:tblPr>
         <w:tblW w:type="dxa" w:w="9648"/>
         <w:tblBorders>
-          <w:top w:val="single" w:color="D9DEE7" w:sz="4"/>
-          <w:left w:val="single" w:color="D9DEE7" w:sz="4"/>
-          <w:bottom w:val="single" w:color="D9DEE7" w:sz="4"/>
-          <w:right w:val="single" w:color="D9DEE7" w:sz="4"/>
+          <w:top w:val="none" w:color="FFFFFF" w:sz="0"/>
+          <w:left w:val="none" w:color="FFFFFF" w:sz="0"/>
+          <w:bottom w:val="single" w:color="0B2A4A" w:sz="8"/>
+          <w:right w:val="none" w:color="FFFFFF" w:sz="0"/>
           <w:insideH w:val="single" w:color="D9DEE7" w:sz="4"/>
-          <w:insideV w:val="single" w:color="D9DEE7" w:sz="4"/>
+          <w:insideV w:val="none" w:color="FFFFFF" w:sz="0"/>
         </w:tblBorders>
       </w:tblPr>
       <w:tblGrid>
@@ -18084,12 +17831,12 @@
       <w:tblPr>
         <w:tblW w:type="dxa" w:w="9648"/>
         <w:tblBorders>
-          <w:top w:val="single" w:color="D9DEE7" w:sz="4"/>
-          <w:left w:val="single" w:color="D9DEE7" w:sz="4"/>
-          <w:bottom w:val="single" w:color="D9DEE7" w:sz="4"/>
-          <w:right w:val="single" w:color="D9DEE7" w:sz="4"/>
+          <w:top w:val="none" w:color="FFFFFF" w:sz="0"/>
+          <w:left w:val="none" w:color="FFFFFF" w:sz="0"/>
+          <w:bottom w:val="single" w:color="0B2A4A" w:sz="8"/>
+          <w:right w:val="none" w:color="FFFFFF" w:sz="0"/>
           <w:insideH w:val="single" w:color="D9DEE7" w:sz="4"/>
-          <w:insideV w:val="single" w:color="D9DEE7" w:sz="4"/>
+          <w:insideV w:val="none" w:color="FFFFFF" w:sz="0"/>
         </w:tblBorders>
       </w:tblPr>
       <w:tblGrid>
@@ -18502,7 +18249,7 @@
                     </pic:cNvPicPr>
                   </pic:nvPicPr>
                   <pic:blipFill>
-                    <a:blip r:embed="rId27" cstate="none"/>
+                    <a:blip r:embed="rId31" cstate="none"/>
                     <a:srcRect/>
                     <a:stretch>
                       <a:fillRect/>
@@ -18563,12 +18310,12 @@
       <w:tblPr>
         <w:tblW w:type="dxa" w:w="9648"/>
         <w:tblBorders>
-          <w:top w:val="single" w:color="D9DEE7" w:sz="4"/>
-          <w:left w:val="single" w:color="D9DEE7" w:sz="4"/>
-          <w:bottom w:val="single" w:color="D9DEE7" w:sz="4"/>
-          <w:right w:val="single" w:color="D9DEE7" w:sz="4"/>
+          <w:top w:val="none" w:color="FFFFFF" w:sz="0"/>
+          <w:left w:val="none" w:color="FFFFFF" w:sz="0"/>
+          <w:bottom w:val="single" w:color="0B2A4A" w:sz="8"/>
+          <w:right w:val="none" w:color="FFFFFF" w:sz="0"/>
           <w:insideH w:val="single" w:color="D9DEE7" w:sz="4"/>
-          <w:insideV w:val="single" w:color="D9DEE7" w:sz="4"/>
+          <w:insideV w:val="none" w:color="FFFFFF" w:sz="0"/>
         </w:tblBorders>
       </w:tblPr>
       <w:tblGrid>
@@ -19268,7 +19015,7 @@
                     </pic:cNvPicPr>
                   </pic:nvPicPr>
                   <pic:blipFill>
-                    <a:blip r:embed="rId28" cstate="none"/>
+                    <a:blip r:embed="rId32" cstate="none"/>
                     <a:srcRect/>
                     <a:stretch>
                       <a:fillRect/>
@@ -19311,12 +19058,12 @@
       <w:tblPr>
         <w:tblW w:type="dxa" w:w="9648"/>
         <w:tblBorders>
-          <w:top w:val="single" w:color="D9DEE7" w:sz="4"/>
-          <w:left w:val="single" w:color="D9DEE7" w:sz="4"/>
-          <w:bottom w:val="single" w:color="D9DEE7" w:sz="4"/>
-          <w:right w:val="single" w:color="D9DEE7" w:sz="4"/>
+          <w:top w:val="none" w:color="FFFFFF" w:sz="0"/>
+          <w:left w:val="none" w:color="FFFFFF" w:sz="0"/>
+          <w:bottom w:val="single" w:color="0B2A4A" w:sz="8"/>
+          <w:right w:val="none" w:color="FFFFFF" w:sz="0"/>
           <w:insideH w:val="single" w:color="D9DEE7" w:sz="4"/>
-          <w:insideV w:val="single" w:color="D9DEE7" w:sz="4"/>
+          <w:insideV w:val="none" w:color="FFFFFF" w:sz="0"/>
         </w:tblBorders>
       </w:tblPr>
       <w:tblGrid>
@@ -21747,12 +21494,12 @@
       <w:tblPr>
         <w:tblW w:type="dxa" w:w="9648"/>
         <w:tblBorders>
-          <w:top w:val="single" w:color="D9DEE7" w:sz="4"/>
-          <w:left w:val="single" w:color="D9DEE7" w:sz="4"/>
-          <w:bottom w:val="single" w:color="D9DEE7" w:sz="4"/>
-          <w:right w:val="single" w:color="D9DEE7" w:sz="4"/>
+          <w:top w:val="none" w:color="FFFFFF" w:sz="0"/>
+          <w:left w:val="none" w:color="FFFFFF" w:sz="0"/>
+          <w:bottom w:val="single" w:color="0B2A4A" w:sz="8"/>
+          <w:right w:val="none" w:color="FFFFFF" w:sz="0"/>
           <w:insideH w:val="single" w:color="D9DEE7" w:sz="4"/>
-          <w:insideV w:val="single" w:color="D9DEE7" w:sz="4"/>
+          <w:insideV w:val="none" w:color="FFFFFF" w:sz="0"/>
         </w:tblBorders>
       </w:tblPr>
       <w:tblGrid>
@@ -24368,12 +24115,12 @@
       <w:tblPr>
         <w:tblW w:type="dxa" w:w="9648"/>
         <w:tblBorders>
-          <w:top w:val="single" w:color="D9DEE7" w:sz="4"/>
-          <w:left w:val="single" w:color="D9DEE7" w:sz="4"/>
-          <w:bottom w:val="single" w:color="D9DEE7" w:sz="4"/>
-          <w:right w:val="single" w:color="D9DEE7" w:sz="4"/>
+          <w:top w:val="none" w:color="FFFFFF" w:sz="0"/>
+          <w:left w:val="none" w:color="FFFFFF" w:sz="0"/>
+          <w:bottom w:val="single" w:color="0B2A4A" w:sz="8"/>
+          <w:right w:val="none" w:color="FFFFFF" w:sz="0"/>
           <w:insideH w:val="single" w:color="D9DEE7" w:sz="4"/>
-          <w:insideV w:val="single" w:color="D9DEE7" w:sz="4"/>
+          <w:insideV w:val="none" w:color="FFFFFF" w:sz="0"/>
         </w:tblBorders>
       </w:tblPr>
       <w:tblGrid>
@@ -25899,7 +25646,7 @@
                     </pic:cNvPicPr>
                   </pic:nvPicPr>
                   <pic:blipFill>
-                    <a:blip r:embed="rId29" cstate="none"/>
+                    <a:blip r:embed="rId33" cstate="none"/>
                     <a:srcRect/>
                     <a:stretch>
                       <a:fillRect/>
@@ -25960,12 +25707,12 @@
       <w:tblPr>
         <w:tblW w:type="dxa" w:w="9648"/>
         <w:tblBorders>
-          <w:top w:val="single" w:color="D9DEE7" w:sz="4"/>
-          <w:left w:val="single" w:color="D9DEE7" w:sz="4"/>
-          <w:bottom w:val="single" w:color="D9DEE7" w:sz="4"/>
-          <w:right w:val="single" w:color="D9DEE7" w:sz="4"/>
+          <w:top w:val="none" w:color="FFFFFF" w:sz="0"/>
+          <w:left w:val="none" w:color="FFFFFF" w:sz="0"/>
+          <w:bottom w:val="single" w:color="0B2A4A" w:sz="8"/>
+          <w:right w:val="none" w:color="FFFFFF" w:sz="0"/>
           <w:insideH w:val="single" w:color="D9DEE7" w:sz="4"/>
-          <w:insideV w:val="single" w:color="D9DEE7" w:sz="4"/>
+          <w:insideV w:val="none" w:color="FFFFFF" w:sz="0"/>
         </w:tblBorders>
       </w:tblPr>
       <w:tblGrid>
@@ -27471,12 +27218,12 @@
       <w:tblPr>
         <w:tblW w:type="dxa" w:w="9648"/>
         <w:tblBorders>
-          <w:top w:val="single" w:color="D9DEE7" w:sz="4"/>
-          <w:left w:val="single" w:color="D9DEE7" w:sz="4"/>
-          <w:bottom w:val="single" w:color="D9DEE7" w:sz="4"/>
-          <w:right w:val="single" w:color="D9DEE7" w:sz="4"/>
+          <w:top w:val="none" w:color="FFFFFF" w:sz="0"/>
+          <w:left w:val="none" w:color="FFFFFF" w:sz="0"/>
+          <w:bottom w:val="single" w:color="0B2A4A" w:sz="8"/>
+          <w:right w:val="none" w:color="FFFFFF" w:sz="0"/>
           <w:insideH w:val="single" w:color="D9DEE7" w:sz="4"/>
-          <w:insideV w:val="single" w:color="D9DEE7" w:sz="4"/>
+          <w:insideV w:val="none" w:color="FFFFFF" w:sz="0"/>
         </w:tblBorders>
       </w:tblPr>
       <w:tblGrid>
@@ -28441,7 +28188,7 @@
                     </pic:cNvPicPr>
                   </pic:nvPicPr>
                   <pic:blipFill>
-                    <a:blip r:embed="rId30" cstate="none"/>
+                    <a:blip r:embed="rId34" cstate="none"/>
                     <a:srcRect/>
                     <a:stretch>
                       <a:fillRect/>
@@ -28502,12 +28249,12 @@
       <w:tblPr>
         <w:tblW w:type="dxa" w:w="9648"/>
         <w:tblBorders>
-          <w:top w:val="single" w:color="D9DEE7" w:sz="4"/>
-          <w:left w:val="single" w:color="D9DEE7" w:sz="4"/>
-          <w:bottom w:val="single" w:color="D9DEE7" w:sz="4"/>
-          <w:right w:val="single" w:color="D9DEE7" w:sz="4"/>
+          <w:top w:val="none" w:color="FFFFFF" w:sz="0"/>
+          <w:left w:val="none" w:color="FFFFFF" w:sz="0"/>
+          <w:bottom w:val="single" w:color="0B2A4A" w:sz="8"/>
+          <w:right w:val="none" w:color="FFFFFF" w:sz="0"/>
           <w:insideH w:val="single" w:color="D9DEE7" w:sz="4"/>
-          <w:insideV w:val="single" w:color="D9DEE7" w:sz="4"/>
+          <w:insideV w:val="none" w:color="FFFFFF" w:sz="0"/>
         </w:tblBorders>
       </w:tblPr>
       <w:tblGrid>
@@ -29924,12 +29671,12 @@
       <w:tblPr>
         <w:tblW w:type="dxa" w:w="9648"/>
         <w:tblBorders>
-          <w:top w:val="single" w:color="D9DEE7" w:sz="4"/>
-          <w:left w:val="single" w:color="D9DEE7" w:sz="4"/>
-          <w:bottom w:val="single" w:color="D9DEE7" w:sz="4"/>
-          <w:right w:val="single" w:color="D9DEE7" w:sz="4"/>
+          <w:top w:val="none" w:color="FFFFFF" w:sz="0"/>
+          <w:left w:val="none" w:color="FFFFFF" w:sz="0"/>
+          <w:bottom w:val="single" w:color="0B2A4A" w:sz="8"/>
+          <w:right w:val="none" w:color="FFFFFF" w:sz="0"/>
           <w:insideH w:val="single" w:color="D9DEE7" w:sz="4"/>
-          <w:insideV w:val="single" w:color="D9DEE7" w:sz="4"/>
+          <w:insideV w:val="none" w:color="FFFFFF" w:sz="0"/>
         </w:tblBorders>
       </w:tblPr>
       <w:tblGrid>
@@ -30648,37 +30395,113 @@
     </w:p>
     <w:p>
       <w:pPr>
-        <w:pStyle w:val="Heading1"/>
         <w:pageBreakBefore/>
-        <w:pBdr>
-          <w:bottom w:val="single" w:color="1B7F79" w:sz="12" w:space="6"/>
-        </w:pBdr>
-        <w:spacing w:after="200" w:before="0"/>
+        <w:spacing w:after="0" w:before="0" w:line="20" w:lineRule="exact"/>
+      </w:pPr>
+      <w:r>
+        <w:drawing>
+          <wp:anchor distT="0" distB="0" distL="0" distR="0" simplePos="0" allowOverlap="1" behindDoc="1" locked="1" layoutInCell="0" relativeHeight="3838575">
+            <wp:simplePos x="0" y="0"/>
+            <wp:positionH relativeFrom="page">
+              <wp:posOffset>0</wp:posOffset>
+            </wp:positionH>
+            <wp:positionV relativeFrom="page">
+              <wp:posOffset>566928</wp:posOffset>
+            </wp:positionV>
+            <wp:extent cx="7772400" cy="3838575"/>
+            <wp:effectExtent t="0" r="0" b="0" l="0"/>
+            <wp:wrapNone/>
+            <wp:docPr id="1" name="" descr="" title=""/>
+            <wp:cNvGraphicFramePr>
+              <a:graphicFrameLocks xmlns:a="http://schemas.openxmlformats.org/drawingml/2006/main" noChangeAspect="1"/>
+            </wp:cNvGraphicFramePr>
+            <a:graphic xmlns:a="http://schemas.openxmlformats.org/drawingml/2006/main">
+              <a:graphicData uri="http://schemas.openxmlformats.org/drawingml/2006/picture">
+                <pic:pic xmlns:pic="http://schemas.openxmlformats.org/drawingml/2006/picture">
+                  <pic:nvPicPr>
+                    <pic:cNvPr id="0" name="" descr=""/>
+                    <pic:cNvPicPr>
+                      <a:picLocks noChangeAspect="1" noChangeArrowheads="1"/>
+                    </pic:cNvPicPr>
+                  </pic:nvPicPr>
+                  <pic:blipFill>
+                    <a:blip r:embed="rId35" cstate="none"/>
+                    <a:srcRect/>
+                    <a:stretch>
+                      <a:fillRect/>
+                    </a:stretch>
+                  </pic:blipFill>
+                  <pic:spPr bwMode="auto">
+                    <a:xfrm>
+                      <a:off x="0" y="0"/>
+                      <a:ext cx="7772400" cy="3838575"/>
+                    </a:xfrm>
+                    <a:prstGeom prst="rect">
+                      <a:avLst/>
+                    </a:prstGeom>
+                  </pic:spPr>
+                </pic:pic>
+              </a:graphicData>
+            </a:graphic>
+          </wp:anchor>
+        </w:drawing>
+      </w:r>
+    </w:p>
+    <w:p>
+      <w:pPr>
+        <w:spacing w:after="0" w:before="0" w:line="3800" w:lineRule="exact"/>
+      </w:pPr>
+    </w:p>
+    <w:p>
+      <w:pPr>
+        <w:spacing w:after="60" w:before="0"/>
       </w:pPr>
       <w:r>
         <w:rPr>
           <w:rFonts w:ascii="Calibri" w:cs="Calibri" w:eastAsia="Calibri" w:hAnsi="Calibri"/>
           <w:b/>
           <w:bCs/>
-          <w:color w:val="0B2A4A"/>
-          <w:sz w:val="40"/>
-          <w:szCs w:val="40"/>
+          <w:color w:val="C9A227"/>
+          <w:sz w:val="26"/>
+          <w:szCs w:val="26"/>
         </w:rPr>
-        <w:t xml:space="preserve">9. Risques et mesures d'atténuation</w:t>
+        <w:t xml:space="preserve">09</w:t>
       </w:r>
     </w:p>
     <w:p>
       <w:pPr>
-        <w:spacing w:after="200" w:before="0" w:line="276"/>
+        <w:pStyle w:val="Heading1"/>
+        <w:spacing w:after="0" w:before="0"/>
       </w:pPr>
       <w:r>
         <w:rPr>
           <w:rFonts w:ascii="Calibri" w:cs="Calibri" w:eastAsia="Calibri" w:hAnsi="Calibri"/>
+          <w:b/>
+          <w:bCs/>
+          <w:color w:val="FFFFFF"/>
+          <w:sz w:val="46"/>
+          <w:szCs w:val="46"/>
+        </w:rPr>
+        <w:t xml:space="preserve">Risques et mesures d'atténuation</w:t>
+      </w:r>
+    </w:p>
+    <w:p>
+      <w:pPr>
+        <w:spacing w:after="0" w:before="0" w:line="1250" w:lineRule="exact"/>
+      </w:pPr>
+    </w:p>
+    <w:p>
+      <w:pPr>
+        <w:spacing w:after="240" w:before="0" w:line="300"/>
+      </w:pPr>
+      <w:r>
+        <w:rPr>
+          <w:rFonts w:ascii="Georgia" w:cs="Georgia" w:eastAsia="Georgia" w:hAnsi="Georgia"/>
           <w:i/>
           <w:iCs/>
           <w:color w:val="1B7F79"/>
-          <w:sz w:val="24"/>
-          <w:szCs w:val="24"/>
+          <w:sz w:val="25"/>
+          <w:szCs w:val="25"/>
         </w:rPr>
         <w:t xml:space="preserve">Les principaux risques sont identifiés, mesurés et couverts par des mesures concrètes ou par la structure de financement.</w:t>
       </w:r>
@@ -30687,12 +30510,12 @@
       <w:tblPr>
         <w:tblW w:type="dxa" w:w="9648"/>
         <w:tblBorders>
-          <w:top w:val="single" w:color="D9DEE7" w:sz="4"/>
-          <w:left w:val="single" w:color="D9DEE7" w:sz="4"/>
-          <w:bottom w:val="single" w:color="D9DEE7" w:sz="4"/>
-          <w:right w:val="single" w:color="D9DEE7" w:sz="4"/>
+          <w:top w:val="none" w:color="FFFFFF" w:sz="0"/>
+          <w:left w:val="none" w:color="FFFFFF" w:sz="0"/>
+          <w:bottom w:val="single" w:color="0B2A4A" w:sz="8"/>
+          <w:right w:val="none" w:color="FFFFFF" w:sz="0"/>
           <w:insideH w:val="single" w:color="D9DEE7" w:sz="4"/>
-          <w:insideV w:val="single" w:color="D9DEE7" w:sz="4"/>
+          <w:insideV w:val="none" w:color="FFFFFF" w:sz="0"/>
         </w:tblBorders>
       </w:tblPr>
       <w:tblGrid>
@@ -31558,37 +31381,113 @@
     </w:tbl>
     <w:p>
       <w:pPr>
-        <w:pStyle w:val="Heading1"/>
         <w:pageBreakBefore/>
-        <w:pBdr>
-          <w:bottom w:val="single" w:color="1B7F79" w:sz="12" w:space="6"/>
-        </w:pBdr>
-        <w:spacing w:after="200" w:before="0"/>
+        <w:spacing w:after="0" w:before="0" w:line="20" w:lineRule="exact"/>
+      </w:pPr>
+      <w:r>
+        <w:drawing>
+          <wp:anchor distT="0" distB="0" distL="0" distR="0" simplePos="0" allowOverlap="1" behindDoc="1" locked="1" layoutInCell="0" relativeHeight="3838575">
+            <wp:simplePos x="0" y="0"/>
+            <wp:positionH relativeFrom="page">
+              <wp:posOffset>0</wp:posOffset>
+            </wp:positionH>
+            <wp:positionV relativeFrom="page">
+              <wp:posOffset>566928</wp:posOffset>
+            </wp:positionV>
+            <wp:extent cx="7772400" cy="3838575"/>
+            <wp:effectExtent t="0" r="0" b="0" l="0"/>
+            <wp:wrapNone/>
+            <wp:docPr id="1" name="" descr="" title=""/>
+            <wp:cNvGraphicFramePr>
+              <a:graphicFrameLocks xmlns:a="http://schemas.openxmlformats.org/drawingml/2006/main" noChangeAspect="1"/>
+            </wp:cNvGraphicFramePr>
+            <a:graphic xmlns:a="http://schemas.openxmlformats.org/drawingml/2006/main">
+              <a:graphicData uri="http://schemas.openxmlformats.org/drawingml/2006/picture">
+                <pic:pic xmlns:pic="http://schemas.openxmlformats.org/drawingml/2006/picture">
+                  <pic:nvPicPr>
+                    <pic:cNvPr id="0" name="" descr=""/>
+                    <pic:cNvPicPr>
+                      <a:picLocks noChangeAspect="1" noChangeArrowheads="1"/>
+                    </pic:cNvPicPr>
+                  </pic:nvPicPr>
+                  <pic:blipFill>
+                    <a:blip r:embed="rId36" cstate="none"/>
+                    <a:srcRect/>
+                    <a:stretch>
+                      <a:fillRect/>
+                    </a:stretch>
+                  </pic:blipFill>
+                  <pic:spPr bwMode="auto">
+                    <a:xfrm>
+                      <a:off x="0" y="0"/>
+                      <a:ext cx="7772400" cy="3838575"/>
+                    </a:xfrm>
+                    <a:prstGeom prst="rect">
+                      <a:avLst/>
+                    </a:prstGeom>
+                  </pic:spPr>
+                </pic:pic>
+              </a:graphicData>
+            </a:graphic>
+          </wp:anchor>
+        </w:drawing>
+      </w:r>
+    </w:p>
+    <w:p>
+      <w:pPr>
+        <w:spacing w:after="0" w:before="0" w:line="3800" w:lineRule="exact"/>
+      </w:pPr>
+    </w:p>
+    <w:p>
+      <w:pPr>
+        <w:spacing w:after="60" w:before="0"/>
       </w:pPr>
       <w:r>
         <w:rPr>
           <w:rFonts w:ascii="Calibri" w:cs="Calibri" w:eastAsia="Calibri" w:hAnsi="Calibri"/>
           <w:b/>
           <w:bCs/>
-          <w:color w:val="0B2A4A"/>
-          <w:sz w:val="40"/>
-          <w:szCs w:val="40"/>
+          <w:color w:val="C9A227"/>
+          <w:sz w:val="26"/>
+          <w:szCs w:val="26"/>
         </w:rPr>
-        <w:t xml:space="preserve">10. Conclusion et demande</w:t>
+        <w:t xml:space="preserve">10</w:t>
       </w:r>
     </w:p>
     <w:p>
       <w:pPr>
-        <w:spacing w:after="200" w:before="0" w:line="276"/>
+        <w:pStyle w:val="Heading1"/>
+        <w:spacing w:after="0" w:before="0"/>
       </w:pPr>
       <w:r>
         <w:rPr>
           <w:rFonts w:ascii="Calibri" w:cs="Calibri" w:eastAsia="Calibri" w:hAnsi="Calibri"/>
+          <w:b/>
+          <w:bCs/>
+          <w:color w:val="FFFFFF"/>
+          <w:sz w:val="46"/>
+          <w:szCs w:val="46"/>
+        </w:rPr>
+        <w:t xml:space="preserve">Conclusion et demande</w:t>
+      </w:r>
+    </w:p>
+    <w:p>
+      <w:pPr>
+        <w:spacing w:after="0" w:before="0" w:line="1250" w:lineRule="exact"/>
+      </w:pPr>
+    </w:p>
+    <w:p>
+      <w:pPr>
+        <w:spacing w:after="240" w:before="0" w:line="300"/>
+      </w:pPr>
+      <w:r>
+        <w:rPr>
+          <w:rFonts w:ascii="Georgia" w:cs="Georgia" w:eastAsia="Georgia" w:hAnsi="Georgia"/>
           <w:i/>
           <w:iCs/>
           <w:color w:val="1B7F79"/>
-          <w:sz w:val="24"/>
-          <w:szCs w:val="24"/>
+          <w:sz w:val="25"/>
+          <w:szCs w:val="25"/>
         </w:rPr>
         <w:t xml:space="preserve">Un actif de 28 M$, une demande démontrée et un plan phasé : le Complexe Havana demande un prêt de 10,3 M$ pour devenir une destination quatre saisons.</w:t>
       </w:r>
@@ -31729,11 +31628,6 @@
     </w:tbl>
     <w:p>
       <w:pPr>
-        <w:spacing w:after="200"/>
-      </w:pPr>
-    </w:p>
-    <w:p>
-      <w:pPr>
         <w:spacing w:after="120" w:before="0" w:line="276"/>
         <w:jc w:val="left"/>
       </w:pPr>
@@ -31746,7 +31640,7 @@
     </w:p>
     <w:p>
       <w:pPr>
-        <w:spacing w:after="400"/>
+        <w:spacing w:after="200"/>
       </w:pPr>
     </w:p>
     <w:p>
@@ -31799,24 +31693,100 @@
     </w:p>
     <w:p>
       <w:pPr>
-        <w:pStyle w:val="Heading1"/>
         <w:pageBreakBefore/>
-        <w:pBdr>
-          <w:bottom w:val="single" w:color="1B7F79" w:sz="12" w:space="6"/>
-        </w:pBdr>
-        <w:spacing w:after="200" w:before="0"/>
+        <w:spacing w:after="0" w:before="0" w:line="20" w:lineRule="exact"/>
+      </w:pPr>
+      <w:r>
+        <w:drawing>
+          <wp:anchor distT="0" distB="0" distL="0" distR="0" simplePos="0" allowOverlap="1" behindDoc="1" locked="1" layoutInCell="0" relativeHeight="3838575">
+            <wp:simplePos x="0" y="0"/>
+            <wp:positionH relativeFrom="page">
+              <wp:posOffset>0</wp:posOffset>
+            </wp:positionH>
+            <wp:positionV relativeFrom="page">
+              <wp:posOffset>566928</wp:posOffset>
+            </wp:positionV>
+            <wp:extent cx="7772400" cy="3838575"/>
+            <wp:effectExtent t="0" r="0" b="0" l="0"/>
+            <wp:wrapNone/>
+            <wp:docPr id="1" name="" descr="" title=""/>
+            <wp:cNvGraphicFramePr>
+              <a:graphicFrameLocks xmlns:a="http://schemas.openxmlformats.org/drawingml/2006/main" noChangeAspect="1"/>
+            </wp:cNvGraphicFramePr>
+            <a:graphic xmlns:a="http://schemas.openxmlformats.org/drawingml/2006/main">
+              <a:graphicData uri="http://schemas.openxmlformats.org/drawingml/2006/picture">
+                <pic:pic xmlns:pic="http://schemas.openxmlformats.org/drawingml/2006/picture">
+                  <pic:nvPicPr>
+                    <pic:cNvPr id="0" name="" descr=""/>
+                    <pic:cNvPicPr>
+                      <a:picLocks noChangeAspect="1" noChangeArrowheads="1"/>
+                    </pic:cNvPicPr>
+                  </pic:nvPicPr>
+                  <pic:blipFill>
+                    <a:blip r:embed="rId37" cstate="none"/>
+                    <a:srcRect/>
+                    <a:stretch>
+                      <a:fillRect/>
+                    </a:stretch>
+                  </pic:blipFill>
+                  <pic:spPr bwMode="auto">
+                    <a:xfrm>
+                      <a:off x="0" y="0"/>
+                      <a:ext cx="7772400" cy="3838575"/>
+                    </a:xfrm>
+                    <a:prstGeom prst="rect">
+                      <a:avLst/>
+                    </a:prstGeom>
+                  </pic:spPr>
+                </pic:pic>
+              </a:graphicData>
+            </a:graphic>
+          </wp:anchor>
+        </w:drawing>
+      </w:r>
+    </w:p>
+    <w:p>
+      <w:pPr>
+        <w:spacing w:after="0" w:before="0" w:line="3800" w:lineRule="exact"/>
+      </w:pPr>
+    </w:p>
+    <w:p>
+      <w:pPr>
+        <w:spacing w:after="60" w:before="0"/>
       </w:pPr>
       <w:r>
         <w:rPr>
           <w:rFonts w:ascii="Calibri" w:cs="Calibri" w:eastAsia="Calibri" w:hAnsi="Calibri"/>
           <w:b/>
           <w:bCs/>
-          <w:color w:val="0B2A4A"/>
-          <w:sz w:val="40"/>
-          <w:szCs w:val="40"/>
+          <w:color w:val="C9A227"/>
+          <w:sz w:val="26"/>
+          <w:szCs w:val="26"/>
+        </w:rPr>
+        <w:t xml:space="preserve">A</w:t>
+      </w:r>
+    </w:p>
+    <w:p>
+      <w:pPr>
+        <w:pStyle w:val="Heading1"/>
+        <w:spacing w:after="0" w:before="0"/>
+      </w:pPr>
+      <w:r>
+        <w:rPr>
+          <w:rFonts w:ascii="Calibri" w:cs="Calibri" w:eastAsia="Calibri" w:hAnsi="Calibri"/>
+          <w:b/>
+          <w:bCs/>
+          <w:color w:val="FFFFFF"/>
+          <w:sz w:val="46"/>
+          <w:szCs w:val="46"/>
         </w:rPr>
         <w:t xml:space="preserve">Annexes</w:t>
       </w:r>
+    </w:p>
+    <w:p>
+      <w:pPr>
+        <w:spacing w:after="0" w:before="0" w:line="1250" w:lineRule="exact"/>
+      </w:pPr>
     </w:p>
     <w:p>
       <w:pPr>
@@ -31834,12 +31804,12 @@
       <w:tblPr>
         <w:tblW w:type="dxa" w:w="9648"/>
         <w:tblBorders>
-          <w:top w:val="single" w:color="D9DEE7" w:sz="4"/>
-          <w:left w:val="single" w:color="D9DEE7" w:sz="4"/>
-          <w:bottom w:val="single" w:color="D9DEE7" w:sz="4"/>
-          <w:right w:val="single" w:color="D9DEE7" w:sz="4"/>
+          <w:top w:val="none" w:color="FFFFFF" w:sz="0"/>
+          <w:left w:val="none" w:color="FFFFFF" w:sz="0"/>
+          <w:bottom w:val="single" w:color="0B2A4A" w:sz="8"/>
+          <w:right w:val="none" w:color="FFFFFF" w:sz="0"/>
           <w:insideH w:val="single" w:color="D9DEE7" w:sz="4"/>
-          <w:insideV w:val="single" w:color="D9DEE7" w:sz="4"/>
+          <w:insideV w:val="none" w:color="FFFFFF" w:sz="0"/>
         </w:tblBorders>
       </w:tblPr>
       <w:tblGrid>
@@ -32858,13 +32828,13 @@
           </w:tcPr>
           <w:p>
             <w:pPr>
-              <w:spacing w:after="40"/>
-              <w:jc w:val="center"/>
+              <w:spacing w:after="60"/>
+              <w:jc w:val="left"/>
             </w:pPr>
             <w:r>
               <w:drawing>
                 <wp:inline distT="0" distB="0" distL="0" distR="0">
-                  <wp:extent cx="2286000" cy="2286000"/>
+                  <wp:extent cx="3000375" cy="2000250"/>
                   <wp:effectExtent t="0" r="0" b="0" l="0"/>
                   <wp:docPr id="1" name="" descr="" title=""/>
                   <wp:cNvGraphicFramePr>
@@ -32880,7 +32850,7 @@
                           </pic:cNvPicPr>
                         </pic:nvPicPr>
                         <pic:blipFill>
-                          <a:blip r:embed="rId31" cstate="none"/>
+                          <a:blip r:embed="rId38" cstate="none"/>
                           <a:srcRect/>
                           <a:stretch>
                             <a:fillRect/>
@@ -32889,7 +32859,7 @@
                         <pic:spPr bwMode="auto">
                           <a:xfrm>
                             <a:off x="0" y="0"/>
-                            <a:ext cx="2286000" cy="2286000"/>
+                            <a:ext cx="3000375" cy="2000250"/>
                           </a:xfrm>
                           <a:prstGeom prst="rect">
                             <a:avLst/>
@@ -32904,19 +32874,20 @@
           </w:p>
           <w:p>
             <w:pPr>
-              <w:spacing w:after="0"/>
-              <w:jc w:val="center"/>
-            </w:pPr>
-            <w:r>
-              <w:rPr>
-                <w:rFonts w:ascii="Calibri" w:cs="Calibri" w:eastAsia="Calibri" w:hAnsi="Calibri"/>
-                <w:i/>
-                <w:iCs/>
+              <w:pBdr>
+                <w:top w:val="single" w:color="1B7F79" w:sz="6" w:space="3"/>
+              </w:pBdr>
+              <w:spacing w:after="0" w:line="240"/>
+              <w:jc w:val="left"/>
+            </w:pPr>
+            <w:r>
+              <w:rPr>
+                <w:rFonts w:ascii="Calibri" w:cs="Calibri" w:eastAsia="Calibri" w:hAnsi="Calibri"/>
                 <w:color w:val="8A94A6"/>
-                <w:sz w:val="17"/>
-                <w:szCs w:val="17"/>
-              </w:rPr>
-              <w:t xml:space="preserve">La piscine, la plage de sable et les palapas</w:t>
+                <w:sz w:val="16"/>
+                <w:szCs w:val="16"/>
+              </w:rPr>
+              <w:t xml:space="preserve">Les Coolbox, mini-maisons en conteneur</w:t>
             </w:r>
           </w:p>
         </w:tc>
@@ -32955,13 +32926,13 @@
           </w:tcPr>
           <w:p>
             <w:pPr>
-              <w:spacing w:after="40"/>
-              <w:jc w:val="center"/>
+              <w:spacing w:after="60"/>
+              <w:jc w:val="left"/>
             </w:pPr>
             <w:r>
               <w:drawing>
                 <wp:inline distT="0" distB="0" distL="0" distR="0">
-                  <wp:extent cx="3000375" cy="1343025"/>
+                  <wp:extent cx="3000375" cy="2000250"/>
                   <wp:effectExtent t="0" r="0" b="0" l="0"/>
                   <wp:docPr id="1" name="" descr="" title=""/>
                   <wp:cNvGraphicFramePr>
@@ -32977,7 +32948,7 @@
                           </pic:cNvPicPr>
                         </pic:nvPicPr>
                         <pic:blipFill>
-                          <a:blip r:embed="rId32" cstate="none"/>
+                          <a:blip r:embed="rId39" cstate="none"/>
                           <a:srcRect/>
                           <a:stretch>
                             <a:fillRect/>
@@ -32986,7 +32957,7 @@
                         <pic:spPr bwMode="auto">
                           <a:xfrm>
                             <a:off x="0" y="0"/>
-                            <a:ext cx="3000375" cy="1343025"/>
+                            <a:ext cx="3000375" cy="2000250"/>
                           </a:xfrm>
                           <a:prstGeom prst="rect">
                             <a:avLst/>
@@ -33001,19 +32972,20 @@
           </w:p>
           <w:p>
             <w:pPr>
-              <w:spacing w:after="0"/>
-              <w:jc w:val="center"/>
-            </w:pPr>
-            <w:r>
-              <w:rPr>
-                <w:rFonts w:ascii="Calibri" w:cs="Calibri" w:eastAsia="Calibri" w:hAnsi="Calibri"/>
-                <w:i/>
-                <w:iCs/>
+              <w:pBdr>
+                <w:top w:val="single" w:color="1B7F79" w:sz="6" w:space="3"/>
+              </w:pBdr>
+              <w:spacing w:after="0" w:line="240"/>
+              <w:jc w:val="left"/>
+            </w:pPr>
+            <w:r>
+              <w:rPr>
+                <w:rFonts w:ascii="Calibri" w:cs="Calibri" w:eastAsia="Calibri" w:hAnsi="Calibri"/>
                 <w:color w:val="8A94A6"/>
-                <w:sz w:val="17"/>
-                <w:szCs w:val="17"/>
-              </w:rPr>
-              <w:t xml:space="preserve">Les Coolbox, mini-maisons en conteneur</w:t>
+                <w:sz w:val="16"/>
+                <w:szCs w:val="16"/>
+              </w:rPr>
+              <w:t xml:space="preserve">L'Aqua Bar, dans la piscine centrale</w:t>
             </w:r>
           </w:p>
         </w:tc>
@@ -33041,9 +33013,161 @@
         </w:tc>
       </w:tr>
     </w:tbl>
+    <w:p>
+      <w:pPr>
+        <w:sectPr>
+          <w:headerReference w:type="default" r:id="rId7"/>
+          <w:headerReference w:type="first" r:id="rId8"/>
+          <w:footerReference w:type="default" r:id="rId9"/>
+          <w:footerReference w:type="first" r:id="rId10"/>
+          <w:pgSz w:w="12240" w:h="15840" w:orient="portrait"/>
+          <w:pgMar w:top="1200" w:right="1296" w:bottom="1100" w:left="1296" w:header="560" w:footer="560" w:gutter="0"/>
+          <w:pgNumType/>
+          <w:titlePg/>
+          <w:docGrid w:linePitch="360"/>
+        </w:sectPr>
+      </w:pPr>
+    </w:p>
+    <w:p>
+      <w:pPr>
+        <w:spacing w:after="0" w:before="0" w:line="20" w:lineRule="exact"/>
+      </w:pPr>
+      <w:r>
+        <w:drawing>
+          <wp:anchor distT="0" distB="0" distL="0" distR="0" simplePos="0" allowOverlap="1" behindDoc="1" locked="1" layoutInCell="0" relativeHeight="10058400">
+            <wp:simplePos x="0" y="0"/>
+            <wp:positionH relativeFrom="page">
+              <wp:posOffset>0</wp:posOffset>
+            </wp:positionH>
+            <wp:positionV relativeFrom="page">
+              <wp:posOffset>0</wp:posOffset>
+            </wp:positionV>
+            <wp:extent cx="7772400" cy="10058400"/>
+            <wp:effectExtent t="0" r="0" b="0" l="0"/>
+            <wp:wrapNone/>
+            <wp:docPr id="1" name="" descr="" title=""/>
+            <wp:cNvGraphicFramePr>
+              <a:graphicFrameLocks xmlns:a="http://schemas.openxmlformats.org/drawingml/2006/main" noChangeAspect="1"/>
+            </wp:cNvGraphicFramePr>
+            <a:graphic xmlns:a="http://schemas.openxmlformats.org/drawingml/2006/main">
+              <a:graphicData uri="http://schemas.openxmlformats.org/drawingml/2006/picture">
+                <pic:pic xmlns:pic="http://schemas.openxmlformats.org/drawingml/2006/picture">
+                  <pic:nvPicPr>
+                    <pic:cNvPr id="0" name="" descr=""/>
+                    <pic:cNvPicPr>
+                      <a:picLocks noChangeAspect="1" noChangeArrowheads="1"/>
+                    </pic:cNvPicPr>
+                  </pic:nvPicPr>
+                  <pic:blipFill>
+                    <a:blip r:embed="rId40" cstate="none"/>
+                    <a:srcRect/>
+                    <a:stretch>
+                      <a:fillRect/>
+                    </a:stretch>
+                  </pic:blipFill>
+                  <pic:spPr bwMode="auto">
+                    <a:xfrm>
+                      <a:off x="0" y="0"/>
+                      <a:ext cx="7772400" cy="10058400"/>
+                    </a:xfrm>
+                    <a:prstGeom prst="rect">
+                      <a:avLst/>
+                    </a:prstGeom>
+                  </pic:spPr>
+                </pic:pic>
+              </a:graphicData>
+            </a:graphic>
+          </wp:anchor>
+        </w:drawing>
+      </w:r>
+    </w:p>
+    <w:p>
+      <w:pPr>
+        <w:spacing w:after="0" w:before="0" w:line="5200" w:lineRule="exact"/>
+      </w:pPr>
+    </w:p>
+    <w:p>
+      <w:pPr>
+        <w:spacing w:after="0"/>
+        <w:jc w:val="center"/>
+      </w:pPr>
+      <w:r>
+        <w:rPr>
+          <w:rFonts w:ascii="Calibri" w:cs="Calibri" w:eastAsia="Calibri" w:hAnsi="Calibri"/>
+          <w:b/>
+          <w:bCs/>
+          <w:color w:val="FFFFFF"/>
+          <w:sz w:val="40"/>
+          <w:szCs w:val="40"/>
+        </w:rPr>
+        <w:t xml:space="preserve">COMPLEXE HAVANA</w:t>
+      </w:r>
+    </w:p>
+    <w:p>
+      <w:pPr>
+        <w:spacing w:after="0" w:before="80"/>
+        <w:jc w:val="center"/>
+      </w:pPr>
+      <w:r>
+        <w:rPr>
+          <w:rFonts w:ascii="Georgia" w:cs="Georgia" w:eastAsia="Georgia" w:hAnsi="Georgia"/>
+          <w:i/>
+          <w:iCs/>
+          <w:color w:val="C9A227"/>
+          <w:sz w:val="24"/>
+          <w:szCs w:val="24"/>
+        </w:rPr>
+        <w:t xml:space="preserve">Un petit bout de Cuba, douze mois par année</w:t>
+      </w:r>
+    </w:p>
+    <w:p>
+      <w:pPr>
+        <w:spacing w:after="0" w:before="600"/>
+        <w:jc w:val="center"/>
+      </w:pPr>
+      <w:r>
+        <w:rPr>
+          <w:rFonts w:ascii="Calibri" w:cs="Calibri" w:eastAsia="Calibri" w:hAnsi="Calibri"/>
+          <w:color w:val="D6DEE8"/>
+          <w:sz w:val="20"/>
+          <w:szCs w:val="20"/>
+        </w:rPr>
+        <w:t xml:space="preserve">631, 7e Rang, Maricourt (Québec)  J0E 2L2</w:t>
+      </w:r>
+    </w:p>
+    <w:p>
+      <w:pPr>
+        <w:spacing w:after="0" w:before="60"/>
+        <w:jc w:val="center"/>
+      </w:pPr>
+      <w:r>
+        <w:rPr>
+          <w:rFonts w:ascii="Calibri" w:cs="Calibri" w:eastAsia="Calibri" w:hAnsi="Calibri"/>
+          <w:color w:val="D6DEE8"/>
+          <w:sz w:val="20"/>
+          <w:szCs w:val="20"/>
+        </w:rPr>
+        <w:t xml:space="preserve">514 774-7979   ·   havanaresort.ca</w:t>
+      </w:r>
+    </w:p>
+    <w:p>
+      <w:pPr>
+        <w:spacing w:after="0" w:before="600"/>
+        <w:jc w:val="center"/>
+      </w:pPr>
+      <w:r>
+        <w:rPr>
+          <w:rFonts w:ascii="Calibri" w:cs="Calibri" w:eastAsia="Calibri" w:hAnsi="Calibri"/>
+          <w:color w:val="AAB6C6"/>
+          <w:sz w:val="17"/>
+          <w:szCs w:val="17"/>
+        </w:rPr>
+        <w:t xml:space="preserve">Plan d'affaires 2027 – 2031   ·   Document confidentiel</w:t>
+      </w:r>
+    </w:p>
     <w:sectPr>
-      <w:headerReference w:type="default" r:id="rId7"/>
-      <w:footerReference w:type="default" r:id="rId8"/>
+      <w:headerReference w:type="default" r:id="rId11"/>
+      <w:footerReference w:type="default" r:id="rId12"/>
       <w:pgSz w:w="12240" w:h="15840" w:orient="portrait"/>
       <w:pgMar w:top="1200" w:right="1296" w:bottom="1100" w:left="1296" w:header="560" w:footer="560" w:gutter="0"/>
       <w:pgNumType/>
@@ -33128,6 +33252,14 @@
 </w:ftr>
 </file>
 
+<file path=word/footer2.xml><?xml version="1.0" encoding="utf-8"?>
+<w:ftr xmlns:wpc="http://schemas.microsoft.com/office/word/2010/wordprocessingCanvas" xmlns:mc="http://schemas.openxmlformats.org/markup-compatibility/2006" xmlns:o="urn:schemas-microsoft-com:office:office" xmlns:r="http://schemas.openxmlformats.org/officeDocument/2006/relationships" xmlns:m="http://schemas.openxmlformats.org/officeDocument/2006/math" xmlns:v="urn:schemas-microsoft-com:vml" xmlns:wp14="http://schemas.microsoft.com/office/word/2010/wordprocessingDrawing" xmlns:wp="http://schemas.openxmlformats.org/drawingml/2006/wordprocessingDrawing" xmlns:w10="urn:schemas-microsoft-com:office:word" xmlns:w="http://schemas.openxmlformats.org/wordprocessingml/2006/main" xmlns:w14="http://schemas.microsoft.com/office/word/2010/wordml" xmlns:w15="http://schemas.microsoft.com/office/word/2012/wordml" xmlns:wpg="http://schemas.microsoft.com/office/word/2010/wordprocessingGroup" xmlns:wpi="http://schemas.microsoft.com/office/word/2010/wordprocessingInk" xmlns:wne="http://schemas.microsoft.com/office/word/2006/wordml" xmlns:wps="http://schemas.microsoft.com/office/word/2010/wordprocessingShape"/>
+</file>
+
+<file path=word/footer3.xml><?xml version="1.0" encoding="utf-8"?>
+<w:ftr xmlns:wpc="http://schemas.microsoft.com/office/word/2010/wordprocessingCanvas" xmlns:mc="http://schemas.openxmlformats.org/markup-compatibility/2006" xmlns:o="urn:schemas-microsoft-com:office:office" xmlns:r="http://schemas.openxmlformats.org/officeDocument/2006/relationships" xmlns:m="http://schemas.openxmlformats.org/officeDocument/2006/math" xmlns:v="urn:schemas-microsoft-com:vml" xmlns:wp14="http://schemas.microsoft.com/office/word/2010/wordprocessingDrawing" xmlns:wp="http://schemas.openxmlformats.org/drawingml/2006/wordprocessingDrawing" xmlns:w10="urn:schemas-microsoft-com:office:word" xmlns:w="http://schemas.openxmlformats.org/wordprocessingml/2006/main" xmlns:w14="http://schemas.microsoft.com/office/word/2010/wordml" xmlns:w15="http://schemas.microsoft.com/office/word/2012/wordml" xmlns:wpg="http://schemas.microsoft.com/office/word/2010/wordprocessingGroup" xmlns:wpi="http://schemas.microsoft.com/office/word/2010/wordprocessingInk" xmlns:wne="http://schemas.microsoft.com/office/word/2006/wordml" xmlns:wps="http://schemas.microsoft.com/office/word/2010/wordprocessingShape"/>
+</file>
+
 <file path=word/footnotes.xml><?xml version="1.0" encoding="utf-8"?>
 <w:footnotes xmlns:wpc="http://schemas.microsoft.com/office/word/2010/wordprocessingCanvas" xmlns:mc="http://schemas.openxmlformats.org/markup-compatibility/2006" xmlns:o="urn:schemas-microsoft-com:office:office" xmlns:r="http://schemas.openxmlformats.org/officeDocument/2006/relationships" xmlns:m="http://schemas.openxmlformats.org/officeDocument/2006/math" xmlns:v="urn:schemas-microsoft-com:vml" xmlns:wp14="http://schemas.microsoft.com/office/word/2010/wordprocessingDrawing" xmlns:wp="http://schemas.openxmlformats.org/drawingml/2006/wordprocessingDrawing" xmlns:w10="urn:schemas-microsoft-com:office:word" xmlns:w="http://schemas.openxmlformats.org/wordprocessingml/2006/main" xmlns:w14="http://schemas.microsoft.com/office/word/2010/wordml" xmlns:w15="http://schemas.microsoft.com/office/word/2012/wordml" xmlns:wpg="http://schemas.microsoft.com/office/word/2010/wordprocessingGroup" xmlns:wpi="http://schemas.microsoft.com/office/word/2010/wordprocessingInk" xmlns:wne="http://schemas.microsoft.com/office/word/2006/wordml" xmlns:wps="http://schemas.microsoft.com/office/word/2010/wordprocessingShape" mc:Ignorable="w14 w15 wp14">
   <w:footnote w:type="separator" w:id="-1">
@@ -33198,6 +33330,14 @@
     </w:r>
   </w:p>
 </w:hdr>
+</file>
+
+<file path=word/header2.xml><?xml version="1.0" encoding="utf-8"?>
+<w:hdr xmlns:wpc="http://schemas.microsoft.com/office/word/2010/wordprocessingCanvas" xmlns:mc="http://schemas.openxmlformats.org/markup-compatibility/2006" xmlns:o="urn:schemas-microsoft-com:office:office" xmlns:r="http://schemas.openxmlformats.org/officeDocument/2006/relationships" xmlns:m="http://schemas.openxmlformats.org/officeDocument/2006/math" xmlns:v="urn:schemas-microsoft-com:vml" xmlns:wp14="http://schemas.microsoft.com/office/word/2010/wordprocessingDrawing" xmlns:wp="http://schemas.openxmlformats.org/drawingml/2006/wordprocessingDrawing" xmlns:w10="urn:schemas-microsoft-com:office:word" xmlns:w="http://schemas.openxmlformats.org/wordprocessingml/2006/main" xmlns:w14="http://schemas.microsoft.com/office/word/2010/wordml" xmlns:w15="http://schemas.microsoft.com/office/word/2012/wordml" xmlns:wpg="http://schemas.microsoft.com/office/word/2010/wordprocessingGroup" xmlns:wpi="http://schemas.microsoft.com/office/word/2010/wordprocessingInk" xmlns:wne="http://schemas.microsoft.com/office/word/2006/wordml" xmlns:wps="http://schemas.microsoft.com/office/word/2010/wordprocessingShape" xmlns:cx="http://schemas.microsoft.com/office/drawing/2014/chartex" xmlns:cx1="http://schemas.microsoft.com/office/drawing/2015/9/8/chartex" xmlns:cx2="http://schemas.microsoft.com/office/drawing/2015/10/21/chartex" xmlns:cx3="http://schemas.microsoft.com/office/drawing/2016/5/9/chartex" xmlns:cx4="http://schemas.microsoft.com/office/drawing/2016/5/10/chartex" xmlns:cx5="http://schemas.microsoft.com/office/drawing/2016/5/11/chartex" xmlns:cx6="http://schemas.microsoft.com/office/drawing/2016/5/12/chartex" xmlns:cx7="http://schemas.microsoft.com/office/drawing/2016/5/13/chartex" xmlns:cx8="http://schemas.microsoft.com/office/drawing/2016/5/14/chartex" xmlns:w16cid="http://schemas.microsoft.com/office/word/2016/wordml/cid" xmlns:w16se="http://schemas.microsoft.com/office/word/2015/wordml/symex"/>
+</file>
+
+<file path=word/header3.xml><?xml version="1.0" encoding="utf-8"?>
+<w:hdr xmlns:wpc="http://schemas.microsoft.com/office/word/2010/wordprocessingCanvas" xmlns:mc="http://schemas.openxmlformats.org/markup-compatibility/2006" xmlns:o="urn:schemas-microsoft-com:office:office" xmlns:r="http://schemas.openxmlformats.org/officeDocument/2006/relationships" xmlns:m="http://schemas.openxmlformats.org/officeDocument/2006/math" xmlns:v="urn:schemas-microsoft-com:vml" xmlns:wp14="http://schemas.microsoft.com/office/word/2010/wordprocessingDrawing" xmlns:wp="http://schemas.openxmlformats.org/drawingml/2006/wordprocessingDrawing" xmlns:w10="urn:schemas-microsoft-com:office:word" xmlns:w="http://schemas.openxmlformats.org/wordprocessingml/2006/main" xmlns:w14="http://schemas.microsoft.com/office/word/2010/wordml" xmlns:w15="http://schemas.microsoft.com/office/word/2012/wordml" xmlns:wpg="http://schemas.microsoft.com/office/word/2010/wordprocessingGroup" xmlns:wpi="http://schemas.microsoft.com/office/word/2010/wordprocessingInk" xmlns:wne="http://schemas.microsoft.com/office/word/2006/wordml" xmlns:wps="http://schemas.microsoft.com/office/word/2010/wordprocessingShape" xmlns:cx="http://schemas.microsoft.com/office/drawing/2014/chartex" xmlns:cx1="http://schemas.microsoft.com/office/drawing/2015/9/8/chartex" xmlns:cx2="http://schemas.microsoft.com/office/drawing/2015/10/21/chartex" xmlns:cx3="http://schemas.microsoft.com/office/drawing/2016/5/9/chartex" xmlns:cx4="http://schemas.microsoft.com/office/drawing/2016/5/10/chartex" xmlns:cx5="http://schemas.microsoft.com/office/drawing/2016/5/11/chartex" xmlns:cx6="http://schemas.microsoft.com/office/drawing/2016/5/12/chartex" xmlns:cx7="http://schemas.microsoft.com/office/drawing/2016/5/13/chartex" xmlns:cx8="http://schemas.microsoft.com/office/drawing/2016/5/14/chartex" xmlns:w16cid="http://schemas.microsoft.com/office/word/2016/wordml/cid" xmlns:w16se="http://schemas.microsoft.com/office/word/2015/wordml/symex"/>
 </file>
 
 <file path=word/numbering.xml><?xml version="1.0" encoding="utf-8"?>

</xml_diff>